<commit_message>
Definizione della configurazione "build.sbt", modifica al "README.dm" e creazione della documentazione
</commit_message>
<xml_diff>
--- a/Documentazione.docx
+++ b/Documentazione.docx
@@ -4167,6 +4167,24 @@
         </w:rPr>
         <w:t>.</w:t>
       </w:r>
+    </w:p>
+    <w:p>
+      <w:pPr>
+        <w:spacing w:line="360" w:lineRule="auto"/>
+        <w:jc w:val="both"/>
+        <w:rPr>
+          <w:rFonts w:ascii="Times New Roman" w:hAnsi="Times New Roman" w:cs="Times New Roman"/>
+        </w:rPr>
+      </w:pPr>
+    </w:p>
+    <w:p>
+      <w:pPr>
+        <w:spacing w:line="360" w:lineRule="auto"/>
+        <w:jc w:val="both"/>
+        <w:rPr>
+          <w:rFonts w:ascii="Times New Roman" w:hAnsi="Times New Roman" w:cs="Times New Roman"/>
+        </w:rPr>
+      </w:pPr>
     </w:p>
     <w:sectPr>
       <w:pgSz w:w="11906" w:h="16838"/>

</xml_diff>

<commit_message>
Modifica del "README.md" e della documentazione
</commit_message>
<xml_diff>
--- a/Documentazione.docx
+++ b/Documentazione.docx
@@ -2399,33 +2399,6 @@
     </w:p>
     <w:p>
       <w:pPr>
-        <w:spacing w:line="360" w:lineRule="auto"/>
-        <w:jc w:val="both"/>
-        <w:rPr>
-          <w:rFonts w:ascii="Times New Roman" w:hAnsi="Times New Roman" w:cs="Times New Roman"/>
-        </w:rPr>
-      </w:pPr>
-    </w:p>
-    <w:p>
-      <w:pPr>
-        <w:spacing w:line="360" w:lineRule="auto"/>
-        <w:jc w:val="both"/>
-        <w:rPr>
-          <w:rFonts w:ascii="Times New Roman" w:hAnsi="Times New Roman" w:cs="Times New Roman"/>
-        </w:rPr>
-      </w:pPr>
-    </w:p>
-    <w:p>
-      <w:pPr>
-        <w:spacing w:line="360" w:lineRule="auto"/>
-        <w:jc w:val="both"/>
-        <w:rPr>
-          <w:rFonts w:ascii="Times New Roman" w:hAnsi="Times New Roman" w:cs="Times New Roman"/>
-        </w:rPr>
-      </w:pPr>
-    </w:p>
-    <w:p>
-      <w:pPr>
         <w:spacing w:after="0" w:line="360" w:lineRule="auto"/>
         <w:jc w:val="both"/>
         <w:rPr>
@@ -2806,6 +2779,7 @@
         <w:pStyle w:val="Titolo2"/>
       </w:pPr>
       <w:r>
+        <w:lastRenderedPageBreak/>
         <w:t>2.</w:t>
       </w:r>
       <w:r>
@@ -3160,6 +3134,23 @@
           <w:rFonts w:ascii="Times New Roman" w:hAnsi="Times New Roman" w:cs="Times New Roman"/>
         </w:rPr>
         <w:t xml:space="preserve"> o Tableau) o query SQL veloci.</w:t>
+      </w:r>
+    </w:p>
+    <w:p>
+      <w:pPr>
+        <w:spacing w:after="0" w:line="360" w:lineRule="auto"/>
+        <w:jc w:val="both"/>
+        <w:rPr>
+          <w:rFonts w:ascii="Times New Roman" w:hAnsi="Times New Roman" w:cs="Times New Roman"/>
+        </w:rPr>
+      </w:pPr>
+    </w:p>
+    <w:p>
+      <w:pPr>
+        <w:pStyle w:val="Titolo3"/>
+      </w:pPr>
+      <w:r>
+        <w:t>Architettura</w:t>
       </w:r>
     </w:p>
     <w:p>
@@ -3243,85 +3234,258 @@
     </w:p>
     <w:p>
       <w:pPr>
+        <w:spacing w:line="360" w:lineRule="auto"/>
+        <w:jc w:val="both"/>
+        <w:rPr>
+          <w:rFonts w:ascii="Times New Roman" w:hAnsi="Times New Roman" w:cs="Times New Roman"/>
+        </w:rPr>
+      </w:pPr>
+    </w:p>
+    <w:p>
+      <w:pPr>
+        <w:spacing w:line="360" w:lineRule="auto"/>
+        <w:jc w:val="both"/>
+        <w:rPr>
+          <w:rFonts w:ascii="Times New Roman" w:hAnsi="Times New Roman" w:cs="Times New Roman"/>
+        </w:rPr>
+      </w:pPr>
+    </w:p>
+    <w:p>
+      <w:pPr>
         <w:pStyle w:val="Titolo1"/>
       </w:pPr>
       <w:r>
+        <w:lastRenderedPageBreak/>
         <w:t>3. Analisi dei Dataset</w:t>
+      </w:r>
+    </w:p>
+    <w:p>
+      <w:pPr>
+        <w:pStyle w:val="Titolo2"/>
+      </w:pPr>
+      <w:r>
+        <w:t xml:space="preserve">3.1 La Sorgente: LCL </w:t>
+      </w:r>
+      <w:proofErr w:type="spellStart"/>
+      <w:r>
+        <w:t>SmartMeter</w:t>
+      </w:r>
+      <w:proofErr w:type="spellEnd"/>
+      <w:r>
+        <w:t xml:space="preserve"> Dataset</w:t>
+      </w:r>
+    </w:p>
+    <w:p>
+      <w:pPr>
+        <w:spacing w:line="360" w:lineRule="auto"/>
+        <w:jc w:val="both"/>
+        <w:rPr>
+          <w:rFonts w:ascii="Times New Roman" w:hAnsi="Times New Roman" w:cs="Times New Roman"/>
+        </w:rPr>
+      </w:pPr>
+      <w:r>
+        <w:rPr>
+          <w:rFonts w:ascii="Times New Roman" w:hAnsi="Times New Roman" w:cs="Times New Roman"/>
+        </w:rPr>
+        <w:t xml:space="preserve">Il cuore pulsante del progetto è il dataset </w:t>
+      </w:r>
+      <w:r>
+        <w:rPr>
+          <w:rFonts w:ascii="Times New Roman" w:hAnsi="Times New Roman" w:cs="Times New Roman"/>
+          <w:b/>
+          <w:bCs/>
+        </w:rPr>
+        <w:t>Low Carbon London (LCL)</w:t>
+      </w:r>
+      <w:r>
+        <w:rPr>
+          <w:rFonts w:ascii="Times New Roman" w:hAnsi="Times New Roman" w:cs="Times New Roman"/>
+        </w:rPr>
+        <w:t xml:space="preserve">, ospitato sul London </w:t>
+      </w:r>
+      <w:proofErr w:type="spellStart"/>
+      <w:r>
+        <w:rPr>
+          <w:rFonts w:ascii="Times New Roman" w:hAnsi="Times New Roman" w:cs="Times New Roman"/>
+        </w:rPr>
+        <w:t>DataStore</w:t>
+      </w:r>
+      <w:proofErr w:type="spellEnd"/>
+      <w:r>
+        <w:rPr>
+          <w:rFonts w:ascii="Times New Roman" w:hAnsi="Times New Roman" w:cs="Times New Roman"/>
+        </w:rPr>
+        <w:t xml:space="preserve"> e ora disponibile su </w:t>
+      </w:r>
+      <w:proofErr w:type="spellStart"/>
+      <w:r>
+        <w:rPr>
+          <w:rFonts w:ascii="Times New Roman" w:hAnsi="Times New Roman" w:cs="Times New Roman"/>
+        </w:rPr>
+        <w:t>Kaggle</w:t>
+      </w:r>
+      <w:proofErr w:type="spellEnd"/>
+      <w:r>
+        <w:rPr>
+          <w:rFonts w:ascii="Times New Roman" w:hAnsi="Times New Roman" w:cs="Times New Roman"/>
+        </w:rPr>
+        <w:t xml:space="preserve">. Non si tratta di un semplice file di prova, ma di un archivio massivo che contiene le letture dei contatori intelligenti di oltre </w:t>
+      </w:r>
+      <w:r>
+        <w:rPr>
+          <w:rFonts w:ascii="Times New Roman" w:hAnsi="Times New Roman" w:cs="Times New Roman"/>
+          <w:b/>
+          <w:bCs/>
+        </w:rPr>
+        <w:t>5.500 famiglie londinesi</w:t>
+      </w:r>
+      <w:r>
+        <w:rPr>
+          <w:rFonts w:ascii="Times New Roman" w:hAnsi="Times New Roman" w:cs="Times New Roman"/>
+        </w:rPr>
+        <w:t xml:space="preserve"> tra il 2011 e il 2014.</w:t>
+      </w:r>
+    </w:p>
+    <w:p>
+      <w:pPr>
+        <w:spacing w:after="0" w:line="360" w:lineRule="auto"/>
+        <w:jc w:val="both"/>
+        <w:rPr>
+          <w:rFonts w:ascii="Times New Roman" w:hAnsi="Times New Roman" w:cs="Times New Roman"/>
+        </w:rPr>
+      </w:pPr>
+      <w:r>
+        <w:rPr>
+          <w:rFonts w:ascii="Times New Roman" w:hAnsi="Times New Roman" w:cs="Times New Roman"/>
+        </w:rPr>
+        <w:t>I</w:t>
+      </w:r>
+      <w:r>
+        <w:rPr>
+          <w:rFonts w:ascii="Times New Roman" w:hAnsi="Times New Roman" w:cs="Times New Roman"/>
+        </w:rPr>
+        <w:t>l dataset è costituito da</w:t>
+      </w:r>
+      <w:r>
+        <w:rPr>
+          <w:rFonts w:ascii="Times New Roman" w:hAnsi="Times New Roman" w:cs="Times New Roman"/>
+        </w:rPr>
+        <w:t xml:space="preserve"> oltre </w:t>
+      </w:r>
+      <w:r>
+        <w:rPr>
+          <w:rFonts w:ascii="Times New Roman" w:hAnsi="Times New Roman" w:cs="Times New Roman"/>
+          <w:b/>
+          <w:bCs/>
+        </w:rPr>
+        <w:t>167 milioni di righe</w:t>
+      </w:r>
+      <w:r>
+        <w:rPr>
+          <w:rFonts w:ascii="Times New Roman" w:hAnsi="Times New Roman" w:cs="Times New Roman"/>
+        </w:rPr>
+        <w:t>. Ogni record rappresenta il consumo di energia elettrica rilevato ogni 30 minuti (</w:t>
+      </w:r>
+      <w:proofErr w:type="spellStart"/>
+      <w:r>
+        <w:rPr>
+          <w:rFonts w:ascii="Times New Roman" w:hAnsi="Times New Roman" w:cs="Times New Roman"/>
+        </w:rPr>
+        <w:t>half-hourly</w:t>
+      </w:r>
+      <w:proofErr w:type="spellEnd"/>
+      <w:r>
+        <w:rPr>
+          <w:rFonts w:ascii="Times New Roman" w:hAnsi="Times New Roman" w:cs="Times New Roman"/>
+        </w:rPr>
+        <w:t>).</w:t>
       </w:r>
     </w:p>
     <w:p>
       <w:pPr>
         <w:numPr>
           <w:ilvl w:val="0"/>
-          <w:numId w:val="3"/>
+          <w:numId w:val="16"/>
         </w:numPr>
-        <w:spacing w:line="360" w:lineRule="auto"/>
-        <w:jc w:val="both"/>
-        <w:rPr>
-          <w:rFonts w:ascii="Times New Roman" w:hAnsi="Times New Roman" w:cs="Times New Roman"/>
-        </w:rPr>
-      </w:pPr>
-      <w:r>
-        <w:rPr>
-          <w:rFonts w:ascii="Times New Roman" w:hAnsi="Times New Roman" w:cs="Times New Roman"/>
-          <w:b/>
-          <w:bCs/>
-        </w:rPr>
-        <w:t xml:space="preserve">LCL </w:t>
-      </w:r>
-      <w:proofErr w:type="spellStart"/>
-      <w:r>
-        <w:rPr>
-          <w:rFonts w:ascii="Times New Roman" w:hAnsi="Times New Roman" w:cs="Times New Roman"/>
-          <w:b/>
-          <w:bCs/>
-        </w:rPr>
-        <w:t>SmartMeter</w:t>
-      </w:r>
-      <w:proofErr w:type="spellEnd"/>
-      <w:r>
-        <w:rPr>
-          <w:rFonts w:ascii="Times New Roman" w:hAnsi="Times New Roman" w:cs="Times New Roman"/>
-          <w:b/>
-          <w:bCs/>
-        </w:rPr>
-        <w:t xml:space="preserve"> Dataset:</w:t>
-      </w:r>
-      <w:r>
-        <w:rPr>
-          <w:rFonts w:ascii="Times New Roman" w:hAnsi="Times New Roman" w:cs="Times New Roman"/>
-        </w:rPr>
-        <w:t xml:space="preserve"> Struttura dei dati di consumo (167M+ righe).</w:t>
+        <w:tabs>
+          <w:tab w:val="clear" w:pos="720"/>
+        </w:tabs>
+        <w:spacing w:after="0" w:line="360" w:lineRule="auto"/>
+        <w:ind w:left="284" w:hanging="284"/>
+        <w:jc w:val="both"/>
+        <w:rPr>
+          <w:rFonts w:ascii="Times New Roman" w:hAnsi="Times New Roman" w:cs="Times New Roman"/>
+        </w:rPr>
+      </w:pPr>
+      <w:r>
+        <w:rPr>
+          <w:rFonts w:ascii="Times New Roman" w:hAnsi="Times New Roman" w:cs="Times New Roman"/>
+          <w:b/>
+          <w:bCs/>
+        </w:rPr>
+        <w:t>ID Utente (</w:t>
+      </w:r>
+      <w:proofErr w:type="spellStart"/>
+      <w:r>
+        <w:rPr>
+          <w:rFonts w:ascii="Times New Roman" w:hAnsi="Times New Roman" w:cs="Times New Roman"/>
+          <w:b/>
+          <w:bCs/>
+        </w:rPr>
+        <w:t>LCLid</w:t>
+      </w:r>
+      <w:proofErr w:type="spellEnd"/>
+      <w:r>
+        <w:rPr>
+          <w:rFonts w:ascii="Times New Roman" w:hAnsi="Times New Roman" w:cs="Times New Roman"/>
+          <w:b/>
+          <w:bCs/>
+        </w:rPr>
+        <w:t>):</w:t>
+      </w:r>
+      <w:r>
+        <w:rPr>
+          <w:rFonts w:ascii="Times New Roman" w:hAnsi="Times New Roman" w:cs="Times New Roman"/>
+        </w:rPr>
+        <w:t xml:space="preserve"> </w:t>
+      </w:r>
+      <w:r>
+        <w:rPr>
+          <w:rFonts w:ascii="Times New Roman" w:hAnsi="Times New Roman" w:cs="Times New Roman"/>
+        </w:rPr>
+        <w:t>l</w:t>
+      </w:r>
+      <w:r>
+        <w:rPr>
+          <w:rFonts w:ascii="Times New Roman" w:hAnsi="Times New Roman" w:cs="Times New Roman"/>
+        </w:rPr>
+        <w:t>'identificativo univoco dell'abitazione.</w:t>
       </w:r>
     </w:p>
     <w:p>
       <w:pPr>
         <w:numPr>
           <w:ilvl w:val="0"/>
-          <w:numId w:val="3"/>
+          <w:numId w:val="16"/>
         </w:numPr>
-        <w:spacing w:line="360" w:lineRule="auto"/>
-        <w:jc w:val="both"/>
-        <w:rPr>
-          <w:rFonts w:ascii="Times New Roman" w:hAnsi="Times New Roman" w:cs="Times New Roman"/>
-        </w:rPr>
-      </w:pPr>
-      <w:r>
-        <w:rPr>
-          <w:rFonts w:ascii="Times New Roman" w:hAnsi="Times New Roman" w:cs="Times New Roman"/>
-          <w:b/>
-          <w:bCs/>
-        </w:rPr>
-        <w:t xml:space="preserve">Data </w:t>
-      </w:r>
-      <w:proofErr w:type="spellStart"/>
-      <w:r>
-        <w:rPr>
-          <w:rFonts w:ascii="Times New Roman" w:hAnsi="Times New Roman" w:cs="Times New Roman"/>
-          <w:b/>
-          <w:bCs/>
-        </w:rPr>
-        <w:t>Enrichment</w:t>
+        <w:tabs>
+          <w:tab w:val="clear" w:pos="720"/>
+        </w:tabs>
+        <w:spacing w:after="0" w:line="360" w:lineRule="auto"/>
+        <w:ind w:left="284" w:hanging="284"/>
+        <w:jc w:val="both"/>
+        <w:rPr>
+          <w:rFonts w:ascii="Times New Roman" w:hAnsi="Times New Roman" w:cs="Times New Roman"/>
+        </w:rPr>
+      </w:pPr>
+      <w:proofErr w:type="spellStart"/>
+      <w:r>
+        <w:rPr>
+          <w:rFonts w:ascii="Times New Roman" w:hAnsi="Times New Roman" w:cs="Times New Roman"/>
+          <w:b/>
+          <w:bCs/>
+        </w:rPr>
+        <w:t>Timestamp</w:t>
       </w:r>
       <w:proofErr w:type="spellEnd"/>
       <w:r>
@@ -3336,43 +3500,226 @@
         <w:rPr>
           <w:rFonts w:ascii="Times New Roman" w:hAnsi="Times New Roman" w:cs="Times New Roman"/>
         </w:rPr>
-        <w:t xml:space="preserve"> Descrizione dei metadati </w:t>
-      </w:r>
-      <w:proofErr w:type="gramStart"/>
-      <w:r>
-        <w:rPr>
-          <w:rFonts w:ascii="Times New Roman" w:hAnsi="Times New Roman" w:cs="Times New Roman"/>
-        </w:rPr>
-        <w:t>socio-economici</w:t>
-      </w:r>
-      <w:proofErr w:type="gramEnd"/>
-      <w:r>
-        <w:rPr>
-          <w:rFonts w:ascii="Times New Roman" w:hAnsi="Times New Roman" w:cs="Times New Roman"/>
-        </w:rPr>
-        <w:t xml:space="preserve"> (</w:t>
-      </w:r>
-      <w:r>
-        <w:rPr>
-          <w:rFonts w:ascii="Times New Roman" w:hAnsi="Times New Roman" w:cs="Times New Roman"/>
-          <w:b/>
-          <w:bCs/>
-        </w:rPr>
-        <w:t>Acorn Groups</w:t>
-      </w:r>
-      <w:r>
-        <w:rPr>
-          <w:rFonts w:ascii="Times New Roman" w:hAnsi="Times New Roman" w:cs="Times New Roman"/>
-        </w:rPr>
-        <w:t>) e dei dati meteorologici di supporto.</w:t>
+        <w:t xml:space="preserve"> </w:t>
+      </w:r>
+      <w:r>
+        <w:rPr>
+          <w:rFonts w:ascii="Times New Roman" w:hAnsi="Times New Roman" w:cs="Times New Roman"/>
+        </w:rPr>
+        <w:t>d</w:t>
+      </w:r>
+      <w:r>
+        <w:rPr>
+          <w:rFonts w:ascii="Times New Roman" w:hAnsi="Times New Roman" w:cs="Times New Roman"/>
+        </w:rPr>
+        <w:t>ata e ora della lettura.</w:t>
       </w:r>
     </w:p>
     <w:p>
       <w:pPr>
         <w:numPr>
           <w:ilvl w:val="0"/>
-          <w:numId w:val="3"/>
+          <w:numId w:val="16"/>
         </w:numPr>
+        <w:tabs>
+          <w:tab w:val="clear" w:pos="720"/>
+        </w:tabs>
+        <w:spacing w:after="0" w:line="360" w:lineRule="auto"/>
+        <w:ind w:left="284" w:hanging="284"/>
+        <w:jc w:val="both"/>
+        <w:rPr>
+          <w:rFonts w:ascii="Times New Roman" w:hAnsi="Times New Roman" w:cs="Times New Roman"/>
+        </w:rPr>
+      </w:pPr>
+      <w:r>
+        <w:rPr>
+          <w:rFonts w:ascii="Times New Roman" w:hAnsi="Times New Roman" w:cs="Times New Roman"/>
+          <w:b/>
+          <w:bCs/>
+        </w:rPr>
+        <w:t>KWh:</w:t>
+      </w:r>
+      <w:r>
+        <w:rPr>
+          <w:rFonts w:ascii="Times New Roman" w:hAnsi="Times New Roman" w:cs="Times New Roman"/>
+        </w:rPr>
+        <w:t xml:space="preserve"> </w:t>
+      </w:r>
+      <w:r>
+        <w:rPr>
+          <w:rFonts w:ascii="Times New Roman" w:hAnsi="Times New Roman" w:cs="Times New Roman"/>
+        </w:rPr>
+        <w:t>i</w:t>
+      </w:r>
+      <w:r>
+        <w:rPr>
+          <w:rFonts w:ascii="Times New Roman" w:hAnsi="Times New Roman" w:cs="Times New Roman"/>
+        </w:rPr>
+        <w:t>l consumo effettivo registrato nel periodo.</w:t>
+      </w:r>
+    </w:p>
+    <w:p>
+      <w:pPr>
+        <w:spacing w:after="0" w:line="360" w:lineRule="auto"/>
+        <w:jc w:val="both"/>
+        <w:rPr>
+          <w:rFonts w:ascii="Times New Roman" w:hAnsi="Times New Roman" w:cs="Times New Roman"/>
+        </w:rPr>
+      </w:pPr>
+    </w:p>
+    <w:p>
+      <w:pPr>
+        <w:spacing w:after="0" w:line="360" w:lineRule="auto"/>
+        <w:jc w:val="both"/>
+        <w:rPr>
+          <w:rFonts w:ascii="Times New Roman" w:hAnsi="Times New Roman" w:cs="Times New Roman"/>
+        </w:rPr>
+      </w:pPr>
+      <w:r>
+        <w:rPr>
+          <w:rFonts w:ascii="Times New Roman" w:hAnsi="Times New Roman" w:cs="Times New Roman"/>
+        </w:rPr>
+        <w:t xml:space="preserve">Il dataset </w:t>
+      </w:r>
+      <w:r>
+        <w:rPr>
+          <w:rFonts w:ascii="Times New Roman" w:hAnsi="Times New Roman" w:cs="Times New Roman"/>
+        </w:rPr>
+        <w:t>è suddiviso in 112</w:t>
+      </w:r>
+      <w:r>
+        <w:rPr>
+          <w:rFonts w:ascii="Times New Roman" w:hAnsi="Times New Roman" w:cs="Times New Roman"/>
+        </w:rPr>
+        <w:t xml:space="preserve"> file CSV denominati:</w:t>
+      </w:r>
+    </w:p>
+    <w:p>
+      <w:pPr>
+        <w:numPr>
+          <w:ilvl w:val="0"/>
+          <w:numId w:val="20"/>
+        </w:numPr>
+        <w:spacing w:after="0" w:line="360" w:lineRule="auto"/>
+        <w:jc w:val="both"/>
+        <w:rPr>
+          <w:rFonts w:ascii="Times New Roman" w:hAnsi="Times New Roman" w:cs="Times New Roman"/>
+        </w:rPr>
+      </w:pPr>
+      <w:r>
+        <w:rPr>
+          <w:rFonts w:ascii="Times New Roman" w:hAnsi="Times New Roman" w:cs="Times New Roman"/>
+        </w:rPr>
+        <w:t>block_0.csv</w:t>
+      </w:r>
+    </w:p>
+    <w:p>
+      <w:pPr>
+        <w:numPr>
+          <w:ilvl w:val="0"/>
+          <w:numId w:val="20"/>
+        </w:numPr>
+        <w:spacing w:after="0" w:line="360" w:lineRule="auto"/>
+        <w:jc w:val="both"/>
+        <w:rPr>
+          <w:rFonts w:ascii="Times New Roman" w:hAnsi="Times New Roman" w:cs="Times New Roman"/>
+        </w:rPr>
+      </w:pPr>
+      <w:r>
+        <w:rPr>
+          <w:rFonts w:ascii="Times New Roman" w:hAnsi="Times New Roman" w:cs="Times New Roman"/>
+        </w:rPr>
+        <w:t>block_1.csv</w:t>
+      </w:r>
+    </w:p>
+    <w:p>
+      <w:pPr>
+        <w:numPr>
+          <w:ilvl w:val="0"/>
+          <w:numId w:val="20"/>
+        </w:numPr>
+        <w:spacing w:after="0" w:line="360" w:lineRule="auto"/>
+        <w:jc w:val="both"/>
+        <w:rPr>
+          <w:rFonts w:ascii="Times New Roman" w:hAnsi="Times New Roman" w:cs="Times New Roman"/>
+        </w:rPr>
+      </w:pPr>
+      <w:r>
+        <w:rPr>
+          <w:rFonts w:ascii="Times New Roman" w:hAnsi="Times New Roman" w:cs="Times New Roman"/>
+        </w:rPr>
+        <w:t>block_2.csv</w:t>
+      </w:r>
+    </w:p>
+    <w:p>
+      <w:pPr>
+        <w:numPr>
+          <w:ilvl w:val="0"/>
+          <w:numId w:val="20"/>
+        </w:numPr>
+        <w:spacing w:after="0" w:line="360" w:lineRule="auto"/>
+        <w:jc w:val="both"/>
+        <w:rPr>
+          <w:rFonts w:ascii="Times New Roman" w:hAnsi="Times New Roman" w:cs="Times New Roman"/>
+        </w:rPr>
+      </w:pPr>
+      <w:r>
+        <w:rPr>
+          <w:rFonts w:ascii="Times New Roman" w:hAnsi="Times New Roman" w:cs="Times New Roman"/>
+        </w:rPr>
+        <w:t>...</w:t>
+      </w:r>
+    </w:p>
+    <w:p>
+      <w:pPr>
+        <w:spacing w:after="0" w:line="360" w:lineRule="auto"/>
+        <w:jc w:val="both"/>
+        <w:rPr>
+          <w:rFonts w:ascii="Times New Roman" w:hAnsi="Times New Roman" w:cs="Times New Roman"/>
+        </w:rPr>
+      </w:pPr>
+      <w:r>
+        <w:rPr>
+          <w:rFonts w:ascii="Times New Roman" w:hAnsi="Times New Roman" w:cs="Times New Roman"/>
+        </w:rPr>
+        <w:t xml:space="preserve">Ogni file </w:t>
+      </w:r>
+      <w:proofErr w:type="spellStart"/>
+      <w:r>
+        <w:rPr>
+          <w:rFonts w:ascii="Times New Roman" w:hAnsi="Times New Roman" w:cs="Times New Roman"/>
+          <w:i/>
+          <w:iCs/>
+        </w:rPr>
+        <w:t>block</w:t>
+      </w:r>
+      <w:proofErr w:type="spellEnd"/>
+      <w:r>
+        <w:rPr>
+          <w:rFonts w:ascii="Times New Roman" w:hAnsi="Times New Roman" w:cs="Times New Roman"/>
+        </w:rPr>
+        <w:t xml:space="preserve"> contiene una porzione del dataset complessivo.</w:t>
+      </w:r>
+    </w:p>
+    <w:p>
+      <w:pPr>
+        <w:spacing w:after="0" w:line="360" w:lineRule="auto"/>
+        <w:jc w:val="both"/>
+        <w:rPr>
+          <w:rFonts w:ascii="Times New Roman" w:hAnsi="Times New Roman" w:cs="Times New Roman"/>
+        </w:rPr>
+      </w:pPr>
+    </w:p>
+    <w:p>
+      <w:pPr>
+        <w:pStyle w:val="Titolo2"/>
+      </w:pPr>
+      <w:r>
+        <w:t>3.2 L'Arricchimento: Gruppi Acorn</w:t>
+      </w:r>
+    </w:p>
+    <w:p>
+      <w:pPr>
         <w:spacing w:line="360" w:lineRule="auto"/>
         <w:jc w:val="both"/>
         <w:rPr>
@@ -3382,20 +3729,615 @@
       <w:r>
         <w:rPr>
           <w:rFonts w:ascii="Times New Roman" w:hAnsi="Times New Roman" w:cs="Times New Roman"/>
-          <w:b/>
-          <w:bCs/>
-        </w:rPr>
+        </w:rPr>
+        <w:t xml:space="preserve">I dati di consumo, da soli, dicono solo </w:t>
+      </w:r>
+      <w:r>
+        <w:rPr>
+          <w:rFonts w:ascii="Times New Roman" w:hAnsi="Times New Roman" w:cs="Times New Roman"/>
+          <w:i/>
+          <w:iCs/>
+        </w:rPr>
+        <w:t>quanto</w:t>
+      </w:r>
+      <w:r>
+        <w:rPr>
+          <w:rFonts w:ascii="Times New Roman" w:hAnsi="Times New Roman" w:cs="Times New Roman"/>
+        </w:rPr>
+        <w:t xml:space="preserve"> viene consumato. Per capire il </w:t>
+      </w:r>
+      <w:r>
+        <w:rPr>
+          <w:rFonts w:ascii="Times New Roman" w:hAnsi="Times New Roman" w:cs="Times New Roman"/>
+          <w:i/>
+          <w:iCs/>
+        </w:rPr>
+        <w:t>perché</w:t>
+      </w:r>
+      <w:r>
+        <w:rPr>
+          <w:rFonts w:ascii="Times New Roman" w:hAnsi="Times New Roman" w:cs="Times New Roman"/>
+        </w:rPr>
+        <w:t xml:space="preserve">, </w:t>
+      </w:r>
+      <w:r>
+        <w:rPr>
+          <w:rFonts w:ascii="Times New Roman" w:hAnsi="Times New Roman" w:cs="Times New Roman"/>
+        </w:rPr>
+        <w:t>ho</w:t>
+      </w:r>
+      <w:r>
+        <w:rPr>
+          <w:rFonts w:ascii="Times New Roman" w:hAnsi="Times New Roman" w:cs="Times New Roman"/>
+        </w:rPr>
+        <w:t xml:space="preserve"> integrato i metadati </w:t>
+      </w:r>
+      <w:r>
+        <w:rPr>
+          <w:rFonts w:ascii="Times New Roman" w:hAnsi="Times New Roman" w:cs="Times New Roman"/>
+          <w:b/>
+          <w:bCs/>
+        </w:rPr>
+        <w:t>Acorn</w:t>
+      </w:r>
+      <w:r>
+        <w:rPr>
+          <w:rFonts w:ascii="Times New Roman" w:hAnsi="Times New Roman" w:cs="Times New Roman"/>
+        </w:rPr>
+        <w:t xml:space="preserve">. Si tratta di una classificazione </w:t>
+      </w:r>
+      <w:proofErr w:type="gramStart"/>
+      <w:r>
+        <w:rPr>
+          <w:rFonts w:ascii="Times New Roman" w:hAnsi="Times New Roman" w:cs="Times New Roman"/>
+        </w:rPr>
+        <w:t>socio-demografica</w:t>
+      </w:r>
+      <w:proofErr w:type="gramEnd"/>
+      <w:r>
+        <w:rPr>
+          <w:rFonts w:ascii="Times New Roman" w:hAnsi="Times New Roman" w:cs="Times New Roman"/>
+        </w:rPr>
+        <w:t xml:space="preserve"> (sviluppata da CACI) che suddivide la popolazione in categorie basate sullo stile di vita e sul benessere economico.</w:t>
+      </w:r>
+    </w:p>
+    <w:p>
+      <w:pPr>
+        <w:spacing w:after="0" w:line="360" w:lineRule="auto"/>
+        <w:jc w:val="both"/>
+        <w:rPr>
+          <w:rFonts w:ascii="Times New Roman" w:hAnsi="Times New Roman" w:cs="Times New Roman"/>
+        </w:rPr>
+      </w:pPr>
+      <w:r>
+        <w:rPr>
+          <w:rFonts w:ascii="Times New Roman" w:hAnsi="Times New Roman" w:cs="Times New Roman"/>
+        </w:rPr>
+        <w:t>Nel progetto, queste informazioni ci permettono di segmentare l'analisi:</w:t>
+      </w:r>
+    </w:p>
+    <w:p>
+      <w:pPr>
+        <w:numPr>
+          <w:ilvl w:val="0"/>
+          <w:numId w:val="17"/>
+        </w:numPr>
+        <w:tabs>
+          <w:tab w:val="clear" w:pos="720"/>
+        </w:tabs>
+        <w:spacing w:after="0" w:line="360" w:lineRule="auto"/>
+        <w:ind w:left="284" w:hanging="284"/>
+        <w:jc w:val="both"/>
+        <w:rPr>
+          <w:rFonts w:ascii="Times New Roman" w:hAnsi="Times New Roman" w:cs="Times New Roman"/>
+        </w:rPr>
+      </w:pPr>
+      <w:proofErr w:type="spellStart"/>
+      <w:r>
+        <w:rPr>
+          <w:rFonts w:ascii="Times New Roman" w:hAnsi="Times New Roman" w:cs="Times New Roman"/>
+          <w:b/>
+          <w:bCs/>
+        </w:rPr>
+        <w:t>Affluent</w:t>
+      </w:r>
+      <w:proofErr w:type="spellEnd"/>
+      <w:r>
+        <w:rPr>
+          <w:rFonts w:ascii="Times New Roman" w:hAnsi="Times New Roman" w:cs="Times New Roman"/>
+          <w:b/>
+          <w:bCs/>
+        </w:rPr>
+        <w:t>:</w:t>
+      </w:r>
+      <w:r>
+        <w:rPr>
+          <w:rFonts w:ascii="Times New Roman" w:hAnsi="Times New Roman" w:cs="Times New Roman"/>
+        </w:rPr>
+        <w:t xml:space="preserve"> </w:t>
+      </w:r>
+      <w:r>
+        <w:rPr>
+          <w:rFonts w:ascii="Times New Roman" w:hAnsi="Times New Roman" w:cs="Times New Roman"/>
+        </w:rPr>
+        <w:t>u</w:t>
+      </w:r>
+      <w:r>
+        <w:rPr>
+          <w:rFonts w:ascii="Times New Roman" w:hAnsi="Times New Roman" w:cs="Times New Roman"/>
+        </w:rPr>
+        <w:t>tenti con alta disponibilità economica</w:t>
+      </w:r>
+      <w:r>
+        <w:rPr>
+          <w:rFonts w:ascii="Times New Roman" w:hAnsi="Times New Roman" w:cs="Times New Roman"/>
+        </w:rPr>
+        <w:t>;</w:t>
+      </w:r>
+    </w:p>
+    <w:p>
+      <w:pPr>
+        <w:numPr>
+          <w:ilvl w:val="0"/>
+          <w:numId w:val="17"/>
+        </w:numPr>
+        <w:tabs>
+          <w:tab w:val="clear" w:pos="720"/>
+        </w:tabs>
+        <w:spacing w:after="0" w:line="360" w:lineRule="auto"/>
+        <w:ind w:left="284" w:hanging="284"/>
+        <w:jc w:val="both"/>
+        <w:rPr>
+          <w:rFonts w:ascii="Times New Roman" w:hAnsi="Times New Roman" w:cs="Times New Roman"/>
+        </w:rPr>
+      </w:pPr>
+      <w:proofErr w:type="spellStart"/>
+      <w:r>
+        <w:rPr>
+          <w:rFonts w:ascii="Times New Roman" w:hAnsi="Times New Roman" w:cs="Times New Roman"/>
+          <w:b/>
+          <w:bCs/>
+        </w:rPr>
+        <w:t>Comfortable</w:t>
+      </w:r>
+      <w:proofErr w:type="spellEnd"/>
+      <w:r>
+        <w:rPr>
+          <w:rFonts w:ascii="Times New Roman" w:hAnsi="Times New Roman" w:cs="Times New Roman"/>
+          <w:b/>
+          <w:bCs/>
+        </w:rPr>
+        <w:t>:</w:t>
+      </w:r>
+      <w:r>
+        <w:rPr>
+          <w:rFonts w:ascii="Times New Roman" w:hAnsi="Times New Roman" w:cs="Times New Roman"/>
+        </w:rPr>
+        <w:t xml:space="preserve"> </w:t>
+      </w:r>
+      <w:r>
+        <w:rPr>
+          <w:rFonts w:ascii="Times New Roman" w:hAnsi="Times New Roman" w:cs="Times New Roman"/>
+        </w:rPr>
+        <w:t>l</w:t>
+      </w:r>
+      <w:r>
+        <w:rPr>
+          <w:rFonts w:ascii="Times New Roman" w:hAnsi="Times New Roman" w:cs="Times New Roman"/>
+        </w:rPr>
+        <w:t>a classe media</w:t>
+      </w:r>
+      <w:r>
+        <w:rPr>
+          <w:rFonts w:ascii="Times New Roman" w:hAnsi="Times New Roman" w:cs="Times New Roman"/>
+        </w:rPr>
+        <w:t>;</w:t>
+      </w:r>
+    </w:p>
+    <w:p>
+      <w:pPr>
+        <w:numPr>
+          <w:ilvl w:val="0"/>
+          <w:numId w:val="17"/>
+        </w:numPr>
+        <w:tabs>
+          <w:tab w:val="clear" w:pos="720"/>
+        </w:tabs>
+        <w:spacing w:after="0" w:line="360" w:lineRule="auto"/>
+        <w:ind w:left="284" w:hanging="284"/>
+        <w:jc w:val="both"/>
+        <w:rPr>
+          <w:rFonts w:ascii="Times New Roman" w:hAnsi="Times New Roman" w:cs="Times New Roman"/>
+        </w:rPr>
+      </w:pPr>
+      <w:proofErr w:type="spellStart"/>
+      <w:r>
+        <w:rPr>
+          <w:rFonts w:ascii="Times New Roman" w:hAnsi="Times New Roman" w:cs="Times New Roman"/>
+          <w:b/>
+          <w:bCs/>
+        </w:rPr>
+        <w:t>Adversity</w:t>
+      </w:r>
+      <w:proofErr w:type="spellEnd"/>
+      <w:r>
+        <w:rPr>
+          <w:rFonts w:ascii="Times New Roman" w:hAnsi="Times New Roman" w:cs="Times New Roman"/>
+          <w:b/>
+          <w:bCs/>
+        </w:rPr>
+        <w:t>:</w:t>
+      </w:r>
+      <w:r>
+        <w:rPr>
+          <w:rFonts w:ascii="Times New Roman" w:hAnsi="Times New Roman" w:cs="Times New Roman"/>
+        </w:rPr>
+        <w:t xml:space="preserve"> </w:t>
+      </w:r>
+      <w:r>
+        <w:rPr>
+          <w:rFonts w:ascii="Times New Roman" w:hAnsi="Times New Roman" w:cs="Times New Roman"/>
+        </w:rPr>
+        <w:t>f</w:t>
+      </w:r>
+      <w:r>
+        <w:rPr>
+          <w:rFonts w:ascii="Times New Roman" w:hAnsi="Times New Roman" w:cs="Times New Roman"/>
+        </w:rPr>
+        <w:t>asce di popolazione più vulnerabili.</w:t>
+      </w:r>
+    </w:p>
+    <w:p>
+      <w:pPr>
+        <w:spacing w:line="360" w:lineRule="auto"/>
+        <w:jc w:val="both"/>
+        <w:rPr>
+          <w:rFonts w:ascii="Times New Roman" w:hAnsi="Times New Roman" w:cs="Times New Roman"/>
+        </w:rPr>
+      </w:pPr>
+      <w:r>
+        <w:rPr>
+          <w:rFonts w:ascii="Times New Roman" w:hAnsi="Times New Roman" w:cs="Times New Roman"/>
+        </w:rPr>
+        <w:t>Questa dimensione è fondamentale per l'</w:t>
+      </w:r>
+      <w:proofErr w:type="spellStart"/>
+      <w:r>
+        <w:rPr>
+          <w:rFonts w:ascii="Times New Roman" w:hAnsi="Times New Roman" w:cs="Times New Roman"/>
+        </w:rPr>
+        <w:t>Anomaly</w:t>
+      </w:r>
+      <w:proofErr w:type="spellEnd"/>
+      <w:r>
+        <w:rPr>
+          <w:rFonts w:ascii="Times New Roman" w:hAnsi="Times New Roman" w:cs="Times New Roman"/>
+        </w:rPr>
+        <w:t xml:space="preserve"> </w:t>
+      </w:r>
+      <w:proofErr w:type="spellStart"/>
+      <w:r>
+        <w:rPr>
+          <w:rFonts w:ascii="Times New Roman" w:hAnsi="Times New Roman" w:cs="Times New Roman"/>
+        </w:rPr>
+        <w:t>Detection</w:t>
+      </w:r>
+      <w:proofErr w:type="spellEnd"/>
+      <w:r>
+        <w:rPr>
+          <w:rFonts w:ascii="Times New Roman" w:hAnsi="Times New Roman" w:cs="Times New Roman"/>
+        </w:rPr>
+        <w:t>: un picco di consumo in una zona "</w:t>
+      </w:r>
+      <w:proofErr w:type="spellStart"/>
+      <w:r>
+        <w:rPr>
+          <w:rFonts w:ascii="Times New Roman" w:hAnsi="Times New Roman" w:cs="Times New Roman"/>
+        </w:rPr>
+        <w:t>Affluent</w:t>
+      </w:r>
+      <w:proofErr w:type="spellEnd"/>
+      <w:r>
+        <w:rPr>
+          <w:rFonts w:ascii="Times New Roman" w:hAnsi="Times New Roman" w:cs="Times New Roman"/>
+        </w:rPr>
+        <w:t>" potrebbe avere cause molto diverse rispetto a uno in una zona "</w:t>
+      </w:r>
+      <w:proofErr w:type="spellStart"/>
+      <w:r>
+        <w:rPr>
+          <w:rFonts w:ascii="Times New Roman" w:hAnsi="Times New Roman" w:cs="Times New Roman"/>
+        </w:rPr>
+        <w:t>Adversity</w:t>
+      </w:r>
+      <w:proofErr w:type="spellEnd"/>
+      <w:r>
+        <w:rPr>
+          <w:rFonts w:ascii="Times New Roman" w:hAnsi="Times New Roman" w:cs="Times New Roman"/>
+        </w:rPr>
+        <w:t>".</w:t>
+      </w:r>
+    </w:p>
+    <w:p>
+      <w:pPr>
+        <w:pStyle w:val="Titolo2"/>
+      </w:pPr>
+      <w:r>
         <w:lastRenderedPageBreak/>
-        <w:t xml:space="preserve">Data </w:t>
-      </w:r>
-      <w:proofErr w:type="spellStart"/>
-      <w:r>
-        <w:rPr>
-          <w:rFonts w:ascii="Times New Roman" w:hAnsi="Times New Roman" w:cs="Times New Roman"/>
-          <w:b/>
-          <w:bCs/>
-        </w:rPr>
-        <w:t>Cleaning</w:t>
+        <w:t xml:space="preserve">3.3 Il Contesto Ambientale: </w:t>
+      </w:r>
+      <w:proofErr w:type="spellStart"/>
+      <w:r>
+        <w:t>Weather</w:t>
+      </w:r>
+      <w:proofErr w:type="spellEnd"/>
+      <w:r>
+        <w:t xml:space="preserve"> Data</w:t>
+      </w:r>
+    </w:p>
+    <w:p>
+      <w:pPr>
+        <w:spacing w:after="0" w:line="360" w:lineRule="auto"/>
+        <w:jc w:val="both"/>
+        <w:rPr>
+          <w:rFonts w:ascii="Times New Roman" w:hAnsi="Times New Roman" w:cs="Times New Roman"/>
+        </w:rPr>
+      </w:pPr>
+      <w:r>
+        <w:rPr>
+          <w:rFonts w:ascii="Times New Roman" w:hAnsi="Times New Roman" w:cs="Times New Roman"/>
+        </w:rPr>
+        <w:t xml:space="preserve">Il terzo pilastro dei dati è costituito dalle </w:t>
+      </w:r>
+      <w:r>
+        <w:rPr>
+          <w:rFonts w:ascii="Times New Roman" w:hAnsi="Times New Roman" w:cs="Times New Roman"/>
+          <w:b/>
+          <w:bCs/>
+        </w:rPr>
+        <w:t>informazioni meteorologiche storiche di Londra</w:t>
+      </w:r>
+      <w:r>
+        <w:rPr>
+          <w:rFonts w:ascii="Times New Roman" w:hAnsi="Times New Roman" w:cs="Times New Roman"/>
+        </w:rPr>
+        <w:t xml:space="preserve"> (temperatura, umidità, velocità del vento). È risaputo che il consumo energetico è fortemente correlato alla temperatura esterna:</w:t>
+      </w:r>
+    </w:p>
+    <w:p>
+      <w:pPr>
+        <w:numPr>
+          <w:ilvl w:val="0"/>
+          <w:numId w:val="18"/>
+        </w:numPr>
+        <w:tabs>
+          <w:tab w:val="clear" w:pos="720"/>
+        </w:tabs>
+        <w:spacing w:after="0" w:line="360" w:lineRule="auto"/>
+        <w:ind w:left="284" w:hanging="284"/>
+        <w:jc w:val="both"/>
+        <w:rPr>
+          <w:rFonts w:ascii="Times New Roman" w:hAnsi="Times New Roman" w:cs="Times New Roman"/>
+        </w:rPr>
+      </w:pPr>
+      <w:r>
+        <w:rPr>
+          <w:rFonts w:ascii="Times New Roman" w:hAnsi="Times New Roman" w:cs="Times New Roman"/>
+        </w:rPr>
+        <w:t>i</w:t>
+      </w:r>
+      <w:r>
+        <w:rPr>
+          <w:rFonts w:ascii="Times New Roman" w:hAnsi="Times New Roman" w:cs="Times New Roman"/>
+        </w:rPr>
+        <w:t>n inverno, il calo della temperatura spinge l'uso del riscaldamento elettrico.</w:t>
+      </w:r>
+    </w:p>
+    <w:p>
+      <w:pPr>
+        <w:numPr>
+          <w:ilvl w:val="0"/>
+          <w:numId w:val="18"/>
+        </w:numPr>
+        <w:tabs>
+          <w:tab w:val="clear" w:pos="720"/>
+        </w:tabs>
+        <w:spacing w:after="0" w:line="360" w:lineRule="auto"/>
+        <w:ind w:left="284" w:hanging="284"/>
+        <w:jc w:val="both"/>
+        <w:rPr>
+          <w:rFonts w:ascii="Times New Roman" w:hAnsi="Times New Roman" w:cs="Times New Roman"/>
+        </w:rPr>
+      </w:pPr>
+      <w:r>
+        <w:rPr>
+          <w:rFonts w:ascii="Times New Roman" w:hAnsi="Times New Roman" w:cs="Times New Roman"/>
+        </w:rPr>
+        <w:t>i</w:t>
+      </w:r>
+      <w:r>
+        <w:rPr>
+          <w:rFonts w:ascii="Times New Roman" w:hAnsi="Times New Roman" w:cs="Times New Roman"/>
+        </w:rPr>
+        <w:t>n estate, ondate di calore possono causare picchi dovuti ai sistemi di climatizzazione.</w:t>
+      </w:r>
+    </w:p>
+    <w:p>
+      <w:pPr>
+        <w:spacing w:line="360" w:lineRule="auto"/>
+        <w:jc w:val="both"/>
+        <w:rPr>
+          <w:rFonts w:ascii="Times New Roman" w:hAnsi="Times New Roman" w:cs="Times New Roman"/>
+        </w:rPr>
+      </w:pPr>
+      <w:r>
+        <w:rPr>
+          <w:rFonts w:ascii="Times New Roman" w:hAnsi="Times New Roman" w:cs="Times New Roman"/>
+        </w:rPr>
+        <w:t>Integrando questi dati nello streaming, Spark può "giustificare" un aumento improvviso dei consumi, evitando di segnalare falsi positivi come anomalie quando in realtà si tratta solo di una giornata particolarmente fredda.</w:t>
+      </w:r>
+    </w:p>
+    <w:p>
+      <w:pPr>
+        <w:spacing w:line="360" w:lineRule="auto"/>
+        <w:jc w:val="both"/>
+        <w:rPr>
+          <w:rFonts w:ascii="Times New Roman" w:hAnsi="Times New Roman" w:cs="Times New Roman"/>
+        </w:rPr>
+      </w:pPr>
+    </w:p>
+    <w:p>
+      <w:pPr>
+        <w:pStyle w:val="Titolo2"/>
+      </w:pPr>
+      <w:r>
+        <w:t xml:space="preserve">3.4 </w:t>
+      </w:r>
+      <w:proofErr w:type="spellStart"/>
+      <w:r>
+        <w:t>Pre</w:t>
+      </w:r>
+      <w:proofErr w:type="spellEnd"/>
+      <w:r>
+        <w:t>-processing</w:t>
+      </w:r>
+    </w:p>
+    <w:p>
+      <w:pPr>
+        <w:spacing w:line="360" w:lineRule="auto"/>
+        <w:jc w:val="both"/>
+        <w:rPr>
+          <w:rFonts w:ascii="Times New Roman" w:hAnsi="Times New Roman" w:cs="Times New Roman"/>
+        </w:rPr>
+      </w:pPr>
+      <w:r>
+        <w:rPr>
+          <w:rFonts w:ascii="Times New Roman" w:hAnsi="Times New Roman" w:cs="Times New Roman"/>
+        </w:rPr>
+        <w:t xml:space="preserve">Dato il volume massivo del dataset (oltre 10GB di file CSV), la fase di </w:t>
+      </w:r>
+      <w:proofErr w:type="spellStart"/>
+      <w:r>
+        <w:rPr>
+          <w:rFonts w:ascii="Times New Roman" w:hAnsi="Times New Roman" w:cs="Times New Roman"/>
+        </w:rPr>
+        <w:t>preprocessing</w:t>
+      </w:r>
+      <w:proofErr w:type="spellEnd"/>
+      <w:r>
+        <w:rPr>
+          <w:rFonts w:ascii="Times New Roman" w:hAnsi="Times New Roman" w:cs="Times New Roman"/>
+        </w:rPr>
+        <w:t xml:space="preserve"> è stata progettata per essere eseguita in modo distribuito e "pigro" (</w:t>
+      </w:r>
+      <w:proofErr w:type="spellStart"/>
+      <w:r>
+        <w:rPr>
+          <w:rFonts w:ascii="Times New Roman" w:hAnsi="Times New Roman" w:cs="Times New Roman"/>
+          <w:i/>
+          <w:iCs/>
+        </w:rPr>
+        <w:t>lazy</w:t>
+      </w:r>
+      <w:proofErr w:type="spellEnd"/>
+      <w:r>
+        <w:rPr>
+          <w:rFonts w:ascii="Times New Roman" w:hAnsi="Times New Roman" w:cs="Times New Roman"/>
+        </w:rPr>
+        <w:t>), minimizzando l'occupazione di RAM e ottimizzando i tempi di calcolo.</w:t>
+      </w:r>
+    </w:p>
+    <w:p>
+      <w:pPr>
+        <w:spacing w:after="0" w:line="360" w:lineRule="auto"/>
+        <w:jc w:val="both"/>
+        <w:rPr>
+          <w:rFonts w:ascii="Times New Roman" w:hAnsi="Times New Roman" w:cs="Times New Roman"/>
+        </w:rPr>
+      </w:pPr>
+      <w:r>
+        <w:rPr>
+          <w:rFonts w:ascii="Times New Roman" w:hAnsi="Times New Roman" w:cs="Times New Roman"/>
+        </w:rPr>
+        <w:t xml:space="preserve">Per gestire l'enorme mole di dati della tabella </w:t>
+      </w:r>
+      <w:proofErr w:type="spellStart"/>
+      <w:r>
+        <w:rPr>
+          <w:rFonts w:ascii="Courier New" w:hAnsi="Courier New" w:cs="Courier New"/>
+        </w:rPr>
+        <w:t>halfhourly_dataset</w:t>
+      </w:r>
+      <w:proofErr w:type="spellEnd"/>
+      <w:r>
+        <w:rPr>
+          <w:rFonts w:ascii="Times New Roman" w:hAnsi="Times New Roman" w:cs="Times New Roman"/>
+        </w:rPr>
+        <w:t xml:space="preserve">, </w:t>
+      </w:r>
+      <w:r>
+        <w:rPr>
+          <w:rFonts w:ascii="Times New Roman" w:hAnsi="Times New Roman" w:cs="Times New Roman"/>
+        </w:rPr>
+        <w:t>ho</w:t>
+      </w:r>
+      <w:r>
+        <w:rPr>
+          <w:rFonts w:ascii="Times New Roman" w:hAnsi="Times New Roman" w:cs="Times New Roman"/>
+        </w:rPr>
+        <w:t xml:space="preserve"> adottato due strategie fondamentali:</w:t>
+      </w:r>
+    </w:p>
+    <w:p>
+      <w:pPr>
+        <w:numPr>
+          <w:ilvl w:val="0"/>
+          <w:numId w:val="21"/>
+        </w:numPr>
+        <w:tabs>
+          <w:tab w:val="clear" w:pos="720"/>
+        </w:tabs>
+        <w:spacing w:after="0" w:line="360" w:lineRule="auto"/>
+        <w:ind w:left="284" w:hanging="284"/>
+        <w:jc w:val="both"/>
+        <w:rPr>
+          <w:rFonts w:ascii="Times New Roman" w:hAnsi="Times New Roman" w:cs="Times New Roman"/>
+        </w:rPr>
+      </w:pPr>
+      <w:r>
+        <w:rPr>
+          <w:rFonts w:ascii="Times New Roman" w:hAnsi="Times New Roman" w:cs="Times New Roman"/>
+          <w:b/>
+          <w:bCs/>
+        </w:rPr>
+        <w:t>File-</w:t>
+      </w:r>
+      <w:proofErr w:type="spellStart"/>
+      <w:r>
+        <w:rPr>
+          <w:rFonts w:ascii="Times New Roman" w:hAnsi="Times New Roman" w:cs="Times New Roman"/>
+          <w:b/>
+          <w:bCs/>
+        </w:rPr>
+        <w:t>based</w:t>
+      </w:r>
+      <w:proofErr w:type="spellEnd"/>
+      <w:r>
+        <w:rPr>
+          <w:rFonts w:ascii="Times New Roman" w:hAnsi="Times New Roman" w:cs="Times New Roman"/>
+          <w:b/>
+          <w:bCs/>
+        </w:rPr>
+        <w:t xml:space="preserve"> </w:t>
+      </w:r>
+      <w:proofErr w:type="spellStart"/>
+      <w:r>
+        <w:rPr>
+          <w:rFonts w:ascii="Times New Roman" w:hAnsi="Times New Roman" w:cs="Times New Roman"/>
+          <w:b/>
+          <w:bCs/>
+        </w:rPr>
+        <w:t>Partitioning</w:t>
       </w:r>
       <w:proofErr w:type="spellEnd"/>
       <w:r>
@@ -3410,14 +4352,1131 @@
         <w:rPr>
           <w:rFonts w:ascii="Times New Roman" w:hAnsi="Times New Roman" w:cs="Times New Roman"/>
         </w:rPr>
-        <w:t xml:space="preserve"> Strategie per la gestione dei valori mancanti o dei duplicati nello streaming.</w:t>
-      </w:r>
+        <w:t xml:space="preserve"> </w:t>
+      </w:r>
+      <w:r>
+        <w:rPr>
+          <w:rFonts w:ascii="Times New Roman" w:hAnsi="Times New Roman" w:cs="Times New Roman"/>
+        </w:rPr>
+        <w:t>i</w:t>
+      </w:r>
+      <w:r>
+        <w:rPr>
+          <w:rFonts w:ascii="Times New Roman" w:hAnsi="Times New Roman" w:cs="Times New Roman"/>
+        </w:rPr>
+        <w:t xml:space="preserve">nvece di caricare l'intero dataset, il sistema lavora per "blocchi" (i file </w:t>
+      </w:r>
+      <w:r>
+        <w:rPr>
+          <w:rFonts w:ascii="Courier New" w:hAnsi="Courier New" w:cs="Courier New"/>
+        </w:rPr>
+        <w:t>block_N.csv</w:t>
+      </w:r>
+      <w:r>
+        <w:rPr>
+          <w:rFonts w:ascii="Times New Roman" w:hAnsi="Times New Roman" w:cs="Times New Roman"/>
+        </w:rPr>
+        <w:t xml:space="preserve"> forniti da </w:t>
+      </w:r>
+      <w:proofErr w:type="spellStart"/>
+      <w:r>
+        <w:rPr>
+          <w:rFonts w:ascii="Times New Roman" w:hAnsi="Times New Roman" w:cs="Times New Roman"/>
+        </w:rPr>
+        <w:t>Kaggle</w:t>
+      </w:r>
+      <w:proofErr w:type="spellEnd"/>
+      <w:r>
+        <w:rPr>
+          <w:rFonts w:ascii="Times New Roman" w:hAnsi="Times New Roman" w:cs="Times New Roman"/>
+        </w:rPr>
+        <w:t>). Questo permette di testare la pipeline su un sottoinsieme e scalarla gradualmente senza modificare il codice.</w:t>
+      </w:r>
+    </w:p>
+    <w:p>
+      <w:pPr>
+        <w:numPr>
+          <w:ilvl w:val="0"/>
+          <w:numId w:val="21"/>
+        </w:numPr>
+        <w:tabs>
+          <w:tab w:val="clear" w:pos="720"/>
+        </w:tabs>
+        <w:spacing w:after="0" w:line="360" w:lineRule="auto"/>
+        <w:ind w:left="284" w:hanging="284"/>
+        <w:jc w:val="both"/>
+        <w:rPr>
+          <w:rFonts w:ascii="Times New Roman" w:hAnsi="Times New Roman" w:cs="Times New Roman"/>
+        </w:rPr>
+      </w:pPr>
+      <w:proofErr w:type="spellStart"/>
+      <w:r>
+        <w:rPr>
+          <w:rFonts w:ascii="Times New Roman" w:hAnsi="Times New Roman" w:cs="Times New Roman"/>
+          <w:b/>
+          <w:bCs/>
+        </w:rPr>
+        <w:t>Column</w:t>
+      </w:r>
+      <w:proofErr w:type="spellEnd"/>
+      <w:r>
+        <w:rPr>
+          <w:rFonts w:ascii="Times New Roman" w:hAnsi="Times New Roman" w:cs="Times New Roman"/>
+          <w:b/>
+          <w:bCs/>
+        </w:rPr>
+        <w:t xml:space="preserve"> </w:t>
+      </w:r>
+      <w:proofErr w:type="spellStart"/>
+      <w:r>
+        <w:rPr>
+          <w:rFonts w:ascii="Times New Roman" w:hAnsi="Times New Roman" w:cs="Times New Roman"/>
+          <w:b/>
+          <w:bCs/>
+        </w:rPr>
+        <w:t>Pruning</w:t>
+      </w:r>
+      <w:proofErr w:type="spellEnd"/>
+      <w:r>
+        <w:rPr>
+          <w:rFonts w:ascii="Times New Roman" w:hAnsi="Times New Roman" w:cs="Times New Roman"/>
+          <w:b/>
+          <w:bCs/>
+        </w:rPr>
+        <w:t xml:space="preserve"> (Potatura):</w:t>
+      </w:r>
+      <w:r>
+        <w:rPr>
+          <w:rFonts w:ascii="Times New Roman" w:hAnsi="Times New Roman" w:cs="Times New Roman"/>
+        </w:rPr>
+        <w:t xml:space="preserve"> </w:t>
+      </w:r>
+      <w:r>
+        <w:rPr>
+          <w:rFonts w:ascii="Times New Roman" w:hAnsi="Times New Roman" w:cs="Times New Roman"/>
+        </w:rPr>
+        <w:t>m</w:t>
+      </w:r>
+      <w:r>
+        <w:rPr>
+          <w:rFonts w:ascii="Times New Roman" w:hAnsi="Times New Roman" w:cs="Times New Roman"/>
+        </w:rPr>
+        <w:t>olti file contengono metadati ridondanti. La prima operazione è</w:t>
+      </w:r>
+      <w:r>
+        <w:rPr>
+          <w:rFonts w:ascii="Times New Roman" w:hAnsi="Times New Roman" w:cs="Times New Roman"/>
+        </w:rPr>
+        <w:t xml:space="preserve"> stata</w:t>
+      </w:r>
+      <w:r>
+        <w:rPr>
+          <w:rFonts w:ascii="Times New Roman" w:hAnsi="Times New Roman" w:cs="Times New Roman"/>
+        </w:rPr>
+        <w:t xml:space="preserve"> la selezione immediata delle sole colonne indispensabili (</w:t>
+      </w:r>
+      <w:r>
+        <w:rPr>
+          <w:rFonts w:ascii="Times New Roman" w:hAnsi="Times New Roman" w:cs="Times New Roman"/>
+        </w:rPr>
+        <w:t xml:space="preserve">come </w:t>
+      </w:r>
+      <w:proofErr w:type="spellStart"/>
+      <w:r>
+        <w:rPr>
+          <w:rFonts w:ascii="Courier New" w:hAnsi="Courier New" w:cs="Courier New"/>
+        </w:rPr>
+        <w:t>LCLid</w:t>
+      </w:r>
+      <w:proofErr w:type="spellEnd"/>
+      <w:r>
+        <w:rPr>
+          <w:rFonts w:ascii="Times New Roman" w:hAnsi="Times New Roman" w:cs="Times New Roman"/>
+        </w:rPr>
+        <w:t xml:space="preserve">, </w:t>
+      </w:r>
+      <w:proofErr w:type="spellStart"/>
+      <w:r>
+        <w:rPr>
+          <w:rFonts w:ascii="Courier New" w:hAnsi="Courier New" w:cs="Courier New"/>
+        </w:rPr>
+        <w:t>tstp</w:t>
+      </w:r>
+      <w:proofErr w:type="spellEnd"/>
+      <w:r>
+        <w:rPr>
+          <w:rFonts w:ascii="Times New Roman" w:hAnsi="Times New Roman" w:cs="Times New Roman"/>
+        </w:rPr>
+        <w:t xml:space="preserve">, </w:t>
+      </w:r>
+      <w:r>
+        <w:rPr>
+          <w:rFonts w:ascii="Courier New" w:hAnsi="Courier New" w:cs="Courier New"/>
+        </w:rPr>
+        <w:t>KWH/</w:t>
+      </w:r>
+      <w:proofErr w:type="spellStart"/>
+      <w:r>
+        <w:rPr>
+          <w:rFonts w:ascii="Courier New" w:hAnsi="Courier New" w:cs="Courier New"/>
+        </w:rPr>
+        <w:t>hh</w:t>
+      </w:r>
+      <w:proofErr w:type="spellEnd"/>
+      <w:r>
+        <w:rPr>
+          <w:rFonts w:ascii="Times New Roman" w:hAnsi="Times New Roman" w:cs="Times New Roman"/>
+        </w:rPr>
+        <w:t>). Ridurre il numero di colonne all'inizio della pipeline riduce drasticamente il volume di dati che viaggia tra i nodi del cluster.</w:t>
+      </w:r>
+    </w:p>
+    <w:p>
+      <w:pPr>
+        <w:spacing w:after="0" w:line="360" w:lineRule="auto"/>
+        <w:jc w:val="both"/>
+        <w:rPr>
+          <w:rFonts w:ascii="Times New Roman" w:hAnsi="Times New Roman" w:cs="Times New Roman"/>
+        </w:rPr>
+      </w:pPr>
+    </w:p>
+    <w:p>
+      <w:pPr>
+        <w:spacing w:after="0" w:line="360" w:lineRule="auto"/>
+        <w:jc w:val="both"/>
+        <w:rPr>
+          <w:rFonts w:ascii="Times New Roman" w:hAnsi="Times New Roman" w:cs="Times New Roman"/>
+        </w:rPr>
+      </w:pPr>
+      <w:r>
+        <w:rPr>
+          <w:rFonts w:ascii="Times New Roman" w:hAnsi="Times New Roman" w:cs="Times New Roman"/>
+        </w:rPr>
+        <w:t xml:space="preserve">Il </w:t>
+      </w:r>
+      <w:proofErr w:type="spellStart"/>
+      <w:r>
+        <w:rPr>
+          <w:rFonts w:ascii="Times New Roman" w:hAnsi="Times New Roman" w:cs="Times New Roman"/>
+        </w:rPr>
+        <w:t>p</w:t>
+      </w:r>
+      <w:r>
+        <w:rPr>
+          <w:rFonts w:ascii="Times New Roman" w:hAnsi="Times New Roman" w:cs="Times New Roman"/>
+        </w:rPr>
+        <w:t>reprocessing</w:t>
+      </w:r>
+      <w:proofErr w:type="spellEnd"/>
+      <w:r>
+        <w:rPr>
+          <w:rFonts w:ascii="Times New Roman" w:hAnsi="Times New Roman" w:cs="Times New Roman"/>
+        </w:rPr>
+        <w:t xml:space="preserve"> </w:t>
+      </w:r>
+      <w:r>
+        <w:rPr>
+          <w:rFonts w:ascii="Times New Roman" w:hAnsi="Times New Roman" w:cs="Times New Roman"/>
+        </w:rPr>
+        <w:t>s</w:t>
+      </w:r>
+      <w:r>
+        <w:rPr>
+          <w:rFonts w:ascii="Times New Roman" w:hAnsi="Times New Roman" w:cs="Times New Roman"/>
+        </w:rPr>
+        <w:t xml:space="preserve">pecifico per </w:t>
+      </w:r>
+      <w:r>
+        <w:rPr>
+          <w:rFonts w:ascii="Times New Roman" w:hAnsi="Times New Roman" w:cs="Times New Roman"/>
+        </w:rPr>
+        <w:t>i singoli d</w:t>
+      </w:r>
+      <w:r>
+        <w:rPr>
+          <w:rFonts w:ascii="Times New Roman" w:hAnsi="Times New Roman" w:cs="Times New Roman"/>
+        </w:rPr>
+        <w:t>ataset</w:t>
+      </w:r>
+      <w:r>
+        <w:rPr>
+          <w:rFonts w:ascii="Times New Roman" w:hAnsi="Times New Roman" w:cs="Times New Roman"/>
+        </w:rPr>
+        <w:t xml:space="preserve"> è stato:</w:t>
+      </w:r>
+    </w:p>
+    <w:p>
+      <w:pPr>
+        <w:spacing w:after="0" w:line="360" w:lineRule="auto"/>
+        <w:jc w:val="both"/>
+        <w:rPr>
+          <w:rFonts w:ascii="Times New Roman" w:hAnsi="Times New Roman" w:cs="Times New Roman"/>
+        </w:rPr>
+      </w:pPr>
+      <w:r>
+        <w:rPr>
+          <w:rFonts w:ascii="Times New Roman" w:hAnsi="Times New Roman" w:cs="Times New Roman"/>
+          <w:b/>
+          <w:bCs/>
+        </w:rPr>
+        <w:t>A. Dataset Consumi</w:t>
+      </w:r>
+    </w:p>
+    <w:p>
+      <w:pPr>
+        <w:numPr>
+          <w:ilvl w:val="0"/>
+          <w:numId w:val="22"/>
+        </w:numPr>
+        <w:tabs>
+          <w:tab w:val="clear" w:pos="720"/>
+        </w:tabs>
+        <w:spacing w:after="0" w:line="360" w:lineRule="auto"/>
+        <w:ind w:left="284" w:hanging="284"/>
+        <w:jc w:val="both"/>
+        <w:rPr>
+          <w:rFonts w:ascii="Times New Roman" w:hAnsi="Times New Roman" w:cs="Times New Roman"/>
+        </w:rPr>
+      </w:pPr>
+      <w:r>
+        <w:rPr>
+          <w:rFonts w:ascii="Times New Roman" w:hAnsi="Times New Roman" w:cs="Times New Roman"/>
+          <w:b/>
+          <w:bCs/>
+        </w:rPr>
+        <w:t xml:space="preserve">Normalizzazione </w:t>
+      </w:r>
+      <w:r>
+        <w:rPr>
+          <w:rFonts w:ascii="Times New Roman" w:hAnsi="Times New Roman" w:cs="Times New Roman"/>
+          <w:b/>
+          <w:bCs/>
+        </w:rPr>
+        <w:t>t</w:t>
+      </w:r>
+      <w:r>
+        <w:rPr>
+          <w:rFonts w:ascii="Times New Roman" w:hAnsi="Times New Roman" w:cs="Times New Roman"/>
+          <w:b/>
+          <w:bCs/>
+        </w:rPr>
+        <w:t>emporale:</w:t>
+      </w:r>
+      <w:r>
+        <w:rPr>
+          <w:rFonts w:ascii="Times New Roman" w:hAnsi="Times New Roman" w:cs="Times New Roman"/>
+        </w:rPr>
+        <w:t xml:space="preserve"> </w:t>
+      </w:r>
+      <w:r>
+        <w:rPr>
+          <w:rFonts w:ascii="Times New Roman" w:hAnsi="Times New Roman" w:cs="Times New Roman"/>
+        </w:rPr>
+        <w:t>l</w:t>
+      </w:r>
+      <w:r>
+        <w:rPr>
+          <w:rFonts w:ascii="Times New Roman" w:hAnsi="Times New Roman" w:cs="Times New Roman"/>
+        </w:rPr>
+        <w:t xml:space="preserve">a colonna </w:t>
+      </w:r>
+      <w:proofErr w:type="spellStart"/>
+      <w:r>
+        <w:rPr>
+          <w:rFonts w:ascii="Courier New" w:hAnsi="Courier New" w:cs="Courier New"/>
+        </w:rPr>
+        <w:t>tstp</w:t>
+      </w:r>
+      <w:proofErr w:type="spellEnd"/>
+      <w:r>
+        <w:rPr>
+          <w:rFonts w:ascii="Times New Roman" w:hAnsi="Times New Roman" w:cs="Times New Roman"/>
+        </w:rPr>
+        <w:t xml:space="preserve"> </w:t>
+      </w:r>
+      <w:r>
+        <w:rPr>
+          <w:rFonts w:ascii="Times New Roman" w:hAnsi="Times New Roman" w:cs="Times New Roman"/>
+        </w:rPr>
+        <w:t>è stata</w:t>
+      </w:r>
+      <w:r>
+        <w:rPr>
+          <w:rFonts w:ascii="Times New Roman" w:hAnsi="Times New Roman" w:cs="Times New Roman"/>
+        </w:rPr>
+        <w:t xml:space="preserve"> convertita da stringa a </w:t>
+      </w:r>
+      <w:proofErr w:type="spellStart"/>
+      <w:r>
+        <w:rPr>
+          <w:rFonts w:ascii="Times New Roman" w:hAnsi="Times New Roman" w:cs="Times New Roman"/>
+        </w:rPr>
+        <w:t>Timestamp</w:t>
+      </w:r>
+      <w:proofErr w:type="spellEnd"/>
+      <w:r>
+        <w:rPr>
+          <w:rFonts w:ascii="Times New Roman" w:hAnsi="Times New Roman" w:cs="Times New Roman"/>
+        </w:rPr>
+        <w:t xml:space="preserve"> di Spark. Questo passaggio è critico per abilitare il </w:t>
+      </w:r>
+      <w:proofErr w:type="spellStart"/>
+      <w:r>
+        <w:rPr>
+          <w:rFonts w:ascii="Times New Roman" w:hAnsi="Times New Roman" w:cs="Times New Roman"/>
+          <w:i/>
+          <w:iCs/>
+        </w:rPr>
+        <w:t>Watermarking</w:t>
+      </w:r>
+      <w:proofErr w:type="spellEnd"/>
+      <w:r>
+        <w:rPr>
+          <w:rFonts w:ascii="Times New Roman" w:hAnsi="Times New Roman" w:cs="Times New Roman"/>
+        </w:rPr>
+        <w:t xml:space="preserve"> e le finestre temporali (</w:t>
+      </w:r>
+      <w:proofErr w:type="spellStart"/>
+      <w:r>
+        <w:rPr>
+          <w:rFonts w:ascii="Times New Roman" w:hAnsi="Times New Roman" w:cs="Times New Roman"/>
+        </w:rPr>
+        <w:t>Windowing</w:t>
+      </w:r>
+      <w:proofErr w:type="spellEnd"/>
+      <w:r>
+        <w:rPr>
+          <w:rFonts w:ascii="Times New Roman" w:hAnsi="Times New Roman" w:cs="Times New Roman"/>
+        </w:rPr>
+        <w:t>) nel motore di streaming.</w:t>
+      </w:r>
+    </w:p>
+    <w:p>
+      <w:pPr>
+        <w:numPr>
+          <w:ilvl w:val="0"/>
+          <w:numId w:val="22"/>
+        </w:numPr>
+        <w:tabs>
+          <w:tab w:val="clear" w:pos="720"/>
+        </w:tabs>
+        <w:spacing w:after="0" w:line="360" w:lineRule="auto"/>
+        <w:ind w:left="284" w:hanging="284"/>
+        <w:jc w:val="both"/>
+        <w:rPr>
+          <w:rFonts w:ascii="Times New Roman" w:hAnsi="Times New Roman" w:cs="Times New Roman"/>
+        </w:rPr>
+      </w:pPr>
+      <w:r>
+        <w:rPr>
+          <w:rFonts w:ascii="Times New Roman" w:hAnsi="Times New Roman" w:cs="Times New Roman"/>
+          <w:b/>
+          <w:bCs/>
+        </w:rPr>
+        <w:t>Schema Enforcement:</w:t>
+      </w:r>
+      <w:r>
+        <w:rPr>
+          <w:rFonts w:ascii="Times New Roman" w:hAnsi="Times New Roman" w:cs="Times New Roman"/>
+        </w:rPr>
+        <w:t xml:space="preserve"> </w:t>
+      </w:r>
+      <w:r>
+        <w:rPr>
+          <w:rFonts w:ascii="Times New Roman" w:hAnsi="Times New Roman" w:cs="Times New Roman"/>
+        </w:rPr>
+        <w:t>l</w:t>
+      </w:r>
+      <w:r>
+        <w:rPr>
+          <w:rFonts w:ascii="Times New Roman" w:hAnsi="Times New Roman" w:cs="Times New Roman"/>
+        </w:rPr>
+        <w:t xml:space="preserve">a colonna dei consumi </w:t>
+      </w:r>
+      <w:r>
+        <w:rPr>
+          <w:rFonts w:ascii="Times New Roman" w:hAnsi="Times New Roman" w:cs="Times New Roman"/>
+        </w:rPr>
+        <w:t>è stata</w:t>
+      </w:r>
+      <w:r>
+        <w:rPr>
+          <w:rFonts w:ascii="Times New Roman" w:hAnsi="Times New Roman" w:cs="Times New Roman"/>
+        </w:rPr>
+        <w:t xml:space="preserve"> forzata al tipo Double. Le righe contenenti stringhe non numeriche o valori "</w:t>
+      </w:r>
+      <w:proofErr w:type="spellStart"/>
+      <w:r>
+        <w:rPr>
+          <w:rFonts w:ascii="Times New Roman" w:hAnsi="Times New Roman" w:cs="Times New Roman"/>
+        </w:rPr>
+        <w:t>Null</w:t>
+      </w:r>
+      <w:proofErr w:type="spellEnd"/>
+      <w:r>
+        <w:rPr>
+          <w:rFonts w:ascii="Times New Roman" w:hAnsi="Times New Roman" w:cs="Times New Roman"/>
+        </w:rPr>
+        <w:t>" vengono filtrate immediatamente per evitare errori nei calcoli matematici successivi.</w:t>
+      </w:r>
+    </w:p>
+    <w:p>
+      <w:pPr>
+        <w:numPr>
+          <w:ilvl w:val="0"/>
+          <w:numId w:val="22"/>
+        </w:numPr>
+        <w:tabs>
+          <w:tab w:val="clear" w:pos="720"/>
+        </w:tabs>
+        <w:spacing w:after="0" w:line="360" w:lineRule="auto"/>
+        <w:ind w:left="284" w:hanging="284"/>
+        <w:jc w:val="both"/>
+        <w:rPr>
+          <w:rFonts w:ascii="Times New Roman" w:hAnsi="Times New Roman" w:cs="Times New Roman"/>
+        </w:rPr>
+      </w:pPr>
+      <w:r>
+        <w:rPr>
+          <w:rFonts w:ascii="Times New Roman" w:hAnsi="Times New Roman" w:cs="Times New Roman"/>
+          <w:b/>
+          <w:bCs/>
+        </w:rPr>
+        <w:lastRenderedPageBreak/>
+        <w:t>Handling del "</w:t>
+      </w:r>
+      <w:proofErr w:type="spellStart"/>
+      <w:r>
+        <w:rPr>
+          <w:rFonts w:ascii="Times New Roman" w:hAnsi="Times New Roman" w:cs="Times New Roman"/>
+          <w:b/>
+          <w:bCs/>
+        </w:rPr>
+        <w:t>Missing</w:t>
+      </w:r>
+      <w:proofErr w:type="spellEnd"/>
+      <w:r>
+        <w:rPr>
+          <w:rFonts w:ascii="Times New Roman" w:hAnsi="Times New Roman" w:cs="Times New Roman"/>
+          <w:b/>
+          <w:bCs/>
+        </w:rPr>
+        <w:t xml:space="preserve"> Data":</w:t>
+      </w:r>
+      <w:r>
+        <w:rPr>
+          <w:rFonts w:ascii="Times New Roman" w:hAnsi="Times New Roman" w:cs="Times New Roman"/>
+        </w:rPr>
+        <w:t xml:space="preserve"> </w:t>
+      </w:r>
+      <w:r>
+        <w:rPr>
+          <w:rFonts w:ascii="Times New Roman" w:hAnsi="Times New Roman" w:cs="Times New Roman"/>
+        </w:rPr>
+        <w:t>ho</w:t>
+      </w:r>
+      <w:r>
+        <w:rPr>
+          <w:rFonts w:ascii="Times New Roman" w:hAnsi="Times New Roman" w:cs="Times New Roman"/>
+        </w:rPr>
+        <w:t xml:space="preserve"> distinto tra uno "0.0" (consumo nullo reale) e un valore mancante. I valori mancanti vengono scartati per evitare di abbassare artificialmente le medie di quartiere.</w:t>
+      </w:r>
+    </w:p>
+    <w:p>
+      <w:pPr>
+        <w:spacing w:after="0" w:line="360" w:lineRule="auto"/>
+        <w:jc w:val="both"/>
+        <w:rPr>
+          <w:rFonts w:ascii="Times New Roman" w:hAnsi="Times New Roman" w:cs="Times New Roman"/>
+        </w:rPr>
+      </w:pPr>
+    </w:p>
+    <w:p>
+      <w:pPr>
+        <w:spacing w:after="0" w:line="360" w:lineRule="auto"/>
+        <w:jc w:val="both"/>
+        <w:rPr>
+          <w:rFonts w:ascii="Times New Roman" w:hAnsi="Times New Roman" w:cs="Times New Roman"/>
+        </w:rPr>
+      </w:pPr>
+      <w:r>
+        <w:rPr>
+          <w:rFonts w:ascii="Times New Roman" w:hAnsi="Times New Roman" w:cs="Times New Roman"/>
+          <w:b/>
+          <w:bCs/>
+        </w:rPr>
+        <w:t>B. Dataset Metadati Acorn</w:t>
+      </w:r>
+    </w:p>
+    <w:p>
+      <w:pPr>
+        <w:numPr>
+          <w:ilvl w:val="0"/>
+          <w:numId w:val="23"/>
+        </w:numPr>
+        <w:tabs>
+          <w:tab w:val="clear" w:pos="720"/>
+        </w:tabs>
+        <w:spacing w:after="0" w:line="360" w:lineRule="auto"/>
+        <w:ind w:left="284" w:hanging="284"/>
+        <w:jc w:val="both"/>
+        <w:rPr>
+          <w:rFonts w:ascii="Times New Roman" w:hAnsi="Times New Roman" w:cs="Times New Roman"/>
+        </w:rPr>
+      </w:pPr>
+      <w:r>
+        <w:rPr>
+          <w:rFonts w:ascii="Times New Roman" w:hAnsi="Times New Roman" w:cs="Times New Roman"/>
+          <w:b/>
+          <w:bCs/>
+        </w:rPr>
+        <w:t>Deduplicazione:</w:t>
+      </w:r>
+      <w:r>
+        <w:rPr>
+          <w:rFonts w:ascii="Times New Roman" w:hAnsi="Times New Roman" w:cs="Times New Roman"/>
+        </w:rPr>
+        <w:t xml:space="preserve"> </w:t>
+      </w:r>
+      <w:r>
+        <w:rPr>
+          <w:rFonts w:ascii="Times New Roman" w:hAnsi="Times New Roman" w:cs="Times New Roman"/>
+        </w:rPr>
+        <w:t>p</w:t>
+      </w:r>
+      <w:r>
+        <w:rPr>
+          <w:rFonts w:ascii="Times New Roman" w:hAnsi="Times New Roman" w:cs="Times New Roman"/>
+        </w:rPr>
+        <w:t xml:space="preserve">oiché un utente può comparire più volte nei metadati se ha cambiato contratto, </w:t>
+      </w:r>
+      <w:r>
+        <w:rPr>
+          <w:rFonts w:ascii="Times New Roman" w:hAnsi="Times New Roman" w:cs="Times New Roman"/>
+        </w:rPr>
+        <w:t xml:space="preserve">ho </w:t>
+      </w:r>
+      <w:r>
+        <w:rPr>
+          <w:rFonts w:ascii="Times New Roman" w:hAnsi="Times New Roman" w:cs="Times New Roman"/>
+        </w:rPr>
+        <w:t>effettu</w:t>
+      </w:r>
+      <w:r>
+        <w:rPr>
+          <w:rFonts w:ascii="Times New Roman" w:hAnsi="Times New Roman" w:cs="Times New Roman"/>
+        </w:rPr>
+        <w:t>ato</w:t>
+      </w:r>
+      <w:r>
+        <w:rPr>
+          <w:rFonts w:ascii="Times New Roman" w:hAnsi="Times New Roman" w:cs="Times New Roman"/>
+        </w:rPr>
+        <w:t xml:space="preserve"> una </w:t>
+      </w:r>
+      <w:proofErr w:type="spellStart"/>
+      <w:r>
+        <w:rPr>
+          <w:rFonts w:ascii="Courier New" w:hAnsi="Courier New" w:cs="Courier New"/>
+        </w:rPr>
+        <w:t>dropDuplicates</w:t>
+      </w:r>
+      <w:proofErr w:type="spellEnd"/>
+      <w:r>
+        <w:rPr>
+          <w:rFonts w:ascii="Times New Roman" w:hAnsi="Times New Roman" w:cs="Times New Roman"/>
+        </w:rPr>
+        <w:t xml:space="preserve"> basata sull'ID utente.</w:t>
+      </w:r>
+    </w:p>
+    <w:p>
+      <w:pPr>
+        <w:numPr>
+          <w:ilvl w:val="0"/>
+          <w:numId w:val="23"/>
+        </w:numPr>
+        <w:tabs>
+          <w:tab w:val="clear" w:pos="720"/>
+        </w:tabs>
+        <w:spacing w:after="0" w:line="360" w:lineRule="auto"/>
+        <w:ind w:left="284" w:hanging="284"/>
+        <w:jc w:val="both"/>
+        <w:rPr>
+          <w:rFonts w:ascii="Times New Roman" w:hAnsi="Times New Roman" w:cs="Times New Roman"/>
+        </w:rPr>
+      </w:pPr>
+      <w:r>
+        <w:rPr>
+          <w:rFonts w:ascii="Times New Roman" w:hAnsi="Times New Roman" w:cs="Times New Roman"/>
+          <w:b/>
+          <w:bCs/>
+        </w:rPr>
+        <w:t xml:space="preserve">Mapping </w:t>
+      </w:r>
+      <w:r>
+        <w:rPr>
+          <w:rFonts w:ascii="Times New Roman" w:hAnsi="Times New Roman" w:cs="Times New Roman"/>
+          <w:b/>
+          <w:bCs/>
+        </w:rPr>
+        <w:t>c</w:t>
+      </w:r>
+      <w:r>
+        <w:rPr>
+          <w:rFonts w:ascii="Times New Roman" w:hAnsi="Times New Roman" w:cs="Times New Roman"/>
+          <w:b/>
+          <w:bCs/>
+        </w:rPr>
+        <w:t>ategoriale:</w:t>
+      </w:r>
+      <w:r>
+        <w:rPr>
+          <w:rFonts w:ascii="Times New Roman" w:hAnsi="Times New Roman" w:cs="Times New Roman"/>
+        </w:rPr>
+        <w:t xml:space="preserve"> </w:t>
+      </w:r>
+      <w:r>
+        <w:rPr>
+          <w:rFonts w:ascii="Times New Roman" w:hAnsi="Times New Roman" w:cs="Times New Roman"/>
+        </w:rPr>
+        <w:t>p</w:t>
+      </w:r>
+      <w:r>
+        <w:rPr>
+          <w:rFonts w:ascii="Times New Roman" w:hAnsi="Times New Roman" w:cs="Times New Roman"/>
+        </w:rPr>
+        <w:t>er ottimizzare le performance, i gruppi Acorn (es. "</w:t>
+      </w:r>
+      <w:proofErr w:type="spellStart"/>
+      <w:r>
+        <w:rPr>
+          <w:rFonts w:ascii="Times New Roman" w:hAnsi="Times New Roman" w:cs="Times New Roman"/>
+        </w:rPr>
+        <w:t>Affluent</w:t>
+      </w:r>
+      <w:proofErr w:type="spellEnd"/>
+      <w:r>
+        <w:rPr>
+          <w:rFonts w:ascii="Times New Roman" w:hAnsi="Times New Roman" w:cs="Times New Roman"/>
+        </w:rPr>
+        <w:t>", "</w:t>
+      </w:r>
+      <w:proofErr w:type="spellStart"/>
+      <w:r>
+        <w:rPr>
+          <w:rFonts w:ascii="Times New Roman" w:hAnsi="Times New Roman" w:cs="Times New Roman"/>
+        </w:rPr>
+        <w:t>Adversity</w:t>
+      </w:r>
+      <w:proofErr w:type="spellEnd"/>
+      <w:r>
+        <w:rPr>
+          <w:rFonts w:ascii="Times New Roman" w:hAnsi="Times New Roman" w:cs="Times New Roman"/>
+        </w:rPr>
+        <w:t xml:space="preserve">") vengono preparati per </w:t>
+      </w:r>
+      <w:proofErr w:type="gramStart"/>
+      <w:r>
+        <w:rPr>
+          <w:rFonts w:ascii="Times New Roman" w:hAnsi="Times New Roman" w:cs="Times New Roman"/>
+        </w:rPr>
+        <w:t>un join</w:t>
+      </w:r>
+      <w:proofErr w:type="gramEnd"/>
+      <w:r>
+        <w:rPr>
+          <w:rFonts w:ascii="Times New Roman" w:hAnsi="Times New Roman" w:cs="Times New Roman"/>
+        </w:rPr>
+        <w:t xml:space="preserve"> di tipo </w:t>
+      </w:r>
+      <w:r>
+        <w:rPr>
+          <w:rFonts w:ascii="Times New Roman" w:hAnsi="Times New Roman" w:cs="Times New Roman"/>
+          <w:i/>
+          <w:iCs/>
+        </w:rPr>
+        <w:t>Broadcast</w:t>
+      </w:r>
+      <w:r>
+        <w:rPr>
+          <w:rFonts w:ascii="Times New Roman" w:hAnsi="Times New Roman" w:cs="Times New Roman"/>
+        </w:rPr>
+        <w:t>. Essendo un dataset piccolo rispetto ai consumi, Spark lo invierà in ogni nodo del cluster, evitando costosi spostamenti di dati in rete (Shuffle).</w:t>
+      </w:r>
+    </w:p>
+    <w:p>
+      <w:pPr>
+        <w:spacing w:after="0" w:line="360" w:lineRule="auto"/>
+        <w:jc w:val="both"/>
+        <w:rPr>
+          <w:rFonts w:ascii="Times New Roman" w:hAnsi="Times New Roman" w:cs="Times New Roman"/>
+        </w:rPr>
+      </w:pPr>
+    </w:p>
+    <w:p>
+      <w:pPr>
+        <w:spacing w:after="0" w:line="360" w:lineRule="auto"/>
+        <w:jc w:val="both"/>
+        <w:rPr>
+          <w:rFonts w:ascii="Times New Roman" w:hAnsi="Times New Roman" w:cs="Times New Roman"/>
+        </w:rPr>
+      </w:pPr>
+      <w:r>
+        <w:rPr>
+          <w:rFonts w:ascii="Times New Roman" w:hAnsi="Times New Roman" w:cs="Times New Roman"/>
+          <w:b/>
+          <w:bCs/>
+        </w:rPr>
+        <w:t xml:space="preserve">C. Dataset </w:t>
+      </w:r>
+      <w:proofErr w:type="spellStart"/>
+      <w:r>
+        <w:rPr>
+          <w:rFonts w:ascii="Times New Roman" w:hAnsi="Times New Roman" w:cs="Times New Roman"/>
+          <w:b/>
+          <w:bCs/>
+        </w:rPr>
+        <w:t>Weather</w:t>
+      </w:r>
+      <w:proofErr w:type="spellEnd"/>
+      <w:r>
+        <w:rPr>
+          <w:rFonts w:ascii="Times New Roman" w:hAnsi="Times New Roman" w:cs="Times New Roman"/>
+          <w:b/>
+          <w:bCs/>
+        </w:rPr>
+        <w:t xml:space="preserve"> (Dati Contestuali):</w:t>
+      </w:r>
+    </w:p>
+    <w:p>
+      <w:pPr>
+        <w:numPr>
+          <w:ilvl w:val="0"/>
+          <w:numId w:val="24"/>
+        </w:numPr>
+        <w:tabs>
+          <w:tab w:val="clear" w:pos="720"/>
+        </w:tabs>
+        <w:spacing w:after="0" w:line="360" w:lineRule="auto"/>
+        <w:ind w:left="284" w:hanging="284"/>
+        <w:jc w:val="both"/>
+        <w:rPr>
+          <w:rFonts w:ascii="Times New Roman" w:hAnsi="Times New Roman" w:cs="Times New Roman"/>
+        </w:rPr>
+      </w:pPr>
+      <w:proofErr w:type="spellStart"/>
+      <w:r>
+        <w:rPr>
+          <w:rFonts w:ascii="Times New Roman" w:hAnsi="Times New Roman" w:cs="Times New Roman"/>
+          <w:b/>
+          <w:bCs/>
+        </w:rPr>
+        <w:t>Resampling</w:t>
+      </w:r>
+      <w:proofErr w:type="spellEnd"/>
+      <w:r>
+        <w:rPr>
+          <w:rFonts w:ascii="Times New Roman" w:hAnsi="Times New Roman" w:cs="Times New Roman"/>
+          <w:b/>
+          <w:bCs/>
+        </w:rPr>
+        <w:t xml:space="preserve"> </w:t>
+      </w:r>
+      <w:r>
+        <w:rPr>
+          <w:rFonts w:ascii="Times New Roman" w:hAnsi="Times New Roman" w:cs="Times New Roman"/>
+          <w:b/>
+          <w:bCs/>
+        </w:rPr>
+        <w:t>t</w:t>
+      </w:r>
+      <w:r>
+        <w:rPr>
+          <w:rFonts w:ascii="Times New Roman" w:hAnsi="Times New Roman" w:cs="Times New Roman"/>
+          <w:b/>
+          <w:bCs/>
+        </w:rPr>
+        <w:t>emporale:</w:t>
+      </w:r>
+      <w:r>
+        <w:rPr>
+          <w:rFonts w:ascii="Times New Roman" w:hAnsi="Times New Roman" w:cs="Times New Roman"/>
+        </w:rPr>
+        <w:t xml:space="preserve"> </w:t>
+      </w:r>
+      <w:r>
+        <w:rPr>
+          <w:rFonts w:ascii="Times New Roman" w:hAnsi="Times New Roman" w:cs="Times New Roman"/>
+        </w:rPr>
+        <w:t>i</w:t>
+      </w:r>
+      <w:r>
+        <w:rPr>
+          <w:rFonts w:ascii="Times New Roman" w:hAnsi="Times New Roman" w:cs="Times New Roman"/>
+        </w:rPr>
+        <w:t xml:space="preserve">l dataset meteo è orario, mentre i consumi sono semi-orari (ogni 30 minuti). Durante il </w:t>
+      </w:r>
+      <w:proofErr w:type="spellStart"/>
+      <w:r>
+        <w:rPr>
+          <w:rFonts w:ascii="Times New Roman" w:hAnsi="Times New Roman" w:cs="Times New Roman"/>
+        </w:rPr>
+        <w:t>preprocessing</w:t>
+      </w:r>
+      <w:proofErr w:type="spellEnd"/>
+      <w:r>
+        <w:rPr>
+          <w:rFonts w:ascii="Times New Roman" w:hAnsi="Times New Roman" w:cs="Times New Roman"/>
+        </w:rPr>
+        <w:t xml:space="preserve">, </w:t>
+      </w:r>
+      <w:r>
+        <w:rPr>
+          <w:rFonts w:ascii="Times New Roman" w:hAnsi="Times New Roman" w:cs="Times New Roman"/>
+        </w:rPr>
+        <w:t>ho</w:t>
+      </w:r>
+      <w:r>
+        <w:rPr>
+          <w:rFonts w:ascii="Times New Roman" w:hAnsi="Times New Roman" w:cs="Times New Roman"/>
+        </w:rPr>
+        <w:t xml:space="preserve"> preparato la logica di join per "</w:t>
+      </w:r>
+      <w:proofErr w:type="spellStart"/>
+      <w:r>
+        <w:rPr>
+          <w:rFonts w:ascii="Times New Roman" w:hAnsi="Times New Roman" w:cs="Times New Roman"/>
+        </w:rPr>
+        <w:t>propogare</w:t>
+      </w:r>
+      <w:proofErr w:type="spellEnd"/>
+      <w:r>
+        <w:rPr>
+          <w:rFonts w:ascii="Times New Roman" w:hAnsi="Times New Roman" w:cs="Times New Roman"/>
+        </w:rPr>
+        <w:t>" la temperatura di un'ora su entrambe le letture di consumo corrispondenti a quell'arco temporale.</w:t>
+      </w:r>
+    </w:p>
+    <w:p>
+      <w:pPr>
+        <w:spacing w:after="0" w:line="360" w:lineRule="auto"/>
+        <w:jc w:val="both"/>
+        <w:rPr>
+          <w:rFonts w:ascii="Times New Roman" w:hAnsi="Times New Roman" w:cs="Times New Roman"/>
+          <w:b/>
+          <w:bCs/>
+        </w:rPr>
+      </w:pPr>
+    </w:p>
+    <w:p>
+      <w:pPr>
+        <w:spacing w:after="0" w:line="360" w:lineRule="auto"/>
+        <w:jc w:val="both"/>
+        <w:rPr>
+          <w:rFonts w:ascii="Times New Roman" w:hAnsi="Times New Roman" w:cs="Times New Roman"/>
+        </w:rPr>
+      </w:pPr>
+      <w:r>
+        <w:rPr>
+          <w:rFonts w:ascii="Times New Roman" w:hAnsi="Times New Roman" w:cs="Times New Roman"/>
+        </w:rPr>
+        <w:t>Per non saturare la memoria in questa fase:</w:t>
+      </w:r>
+    </w:p>
+    <w:p>
+      <w:pPr>
+        <w:numPr>
+          <w:ilvl w:val="0"/>
+          <w:numId w:val="25"/>
+        </w:numPr>
+        <w:tabs>
+          <w:tab w:val="clear" w:pos="720"/>
+        </w:tabs>
+        <w:spacing w:after="0" w:line="360" w:lineRule="auto"/>
+        <w:ind w:left="284" w:hanging="284"/>
+        <w:jc w:val="both"/>
+        <w:rPr>
+          <w:rFonts w:ascii="Times New Roman" w:hAnsi="Times New Roman" w:cs="Times New Roman"/>
+        </w:rPr>
+      </w:pPr>
+      <w:r>
+        <w:rPr>
+          <w:rFonts w:ascii="Times New Roman" w:hAnsi="Times New Roman" w:cs="Times New Roman"/>
+          <w:b/>
+          <w:bCs/>
+        </w:rPr>
+        <w:t>Uso di Parquet/Delta:</w:t>
+      </w:r>
+      <w:r>
+        <w:rPr>
+          <w:rFonts w:ascii="Times New Roman" w:hAnsi="Times New Roman" w:cs="Times New Roman"/>
+        </w:rPr>
+        <w:t xml:space="preserve"> </w:t>
+      </w:r>
+      <w:r>
+        <w:rPr>
+          <w:rFonts w:ascii="Times New Roman" w:hAnsi="Times New Roman" w:cs="Times New Roman"/>
+        </w:rPr>
+        <w:t>i</w:t>
+      </w:r>
+      <w:r>
+        <w:rPr>
+          <w:rFonts w:ascii="Times New Roman" w:hAnsi="Times New Roman" w:cs="Times New Roman"/>
+        </w:rPr>
+        <w:t xml:space="preserve">n fase di test, i dati puliti non vengono salvati in CSV (lento e pesante), ma convertiti nel formato </w:t>
+      </w:r>
+      <w:r>
+        <w:rPr>
+          <w:rFonts w:ascii="Times New Roman" w:hAnsi="Times New Roman" w:cs="Times New Roman"/>
+          <w:b/>
+          <w:bCs/>
+        </w:rPr>
+        <w:t>Parquet</w:t>
+      </w:r>
+      <w:r>
+        <w:rPr>
+          <w:rFonts w:ascii="Times New Roman" w:hAnsi="Times New Roman" w:cs="Times New Roman"/>
+        </w:rPr>
+        <w:t>. Questo formato "colonnare" permette a Spark di leggere solo le parti del file necessarie, riducendo l'I/O del disco fino all'80%.</w:t>
+      </w:r>
+    </w:p>
+    <w:p>
+      <w:pPr>
+        <w:numPr>
+          <w:ilvl w:val="0"/>
+          <w:numId w:val="25"/>
+        </w:numPr>
+        <w:tabs>
+          <w:tab w:val="clear" w:pos="720"/>
+        </w:tabs>
+        <w:spacing w:after="0" w:line="360" w:lineRule="auto"/>
+        <w:ind w:left="284" w:hanging="284"/>
+        <w:jc w:val="both"/>
+        <w:rPr>
+          <w:rFonts w:ascii="Times New Roman" w:hAnsi="Times New Roman" w:cs="Times New Roman"/>
+        </w:rPr>
+      </w:pPr>
+      <w:proofErr w:type="spellStart"/>
+      <w:r>
+        <w:rPr>
+          <w:rFonts w:ascii="Times New Roman" w:hAnsi="Times New Roman" w:cs="Times New Roman"/>
+          <w:b/>
+          <w:bCs/>
+        </w:rPr>
+        <w:t>Lazy</w:t>
+      </w:r>
+      <w:proofErr w:type="spellEnd"/>
+      <w:r>
+        <w:rPr>
+          <w:rFonts w:ascii="Times New Roman" w:hAnsi="Times New Roman" w:cs="Times New Roman"/>
+          <w:b/>
+          <w:bCs/>
+        </w:rPr>
+        <w:t xml:space="preserve"> Evaluation:</w:t>
+      </w:r>
+      <w:r>
+        <w:rPr>
+          <w:rFonts w:ascii="Times New Roman" w:hAnsi="Times New Roman" w:cs="Times New Roman"/>
+        </w:rPr>
+        <w:t xml:space="preserve"> </w:t>
+      </w:r>
+      <w:r>
+        <w:rPr>
+          <w:rFonts w:ascii="Times New Roman" w:hAnsi="Times New Roman" w:cs="Times New Roman"/>
+        </w:rPr>
+        <w:t>t</w:t>
+      </w:r>
+      <w:r>
+        <w:rPr>
+          <w:rFonts w:ascii="Times New Roman" w:hAnsi="Times New Roman" w:cs="Times New Roman"/>
+        </w:rPr>
+        <w:t>utte le trasformazioni descritte sopra non vengono eseguite finché non viene richiesta un'azione (come il salvataggio o l'invio a Kafka). Questo permette a Spark di creare un piano d'esecuzione ottimizzato che accorpa più filtri in un unico passaggio.</w:t>
+      </w:r>
+    </w:p>
+    <w:p>
+      <w:pPr>
+        <w:spacing w:line="360" w:lineRule="auto"/>
+        <w:jc w:val="both"/>
+        <w:rPr>
+          <w:rFonts w:ascii="Times New Roman" w:hAnsi="Times New Roman" w:cs="Times New Roman"/>
+        </w:rPr>
+      </w:pPr>
+    </w:p>
+    <w:p>
+      <w:pPr>
+        <w:spacing w:line="360" w:lineRule="auto"/>
+        <w:jc w:val="both"/>
+        <w:rPr>
+          <w:rFonts w:ascii="Times New Roman" w:hAnsi="Times New Roman" w:cs="Times New Roman"/>
+          <w:b/>
+          <w:bCs/>
+        </w:rPr>
+      </w:pPr>
+      <w:r>
+        <w:rPr>
+          <w:rFonts w:ascii="Times New Roman" w:hAnsi="Times New Roman" w:cs="Times New Roman"/>
+          <w:b/>
+          <w:bCs/>
+        </w:rPr>
+        <w:t>3.5 Lo Schema Finale (</w:t>
+      </w:r>
+      <w:proofErr w:type="spellStart"/>
+      <w:r>
+        <w:rPr>
+          <w:rFonts w:ascii="Times New Roman" w:hAnsi="Times New Roman" w:cs="Times New Roman"/>
+          <w:b/>
+          <w:bCs/>
+        </w:rPr>
+        <w:t>Bronze</w:t>
+      </w:r>
+      <w:proofErr w:type="spellEnd"/>
+      <w:r>
+        <w:rPr>
+          <w:rFonts w:ascii="Times New Roman" w:hAnsi="Times New Roman" w:cs="Times New Roman"/>
+          <w:b/>
+          <w:bCs/>
+        </w:rPr>
+        <w:t xml:space="preserve"> Layer)</w:t>
+      </w:r>
+    </w:p>
+    <w:p>
+      <w:pPr>
+        <w:spacing w:line="360" w:lineRule="auto"/>
+        <w:jc w:val="both"/>
+        <w:rPr>
+          <w:rFonts w:ascii="Times New Roman" w:hAnsi="Times New Roman" w:cs="Times New Roman"/>
+        </w:rPr>
+      </w:pPr>
+      <w:r>
+        <w:rPr>
+          <w:rFonts w:ascii="Times New Roman" w:hAnsi="Times New Roman" w:cs="Times New Roman"/>
+        </w:rPr>
+        <w:t>Prima di passare al processing, abbiamo definito uno schema rigoroso (Case Classes in Scala) che funge da contratto per l'intera pipeline. Questo garantisce che ogni messaggio JSON letto da Kafka sia validato istantaneamente, scartando i dati malformati prima ancora che arrivino al motore di calcolo.</w:t>
+      </w:r>
+    </w:p>
+    <w:p>
+      <w:pPr>
+        <w:spacing w:line="360" w:lineRule="auto"/>
+        <w:jc w:val="both"/>
+        <w:rPr>
+          <w:rFonts w:ascii="Times New Roman" w:hAnsi="Times New Roman" w:cs="Times New Roman"/>
+        </w:rPr>
+      </w:pPr>
+    </w:p>
+    <w:p>
+      <w:pPr>
+        <w:spacing w:line="360" w:lineRule="auto"/>
+        <w:jc w:val="both"/>
+        <w:rPr>
+          <w:rFonts w:ascii="Times New Roman" w:hAnsi="Times New Roman" w:cs="Times New Roman"/>
+        </w:rPr>
+      </w:pPr>
     </w:p>
     <w:p>
       <w:pPr>
         <w:pStyle w:val="Titolo1"/>
       </w:pPr>
       <w:r>
+        <w:lastRenderedPageBreak/>
         <w:t xml:space="preserve">4. Ingestione dei Dati (Data </w:t>
       </w:r>
       <w:proofErr w:type="spellStart"/>
@@ -4497,6 +6556,417 @@
     </w:lvl>
   </w:abstractNum>
   <w:abstractNum w:abstractNumId="2" w15:restartNumberingAfterBreak="0">
+    <w:nsid w:val="0DBE6CFA"/>
+    <w:multiLevelType w:val="multilevel"/>
+    <w:tmpl w:val="1FAA1E50"/>
+    <w:lvl w:ilvl="0">
+      <w:start w:val="1"/>
+      <w:numFmt w:val="bullet"/>
+      <w:lvlText w:val=""/>
+      <w:lvlJc w:val="left"/>
+      <w:pPr>
+        <w:tabs>
+          <w:tab w:val="num" w:pos="720"/>
+        </w:tabs>
+        <w:ind w:left="720" w:hanging="360"/>
+      </w:pPr>
+      <w:rPr>
+        <w:rFonts w:ascii="Symbol" w:hAnsi="Symbol" w:hint="default"/>
+        <w:sz w:val="20"/>
+      </w:rPr>
+    </w:lvl>
+    <w:lvl w:ilvl="1" w:tentative="1">
+      <w:start w:val="1"/>
+      <w:numFmt w:val="bullet"/>
+      <w:lvlText w:val="o"/>
+      <w:lvlJc w:val="left"/>
+      <w:pPr>
+        <w:tabs>
+          <w:tab w:val="num" w:pos="1440"/>
+        </w:tabs>
+        <w:ind w:left="1440" w:hanging="360"/>
+      </w:pPr>
+      <w:rPr>
+        <w:rFonts w:ascii="Courier New" w:hAnsi="Courier New" w:hint="default"/>
+        <w:sz w:val="20"/>
+      </w:rPr>
+    </w:lvl>
+    <w:lvl w:ilvl="2" w:tentative="1">
+      <w:start w:val="1"/>
+      <w:numFmt w:val="bullet"/>
+      <w:lvlText w:val=""/>
+      <w:lvlJc w:val="left"/>
+      <w:pPr>
+        <w:tabs>
+          <w:tab w:val="num" w:pos="2160"/>
+        </w:tabs>
+        <w:ind w:left="2160" w:hanging="360"/>
+      </w:pPr>
+      <w:rPr>
+        <w:rFonts w:ascii="Wingdings" w:hAnsi="Wingdings" w:hint="default"/>
+        <w:sz w:val="20"/>
+      </w:rPr>
+    </w:lvl>
+    <w:lvl w:ilvl="3" w:tentative="1">
+      <w:start w:val="1"/>
+      <w:numFmt w:val="bullet"/>
+      <w:lvlText w:val=""/>
+      <w:lvlJc w:val="left"/>
+      <w:pPr>
+        <w:tabs>
+          <w:tab w:val="num" w:pos="2880"/>
+        </w:tabs>
+        <w:ind w:left="2880" w:hanging="360"/>
+      </w:pPr>
+      <w:rPr>
+        <w:rFonts w:ascii="Wingdings" w:hAnsi="Wingdings" w:hint="default"/>
+        <w:sz w:val="20"/>
+      </w:rPr>
+    </w:lvl>
+    <w:lvl w:ilvl="4" w:tentative="1">
+      <w:start w:val="1"/>
+      <w:numFmt w:val="bullet"/>
+      <w:lvlText w:val=""/>
+      <w:lvlJc w:val="left"/>
+      <w:pPr>
+        <w:tabs>
+          <w:tab w:val="num" w:pos="3600"/>
+        </w:tabs>
+        <w:ind w:left="3600" w:hanging="360"/>
+      </w:pPr>
+      <w:rPr>
+        <w:rFonts w:ascii="Wingdings" w:hAnsi="Wingdings" w:hint="default"/>
+        <w:sz w:val="20"/>
+      </w:rPr>
+    </w:lvl>
+    <w:lvl w:ilvl="5" w:tentative="1">
+      <w:start w:val="1"/>
+      <w:numFmt w:val="bullet"/>
+      <w:lvlText w:val=""/>
+      <w:lvlJc w:val="left"/>
+      <w:pPr>
+        <w:tabs>
+          <w:tab w:val="num" w:pos="4320"/>
+        </w:tabs>
+        <w:ind w:left="4320" w:hanging="360"/>
+      </w:pPr>
+      <w:rPr>
+        <w:rFonts w:ascii="Wingdings" w:hAnsi="Wingdings" w:hint="default"/>
+        <w:sz w:val="20"/>
+      </w:rPr>
+    </w:lvl>
+    <w:lvl w:ilvl="6" w:tentative="1">
+      <w:start w:val="1"/>
+      <w:numFmt w:val="bullet"/>
+      <w:lvlText w:val=""/>
+      <w:lvlJc w:val="left"/>
+      <w:pPr>
+        <w:tabs>
+          <w:tab w:val="num" w:pos="5040"/>
+        </w:tabs>
+        <w:ind w:left="5040" w:hanging="360"/>
+      </w:pPr>
+      <w:rPr>
+        <w:rFonts w:ascii="Wingdings" w:hAnsi="Wingdings" w:hint="default"/>
+        <w:sz w:val="20"/>
+      </w:rPr>
+    </w:lvl>
+    <w:lvl w:ilvl="7" w:tentative="1">
+      <w:start w:val="1"/>
+      <w:numFmt w:val="bullet"/>
+      <w:lvlText w:val=""/>
+      <w:lvlJc w:val="left"/>
+      <w:pPr>
+        <w:tabs>
+          <w:tab w:val="num" w:pos="5760"/>
+        </w:tabs>
+        <w:ind w:left="5760" w:hanging="360"/>
+      </w:pPr>
+      <w:rPr>
+        <w:rFonts w:ascii="Wingdings" w:hAnsi="Wingdings" w:hint="default"/>
+        <w:sz w:val="20"/>
+      </w:rPr>
+    </w:lvl>
+    <w:lvl w:ilvl="8" w:tentative="1">
+      <w:start w:val="1"/>
+      <w:numFmt w:val="bullet"/>
+      <w:lvlText w:val=""/>
+      <w:lvlJc w:val="left"/>
+      <w:pPr>
+        <w:tabs>
+          <w:tab w:val="num" w:pos="6480"/>
+        </w:tabs>
+        <w:ind w:left="6480" w:hanging="360"/>
+      </w:pPr>
+      <w:rPr>
+        <w:rFonts w:ascii="Wingdings" w:hAnsi="Wingdings" w:hint="default"/>
+        <w:sz w:val="20"/>
+      </w:rPr>
+    </w:lvl>
+  </w:abstractNum>
+  <w:abstractNum w:abstractNumId="3" w15:restartNumberingAfterBreak="0">
+    <w:nsid w:val="169046AE"/>
+    <w:multiLevelType w:val="multilevel"/>
+    <w:tmpl w:val="AA30803E"/>
+    <w:lvl w:ilvl="0">
+      <w:start w:val="1"/>
+      <w:numFmt w:val="bullet"/>
+      <w:lvlText w:val=""/>
+      <w:lvlJc w:val="left"/>
+      <w:pPr>
+        <w:tabs>
+          <w:tab w:val="num" w:pos="720"/>
+        </w:tabs>
+        <w:ind w:left="720" w:hanging="360"/>
+      </w:pPr>
+      <w:rPr>
+        <w:rFonts w:ascii="Symbol" w:hAnsi="Symbol" w:hint="default"/>
+        <w:sz w:val="20"/>
+      </w:rPr>
+    </w:lvl>
+    <w:lvl w:ilvl="1" w:tentative="1">
+      <w:start w:val="1"/>
+      <w:numFmt w:val="bullet"/>
+      <w:lvlText w:val="o"/>
+      <w:lvlJc w:val="left"/>
+      <w:pPr>
+        <w:tabs>
+          <w:tab w:val="num" w:pos="1440"/>
+        </w:tabs>
+        <w:ind w:left="1440" w:hanging="360"/>
+      </w:pPr>
+      <w:rPr>
+        <w:rFonts w:ascii="Courier New" w:hAnsi="Courier New" w:hint="default"/>
+        <w:sz w:val="20"/>
+      </w:rPr>
+    </w:lvl>
+    <w:lvl w:ilvl="2" w:tentative="1">
+      <w:start w:val="1"/>
+      <w:numFmt w:val="bullet"/>
+      <w:lvlText w:val=""/>
+      <w:lvlJc w:val="left"/>
+      <w:pPr>
+        <w:tabs>
+          <w:tab w:val="num" w:pos="2160"/>
+        </w:tabs>
+        <w:ind w:left="2160" w:hanging="360"/>
+      </w:pPr>
+      <w:rPr>
+        <w:rFonts w:ascii="Wingdings" w:hAnsi="Wingdings" w:hint="default"/>
+        <w:sz w:val="20"/>
+      </w:rPr>
+    </w:lvl>
+    <w:lvl w:ilvl="3" w:tentative="1">
+      <w:start w:val="1"/>
+      <w:numFmt w:val="bullet"/>
+      <w:lvlText w:val=""/>
+      <w:lvlJc w:val="left"/>
+      <w:pPr>
+        <w:tabs>
+          <w:tab w:val="num" w:pos="2880"/>
+        </w:tabs>
+        <w:ind w:left="2880" w:hanging="360"/>
+      </w:pPr>
+      <w:rPr>
+        <w:rFonts w:ascii="Wingdings" w:hAnsi="Wingdings" w:hint="default"/>
+        <w:sz w:val="20"/>
+      </w:rPr>
+    </w:lvl>
+    <w:lvl w:ilvl="4" w:tentative="1">
+      <w:start w:val="1"/>
+      <w:numFmt w:val="bullet"/>
+      <w:lvlText w:val=""/>
+      <w:lvlJc w:val="left"/>
+      <w:pPr>
+        <w:tabs>
+          <w:tab w:val="num" w:pos="3600"/>
+        </w:tabs>
+        <w:ind w:left="3600" w:hanging="360"/>
+      </w:pPr>
+      <w:rPr>
+        <w:rFonts w:ascii="Wingdings" w:hAnsi="Wingdings" w:hint="default"/>
+        <w:sz w:val="20"/>
+      </w:rPr>
+    </w:lvl>
+    <w:lvl w:ilvl="5" w:tentative="1">
+      <w:start w:val="1"/>
+      <w:numFmt w:val="bullet"/>
+      <w:lvlText w:val=""/>
+      <w:lvlJc w:val="left"/>
+      <w:pPr>
+        <w:tabs>
+          <w:tab w:val="num" w:pos="4320"/>
+        </w:tabs>
+        <w:ind w:left="4320" w:hanging="360"/>
+      </w:pPr>
+      <w:rPr>
+        <w:rFonts w:ascii="Wingdings" w:hAnsi="Wingdings" w:hint="default"/>
+        <w:sz w:val="20"/>
+      </w:rPr>
+    </w:lvl>
+    <w:lvl w:ilvl="6" w:tentative="1">
+      <w:start w:val="1"/>
+      <w:numFmt w:val="bullet"/>
+      <w:lvlText w:val=""/>
+      <w:lvlJc w:val="left"/>
+      <w:pPr>
+        <w:tabs>
+          <w:tab w:val="num" w:pos="5040"/>
+        </w:tabs>
+        <w:ind w:left="5040" w:hanging="360"/>
+      </w:pPr>
+      <w:rPr>
+        <w:rFonts w:ascii="Wingdings" w:hAnsi="Wingdings" w:hint="default"/>
+        <w:sz w:val="20"/>
+      </w:rPr>
+    </w:lvl>
+    <w:lvl w:ilvl="7" w:tentative="1">
+      <w:start w:val="1"/>
+      <w:numFmt w:val="bullet"/>
+      <w:lvlText w:val=""/>
+      <w:lvlJc w:val="left"/>
+      <w:pPr>
+        <w:tabs>
+          <w:tab w:val="num" w:pos="5760"/>
+        </w:tabs>
+        <w:ind w:left="5760" w:hanging="360"/>
+      </w:pPr>
+      <w:rPr>
+        <w:rFonts w:ascii="Wingdings" w:hAnsi="Wingdings" w:hint="default"/>
+        <w:sz w:val="20"/>
+      </w:rPr>
+    </w:lvl>
+    <w:lvl w:ilvl="8" w:tentative="1">
+      <w:start w:val="1"/>
+      <w:numFmt w:val="bullet"/>
+      <w:lvlText w:val=""/>
+      <w:lvlJc w:val="left"/>
+      <w:pPr>
+        <w:tabs>
+          <w:tab w:val="num" w:pos="6480"/>
+        </w:tabs>
+        <w:ind w:left="6480" w:hanging="360"/>
+      </w:pPr>
+      <w:rPr>
+        <w:rFonts w:ascii="Wingdings" w:hAnsi="Wingdings" w:hint="default"/>
+        <w:sz w:val="20"/>
+      </w:rPr>
+    </w:lvl>
+  </w:abstractNum>
+  <w:abstractNum w:abstractNumId="4" w15:restartNumberingAfterBreak="0">
+    <w:nsid w:val="16E1754D"/>
+    <w:multiLevelType w:val="multilevel"/>
+    <w:tmpl w:val="C532B90C"/>
+    <w:lvl w:ilvl="0">
+      <w:start w:val="1"/>
+      <w:numFmt w:val="decimal"/>
+      <w:lvlText w:val="%1."/>
+      <w:lvlJc w:val="left"/>
+      <w:pPr>
+        <w:tabs>
+          <w:tab w:val="num" w:pos="720"/>
+        </w:tabs>
+        <w:ind w:left="720" w:hanging="360"/>
+      </w:pPr>
+    </w:lvl>
+    <w:lvl w:ilvl="1" w:tentative="1">
+      <w:start w:val="1"/>
+      <w:numFmt w:val="decimal"/>
+      <w:lvlText w:val="%2."/>
+      <w:lvlJc w:val="left"/>
+      <w:pPr>
+        <w:tabs>
+          <w:tab w:val="num" w:pos="1440"/>
+        </w:tabs>
+        <w:ind w:left="1440" w:hanging="360"/>
+      </w:pPr>
+    </w:lvl>
+    <w:lvl w:ilvl="2" w:tentative="1">
+      <w:start w:val="1"/>
+      <w:numFmt w:val="decimal"/>
+      <w:lvlText w:val="%3."/>
+      <w:lvlJc w:val="left"/>
+      <w:pPr>
+        <w:tabs>
+          <w:tab w:val="num" w:pos="2160"/>
+        </w:tabs>
+        <w:ind w:left="2160" w:hanging="360"/>
+      </w:pPr>
+    </w:lvl>
+    <w:lvl w:ilvl="3" w:tentative="1">
+      <w:start w:val="1"/>
+      <w:numFmt w:val="decimal"/>
+      <w:lvlText w:val="%4."/>
+      <w:lvlJc w:val="left"/>
+      <w:pPr>
+        <w:tabs>
+          <w:tab w:val="num" w:pos="2880"/>
+        </w:tabs>
+        <w:ind w:left="2880" w:hanging="360"/>
+      </w:pPr>
+    </w:lvl>
+    <w:lvl w:ilvl="4" w:tentative="1">
+      <w:start w:val="1"/>
+      <w:numFmt w:val="decimal"/>
+      <w:lvlText w:val="%5."/>
+      <w:lvlJc w:val="left"/>
+      <w:pPr>
+        <w:tabs>
+          <w:tab w:val="num" w:pos="3600"/>
+        </w:tabs>
+        <w:ind w:left="3600" w:hanging="360"/>
+      </w:pPr>
+    </w:lvl>
+    <w:lvl w:ilvl="5" w:tentative="1">
+      <w:start w:val="1"/>
+      <w:numFmt w:val="decimal"/>
+      <w:lvlText w:val="%6."/>
+      <w:lvlJc w:val="left"/>
+      <w:pPr>
+        <w:tabs>
+          <w:tab w:val="num" w:pos="4320"/>
+        </w:tabs>
+        <w:ind w:left="4320" w:hanging="360"/>
+      </w:pPr>
+    </w:lvl>
+    <w:lvl w:ilvl="6" w:tentative="1">
+      <w:start w:val="1"/>
+      <w:numFmt w:val="decimal"/>
+      <w:lvlText w:val="%7."/>
+      <w:lvlJc w:val="left"/>
+      <w:pPr>
+        <w:tabs>
+          <w:tab w:val="num" w:pos="5040"/>
+        </w:tabs>
+        <w:ind w:left="5040" w:hanging="360"/>
+      </w:pPr>
+    </w:lvl>
+    <w:lvl w:ilvl="7" w:tentative="1">
+      <w:start w:val="1"/>
+      <w:numFmt w:val="decimal"/>
+      <w:lvlText w:val="%8."/>
+      <w:lvlJc w:val="left"/>
+      <w:pPr>
+        <w:tabs>
+          <w:tab w:val="num" w:pos="5760"/>
+        </w:tabs>
+        <w:ind w:left="5760" w:hanging="360"/>
+      </w:pPr>
+    </w:lvl>
+    <w:lvl w:ilvl="8" w:tentative="1">
+      <w:start w:val="1"/>
+      <w:numFmt w:val="decimal"/>
+      <w:lvlText w:val="%9."/>
+      <w:lvlJc w:val="left"/>
+      <w:pPr>
+        <w:tabs>
+          <w:tab w:val="num" w:pos="6480"/>
+        </w:tabs>
+        <w:ind w:left="6480" w:hanging="360"/>
+      </w:pPr>
+    </w:lvl>
+  </w:abstractNum>
+  <w:abstractNum w:abstractNumId="5" w15:restartNumberingAfterBreak="0">
     <w:nsid w:val="2609586F"/>
     <w:multiLevelType w:val="multilevel"/>
     <w:tmpl w:val="D548A2FC"/>
@@ -4609,7 +7079,156 @@
       </w:pPr>
     </w:lvl>
   </w:abstractNum>
-  <w:abstractNum w:abstractNumId="3" w15:restartNumberingAfterBreak="0">
+  <w:abstractNum w:abstractNumId="6" w15:restartNumberingAfterBreak="0">
+    <w:nsid w:val="28266C06"/>
+    <w:multiLevelType w:val="multilevel"/>
+    <w:tmpl w:val="0024DC92"/>
+    <w:lvl w:ilvl="0">
+      <w:start w:val="1"/>
+      <w:numFmt w:val="bullet"/>
+      <w:lvlText w:val=""/>
+      <w:lvlJc w:val="left"/>
+      <w:pPr>
+        <w:tabs>
+          <w:tab w:val="num" w:pos="720"/>
+        </w:tabs>
+        <w:ind w:left="720" w:hanging="360"/>
+      </w:pPr>
+      <w:rPr>
+        <w:rFonts w:ascii="Symbol" w:hAnsi="Symbol" w:hint="default"/>
+        <w:sz w:val="20"/>
+      </w:rPr>
+    </w:lvl>
+    <w:lvl w:ilvl="1" w:tentative="1">
+      <w:start w:val="1"/>
+      <w:numFmt w:val="bullet"/>
+      <w:lvlText w:val="o"/>
+      <w:lvlJc w:val="left"/>
+      <w:pPr>
+        <w:tabs>
+          <w:tab w:val="num" w:pos="1440"/>
+        </w:tabs>
+        <w:ind w:left="1440" w:hanging="360"/>
+      </w:pPr>
+      <w:rPr>
+        <w:rFonts w:ascii="Courier New" w:hAnsi="Courier New" w:hint="default"/>
+        <w:sz w:val="20"/>
+      </w:rPr>
+    </w:lvl>
+    <w:lvl w:ilvl="2" w:tentative="1">
+      <w:start w:val="1"/>
+      <w:numFmt w:val="bullet"/>
+      <w:lvlText w:val=""/>
+      <w:lvlJc w:val="left"/>
+      <w:pPr>
+        <w:tabs>
+          <w:tab w:val="num" w:pos="2160"/>
+        </w:tabs>
+        <w:ind w:left="2160" w:hanging="360"/>
+      </w:pPr>
+      <w:rPr>
+        <w:rFonts w:ascii="Wingdings" w:hAnsi="Wingdings" w:hint="default"/>
+        <w:sz w:val="20"/>
+      </w:rPr>
+    </w:lvl>
+    <w:lvl w:ilvl="3" w:tentative="1">
+      <w:start w:val="1"/>
+      <w:numFmt w:val="bullet"/>
+      <w:lvlText w:val=""/>
+      <w:lvlJc w:val="left"/>
+      <w:pPr>
+        <w:tabs>
+          <w:tab w:val="num" w:pos="2880"/>
+        </w:tabs>
+        <w:ind w:left="2880" w:hanging="360"/>
+      </w:pPr>
+      <w:rPr>
+        <w:rFonts w:ascii="Wingdings" w:hAnsi="Wingdings" w:hint="default"/>
+        <w:sz w:val="20"/>
+      </w:rPr>
+    </w:lvl>
+    <w:lvl w:ilvl="4" w:tentative="1">
+      <w:start w:val="1"/>
+      <w:numFmt w:val="bullet"/>
+      <w:lvlText w:val=""/>
+      <w:lvlJc w:val="left"/>
+      <w:pPr>
+        <w:tabs>
+          <w:tab w:val="num" w:pos="3600"/>
+        </w:tabs>
+        <w:ind w:left="3600" w:hanging="360"/>
+      </w:pPr>
+      <w:rPr>
+        <w:rFonts w:ascii="Wingdings" w:hAnsi="Wingdings" w:hint="default"/>
+        <w:sz w:val="20"/>
+      </w:rPr>
+    </w:lvl>
+    <w:lvl w:ilvl="5" w:tentative="1">
+      <w:start w:val="1"/>
+      <w:numFmt w:val="bullet"/>
+      <w:lvlText w:val=""/>
+      <w:lvlJc w:val="left"/>
+      <w:pPr>
+        <w:tabs>
+          <w:tab w:val="num" w:pos="4320"/>
+        </w:tabs>
+        <w:ind w:left="4320" w:hanging="360"/>
+      </w:pPr>
+      <w:rPr>
+        <w:rFonts w:ascii="Wingdings" w:hAnsi="Wingdings" w:hint="default"/>
+        <w:sz w:val="20"/>
+      </w:rPr>
+    </w:lvl>
+    <w:lvl w:ilvl="6" w:tentative="1">
+      <w:start w:val="1"/>
+      <w:numFmt w:val="bullet"/>
+      <w:lvlText w:val=""/>
+      <w:lvlJc w:val="left"/>
+      <w:pPr>
+        <w:tabs>
+          <w:tab w:val="num" w:pos="5040"/>
+        </w:tabs>
+        <w:ind w:left="5040" w:hanging="360"/>
+      </w:pPr>
+      <w:rPr>
+        <w:rFonts w:ascii="Wingdings" w:hAnsi="Wingdings" w:hint="default"/>
+        <w:sz w:val="20"/>
+      </w:rPr>
+    </w:lvl>
+    <w:lvl w:ilvl="7" w:tentative="1">
+      <w:start w:val="1"/>
+      <w:numFmt w:val="bullet"/>
+      <w:lvlText w:val=""/>
+      <w:lvlJc w:val="left"/>
+      <w:pPr>
+        <w:tabs>
+          <w:tab w:val="num" w:pos="5760"/>
+        </w:tabs>
+        <w:ind w:left="5760" w:hanging="360"/>
+      </w:pPr>
+      <w:rPr>
+        <w:rFonts w:ascii="Wingdings" w:hAnsi="Wingdings" w:hint="default"/>
+        <w:sz w:val="20"/>
+      </w:rPr>
+    </w:lvl>
+    <w:lvl w:ilvl="8" w:tentative="1">
+      <w:start w:val="1"/>
+      <w:numFmt w:val="bullet"/>
+      <w:lvlText w:val=""/>
+      <w:lvlJc w:val="left"/>
+      <w:pPr>
+        <w:tabs>
+          <w:tab w:val="num" w:pos="6480"/>
+        </w:tabs>
+        <w:ind w:left="6480" w:hanging="360"/>
+      </w:pPr>
+      <w:rPr>
+        <w:rFonts w:ascii="Wingdings" w:hAnsi="Wingdings" w:hint="default"/>
+        <w:sz w:val="20"/>
+      </w:rPr>
+    </w:lvl>
+  </w:abstractNum>
+  <w:abstractNum w:abstractNumId="7" w15:restartNumberingAfterBreak="0">
     <w:nsid w:val="337B3063"/>
     <w:multiLevelType w:val="multilevel"/>
     <w:tmpl w:val="F20C4AD4"/>
@@ -4722,7 +7341,7 @@
       </w:pPr>
     </w:lvl>
   </w:abstractNum>
-  <w:abstractNum w:abstractNumId="4" w15:restartNumberingAfterBreak="0">
+  <w:abstractNum w:abstractNumId="8" w15:restartNumberingAfterBreak="0">
     <w:nsid w:val="3E8C4E9E"/>
     <w:multiLevelType w:val="multilevel"/>
     <w:tmpl w:val="6DE8CC28"/>
@@ -4871,7 +7490,7 @@
       </w:rPr>
     </w:lvl>
   </w:abstractNum>
-  <w:abstractNum w:abstractNumId="5" w15:restartNumberingAfterBreak="0">
+  <w:abstractNum w:abstractNumId="9" w15:restartNumberingAfterBreak="0">
     <w:nsid w:val="41F64F2F"/>
     <w:multiLevelType w:val="multilevel"/>
     <w:tmpl w:val="E320C506"/>
@@ -5020,7 +7639,567 @@
       </w:rPr>
     </w:lvl>
   </w:abstractNum>
-  <w:abstractNum w:abstractNumId="6" w15:restartNumberingAfterBreak="0">
+  <w:abstractNum w:abstractNumId="10" w15:restartNumberingAfterBreak="0">
+    <w:nsid w:val="43A31521"/>
+    <w:multiLevelType w:val="multilevel"/>
+    <w:tmpl w:val="A636EDDA"/>
+    <w:lvl w:ilvl="0">
+      <w:start w:val="1"/>
+      <w:numFmt w:val="bullet"/>
+      <w:lvlText w:val=""/>
+      <w:lvlJc w:val="left"/>
+      <w:pPr>
+        <w:tabs>
+          <w:tab w:val="num" w:pos="720"/>
+        </w:tabs>
+        <w:ind w:left="720" w:hanging="360"/>
+      </w:pPr>
+      <w:rPr>
+        <w:rFonts w:ascii="Symbol" w:hAnsi="Symbol" w:hint="default"/>
+        <w:sz w:val="20"/>
+      </w:rPr>
+    </w:lvl>
+    <w:lvl w:ilvl="1" w:tentative="1">
+      <w:start w:val="1"/>
+      <w:numFmt w:val="bullet"/>
+      <w:lvlText w:val="o"/>
+      <w:lvlJc w:val="left"/>
+      <w:pPr>
+        <w:tabs>
+          <w:tab w:val="num" w:pos="1440"/>
+        </w:tabs>
+        <w:ind w:left="1440" w:hanging="360"/>
+      </w:pPr>
+      <w:rPr>
+        <w:rFonts w:ascii="Courier New" w:hAnsi="Courier New" w:hint="default"/>
+        <w:sz w:val="20"/>
+      </w:rPr>
+    </w:lvl>
+    <w:lvl w:ilvl="2" w:tentative="1">
+      <w:start w:val="1"/>
+      <w:numFmt w:val="bullet"/>
+      <w:lvlText w:val=""/>
+      <w:lvlJc w:val="left"/>
+      <w:pPr>
+        <w:tabs>
+          <w:tab w:val="num" w:pos="2160"/>
+        </w:tabs>
+        <w:ind w:left="2160" w:hanging="360"/>
+      </w:pPr>
+      <w:rPr>
+        <w:rFonts w:ascii="Wingdings" w:hAnsi="Wingdings" w:hint="default"/>
+        <w:sz w:val="20"/>
+      </w:rPr>
+    </w:lvl>
+    <w:lvl w:ilvl="3" w:tentative="1">
+      <w:start w:val="1"/>
+      <w:numFmt w:val="bullet"/>
+      <w:lvlText w:val=""/>
+      <w:lvlJc w:val="left"/>
+      <w:pPr>
+        <w:tabs>
+          <w:tab w:val="num" w:pos="2880"/>
+        </w:tabs>
+        <w:ind w:left="2880" w:hanging="360"/>
+      </w:pPr>
+      <w:rPr>
+        <w:rFonts w:ascii="Wingdings" w:hAnsi="Wingdings" w:hint="default"/>
+        <w:sz w:val="20"/>
+      </w:rPr>
+    </w:lvl>
+    <w:lvl w:ilvl="4" w:tentative="1">
+      <w:start w:val="1"/>
+      <w:numFmt w:val="bullet"/>
+      <w:lvlText w:val=""/>
+      <w:lvlJc w:val="left"/>
+      <w:pPr>
+        <w:tabs>
+          <w:tab w:val="num" w:pos="3600"/>
+        </w:tabs>
+        <w:ind w:left="3600" w:hanging="360"/>
+      </w:pPr>
+      <w:rPr>
+        <w:rFonts w:ascii="Wingdings" w:hAnsi="Wingdings" w:hint="default"/>
+        <w:sz w:val="20"/>
+      </w:rPr>
+    </w:lvl>
+    <w:lvl w:ilvl="5" w:tentative="1">
+      <w:start w:val="1"/>
+      <w:numFmt w:val="bullet"/>
+      <w:lvlText w:val=""/>
+      <w:lvlJc w:val="left"/>
+      <w:pPr>
+        <w:tabs>
+          <w:tab w:val="num" w:pos="4320"/>
+        </w:tabs>
+        <w:ind w:left="4320" w:hanging="360"/>
+      </w:pPr>
+      <w:rPr>
+        <w:rFonts w:ascii="Wingdings" w:hAnsi="Wingdings" w:hint="default"/>
+        <w:sz w:val="20"/>
+      </w:rPr>
+    </w:lvl>
+    <w:lvl w:ilvl="6" w:tentative="1">
+      <w:start w:val="1"/>
+      <w:numFmt w:val="bullet"/>
+      <w:lvlText w:val=""/>
+      <w:lvlJc w:val="left"/>
+      <w:pPr>
+        <w:tabs>
+          <w:tab w:val="num" w:pos="5040"/>
+        </w:tabs>
+        <w:ind w:left="5040" w:hanging="360"/>
+      </w:pPr>
+      <w:rPr>
+        <w:rFonts w:ascii="Wingdings" w:hAnsi="Wingdings" w:hint="default"/>
+        <w:sz w:val="20"/>
+      </w:rPr>
+    </w:lvl>
+    <w:lvl w:ilvl="7" w:tentative="1">
+      <w:start w:val="1"/>
+      <w:numFmt w:val="bullet"/>
+      <w:lvlText w:val=""/>
+      <w:lvlJc w:val="left"/>
+      <w:pPr>
+        <w:tabs>
+          <w:tab w:val="num" w:pos="5760"/>
+        </w:tabs>
+        <w:ind w:left="5760" w:hanging="360"/>
+      </w:pPr>
+      <w:rPr>
+        <w:rFonts w:ascii="Wingdings" w:hAnsi="Wingdings" w:hint="default"/>
+        <w:sz w:val="20"/>
+      </w:rPr>
+    </w:lvl>
+    <w:lvl w:ilvl="8" w:tentative="1">
+      <w:start w:val="1"/>
+      <w:numFmt w:val="bullet"/>
+      <w:lvlText w:val=""/>
+      <w:lvlJc w:val="left"/>
+      <w:pPr>
+        <w:tabs>
+          <w:tab w:val="num" w:pos="6480"/>
+        </w:tabs>
+        <w:ind w:left="6480" w:hanging="360"/>
+      </w:pPr>
+      <w:rPr>
+        <w:rFonts w:ascii="Wingdings" w:hAnsi="Wingdings" w:hint="default"/>
+        <w:sz w:val="20"/>
+      </w:rPr>
+    </w:lvl>
+  </w:abstractNum>
+  <w:abstractNum w:abstractNumId="11" w15:restartNumberingAfterBreak="0">
+    <w:nsid w:val="46D76447"/>
+    <w:multiLevelType w:val="multilevel"/>
+    <w:tmpl w:val="625CCF26"/>
+    <w:lvl w:ilvl="0">
+      <w:start w:val="1"/>
+      <w:numFmt w:val="bullet"/>
+      <w:lvlText w:val=""/>
+      <w:lvlJc w:val="left"/>
+      <w:pPr>
+        <w:tabs>
+          <w:tab w:val="num" w:pos="720"/>
+        </w:tabs>
+        <w:ind w:left="720" w:hanging="360"/>
+      </w:pPr>
+      <w:rPr>
+        <w:rFonts w:ascii="Symbol" w:hAnsi="Symbol" w:hint="default"/>
+        <w:sz w:val="20"/>
+      </w:rPr>
+    </w:lvl>
+    <w:lvl w:ilvl="1" w:tentative="1">
+      <w:start w:val="1"/>
+      <w:numFmt w:val="bullet"/>
+      <w:lvlText w:val="o"/>
+      <w:lvlJc w:val="left"/>
+      <w:pPr>
+        <w:tabs>
+          <w:tab w:val="num" w:pos="1440"/>
+        </w:tabs>
+        <w:ind w:left="1440" w:hanging="360"/>
+      </w:pPr>
+      <w:rPr>
+        <w:rFonts w:ascii="Courier New" w:hAnsi="Courier New" w:hint="default"/>
+        <w:sz w:val="20"/>
+      </w:rPr>
+    </w:lvl>
+    <w:lvl w:ilvl="2" w:tentative="1">
+      <w:start w:val="1"/>
+      <w:numFmt w:val="bullet"/>
+      <w:lvlText w:val=""/>
+      <w:lvlJc w:val="left"/>
+      <w:pPr>
+        <w:tabs>
+          <w:tab w:val="num" w:pos="2160"/>
+        </w:tabs>
+        <w:ind w:left="2160" w:hanging="360"/>
+      </w:pPr>
+      <w:rPr>
+        <w:rFonts w:ascii="Wingdings" w:hAnsi="Wingdings" w:hint="default"/>
+        <w:sz w:val="20"/>
+      </w:rPr>
+    </w:lvl>
+    <w:lvl w:ilvl="3" w:tentative="1">
+      <w:start w:val="1"/>
+      <w:numFmt w:val="bullet"/>
+      <w:lvlText w:val=""/>
+      <w:lvlJc w:val="left"/>
+      <w:pPr>
+        <w:tabs>
+          <w:tab w:val="num" w:pos="2880"/>
+        </w:tabs>
+        <w:ind w:left="2880" w:hanging="360"/>
+      </w:pPr>
+      <w:rPr>
+        <w:rFonts w:ascii="Wingdings" w:hAnsi="Wingdings" w:hint="default"/>
+        <w:sz w:val="20"/>
+      </w:rPr>
+    </w:lvl>
+    <w:lvl w:ilvl="4" w:tentative="1">
+      <w:start w:val="1"/>
+      <w:numFmt w:val="bullet"/>
+      <w:lvlText w:val=""/>
+      <w:lvlJc w:val="left"/>
+      <w:pPr>
+        <w:tabs>
+          <w:tab w:val="num" w:pos="3600"/>
+        </w:tabs>
+        <w:ind w:left="3600" w:hanging="360"/>
+      </w:pPr>
+      <w:rPr>
+        <w:rFonts w:ascii="Wingdings" w:hAnsi="Wingdings" w:hint="default"/>
+        <w:sz w:val="20"/>
+      </w:rPr>
+    </w:lvl>
+    <w:lvl w:ilvl="5" w:tentative="1">
+      <w:start w:val="1"/>
+      <w:numFmt w:val="bullet"/>
+      <w:lvlText w:val=""/>
+      <w:lvlJc w:val="left"/>
+      <w:pPr>
+        <w:tabs>
+          <w:tab w:val="num" w:pos="4320"/>
+        </w:tabs>
+        <w:ind w:left="4320" w:hanging="360"/>
+      </w:pPr>
+      <w:rPr>
+        <w:rFonts w:ascii="Wingdings" w:hAnsi="Wingdings" w:hint="default"/>
+        <w:sz w:val="20"/>
+      </w:rPr>
+    </w:lvl>
+    <w:lvl w:ilvl="6" w:tentative="1">
+      <w:start w:val="1"/>
+      <w:numFmt w:val="bullet"/>
+      <w:lvlText w:val=""/>
+      <w:lvlJc w:val="left"/>
+      <w:pPr>
+        <w:tabs>
+          <w:tab w:val="num" w:pos="5040"/>
+        </w:tabs>
+        <w:ind w:left="5040" w:hanging="360"/>
+      </w:pPr>
+      <w:rPr>
+        <w:rFonts w:ascii="Wingdings" w:hAnsi="Wingdings" w:hint="default"/>
+        <w:sz w:val="20"/>
+      </w:rPr>
+    </w:lvl>
+    <w:lvl w:ilvl="7" w:tentative="1">
+      <w:start w:val="1"/>
+      <w:numFmt w:val="bullet"/>
+      <w:lvlText w:val=""/>
+      <w:lvlJc w:val="left"/>
+      <w:pPr>
+        <w:tabs>
+          <w:tab w:val="num" w:pos="5760"/>
+        </w:tabs>
+        <w:ind w:left="5760" w:hanging="360"/>
+      </w:pPr>
+      <w:rPr>
+        <w:rFonts w:ascii="Wingdings" w:hAnsi="Wingdings" w:hint="default"/>
+        <w:sz w:val="20"/>
+      </w:rPr>
+    </w:lvl>
+    <w:lvl w:ilvl="8" w:tentative="1">
+      <w:start w:val="1"/>
+      <w:numFmt w:val="bullet"/>
+      <w:lvlText w:val=""/>
+      <w:lvlJc w:val="left"/>
+      <w:pPr>
+        <w:tabs>
+          <w:tab w:val="num" w:pos="6480"/>
+        </w:tabs>
+        <w:ind w:left="6480" w:hanging="360"/>
+      </w:pPr>
+      <w:rPr>
+        <w:rFonts w:ascii="Wingdings" w:hAnsi="Wingdings" w:hint="default"/>
+        <w:sz w:val="20"/>
+      </w:rPr>
+    </w:lvl>
+  </w:abstractNum>
+  <w:abstractNum w:abstractNumId="12" w15:restartNumberingAfterBreak="0">
+    <w:nsid w:val="525E286E"/>
+    <w:multiLevelType w:val="multilevel"/>
+    <w:tmpl w:val="917266B6"/>
+    <w:lvl w:ilvl="0">
+      <w:start w:val="1"/>
+      <w:numFmt w:val="bullet"/>
+      <w:lvlText w:val=""/>
+      <w:lvlJc w:val="left"/>
+      <w:pPr>
+        <w:tabs>
+          <w:tab w:val="num" w:pos="720"/>
+        </w:tabs>
+        <w:ind w:left="720" w:hanging="360"/>
+      </w:pPr>
+      <w:rPr>
+        <w:rFonts w:ascii="Symbol" w:hAnsi="Symbol" w:hint="default"/>
+        <w:sz w:val="20"/>
+      </w:rPr>
+    </w:lvl>
+    <w:lvl w:ilvl="1" w:tentative="1">
+      <w:start w:val="1"/>
+      <w:numFmt w:val="bullet"/>
+      <w:lvlText w:val="o"/>
+      <w:lvlJc w:val="left"/>
+      <w:pPr>
+        <w:tabs>
+          <w:tab w:val="num" w:pos="1440"/>
+        </w:tabs>
+        <w:ind w:left="1440" w:hanging="360"/>
+      </w:pPr>
+      <w:rPr>
+        <w:rFonts w:ascii="Courier New" w:hAnsi="Courier New" w:hint="default"/>
+        <w:sz w:val="20"/>
+      </w:rPr>
+    </w:lvl>
+    <w:lvl w:ilvl="2" w:tentative="1">
+      <w:start w:val="1"/>
+      <w:numFmt w:val="bullet"/>
+      <w:lvlText w:val=""/>
+      <w:lvlJc w:val="left"/>
+      <w:pPr>
+        <w:tabs>
+          <w:tab w:val="num" w:pos="2160"/>
+        </w:tabs>
+        <w:ind w:left="2160" w:hanging="360"/>
+      </w:pPr>
+      <w:rPr>
+        <w:rFonts w:ascii="Wingdings" w:hAnsi="Wingdings" w:hint="default"/>
+        <w:sz w:val="20"/>
+      </w:rPr>
+    </w:lvl>
+    <w:lvl w:ilvl="3" w:tentative="1">
+      <w:start w:val="1"/>
+      <w:numFmt w:val="bullet"/>
+      <w:lvlText w:val=""/>
+      <w:lvlJc w:val="left"/>
+      <w:pPr>
+        <w:tabs>
+          <w:tab w:val="num" w:pos="2880"/>
+        </w:tabs>
+        <w:ind w:left="2880" w:hanging="360"/>
+      </w:pPr>
+      <w:rPr>
+        <w:rFonts w:ascii="Wingdings" w:hAnsi="Wingdings" w:hint="default"/>
+        <w:sz w:val="20"/>
+      </w:rPr>
+    </w:lvl>
+    <w:lvl w:ilvl="4" w:tentative="1">
+      <w:start w:val="1"/>
+      <w:numFmt w:val="bullet"/>
+      <w:lvlText w:val=""/>
+      <w:lvlJc w:val="left"/>
+      <w:pPr>
+        <w:tabs>
+          <w:tab w:val="num" w:pos="3600"/>
+        </w:tabs>
+        <w:ind w:left="3600" w:hanging="360"/>
+      </w:pPr>
+      <w:rPr>
+        <w:rFonts w:ascii="Wingdings" w:hAnsi="Wingdings" w:hint="default"/>
+        <w:sz w:val="20"/>
+      </w:rPr>
+    </w:lvl>
+    <w:lvl w:ilvl="5" w:tentative="1">
+      <w:start w:val="1"/>
+      <w:numFmt w:val="bullet"/>
+      <w:lvlText w:val=""/>
+      <w:lvlJc w:val="left"/>
+      <w:pPr>
+        <w:tabs>
+          <w:tab w:val="num" w:pos="4320"/>
+        </w:tabs>
+        <w:ind w:left="4320" w:hanging="360"/>
+      </w:pPr>
+      <w:rPr>
+        <w:rFonts w:ascii="Wingdings" w:hAnsi="Wingdings" w:hint="default"/>
+        <w:sz w:val="20"/>
+      </w:rPr>
+    </w:lvl>
+    <w:lvl w:ilvl="6" w:tentative="1">
+      <w:start w:val="1"/>
+      <w:numFmt w:val="bullet"/>
+      <w:lvlText w:val=""/>
+      <w:lvlJc w:val="left"/>
+      <w:pPr>
+        <w:tabs>
+          <w:tab w:val="num" w:pos="5040"/>
+        </w:tabs>
+        <w:ind w:left="5040" w:hanging="360"/>
+      </w:pPr>
+      <w:rPr>
+        <w:rFonts w:ascii="Wingdings" w:hAnsi="Wingdings" w:hint="default"/>
+        <w:sz w:val="20"/>
+      </w:rPr>
+    </w:lvl>
+    <w:lvl w:ilvl="7" w:tentative="1">
+      <w:start w:val="1"/>
+      <w:numFmt w:val="bullet"/>
+      <w:lvlText w:val=""/>
+      <w:lvlJc w:val="left"/>
+      <w:pPr>
+        <w:tabs>
+          <w:tab w:val="num" w:pos="5760"/>
+        </w:tabs>
+        <w:ind w:left="5760" w:hanging="360"/>
+      </w:pPr>
+      <w:rPr>
+        <w:rFonts w:ascii="Wingdings" w:hAnsi="Wingdings" w:hint="default"/>
+        <w:sz w:val="20"/>
+      </w:rPr>
+    </w:lvl>
+    <w:lvl w:ilvl="8" w:tentative="1">
+      <w:start w:val="1"/>
+      <w:numFmt w:val="bullet"/>
+      <w:lvlText w:val=""/>
+      <w:lvlJc w:val="left"/>
+      <w:pPr>
+        <w:tabs>
+          <w:tab w:val="num" w:pos="6480"/>
+        </w:tabs>
+        <w:ind w:left="6480" w:hanging="360"/>
+      </w:pPr>
+      <w:rPr>
+        <w:rFonts w:ascii="Wingdings" w:hAnsi="Wingdings" w:hint="default"/>
+        <w:sz w:val="20"/>
+      </w:rPr>
+    </w:lvl>
+  </w:abstractNum>
+  <w:abstractNum w:abstractNumId="13" w15:restartNumberingAfterBreak="0">
+    <w:nsid w:val="5371535D"/>
+    <w:multiLevelType w:val="multilevel"/>
+    <w:tmpl w:val="A9D25CA4"/>
+    <w:lvl w:ilvl="0">
+      <w:start w:val="1"/>
+      <w:numFmt w:val="decimal"/>
+      <w:lvlText w:val="%1."/>
+      <w:lvlJc w:val="left"/>
+      <w:pPr>
+        <w:tabs>
+          <w:tab w:val="num" w:pos="720"/>
+        </w:tabs>
+        <w:ind w:left="720" w:hanging="360"/>
+      </w:pPr>
+    </w:lvl>
+    <w:lvl w:ilvl="1" w:tentative="1">
+      <w:start w:val="1"/>
+      <w:numFmt w:val="decimal"/>
+      <w:lvlText w:val="%2."/>
+      <w:lvlJc w:val="left"/>
+      <w:pPr>
+        <w:tabs>
+          <w:tab w:val="num" w:pos="1440"/>
+        </w:tabs>
+        <w:ind w:left="1440" w:hanging="360"/>
+      </w:pPr>
+    </w:lvl>
+    <w:lvl w:ilvl="2" w:tentative="1">
+      <w:start w:val="1"/>
+      <w:numFmt w:val="decimal"/>
+      <w:lvlText w:val="%3."/>
+      <w:lvlJc w:val="left"/>
+      <w:pPr>
+        <w:tabs>
+          <w:tab w:val="num" w:pos="2160"/>
+        </w:tabs>
+        <w:ind w:left="2160" w:hanging="360"/>
+      </w:pPr>
+    </w:lvl>
+    <w:lvl w:ilvl="3" w:tentative="1">
+      <w:start w:val="1"/>
+      <w:numFmt w:val="decimal"/>
+      <w:lvlText w:val="%4."/>
+      <w:lvlJc w:val="left"/>
+      <w:pPr>
+        <w:tabs>
+          <w:tab w:val="num" w:pos="2880"/>
+        </w:tabs>
+        <w:ind w:left="2880" w:hanging="360"/>
+      </w:pPr>
+    </w:lvl>
+    <w:lvl w:ilvl="4" w:tentative="1">
+      <w:start w:val="1"/>
+      <w:numFmt w:val="decimal"/>
+      <w:lvlText w:val="%5."/>
+      <w:lvlJc w:val="left"/>
+      <w:pPr>
+        <w:tabs>
+          <w:tab w:val="num" w:pos="3600"/>
+        </w:tabs>
+        <w:ind w:left="3600" w:hanging="360"/>
+      </w:pPr>
+    </w:lvl>
+    <w:lvl w:ilvl="5" w:tentative="1">
+      <w:start w:val="1"/>
+      <w:numFmt w:val="decimal"/>
+      <w:lvlText w:val="%6."/>
+      <w:lvlJc w:val="left"/>
+      <w:pPr>
+        <w:tabs>
+          <w:tab w:val="num" w:pos="4320"/>
+        </w:tabs>
+        <w:ind w:left="4320" w:hanging="360"/>
+      </w:pPr>
+    </w:lvl>
+    <w:lvl w:ilvl="6" w:tentative="1">
+      <w:start w:val="1"/>
+      <w:numFmt w:val="decimal"/>
+      <w:lvlText w:val="%7."/>
+      <w:lvlJc w:val="left"/>
+      <w:pPr>
+        <w:tabs>
+          <w:tab w:val="num" w:pos="5040"/>
+        </w:tabs>
+        <w:ind w:left="5040" w:hanging="360"/>
+      </w:pPr>
+    </w:lvl>
+    <w:lvl w:ilvl="7" w:tentative="1">
+      <w:start w:val="1"/>
+      <w:numFmt w:val="decimal"/>
+      <w:lvlText w:val="%8."/>
+      <w:lvlJc w:val="left"/>
+      <w:pPr>
+        <w:tabs>
+          <w:tab w:val="num" w:pos="5760"/>
+        </w:tabs>
+        <w:ind w:left="5760" w:hanging="360"/>
+      </w:pPr>
+    </w:lvl>
+    <w:lvl w:ilvl="8" w:tentative="1">
+      <w:start w:val="1"/>
+      <w:numFmt w:val="decimal"/>
+      <w:lvlText w:val="%9."/>
+      <w:lvlJc w:val="left"/>
+      <w:pPr>
+        <w:tabs>
+          <w:tab w:val="num" w:pos="6480"/>
+        </w:tabs>
+        <w:ind w:left="6480" w:hanging="360"/>
+      </w:pPr>
+    </w:lvl>
+  </w:abstractNum>
+  <w:abstractNum w:abstractNumId="14" w15:restartNumberingAfterBreak="0">
     <w:nsid w:val="55B97331"/>
     <w:multiLevelType w:val="multilevel"/>
     <w:tmpl w:val="FE301E10"/>
@@ -5169,7 +8348,120 @@
       </w:rPr>
     </w:lvl>
   </w:abstractNum>
-  <w:abstractNum w:abstractNumId="7" w15:restartNumberingAfterBreak="0">
+  <w:abstractNum w:abstractNumId="15" w15:restartNumberingAfterBreak="0">
+    <w:nsid w:val="583A6599"/>
+    <w:multiLevelType w:val="multilevel"/>
+    <w:tmpl w:val="D9B22D0A"/>
+    <w:lvl w:ilvl="0">
+      <w:start w:val="1"/>
+      <w:numFmt w:val="decimal"/>
+      <w:lvlText w:val="%1."/>
+      <w:lvlJc w:val="left"/>
+      <w:pPr>
+        <w:tabs>
+          <w:tab w:val="num" w:pos="720"/>
+        </w:tabs>
+        <w:ind w:left="720" w:hanging="360"/>
+      </w:pPr>
+    </w:lvl>
+    <w:lvl w:ilvl="1" w:tentative="1">
+      <w:start w:val="1"/>
+      <w:numFmt w:val="decimal"/>
+      <w:lvlText w:val="%2."/>
+      <w:lvlJc w:val="left"/>
+      <w:pPr>
+        <w:tabs>
+          <w:tab w:val="num" w:pos="1440"/>
+        </w:tabs>
+        <w:ind w:left="1440" w:hanging="360"/>
+      </w:pPr>
+    </w:lvl>
+    <w:lvl w:ilvl="2" w:tentative="1">
+      <w:start w:val="1"/>
+      <w:numFmt w:val="decimal"/>
+      <w:lvlText w:val="%3."/>
+      <w:lvlJc w:val="left"/>
+      <w:pPr>
+        <w:tabs>
+          <w:tab w:val="num" w:pos="2160"/>
+        </w:tabs>
+        <w:ind w:left="2160" w:hanging="360"/>
+      </w:pPr>
+    </w:lvl>
+    <w:lvl w:ilvl="3" w:tentative="1">
+      <w:start w:val="1"/>
+      <w:numFmt w:val="decimal"/>
+      <w:lvlText w:val="%4."/>
+      <w:lvlJc w:val="left"/>
+      <w:pPr>
+        <w:tabs>
+          <w:tab w:val="num" w:pos="2880"/>
+        </w:tabs>
+        <w:ind w:left="2880" w:hanging="360"/>
+      </w:pPr>
+    </w:lvl>
+    <w:lvl w:ilvl="4" w:tentative="1">
+      <w:start w:val="1"/>
+      <w:numFmt w:val="decimal"/>
+      <w:lvlText w:val="%5."/>
+      <w:lvlJc w:val="left"/>
+      <w:pPr>
+        <w:tabs>
+          <w:tab w:val="num" w:pos="3600"/>
+        </w:tabs>
+        <w:ind w:left="3600" w:hanging="360"/>
+      </w:pPr>
+    </w:lvl>
+    <w:lvl w:ilvl="5" w:tentative="1">
+      <w:start w:val="1"/>
+      <w:numFmt w:val="decimal"/>
+      <w:lvlText w:val="%6."/>
+      <w:lvlJc w:val="left"/>
+      <w:pPr>
+        <w:tabs>
+          <w:tab w:val="num" w:pos="4320"/>
+        </w:tabs>
+        <w:ind w:left="4320" w:hanging="360"/>
+      </w:pPr>
+    </w:lvl>
+    <w:lvl w:ilvl="6" w:tentative="1">
+      <w:start w:val="1"/>
+      <w:numFmt w:val="decimal"/>
+      <w:lvlText w:val="%7."/>
+      <w:lvlJc w:val="left"/>
+      <w:pPr>
+        <w:tabs>
+          <w:tab w:val="num" w:pos="5040"/>
+        </w:tabs>
+        <w:ind w:left="5040" w:hanging="360"/>
+      </w:pPr>
+    </w:lvl>
+    <w:lvl w:ilvl="7" w:tentative="1">
+      <w:start w:val="1"/>
+      <w:numFmt w:val="decimal"/>
+      <w:lvlText w:val="%8."/>
+      <w:lvlJc w:val="left"/>
+      <w:pPr>
+        <w:tabs>
+          <w:tab w:val="num" w:pos="5760"/>
+        </w:tabs>
+        <w:ind w:left="5760" w:hanging="360"/>
+      </w:pPr>
+    </w:lvl>
+    <w:lvl w:ilvl="8" w:tentative="1">
+      <w:start w:val="1"/>
+      <w:numFmt w:val="decimal"/>
+      <w:lvlText w:val="%9."/>
+      <w:lvlJc w:val="left"/>
+      <w:pPr>
+        <w:tabs>
+          <w:tab w:val="num" w:pos="6480"/>
+        </w:tabs>
+        <w:ind w:left="6480" w:hanging="360"/>
+      </w:pPr>
+    </w:lvl>
+  </w:abstractNum>
+  <w:abstractNum w:abstractNumId="16" w15:restartNumberingAfterBreak="0">
     <w:nsid w:val="58A31F64"/>
     <w:multiLevelType w:val="multilevel"/>
     <w:tmpl w:val="E376B886"/>
@@ -5318,7 +8610,7 @@
       </w:rPr>
     </w:lvl>
   </w:abstractNum>
-  <w:abstractNum w:abstractNumId="8" w15:restartNumberingAfterBreak="0">
+  <w:abstractNum w:abstractNumId="17" w15:restartNumberingAfterBreak="0">
     <w:nsid w:val="5B8F3493"/>
     <w:multiLevelType w:val="multilevel"/>
     <w:tmpl w:val="661A68E2"/>
@@ -5467,7 +8759,7 @@
       </w:rPr>
     </w:lvl>
   </w:abstractNum>
-  <w:abstractNum w:abstractNumId="9" w15:restartNumberingAfterBreak="0">
+  <w:abstractNum w:abstractNumId="18" w15:restartNumberingAfterBreak="0">
     <w:nsid w:val="5E5A632C"/>
     <w:multiLevelType w:val="multilevel"/>
     <w:tmpl w:val="C9B0DAC6"/>
@@ -5616,7 +8908,7 @@
       </w:rPr>
     </w:lvl>
   </w:abstractNum>
-  <w:abstractNum w:abstractNumId="10" w15:restartNumberingAfterBreak="0">
+  <w:abstractNum w:abstractNumId="19" w15:restartNumberingAfterBreak="0">
     <w:nsid w:val="63917845"/>
     <w:multiLevelType w:val="multilevel"/>
     <w:tmpl w:val="85DA6CC4"/>
@@ -5765,7 +9057,7 @@
       </w:rPr>
     </w:lvl>
   </w:abstractNum>
-  <w:abstractNum w:abstractNumId="11" w15:restartNumberingAfterBreak="0">
+  <w:abstractNum w:abstractNumId="20" w15:restartNumberingAfterBreak="0">
     <w:nsid w:val="63AE5996"/>
     <w:multiLevelType w:val="multilevel"/>
     <w:tmpl w:val="40DA5966"/>
@@ -5914,7 +9206,305 @@
       </w:rPr>
     </w:lvl>
   </w:abstractNum>
-  <w:abstractNum w:abstractNumId="12" w15:restartNumberingAfterBreak="0">
+  <w:abstractNum w:abstractNumId="21" w15:restartNumberingAfterBreak="0">
+    <w:nsid w:val="66341A8F"/>
+    <w:multiLevelType w:val="multilevel"/>
+    <w:tmpl w:val="135067EE"/>
+    <w:lvl w:ilvl="0">
+      <w:start w:val="1"/>
+      <w:numFmt w:val="bullet"/>
+      <w:lvlText w:val=""/>
+      <w:lvlJc w:val="left"/>
+      <w:pPr>
+        <w:tabs>
+          <w:tab w:val="num" w:pos="720"/>
+        </w:tabs>
+        <w:ind w:left="720" w:hanging="360"/>
+      </w:pPr>
+      <w:rPr>
+        <w:rFonts w:ascii="Symbol" w:hAnsi="Symbol" w:hint="default"/>
+        <w:sz w:val="20"/>
+      </w:rPr>
+    </w:lvl>
+    <w:lvl w:ilvl="1" w:tentative="1">
+      <w:start w:val="1"/>
+      <w:numFmt w:val="bullet"/>
+      <w:lvlText w:val="o"/>
+      <w:lvlJc w:val="left"/>
+      <w:pPr>
+        <w:tabs>
+          <w:tab w:val="num" w:pos="1440"/>
+        </w:tabs>
+        <w:ind w:left="1440" w:hanging="360"/>
+      </w:pPr>
+      <w:rPr>
+        <w:rFonts w:ascii="Courier New" w:hAnsi="Courier New" w:hint="default"/>
+        <w:sz w:val="20"/>
+      </w:rPr>
+    </w:lvl>
+    <w:lvl w:ilvl="2" w:tentative="1">
+      <w:start w:val="1"/>
+      <w:numFmt w:val="bullet"/>
+      <w:lvlText w:val=""/>
+      <w:lvlJc w:val="left"/>
+      <w:pPr>
+        <w:tabs>
+          <w:tab w:val="num" w:pos="2160"/>
+        </w:tabs>
+        <w:ind w:left="2160" w:hanging="360"/>
+      </w:pPr>
+      <w:rPr>
+        <w:rFonts w:ascii="Wingdings" w:hAnsi="Wingdings" w:hint="default"/>
+        <w:sz w:val="20"/>
+      </w:rPr>
+    </w:lvl>
+    <w:lvl w:ilvl="3" w:tentative="1">
+      <w:start w:val="1"/>
+      <w:numFmt w:val="bullet"/>
+      <w:lvlText w:val=""/>
+      <w:lvlJc w:val="left"/>
+      <w:pPr>
+        <w:tabs>
+          <w:tab w:val="num" w:pos="2880"/>
+        </w:tabs>
+        <w:ind w:left="2880" w:hanging="360"/>
+      </w:pPr>
+      <w:rPr>
+        <w:rFonts w:ascii="Wingdings" w:hAnsi="Wingdings" w:hint="default"/>
+        <w:sz w:val="20"/>
+      </w:rPr>
+    </w:lvl>
+    <w:lvl w:ilvl="4" w:tentative="1">
+      <w:start w:val="1"/>
+      <w:numFmt w:val="bullet"/>
+      <w:lvlText w:val=""/>
+      <w:lvlJc w:val="left"/>
+      <w:pPr>
+        <w:tabs>
+          <w:tab w:val="num" w:pos="3600"/>
+        </w:tabs>
+        <w:ind w:left="3600" w:hanging="360"/>
+      </w:pPr>
+      <w:rPr>
+        <w:rFonts w:ascii="Wingdings" w:hAnsi="Wingdings" w:hint="default"/>
+        <w:sz w:val="20"/>
+      </w:rPr>
+    </w:lvl>
+    <w:lvl w:ilvl="5" w:tentative="1">
+      <w:start w:val="1"/>
+      <w:numFmt w:val="bullet"/>
+      <w:lvlText w:val=""/>
+      <w:lvlJc w:val="left"/>
+      <w:pPr>
+        <w:tabs>
+          <w:tab w:val="num" w:pos="4320"/>
+        </w:tabs>
+        <w:ind w:left="4320" w:hanging="360"/>
+      </w:pPr>
+      <w:rPr>
+        <w:rFonts w:ascii="Wingdings" w:hAnsi="Wingdings" w:hint="default"/>
+        <w:sz w:val="20"/>
+      </w:rPr>
+    </w:lvl>
+    <w:lvl w:ilvl="6" w:tentative="1">
+      <w:start w:val="1"/>
+      <w:numFmt w:val="bullet"/>
+      <w:lvlText w:val=""/>
+      <w:lvlJc w:val="left"/>
+      <w:pPr>
+        <w:tabs>
+          <w:tab w:val="num" w:pos="5040"/>
+        </w:tabs>
+        <w:ind w:left="5040" w:hanging="360"/>
+      </w:pPr>
+      <w:rPr>
+        <w:rFonts w:ascii="Wingdings" w:hAnsi="Wingdings" w:hint="default"/>
+        <w:sz w:val="20"/>
+      </w:rPr>
+    </w:lvl>
+    <w:lvl w:ilvl="7" w:tentative="1">
+      <w:start w:val="1"/>
+      <w:numFmt w:val="bullet"/>
+      <w:lvlText w:val=""/>
+      <w:lvlJc w:val="left"/>
+      <w:pPr>
+        <w:tabs>
+          <w:tab w:val="num" w:pos="5760"/>
+        </w:tabs>
+        <w:ind w:left="5760" w:hanging="360"/>
+      </w:pPr>
+      <w:rPr>
+        <w:rFonts w:ascii="Wingdings" w:hAnsi="Wingdings" w:hint="default"/>
+        <w:sz w:val="20"/>
+      </w:rPr>
+    </w:lvl>
+    <w:lvl w:ilvl="8" w:tentative="1">
+      <w:start w:val="1"/>
+      <w:numFmt w:val="bullet"/>
+      <w:lvlText w:val=""/>
+      <w:lvlJc w:val="left"/>
+      <w:pPr>
+        <w:tabs>
+          <w:tab w:val="num" w:pos="6480"/>
+        </w:tabs>
+        <w:ind w:left="6480" w:hanging="360"/>
+      </w:pPr>
+      <w:rPr>
+        <w:rFonts w:ascii="Wingdings" w:hAnsi="Wingdings" w:hint="default"/>
+        <w:sz w:val="20"/>
+      </w:rPr>
+    </w:lvl>
+  </w:abstractNum>
+  <w:abstractNum w:abstractNumId="22" w15:restartNumberingAfterBreak="0">
+    <w:nsid w:val="6737663A"/>
+    <w:multiLevelType w:val="multilevel"/>
+    <w:tmpl w:val="3CF02D0E"/>
+    <w:lvl w:ilvl="0">
+      <w:start w:val="1"/>
+      <w:numFmt w:val="bullet"/>
+      <w:lvlText w:val=""/>
+      <w:lvlJc w:val="left"/>
+      <w:pPr>
+        <w:tabs>
+          <w:tab w:val="num" w:pos="720"/>
+        </w:tabs>
+        <w:ind w:left="720" w:hanging="360"/>
+      </w:pPr>
+      <w:rPr>
+        <w:rFonts w:ascii="Symbol" w:hAnsi="Symbol" w:hint="default"/>
+        <w:sz w:val="20"/>
+      </w:rPr>
+    </w:lvl>
+    <w:lvl w:ilvl="1" w:tentative="1">
+      <w:start w:val="1"/>
+      <w:numFmt w:val="bullet"/>
+      <w:lvlText w:val="o"/>
+      <w:lvlJc w:val="left"/>
+      <w:pPr>
+        <w:tabs>
+          <w:tab w:val="num" w:pos="1440"/>
+        </w:tabs>
+        <w:ind w:left="1440" w:hanging="360"/>
+      </w:pPr>
+      <w:rPr>
+        <w:rFonts w:ascii="Courier New" w:hAnsi="Courier New" w:hint="default"/>
+        <w:sz w:val="20"/>
+      </w:rPr>
+    </w:lvl>
+    <w:lvl w:ilvl="2" w:tentative="1">
+      <w:start w:val="1"/>
+      <w:numFmt w:val="bullet"/>
+      <w:lvlText w:val=""/>
+      <w:lvlJc w:val="left"/>
+      <w:pPr>
+        <w:tabs>
+          <w:tab w:val="num" w:pos="2160"/>
+        </w:tabs>
+        <w:ind w:left="2160" w:hanging="360"/>
+      </w:pPr>
+      <w:rPr>
+        <w:rFonts w:ascii="Wingdings" w:hAnsi="Wingdings" w:hint="default"/>
+        <w:sz w:val="20"/>
+      </w:rPr>
+    </w:lvl>
+    <w:lvl w:ilvl="3" w:tentative="1">
+      <w:start w:val="1"/>
+      <w:numFmt w:val="bullet"/>
+      <w:lvlText w:val=""/>
+      <w:lvlJc w:val="left"/>
+      <w:pPr>
+        <w:tabs>
+          <w:tab w:val="num" w:pos="2880"/>
+        </w:tabs>
+        <w:ind w:left="2880" w:hanging="360"/>
+      </w:pPr>
+      <w:rPr>
+        <w:rFonts w:ascii="Wingdings" w:hAnsi="Wingdings" w:hint="default"/>
+        <w:sz w:val="20"/>
+      </w:rPr>
+    </w:lvl>
+    <w:lvl w:ilvl="4" w:tentative="1">
+      <w:start w:val="1"/>
+      <w:numFmt w:val="bullet"/>
+      <w:lvlText w:val=""/>
+      <w:lvlJc w:val="left"/>
+      <w:pPr>
+        <w:tabs>
+          <w:tab w:val="num" w:pos="3600"/>
+        </w:tabs>
+        <w:ind w:left="3600" w:hanging="360"/>
+      </w:pPr>
+      <w:rPr>
+        <w:rFonts w:ascii="Wingdings" w:hAnsi="Wingdings" w:hint="default"/>
+        <w:sz w:val="20"/>
+      </w:rPr>
+    </w:lvl>
+    <w:lvl w:ilvl="5" w:tentative="1">
+      <w:start w:val="1"/>
+      <w:numFmt w:val="bullet"/>
+      <w:lvlText w:val=""/>
+      <w:lvlJc w:val="left"/>
+      <w:pPr>
+        <w:tabs>
+          <w:tab w:val="num" w:pos="4320"/>
+        </w:tabs>
+        <w:ind w:left="4320" w:hanging="360"/>
+      </w:pPr>
+      <w:rPr>
+        <w:rFonts w:ascii="Wingdings" w:hAnsi="Wingdings" w:hint="default"/>
+        <w:sz w:val="20"/>
+      </w:rPr>
+    </w:lvl>
+    <w:lvl w:ilvl="6" w:tentative="1">
+      <w:start w:val="1"/>
+      <w:numFmt w:val="bullet"/>
+      <w:lvlText w:val=""/>
+      <w:lvlJc w:val="left"/>
+      <w:pPr>
+        <w:tabs>
+          <w:tab w:val="num" w:pos="5040"/>
+        </w:tabs>
+        <w:ind w:left="5040" w:hanging="360"/>
+      </w:pPr>
+      <w:rPr>
+        <w:rFonts w:ascii="Wingdings" w:hAnsi="Wingdings" w:hint="default"/>
+        <w:sz w:val="20"/>
+      </w:rPr>
+    </w:lvl>
+    <w:lvl w:ilvl="7" w:tentative="1">
+      <w:start w:val="1"/>
+      <w:numFmt w:val="bullet"/>
+      <w:lvlText w:val=""/>
+      <w:lvlJc w:val="left"/>
+      <w:pPr>
+        <w:tabs>
+          <w:tab w:val="num" w:pos="5760"/>
+        </w:tabs>
+        <w:ind w:left="5760" w:hanging="360"/>
+      </w:pPr>
+      <w:rPr>
+        <w:rFonts w:ascii="Wingdings" w:hAnsi="Wingdings" w:hint="default"/>
+        <w:sz w:val="20"/>
+      </w:rPr>
+    </w:lvl>
+    <w:lvl w:ilvl="8" w:tentative="1">
+      <w:start w:val="1"/>
+      <w:numFmt w:val="bullet"/>
+      <w:lvlText w:val=""/>
+      <w:lvlJc w:val="left"/>
+      <w:pPr>
+        <w:tabs>
+          <w:tab w:val="num" w:pos="6480"/>
+        </w:tabs>
+        <w:ind w:left="6480" w:hanging="360"/>
+      </w:pPr>
+      <w:rPr>
+        <w:rFonts w:ascii="Wingdings" w:hAnsi="Wingdings" w:hint="default"/>
+        <w:sz w:val="20"/>
+      </w:rPr>
+    </w:lvl>
+  </w:abstractNum>
+  <w:abstractNum w:abstractNumId="23" w15:restartNumberingAfterBreak="0">
     <w:nsid w:val="69E009C9"/>
     <w:multiLevelType w:val="multilevel"/>
     <w:tmpl w:val="3B3CF598"/>
@@ -6063,7 +9653,7 @@
       </w:rPr>
     </w:lvl>
   </w:abstractNum>
-  <w:abstractNum w:abstractNumId="13" w15:restartNumberingAfterBreak="0">
+  <w:abstractNum w:abstractNumId="24" w15:restartNumberingAfterBreak="0">
     <w:nsid w:val="786A4D3B"/>
     <w:multiLevelType w:val="multilevel"/>
     <w:tmpl w:val="1C9E256C"/>
@@ -6212,7 +9802,7 @@
       </w:rPr>
     </w:lvl>
   </w:abstractNum>
-  <w:abstractNum w:abstractNumId="14" w15:restartNumberingAfterBreak="0">
+  <w:abstractNum w:abstractNumId="25" w15:restartNumberingAfterBreak="0">
     <w:nsid w:val="787043DD"/>
     <w:multiLevelType w:val="multilevel"/>
     <w:tmpl w:val="8B328E80"/>
@@ -6362,49 +9952,82 @@
     </w:lvl>
   </w:abstractNum>
   <w:num w:numId="1" w16cid:durableId="955064590">
-    <w:abstractNumId w:val="7"/>
+    <w:abstractNumId w:val="16"/>
   </w:num>
   <w:num w:numId="2" w16cid:durableId="856381992">
-    <w:abstractNumId w:val="9"/>
+    <w:abstractNumId w:val="18"/>
   </w:num>
   <w:num w:numId="3" w16cid:durableId="510919362">
-    <w:abstractNumId w:val="14"/>
+    <w:abstractNumId w:val="25"/>
   </w:num>
   <w:num w:numId="4" w16cid:durableId="1724405010">
     <w:abstractNumId w:val="0"/>
   </w:num>
   <w:num w:numId="5" w16cid:durableId="1629623069">
-    <w:abstractNumId w:val="6"/>
+    <w:abstractNumId w:val="14"/>
   </w:num>
   <w:num w:numId="6" w16cid:durableId="372192214">
-    <w:abstractNumId w:val="13"/>
+    <w:abstractNumId w:val="24"/>
   </w:num>
   <w:num w:numId="7" w16cid:durableId="25327836">
-    <w:abstractNumId w:val="10"/>
+    <w:abstractNumId w:val="19"/>
   </w:num>
   <w:num w:numId="8" w16cid:durableId="176893813">
-    <w:abstractNumId w:val="11"/>
+    <w:abstractNumId w:val="20"/>
   </w:num>
   <w:num w:numId="9" w16cid:durableId="1011765007">
-    <w:abstractNumId w:val="12"/>
+    <w:abstractNumId w:val="23"/>
   </w:num>
   <w:num w:numId="10" w16cid:durableId="1195389871">
     <w:abstractNumId w:val="1"/>
   </w:num>
   <w:num w:numId="11" w16cid:durableId="21175925">
+    <w:abstractNumId w:val="17"/>
+  </w:num>
+  <w:num w:numId="12" w16cid:durableId="244921388">
+    <w:abstractNumId w:val="7"/>
+  </w:num>
+  <w:num w:numId="13" w16cid:durableId="1749184363">
     <w:abstractNumId w:val="8"/>
   </w:num>
-  <w:num w:numId="12" w16cid:durableId="244921388">
+  <w:num w:numId="14" w16cid:durableId="649359082">
+    <w:abstractNumId w:val="5"/>
+  </w:num>
+  <w:num w:numId="15" w16cid:durableId="74983087">
+    <w:abstractNumId w:val="9"/>
+  </w:num>
+  <w:num w:numId="16" w16cid:durableId="1079594202">
+    <w:abstractNumId w:val="11"/>
+  </w:num>
+  <w:num w:numId="17" w16cid:durableId="680013669">
+    <w:abstractNumId w:val="2"/>
+  </w:num>
+  <w:num w:numId="18" w16cid:durableId="1151286382">
+    <w:abstractNumId w:val="21"/>
+  </w:num>
+  <w:num w:numId="19" w16cid:durableId="1188518645">
+    <w:abstractNumId w:val="4"/>
+  </w:num>
+  <w:num w:numId="20" w16cid:durableId="596645482">
+    <w:abstractNumId w:val="6"/>
+  </w:num>
+  <w:num w:numId="21" w16cid:durableId="1095788525">
+    <w:abstractNumId w:val="13"/>
+  </w:num>
+  <w:num w:numId="22" w16cid:durableId="1107695619">
+    <w:abstractNumId w:val="10"/>
+  </w:num>
+  <w:num w:numId="23" w16cid:durableId="1533301829">
+    <w:abstractNumId w:val="12"/>
+  </w:num>
+  <w:num w:numId="24" w16cid:durableId="669063692">
     <w:abstractNumId w:val="3"/>
   </w:num>
-  <w:num w:numId="13" w16cid:durableId="1749184363">
-    <w:abstractNumId w:val="4"/>
+  <w:num w:numId="25" w16cid:durableId="1947106744">
+    <w:abstractNumId w:val="22"/>
   </w:num>
-  <w:num w:numId="14" w16cid:durableId="649359082">
-    <w:abstractNumId w:val="2"/>
-  </w:num>
-  <w:num w:numId="15" w16cid:durableId="74983087">
-    <w:abstractNumId w:val="5"/>
+  <w:num w:numId="26" w16cid:durableId="815488017">
+    <w:abstractNumId w:val="15"/>
   </w:num>
 </w:numbering>
 </file>

</xml_diff>

<commit_message>
Modifica alla documentazione. Creazione degli oggetti "DataExploration.scala" e "DataPreprocessor.scale" per la fase di EDA e di pre-processing.
</commit_message>
<xml_diff>
--- a/Documentazione.docx
+++ b/Documentazione.docx
@@ -3164,6 +3164,7 @@
       <w:r>
         <w:rPr>
           <w:rFonts w:ascii="Times New Roman" w:hAnsi="Times New Roman" w:cs="Times New Roman"/>
+          <w:noProof/>
         </w:rPr>
         <w:drawing>
           <wp:inline distT="0" distB="0" distL="0" distR="0" wp14:anchorId="4C5389F7" wp14:editId="1778CB3B">
@@ -4191,15 +4192,7 @@
         <w:pStyle w:val="Titolo2"/>
       </w:pPr>
       <w:r>
-        <w:t xml:space="preserve">3.4 </w:t>
-      </w:r>
-      <w:proofErr w:type="spellStart"/>
-      <w:r>
-        <w:t>Pre</w:t>
-      </w:r>
-      <w:proofErr w:type="spellEnd"/>
-      <w:r>
-        <w:t>-processing</w:t>
+        <w:t>3.4 Analisi Esplorativa dei Dati (EDA)</w:t>
       </w:r>
     </w:p>
     <w:p>
@@ -4214,13 +4207,189 @@
         <w:rPr>
           <w:rFonts w:ascii="Times New Roman" w:hAnsi="Times New Roman" w:cs="Times New Roman"/>
         </w:rPr>
-        <w:t xml:space="preserve">Dato il volume massivo del dataset (oltre 10GB di file CSV), la fase di </w:t>
+        <w:t>Ho effettuato</w:t>
+      </w:r>
+      <w:r>
+        <w:rPr>
+          <w:rFonts w:ascii="Times New Roman" w:hAnsi="Times New Roman" w:cs="Times New Roman"/>
+        </w:rPr>
+        <w:t xml:space="preserve"> un'analisi esplorativa esaustiva sull'intero corpo del dataset, composto da </w:t>
+      </w:r>
+      <w:r>
+        <w:rPr>
+          <w:rFonts w:ascii="Times New Roman" w:hAnsi="Times New Roman" w:cs="Times New Roman"/>
+          <w:b/>
+          <w:bCs/>
+        </w:rPr>
+        <w:t>167.817.021 di record</w:t>
+      </w:r>
+      <w:r>
+        <w:rPr>
+          <w:rFonts w:ascii="Times New Roman" w:hAnsi="Times New Roman" w:cs="Times New Roman"/>
+        </w:rPr>
+        <w:t xml:space="preserve">. L'elaborazione, eseguita in modalità distribuita tramite Apache Spark, ha permesso di mappare l'intero perimetro temporale dei consumi, che si estende dal </w:t>
+      </w:r>
+      <w:r>
+        <w:rPr>
+          <w:rFonts w:ascii="Times New Roman" w:hAnsi="Times New Roman" w:cs="Times New Roman"/>
+          <w:b/>
+          <w:bCs/>
+        </w:rPr>
+        <w:t>23 novembre 2011</w:t>
+      </w:r>
+      <w:r>
+        <w:rPr>
+          <w:rFonts w:ascii="Times New Roman" w:hAnsi="Times New Roman" w:cs="Times New Roman"/>
+        </w:rPr>
+        <w:t xml:space="preserve"> al </w:t>
+      </w:r>
+      <w:r>
+        <w:rPr>
+          <w:rFonts w:ascii="Times New Roman" w:hAnsi="Times New Roman" w:cs="Times New Roman"/>
+          <w:b/>
+          <w:bCs/>
+        </w:rPr>
+        <w:t>28 febbraio 2014</w:t>
+      </w:r>
+      <w:r>
+        <w:rPr>
+          <w:rFonts w:ascii="Times New Roman" w:hAnsi="Times New Roman" w:cs="Times New Roman"/>
+        </w:rPr>
+        <w:t>.</w:t>
+      </w:r>
+    </w:p>
+    <w:p>
+      <w:pPr>
+        <w:spacing w:line="360" w:lineRule="auto"/>
+        <w:jc w:val="both"/>
+        <w:rPr>
+          <w:rFonts w:ascii="Times New Roman" w:hAnsi="Times New Roman" w:cs="Times New Roman"/>
+        </w:rPr>
+      </w:pPr>
+      <w:r>
+        <w:rPr>
+          <w:rFonts w:ascii="Times New Roman" w:hAnsi="Times New Roman" w:cs="Times New Roman"/>
+        </w:rPr>
+        <w:t xml:space="preserve">L'analisi ha evidenziato un'elevata coerenza strutturale: il formato dei </w:t>
       </w:r>
       <w:proofErr w:type="spellStart"/>
       <w:r>
         <w:rPr>
           <w:rFonts w:ascii="Times New Roman" w:hAnsi="Times New Roman" w:cs="Times New Roman"/>
         </w:rPr>
+        <w:t>timestamp</w:t>
+      </w:r>
+      <w:proofErr w:type="spellEnd"/>
+      <w:r>
+        <w:rPr>
+          <w:rFonts w:ascii="Times New Roman" w:hAnsi="Times New Roman" w:cs="Times New Roman"/>
+        </w:rPr>
+        <w:t xml:space="preserve"> è risultato perfettamente consistente su scala globale, con una lunghezza costante di </w:t>
+      </w:r>
+      <w:r>
+        <w:rPr>
+          <w:rFonts w:ascii="Times New Roman" w:hAnsi="Times New Roman" w:cs="Times New Roman"/>
+          <w:b/>
+          <w:bCs/>
+        </w:rPr>
+        <w:t>27 caratteri</w:t>
+      </w:r>
+      <w:r>
+        <w:rPr>
+          <w:rFonts w:ascii="Times New Roman" w:hAnsi="Times New Roman" w:cs="Times New Roman"/>
+        </w:rPr>
+        <w:t xml:space="preserve">, eliminando il rischio di perdite di dati durante le operazioni di casting temporale. Per quanto riguarda la pulizia dei dati, sono stati individuati </w:t>
+      </w:r>
+      <w:r>
+        <w:rPr>
+          <w:rFonts w:ascii="Times New Roman" w:hAnsi="Times New Roman" w:cs="Times New Roman"/>
+          <w:b/>
+          <w:bCs/>
+        </w:rPr>
+        <w:t>5.560 record</w:t>
+      </w:r>
+      <w:r>
+        <w:rPr>
+          <w:rFonts w:ascii="Times New Roman" w:hAnsi="Times New Roman" w:cs="Times New Roman"/>
+        </w:rPr>
+        <w:t xml:space="preserve"> con valori di consumo mancanti o etichettati come stringhe "</w:t>
+      </w:r>
+      <w:proofErr w:type="spellStart"/>
+      <w:r>
+        <w:rPr>
+          <w:rFonts w:ascii="Times New Roman" w:hAnsi="Times New Roman" w:cs="Times New Roman"/>
+        </w:rPr>
+        <w:t>Null</w:t>
+      </w:r>
+      <w:proofErr w:type="spellEnd"/>
+      <w:r>
+        <w:rPr>
+          <w:rFonts w:ascii="Times New Roman" w:hAnsi="Times New Roman" w:cs="Times New Roman"/>
+        </w:rPr>
+        <w:t>", una quota estremamente ridotta rispetto al volume totale (circa lo 0,003%), che permette una gestione tramite filtraggio semplice senza compromettere la significatività statistica.</w:t>
+      </w:r>
+    </w:p>
+    <w:p>
+      <w:pPr>
+        <w:spacing w:line="360" w:lineRule="auto"/>
+        <w:jc w:val="both"/>
+        <w:rPr>
+          <w:rFonts w:ascii="Times New Roman" w:hAnsi="Times New Roman" w:cs="Times New Roman"/>
+        </w:rPr>
+      </w:pPr>
+      <w:r>
+        <w:rPr>
+          <w:rFonts w:ascii="Times New Roman" w:hAnsi="Times New Roman" w:cs="Times New Roman"/>
+        </w:rPr>
+        <w:t xml:space="preserve">Un risultato di particolare rilievo riguarda la </w:t>
+      </w:r>
+      <w:r>
+        <w:rPr>
+          <w:rFonts w:ascii="Times New Roman" w:hAnsi="Times New Roman" w:cs="Times New Roman"/>
+          <w:b/>
+          <w:bCs/>
+        </w:rPr>
+        <w:t>verifica dell'integrità referenziale</w:t>
+      </w:r>
+      <w:r>
+        <w:rPr>
+          <w:rFonts w:ascii="Times New Roman" w:hAnsi="Times New Roman" w:cs="Times New Roman"/>
+        </w:rPr>
+        <w:t xml:space="preserve">: il confronto tra il dataset energetico e i metadati delle utenze ha restituito </w:t>
+      </w:r>
+      <w:r>
+        <w:rPr>
+          <w:rFonts w:ascii="Times New Roman" w:hAnsi="Times New Roman" w:cs="Times New Roman"/>
+          <w:b/>
+          <w:bCs/>
+        </w:rPr>
+        <w:t>zero record orfani</w:t>
+      </w:r>
+      <w:r>
+        <w:rPr>
+          <w:rFonts w:ascii="Times New Roman" w:hAnsi="Times New Roman" w:cs="Times New Roman"/>
+        </w:rPr>
+        <w:t xml:space="preserve">, confermando che ogni misurazione nel dataset è riconducibile a un'abitazione censita. Infine, l'analisi dei gruppi </w:t>
+      </w:r>
+      <w:proofErr w:type="gramStart"/>
+      <w:r>
+        <w:rPr>
+          <w:rFonts w:ascii="Times New Roman" w:hAnsi="Times New Roman" w:cs="Times New Roman"/>
+        </w:rPr>
+        <w:t>socio-economici</w:t>
+      </w:r>
+      <w:proofErr w:type="gramEnd"/>
+      <w:r>
+        <w:rPr>
+          <w:rFonts w:ascii="Times New Roman" w:hAnsi="Times New Roman" w:cs="Times New Roman"/>
+        </w:rPr>
+        <w:t xml:space="preserve"> ha confermato la presenza di una stratificazione basata su categorie ACORN, individuando tuttavia una trascurabile percentuale di etichette spurie (ACORN-U, ACORN-) che verranno normalizzate nella successiva fase di </w:t>
+      </w:r>
+      <w:proofErr w:type="spellStart"/>
+      <w:r>
+        <w:rPr>
+          <w:rFonts w:ascii="Times New Roman" w:hAnsi="Times New Roman" w:cs="Times New Roman"/>
+        </w:rPr>
         <w:t>preprocessing</w:t>
       </w:r>
       <w:proofErr w:type="spellEnd"/>
@@ -4228,7 +4397,98 @@
         <w:rPr>
           <w:rFonts w:ascii="Times New Roman" w:hAnsi="Times New Roman" w:cs="Times New Roman"/>
         </w:rPr>
-        <w:t xml:space="preserve"> è stata progettata per essere eseguita in modo distribuito e "pigro" (</w:t>
+        <w:t>. Questo screening completo assicura che lo schema definito per la pipeline di streaming sia resiliente e privo di ambiguità strutturali.</w:t>
+      </w:r>
+    </w:p>
+    <w:p>
+      <w:pPr>
+        <w:spacing w:line="360" w:lineRule="auto"/>
+        <w:jc w:val="both"/>
+        <w:rPr>
+          <w:rFonts w:ascii="Times New Roman" w:hAnsi="Times New Roman" w:cs="Times New Roman"/>
+        </w:rPr>
+      </w:pPr>
+    </w:p>
+    <w:p>
+      <w:pPr>
+        <w:pStyle w:val="Titolo2"/>
+      </w:pPr>
+      <w:r>
+        <w:lastRenderedPageBreak/>
+        <w:t>3.</w:t>
+      </w:r>
+      <w:r>
+        <w:t>5</w:t>
+      </w:r>
+      <w:r>
+        <w:t xml:space="preserve"> </w:t>
+      </w:r>
+      <w:proofErr w:type="spellStart"/>
+      <w:r>
+        <w:t>Pre</w:t>
+      </w:r>
+      <w:proofErr w:type="spellEnd"/>
+      <w:r>
+        <w:t>-processing</w:t>
+      </w:r>
+    </w:p>
+    <w:p>
+      <w:pPr>
+        <w:spacing w:line="360" w:lineRule="auto"/>
+        <w:jc w:val="both"/>
+        <w:rPr>
+          <w:rFonts w:ascii="Times New Roman" w:hAnsi="Times New Roman" w:cs="Times New Roman"/>
+        </w:rPr>
+      </w:pPr>
+      <w:r>
+        <w:rPr>
+          <w:rFonts w:ascii="Times New Roman" w:hAnsi="Times New Roman" w:cs="Times New Roman"/>
+        </w:rPr>
+        <w:t xml:space="preserve">Data la mole massiva del dataset (oltre </w:t>
+      </w:r>
+      <w:r>
+        <w:rPr>
+          <w:rFonts w:ascii="Times New Roman" w:hAnsi="Times New Roman" w:cs="Times New Roman"/>
+          <w:b/>
+          <w:bCs/>
+        </w:rPr>
+        <w:t>167 milioni di record</w:t>
+      </w:r>
+      <w:r>
+        <w:rPr>
+          <w:rFonts w:ascii="Times New Roman" w:hAnsi="Times New Roman" w:cs="Times New Roman"/>
+        </w:rPr>
+        <w:t xml:space="preserve">), la fase di </w:t>
+      </w:r>
+      <w:proofErr w:type="spellStart"/>
+      <w:r>
+        <w:rPr>
+          <w:rFonts w:ascii="Times New Roman" w:hAnsi="Times New Roman" w:cs="Times New Roman"/>
+        </w:rPr>
+        <w:t>preprocessing</w:t>
+      </w:r>
+      <w:proofErr w:type="spellEnd"/>
+      <w:r>
+        <w:rPr>
+          <w:rFonts w:ascii="Times New Roman" w:hAnsi="Times New Roman" w:cs="Times New Roman"/>
+        </w:rPr>
+        <w:t xml:space="preserve"> è stata progettata seguendo i principi dell'architettura </w:t>
+      </w:r>
+      <w:proofErr w:type="spellStart"/>
+      <w:r>
+        <w:rPr>
+          <w:rFonts w:ascii="Times New Roman" w:hAnsi="Times New Roman" w:cs="Times New Roman"/>
+          <w:b/>
+          <w:bCs/>
+        </w:rPr>
+        <w:t>Medallion</w:t>
+      </w:r>
+      <w:proofErr w:type="spellEnd"/>
+      <w:r>
+        <w:rPr>
+          <w:rFonts w:ascii="Times New Roman" w:hAnsi="Times New Roman" w:cs="Times New Roman"/>
+        </w:rPr>
+        <w:t>, trasformando i dati dal formato grezzo (</w:t>
       </w:r>
       <w:proofErr w:type="spellStart"/>
       <w:r>
@@ -4237,14 +4497,28 @@
           <w:i/>
           <w:iCs/>
         </w:rPr>
-        <w:t>lazy</w:t>
+        <w:t>Bronze</w:t>
       </w:r>
       <w:proofErr w:type="spellEnd"/>
       <w:r>
         <w:rPr>
           <w:rFonts w:ascii="Times New Roman" w:hAnsi="Times New Roman" w:cs="Times New Roman"/>
         </w:rPr>
-        <w:t>), minimizzando l'occupazione di RAM e ottimizzando i tempi di calcolo.</w:t>
+        <w:t>) a una versione pulita, tipizzata e arricchita (</w:t>
+      </w:r>
+      <w:r>
+        <w:rPr>
+          <w:rFonts w:ascii="Times New Roman" w:hAnsi="Times New Roman" w:cs="Times New Roman"/>
+          <w:i/>
+          <w:iCs/>
+        </w:rPr>
+        <w:t>Silver</w:t>
+      </w:r>
+      <w:r>
+        <w:rPr>
+          <w:rFonts w:ascii="Times New Roman" w:hAnsi="Times New Roman" w:cs="Times New Roman"/>
+        </w:rPr>
+        <w:t>). L'intera pipeline è stata ottimizzata per l'esecuzione distribuita, minimizzando l'occupazione di RAM e i tempi di calcolo.</w:t>
       </w:r>
     </w:p>
     <w:p>
@@ -4253,46 +4527,24 @@
         <w:jc w:val="both"/>
         <w:rPr>
           <w:rFonts w:ascii="Times New Roman" w:hAnsi="Times New Roman" w:cs="Times New Roman"/>
-        </w:rPr>
-      </w:pPr>
-      <w:r>
-        <w:rPr>
-          <w:rFonts w:ascii="Times New Roman" w:hAnsi="Times New Roman" w:cs="Times New Roman"/>
-        </w:rPr>
-        <w:t xml:space="preserve">Per gestire l'enorme mole di dati della tabella </w:t>
-      </w:r>
-      <w:proofErr w:type="spellStart"/>
-      <w:r>
-        <w:rPr>
-          <w:rFonts w:ascii="Courier New" w:hAnsi="Courier New" w:cs="Courier New"/>
-        </w:rPr>
-        <w:t>halfhourly_dataset</w:t>
-      </w:r>
-      <w:proofErr w:type="spellEnd"/>
-      <w:r>
-        <w:rPr>
-          <w:rFonts w:ascii="Times New Roman" w:hAnsi="Times New Roman" w:cs="Times New Roman"/>
-        </w:rPr>
-        <w:t xml:space="preserve">, </w:t>
-      </w:r>
-      <w:r>
-        <w:rPr>
-          <w:rFonts w:ascii="Times New Roman" w:hAnsi="Times New Roman" w:cs="Times New Roman"/>
-        </w:rPr>
-        <w:t>ho</w:t>
-      </w:r>
-      <w:r>
-        <w:rPr>
-          <w:rFonts w:ascii="Times New Roman" w:hAnsi="Times New Roman" w:cs="Times New Roman"/>
-        </w:rPr>
-        <w:t xml:space="preserve"> adottato due strategie fondamentali:</w:t>
+          <w:b/>
+          <w:bCs/>
+        </w:rPr>
+      </w:pPr>
+      <w:r>
+        <w:rPr>
+          <w:rFonts w:ascii="Times New Roman" w:hAnsi="Times New Roman" w:cs="Times New Roman"/>
+          <w:b/>
+          <w:bCs/>
+        </w:rPr>
+        <w:t>Strategie di Ottimizzazione</w:t>
       </w:r>
     </w:p>
     <w:p>
       <w:pPr>
         <w:numPr>
           <w:ilvl w:val="0"/>
-          <w:numId w:val="21"/>
+          <w:numId w:val="32"/>
         </w:numPr>
         <w:tabs>
           <w:tab w:val="clear" w:pos="720"/>
@@ -4343,16 +4595,8 @@
       <w:r>
         <w:rPr>
           <w:rFonts w:ascii="Times New Roman" w:hAnsi="Times New Roman" w:cs="Times New Roman"/>
-          <w:b/>
-          <w:bCs/>
-        </w:rPr>
-        <w:t>:</w:t>
-      </w:r>
-      <w:r>
-        <w:rPr>
-          <w:rFonts w:ascii="Times New Roman" w:hAnsi="Times New Roman" w:cs="Times New Roman"/>
-        </w:rPr>
-        <w:t xml:space="preserve"> </w:t>
+        </w:rPr>
+        <w:t xml:space="preserve">: </w:t>
       </w:r>
       <w:r>
         <w:rPr>
@@ -4364,7 +4608,7 @@
         <w:rPr>
           <w:rFonts w:ascii="Times New Roman" w:hAnsi="Times New Roman" w:cs="Times New Roman"/>
         </w:rPr>
-        <w:t xml:space="preserve">nvece di caricare l'intero dataset, il sistema lavora per "blocchi" (i file </w:t>
+        <w:t>l sistema elabora i dati sfruttando la suddivisione nativa in blocchi (</w:t>
       </w:r>
       <w:r>
         <w:rPr>
@@ -4376,28 +4620,26 @@
         <w:rPr>
           <w:rFonts w:ascii="Times New Roman" w:hAnsi="Times New Roman" w:cs="Times New Roman"/>
         </w:rPr>
-        <w:t xml:space="preserve"> forniti da </w:t>
-      </w:r>
-      <w:proofErr w:type="spellStart"/>
-      <w:r>
-        <w:rPr>
-          <w:rFonts w:ascii="Times New Roman" w:hAnsi="Times New Roman" w:cs="Times New Roman"/>
-        </w:rPr>
-        <w:t>Kaggle</w:t>
-      </w:r>
-      <w:proofErr w:type="spellEnd"/>
-      <w:r>
-        <w:rPr>
-          <w:rFonts w:ascii="Times New Roman" w:hAnsi="Times New Roman" w:cs="Times New Roman"/>
-        </w:rPr>
-        <w:t>). Questo permette di testare la pipeline su un sottoinsieme e scalarla gradualmente senza modificare il codice.</w:t>
+        <w:t>). L'uso di pattern matching (</w:t>
+      </w:r>
+      <w:r>
+        <w:rPr>
+          <w:rFonts w:ascii="Courier New" w:hAnsi="Courier New" w:cs="Courier New"/>
+        </w:rPr>
+        <w:t>*.csv</w:t>
+      </w:r>
+      <w:r>
+        <w:rPr>
+          <w:rFonts w:ascii="Times New Roman" w:hAnsi="Times New Roman" w:cs="Times New Roman"/>
+        </w:rPr>
+        <w:t>) ha permesso di scalare la pipeline dal singolo test sull'intero dataset senza modifiche strutturali.</w:t>
       </w:r>
     </w:p>
     <w:p>
       <w:pPr>
         <w:numPr>
           <w:ilvl w:val="0"/>
-          <w:numId w:val="21"/>
+          <w:numId w:val="32"/>
         </w:numPr>
         <w:tabs>
           <w:tab w:val="clear" w:pos="720"/>
@@ -4443,43 +4685,25 @@
           <w:b/>
           <w:bCs/>
         </w:rPr>
-        <w:t xml:space="preserve"> (Potatura):</w:t>
-      </w:r>
-      <w:r>
-        <w:rPr>
-          <w:rFonts w:ascii="Times New Roman" w:hAnsi="Times New Roman" w:cs="Times New Roman"/>
-        </w:rPr>
-        <w:t xml:space="preserve"> </w:t>
-      </w:r>
-      <w:r>
-        <w:rPr>
-          <w:rFonts w:ascii="Times New Roman" w:hAnsi="Times New Roman" w:cs="Times New Roman"/>
-        </w:rPr>
-        <w:t>m</w:t>
-      </w:r>
-      <w:r>
-        <w:rPr>
-          <w:rFonts w:ascii="Times New Roman" w:hAnsi="Times New Roman" w:cs="Times New Roman"/>
-        </w:rPr>
-        <w:t>olti file contengono metadati ridondanti. La prima operazione è</w:t>
-      </w:r>
-      <w:r>
-        <w:rPr>
-          <w:rFonts w:ascii="Times New Roman" w:hAnsi="Times New Roman" w:cs="Times New Roman"/>
-        </w:rPr>
-        <w:t xml:space="preserve"> stata</w:t>
-      </w:r>
-      <w:r>
-        <w:rPr>
-          <w:rFonts w:ascii="Times New Roman" w:hAnsi="Times New Roman" w:cs="Times New Roman"/>
-        </w:rPr>
-        <w:t xml:space="preserve"> la selezione immediata delle sole colonne indispensabili (</w:t>
-      </w:r>
-      <w:r>
-        <w:rPr>
-          <w:rFonts w:ascii="Times New Roman" w:hAnsi="Times New Roman" w:cs="Times New Roman"/>
-        </w:rPr>
-        <w:t xml:space="preserve">come </w:t>
+        <w:t xml:space="preserve"> (Potatura)</w:t>
+      </w:r>
+      <w:r>
+        <w:rPr>
+          <w:rFonts w:ascii="Times New Roman" w:hAnsi="Times New Roman" w:cs="Times New Roman"/>
+        </w:rPr>
+        <w:t xml:space="preserve">: </w:t>
+      </w:r>
+      <w:r>
+        <w:rPr>
+          <w:rFonts w:ascii="Times New Roman" w:hAnsi="Times New Roman" w:cs="Times New Roman"/>
+        </w:rPr>
+        <w:t>p</w:t>
+      </w:r>
+      <w:r>
+        <w:rPr>
+          <w:rFonts w:ascii="Times New Roman" w:hAnsi="Times New Roman" w:cs="Times New Roman"/>
+        </w:rPr>
+        <w:t>er ridurre drasticamente il traffico di rete tra i nodi del cluster (Shuffle), è stata eseguita una selezione immediata delle sole colonne indispensabili (</w:t>
       </w:r>
       <w:proofErr w:type="spellStart"/>
       <w:r>
@@ -4513,7 +4737,7 @@
         <w:rPr>
           <w:rFonts w:ascii="Courier New" w:hAnsi="Courier New" w:cs="Courier New"/>
         </w:rPr>
-        <w:t>KWH/</w:t>
+        <w:t>energy(kWh/</w:t>
       </w:r>
       <w:proofErr w:type="spellStart"/>
       <w:r>
@@ -4525,107 +4749,22 @@
       <w:proofErr w:type="spellEnd"/>
       <w:r>
         <w:rPr>
-          <w:rFonts w:ascii="Times New Roman" w:hAnsi="Times New Roman" w:cs="Times New Roman"/>
-        </w:rPr>
-        <w:t>). Ridurre il numero di colonne all'inizio della pipeline riduce drasticamente il volume di dati che viaggia tra i nodi del cluster.</w:t>
-      </w:r>
-    </w:p>
-    <w:p>
-      <w:pPr>
-        <w:spacing w:after="0" w:line="360" w:lineRule="auto"/>
-        <w:jc w:val="both"/>
-        <w:rPr>
-          <w:rFonts w:ascii="Times New Roman" w:hAnsi="Times New Roman" w:cs="Times New Roman"/>
-        </w:rPr>
-      </w:pPr>
-    </w:p>
-    <w:p>
-      <w:pPr>
-        <w:spacing w:after="0" w:line="360" w:lineRule="auto"/>
-        <w:jc w:val="both"/>
-        <w:rPr>
-          <w:rFonts w:ascii="Times New Roman" w:hAnsi="Times New Roman" w:cs="Times New Roman"/>
-        </w:rPr>
-      </w:pPr>
-      <w:r>
-        <w:rPr>
-          <w:rFonts w:ascii="Times New Roman" w:hAnsi="Times New Roman" w:cs="Times New Roman"/>
-        </w:rPr>
-        <w:t xml:space="preserve">Il </w:t>
-      </w:r>
-      <w:proofErr w:type="spellStart"/>
-      <w:r>
-        <w:rPr>
-          <w:rFonts w:ascii="Times New Roman" w:hAnsi="Times New Roman" w:cs="Times New Roman"/>
-        </w:rPr>
-        <w:t>p</w:t>
-      </w:r>
-      <w:r>
-        <w:rPr>
-          <w:rFonts w:ascii="Times New Roman" w:hAnsi="Times New Roman" w:cs="Times New Roman"/>
-        </w:rPr>
-        <w:t>reprocessing</w:t>
-      </w:r>
-      <w:proofErr w:type="spellEnd"/>
-      <w:r>
-        <w:rPr>
-          <w:rFonts w:ascii="Times New Roman" w:hAnsi="Times New Roman" w:cs="Times New Roman"/>
-        </w:rPr>
-        <w:t xml:space="preserve"> </w:t>
-      </w:r>
-      <w:r>
-        <w:rPr>
-          <w:rFonts w:ascii="Times New Roman" w:hAnsi="Times New Roman" w:cs="Times New Roman"/>
-        </w:rPr>
-        <w:t>s</w:t>
-      </w:r>
-      <w:r>
-        <w:rPr>
-          <w:rFonts w:ascii="Times New Roman" w:hAnsi="Times New Roman" w:cs="Times New Roman"/>
-        </w:rPr>
-        <w:t xml:space="preserve">pecifico per </w:t>
-      </w:r>
-      <w:r>
-        <w:rPr>
-          <w:rFonts w:ascii="Times New Roman" w:hAnsi="Times New Roman" w:cs="Times New Roman"/>
-        </w:rPr>
-        <w:t>i singoli d</w:t>
-      </w:r>
-      <w:r>
-        <w:rPr>
-          <w:rFonts w:ascii="Times New Roman" w:hAnsi="Times New Roman" w:cs="Times New Roman"/>
-        </w:rPr>
-        <w:t>ataset</w:t>
-      </w:r>
-      <w:r>
-        <w:rPr>
-          <w:rFonts w:ascii="Times New Roman" w:hAnsi="Times New Roman" w:cs="Times New Roman"/>
-        </w:rPr>
-        <w:t xml:space="preserve"> è stato:</w:t>
-      </w:r>
-    </w:p>
-    <w:p>
-      <w:pPr>
-        <w:spacing w:after="0" w:line="360" w:lineRule="auto"/>
-        <w:jc w:val="both"/>
-        <w:rPr>
-          <w:rFonts w:ascii="Times New Roman" w:hAnsi="Times New Roman" w:cs="Times New Roman"/>
-        </w:rPr>
-      </w:pPr>
-      <w:r>
-        <w:rPr>
-          <w:rFonts w:ascii="Times New Roman" w:hAnsi="Times New Roman" w:cs="Times New Roman"/>
-          <w:b/>
-          <w:bCs/>
-        </w:rPr>
-        <w:t>A. Dataset Consumi</w:t>
+          <w:rFonts w:ascii="Courier New" w:hAnsi="Courier New" w:cs="Courier New"/>
+        </w:rPr>
+        <w:t>)</w:t>
+      </w:r>
+      <w:r>
+        <w:rPr>
+          <w:rFonts w:ascii="Times New Roman" w:hAnsi="Times New Roman" w:cs="Times New Roman"/>
+        </w:rPr>
+        <w:t>), scartando i metadati ridondanti all'inizio del flusso.</w:t>
       </w:r>
     </w:p>
     <w:p>
       <w:pPr>
         <w:numPr>
           <w:ilvl w:val="0"/>
-          <w:numId w:val="22"/>
+          <w:numId w:val="32"/>
         </w:numPr>
         <w:tabs>
           <w:tab w:val="clear" w:pos="720"/>
@@ -4643,118 +4782,91 @@
           <w:b/>
           <w:bCs/>
         </w:rPr>
-        <w:t xml:space="preserve">Normalizzazione </w:t>
-      </w:r>
-      <w:r>
-        <w:rPr>
-          <w:rFonts w:ascii="Times New Roman" w:hAnsi="Times New Roman" w:cs="Times New Roman"/>
-          <w:b/>
-          <w:bCs/>
-        </w:rPr>
-        <w:t>t</w:t>
-      </w:r>
-      <w:r>
-        <w:rPr>
-          <w:rFonts w:ascii="Times New Roman" w:hAnsi="Times New Roman" w:cs="Times New Roman"/>
-          <w:b/>
-          <w:bCs/>
-        </w:rPr>
-        <w:t>emporale:</w:t>
-      </w:r>
-      <w:r>
-        <w:rPr>
-          <w:rFonts w:ascii="Times New Roman" w:hAnsi="Times New Roman" w:cs="Times New Roman"/>
-        </w:rPr>
-        <w:t xml:space="preserve"> </w:t>
-      </w:r>
-      <w:r>
-        <w:rPr>
-          <w:rFonts w:ascii="Times New Roman" w:hAnsi="Times New Roman" w:cs="Times New Roman"/>
-        </w:rPr>
-        <w:t>l</w:t>
-      </w:r>
-      <w:r>
-        <w:rPr>
-          <w:rFonts w:ascii="Times New Roman" w:hAnsi="Times New Roman" w:cs="Times New Roman"/>
-        </w:rPr>
-        <w:t xml:space="preserve">a colonna </w:t>
-      </w:r>
-      <w:proofErr w:type="spellStart"/>
-      <w:r>
-        <w:rPr>
-          <w:rFonts w:ascii="Courier New" w:hAnsi="Courier New" w:cs="Courier New"/>
-        </w:rPr>
-        <w:t>tstp</w:t>
-      </w:r>
-      <w:proofErr w:type="spellEnd"/>
-      <w:r>
-        <w:rPr>
-          <w:rFonts w:ascii="Times New Roman" w:hAnsi="Times New Roman" w:cs="Times New Roman"/>
-        </w:rPr>
-        <w:t xml:space="preserve"> </w:t>
-      </w:r>
-      <w:r>
-        <w:rPr>
-          <w:rFonts w:ascii="Times New Roman" w:hAnsi="Times New Roman" w:cs="Times New Roman"/>
-        </w:rPr>
-        <w:t>è stata</w:t>
-      </w:r>
-      <w:r>
-        <w:rPr>
-          <w:rFonts w:ascii="Times New Roman" w:hAnsi="Times New Roman" w:cs="Times New Roman"/>
-        </w:rPr>
-        <w:t xml:space="preserve"> convertita da stringa a </w:t>
-      </w:r>
-      <w:proofErr w:type="spellStart"/>
-      <w:r>
-        <w:rPr>
-          <w:rFonts w:ascii="Times New Roman" w:hAnsi="Times New Roman" w:cs="Times New Roman"/>
-        </w:rPr>
-        <w:t>Timestamp</w:t>
-      </w:r>
-      <w:proofErr w:type="spellEnd"/>
-      <w:r>
-        <w:rPr>
-          <w:rFonts w:ascii="Times New Roman" w:hAnsi="Times New Roman" w:cs="Times New Roman"/>
-        </w:rPr>
-        <w:t xml:space="preserve"> di Spark. Questo passaggio è critico per abilitare il </w:t>
-      </w:r>
-      <w:proofErr w:type="spellStart"/>
+        <w:t>Double Broadcast Hash Join</w:t>
+      </w:r>
+      <w:r>
+        <w:rPr>
+          <w:rFonts w:ascii="Times New Roman" w:hAnsi="Times New Roman" w:cs="Times New Roman"/>
+        </w:rPr>
+        <w:t xml:space="preserve">: </w:t>
+      </w:r>
+      <w:r>
+        <w:rPr>
+          <w:rFonts w:ascii="Times New Roman" w:hAnsi="Times New Roman" w:cs="Times New Roman"/>
+        </w:rPr>
+        <w:t>d</w:t>
+      </w:r>
+      <w:r>
+        <w:rPr>
+          <w:rFonts w:ascii="Times New Roman" w:hAnsi="Times New Roman" w:cs="Times New Roman"/>
+        </w:rPr>
+        <w:t xml:space="preserve">ata la disparità di dimensioni tra il dataset dei consumi e quelli dei metadati/meteo, è stata forzata la strategia di </w:t>
+      </w:r>
       <w:r>
         <w:rPr>
           <w:rFonts w:ascii="Times New Roman" w:hAnsi="Times New Roman" w:cs="Times New Roman"/>
           <w:i/>
           <w:iCs/>
         </w:rPr>
-        <w:t>Watermarking</w:t>
-      </w:r>
-      <w:proofErr w:type="spellEnd"/>
-      <w:r>
-        <w:rPr>
-          <w:rFonts w:ascii="Times New Roman" w:hAnsi="Times New Roman" w:cs="Times New Roman"/>
-        </w:rPr>
-        <w:t xml:space="preserve"> e le finestre temporali (</w:t>
-      </w:r>
-      <w:proofErr w:type="spellStart"/>
-      <w:r>
-        <w:rPr>
-          <w:rFonts w:ascii="Times New Roman" w:hAnsi="Times New Roman" w:cs="Times New Roman"/>
-        </w:rPr>
-        <w:t>Windowing</w:t>
-      </w:r>
-      <w:proofErr w:type="spellEnd"/>
-      <w:r>
-        <w:rPr>
-          <w:rFonts w:ascii="Times New Roman" w:hAnsi="Times New Roman" w:cs="Times New Roman"/>
-        </w:rPr>
-        <w:t>) nel motore di streaming.</w:t>
+        <w:t>Broadcast</w:t>
+      </w:r>
+      <w:r>
+        <w:rPr>
+          <w:rFonts w:ascii="Times New Roman" w:hAnsi="Times New Roman" w:cs="Times New Roman"/>
+        </w:rPr>
+        <w:t>. Replicando le tabelle piccole su ogni worker, è stato possibile arricchire i 167 milioni di record evitando costosi spostamenti di dati pesanti sulla rete.</w:t>
+      </w:r>
+    </w:p>
+    <w:p>
+      <w:pPr>
+        <w:spacing w:after="0" w:line="360" w:lineRule="auto"/>
+        <w:jc w:val="both"/>
+        <w:rPr>
+          <w:rFonts w:ascii="Times New Roman" w:hAnsi="Times New Roman" w:cs="Times New Roman"/>
+        </w:rPr>
+      </w:pPr>
+    </w:p>
+    <w:p>
+      <w:pPr>
+        <w:spacing w:after="0" w:line="360" w:lineRule="auto"/>
+        <w:jc w:val="both"/>
+        <w:rPr>
+          <w:rFonts w:ascii="Times New Roman" w:hAnsi="Times New Roman" w:cs="Times New Roman"/>
+          <w:b/>
+          <w:bCs/>
+        </w:rPr>
+      </w:pPr>
+      <w:r>
+        <w:rPr>
+          <w:rFonts w:ascii="Times New Roman" w:hAnsi="Times New Roman" w:cs="Times New Roman"/>
+          <w:b/>
+          <w:bCs/>
+        </w:rPr>
+        <w:t>Trasformazioni Specifiche</w:t>
+      </w:r>
+    </w:p>
+    <w:p>
+      <w:pPr>
+        <w:spacing w:after="0" w:line="360" w:lineRule="auto"/>
+        <w:jc w:val="both"/>
+        <w:rPr>
+          <w:rFonts w:ascii="Times New Roman" w:hAnsi="Times New Roman" w:cs="Times New Roman"/>
+        </w:rPr>
+      </w:pPr>
+      <w:r>
+        <w:rPr>
+          <w:rFonts w:ascii="Times New Roman" w:hAnsi="Times New Roman" w:cs="Times New Roman"/>
+          <w:b/>
+          <w:bCs/>
+        </w:rPr>
+        <w:t>A. Dataset Consumi</w:t>
       </w:r>
     </w:p>
     <w:p>
       <w:pPr>
         <w:numPr>
           <w:ilvl w:val="0"/>
-          <w:numId w:val="22"/>
+          <w:numId w:val="33"/>
         </w:numPr>
         <w:tabs>
           <w:tab w:val="clear" w:pos="720"/>
@@ -4772,13 +4884,29 @@
           <w:b/>
           <w:bCs/>
         </w:rPr>
-        <w:t>Schema Enforcement:</w:t>
-      </w:r>
-      <w:r>
-        <w:rPr>
-          <w:rFonts w:ascii="Times New Roman" w:hAnsi="Times New Roman" w:cs="Times New Roman"/>
-        </w:rPr>
-        <w:t xml:space="preserve"> </w:t>
+        <w:t xml:space="preserve">Normalizzazione </w:t>
+      </w:r>
+      <w:r>
+        <w:rPr>
+          <w:rFonts w:ascii="Times New Roman" w:hAnsi="Times New Roman" w:cs="Times New Roman"/>
+          <w:b/>
+          <w:bCs/>
+        </w:rPr>
+        <w:t>t</w:t>
+      </w:r>
+      <w:r>
+        <w:rPr>
+          <w:rFonts w:ascii="Times New Roman" w:hAnsi="Times New Roman" w:cs="Times New Roman"/>
+          <w:b/>
+          <w:bCs/>
+        </w:rPr>
+        <w:t>emporale</w:t>
+      </w:r>
+      <w:r>
+        <w:rPr>
+          <w:rFonts w:ascii="Times New Roman" w:hAnsi="Times New Roman" w:cs="Times New Roman"/>
+        </w:rPr>
+        <w:t xml:space="preserve">: </w:t>
       </w:r>
       <w:r>
         <w:rPr>
@@ -4790,40 +4918,86 @@
         <w:rPr>
           <w:rFonts w:ascii="Times New Roman" w:hAnsi="Times New Roman" w:cs="Times New Roman"/>
         </w:rPr>
-        <w:t xml:space="preserve">a colonna dei consumi </w:t>
-      </w:r>
-      <w:r>
-        <w:rPr>
-          <w:rFonts w:ascii="Times New Roman" w:hAnsi="Times New Roman" w:cs="Times New Roman"/>
-        </w:rPr>
-        <w:t>è stata</w:t>
-      </w:r>
-      <w:r>
-        <w:rPr>
-          <w:rFonts w:ascii="Times New Roman" w:hAnsi="Times New Roman" w:cs="Times New Roman"/>
-        </w:rPr>
-        <w:t xml:space="preserve"> forzata al tipo Double. Le righe contenenti stringhe non numeriche o valori "</w:t>
+        <w:t xml:space="preserve">a colonna </w:t>
       </w:r>
       <w:proofErr w:type="spellStart"/>
       <w:r>
         <w:rPr>
-          <w:rFonts w:ascii="Times New Roman" w:hAnsi="Times New Roman" w:cs="Times New Roman"/>
-        </w:rPr>
-        <w:t>Null</w:t>
+          <w:rFonts w:ascii="Courier New" w:hAnsi="Courier New" w:cs="Courier New"/>
+        </w:rPr>
+        <w:t>tstp</w:t>
       </w:r>
       <w:proofErr w:type="spellEnd"/>
       <w:r>
         <w:rPr>
           <w:rFonts w:ascii="Times New Roman" w:hAnsi="Times New Roman" w:cs="Times New Roman"/>
         </w:rPr>
-        <w:t>" vengono filtrate immediatamente per evitare errori nei calcoli matematici successivi.</w:t>
+        <w:t xml:space="preserve"> è stata convertita in </w:t>
+      </w:r>
+      <w:proofErr w:type="spellStart"/>
+      <w:r>
+        <w:rPr>
+          <w:rFonts w:ascii="Times New Roman" w:hAnsi="Times New Roman" w:cs="Times New Roman"/>
+        </w:rPr>
+        <w:t>Timestamp</w:t>
+      </w:r>
+      <w:proofErr w:type="spellEnd"/>
+      <w:r>
+        <w:rPr>
+          <w:rFonts w:ascii="Times New Roman" w:hAnsi="Times New Roman" w:cs="Times New Roman"/>
+        </w:rPr>
+        <w:t xml:space="preserve"> utilizzando un </w:t>
+      </w:r>
+      <w:proofErr w:type="spellStart"/>
+      <w:r>
+        <w:rPr>
+          <w:rFonts w:ascii="Times New Roman" w:hAnsi="Times New Roman" w:cs="Times New Roman"/>
+        </w:rPr>
+        <w:t>parsing</w:t>
+      </w:r>
+      <w:proofErr w:type="spellEnd"/>
+      <w:r>
+        <w:rPr>
+          <w:rFonts w:ascii="Times New Roman" w:hAnsi="Times New Roman" w:cs="Times New Roman"/>
+        </w:rPr>
+        <w:t xml:space="preserve"> specifico a </w:t>
+      </w:r>
+      <w:r>
+        <w:rPr>
+          <w:rFonts w:ascii="Times New Roman" w:hAnsi="Times New Roman" w:cs="Times New Roman"/>
+          <w:b/>
+          <w:bCs/>
+        </w:rPr>
+        <w:t>27 caratteri</w:t>
+      </w:r>
+      <w:r>
+        <w:rPr>
+          <w:rFonts w:ascii="Times New Roman" w:hAnsi="Times New Roman" w:cs="Times New Roman"/>
+        </w:rPr>
+        <w:t xml:space="preserve"> (scoperto in fase di EDA). Questo garantisce la precisione al microsecondo necessaria per il futuro </w:t>
+      </w:r>
+      <w:proofErr w:type="spellStart"/>
+      <w:r>
+        <w:rPr>
+          <w:rFonts w:ascii="Times New Roman" w:hAnsi="Times New Roman" w:cs="Times New Roman"/>
+          <w:i/>
+          <w:iCs/>
+        </w:rPr>
+        <w:t>Watermarking</w:t>
+      </w:r>
+      <w:proofErr w:type="spellEnd"/>
+      <w:r>
+        <w:rPr>
+          <w:rFonts w:ascii="Times New Roman" w:hAnsi="Times New Roman" w:cs="Times New Roman"/>
+        </w:rPr>
+        <w:t xml:space="preserve"> in streaming.</w:t>
       </w:r>
     </w:p>
     <w:p>
       <w:pPr>
         <w:numPr>
           <w:ilvl w:val="0"/>
-          <w:numId w:val="22"/>
+          <w:numId w:val="33"/>
         </w:numPr>
         <w:tabs>
           <w:tab w:val="clear" w:pos="720"/>
@@ -4841,77 +5015,76 @@
           <w:b/>
           <w:bCs/>
         </w:rPr>
-        <w:lastRenderedPageBreak/>
-        <w:t>Handling del "</w:t>
+        <w:t xml:space="preserve">Schema </w:t>
+      </w:r>
+      <w:r>
+        <w:rPr>
+          <w:rFonts w:ascii="Times New Roman" w:hAnsi="Times New Roman" w:cs="Times New Roman"/>
+          <w:b/>
+          <w:bCs/>
+        </w:rPr>
+        <w:t>e</w:t>
+      </w:r>
+      <w:r>
+        <w:rPr>
+          <w:rFonts w:ascii="Times New Roman" w:hAnsi="Times New Roman" w:cs="Times New Roman"/>
+          <w:b/>
+          <w:bCs/>
+        </w:rPr>
+        <w:t>nforcement</w:t>
+      </w:r>
+      <w:r>
+        <w:rPr>
+          <w:rFonts w:ascii="Times New Roman" w:hAnsi="Times New Roman" w:cs="Times New Roman"/>
+        </w:rPr>
+        <w:t xml:space="preserve">: </w:t>
+      </w:r>
+      <w:r>
+        <w:rPr>
+          <w:rFonts w:ascii="Times New Roman" w:hAnsi="Times New Roman" w:cs="Times New Roman"/>
+        </w:rPr>
+        <w:t>i</w:t>
+      </w:r>
+      <w:r>
+        <w:rPr>
+          <w:rFonts w:ascii="Times New Roman" w:hAnsi="Times New Roman" w:cs="Times New Roman"/>
+        </w:rPr>
+        <w:t xml:space="preserve">l consumo è stato </w:t>
       </w:r>
       <w:proofErr w:type="spellStart"/>
       <w:r>
         <w:rPr>
           <w:rFonts w:ascii="Times New Roman" w:hAnsi="Times New Roman" w:cs="Times New Roman"/>
-          <w:b/>
-          <w:bCs/>
-        </w:rPr>
-        <w:t>Missing</w:t>
+        </w:rPr>
+        <w:t>castato</w:t>
       </w:r>
       <w:proofErr w:type="spellEnd"/>
       <w:r>
         <w:rPr>
           <w:rFonts w:ascii="Times New Roman" w:hAnsi="Times New Roman" w:cs="Times New Roman"/>
-          <w:b/>
-          <w:bCs/>
-        </w:rPr>
-        <w:t xml:space="preserve"> Data":</w:t>
-      </w:r>
-      <w:r>
-        <w:rPr>
-          <w:rFonts w:ascii="Times New Roman" w:hAnsi="Times New Roman" w:cs="Times New Roman"/>
-        </w:rPr>
-        <w:t xml:space="preserve"> </w:t>
-      </w:r>
-      <w:r>
-        <w:rPr>
-          <w:rFonts w:ascii="Times New Roman" w:hAnsi="Times New Roman" w:cs="Times New Roman"/>
-        </w:rPr>
-        <w:t>ho</w:t>
-      </w:r>
-      <w:r>
-        <w:rPr>
-          <w:rFonts w:ascii="Times New Roman" w:hAnsi="Times New Roman" w:cs="Times New Roman"/>
-        </w:rPr>
-        <w:t xml:space="preserve"> distinto tra uno "0.0" (consumo nullo reale) e un valore mancante. I valori mancanti vengono scartati per evitare di abbassare artificialmente le medie di quartiere.</w:t>
-      </w:r>
-    </w:p>
-    <w:p>
-      <w:pPr>
-        <w:spacing w:after="0" w:line="360" w:lineRule="auto"/>
-        <w:jc w:val="both"/>
-        <w:rPr>
-          <w:rFonts w:ascii="Times New Roman" w:hAnsi="Times New Roman" w:cs="Times New Roman"/>
-        </w:rPr>
-      </w:pPr>
-    </w:p>
-    <w:p>
-      <w:pPr>
-        <w:spacing w:after="0" w:line="360" w:lineRule="auto"/>
-        <w:jc w:val="both"/>
-        <w:rPr>
-          <w:rFonts w:ascii="Times New Roman" w:hAnsi="Times New Roman" w:cs="Times New Roman"/>
-        </w:rPr>
-      </w:pPr>
-      <w:r>
-        <w:rPr>
-          <w:rFonts w:ascii="Times New Roman" w:hAnsi="Times New Roman" w:cs="Times New Roman"/>
-          <w:b/>
-          <w:bCs/>
-        </w:rPr>
-        <w:t>B. Dataset Metadati Acorn</w:t>
+        </w:rPr>
+        <w:t xml:space="preserve"> a Double. Le righe contenenti stringhe "</w:t>
+      </w:r>
+      <w:proofErr w:type="spellStart"/>
+      <w:r>
+        <w:rPr>
+          <w:rFonts w:ascii="Times New Roman" w:hAnsi="Times New Roman" w:cs="Times New Roman"/>
+        </w:rPr>
+        <w:t>Null</w:t>
+      </w:r>
+      <w:proofErr w:type="spellEnd"/>
+      <w:r>
+        <w:rPr>
+          <w:rFonts w:ascii="Times New Roman" w:hAnsi="Times New Roman" w:cs="Times New Roman"/>
+        </w:rPr>
+        <w:t>" o campi vuoti (circa lo 0,003% del totale) vengono filtrate per prevenire errori nei calcoli matematici.</w:t>
       </w:r>
     </w:p>
     <w:p>
       <w:pPr>
         <w:numPr>
           <w:ilvl w:val="0"/>
-          <w:numId w:val="23"/>
+          <w:numId w:val="33"/>
         </w:numPr>
         <w:tabs>
           <w:tab w:val="clear" w:pos="720"/>
@@ -4923,76 +5096,132 @@
           <w:rFonts w:ascii="Times New Roman" w:hAnsi="Times New Roman" w:cs="Times New Roman"/>
         </w:rPr>
       </w:pPr>
-      <w:r>
-        <w:rPr>
-          <w:rFonts w:ascii="Times New Roman" w:hAnsi="Times New Roman" w:cs="Times New Roman"/>
-          <w:b/>
-          <w:bCs/>
-        </w:rPr>
-        <w:t>Deduplicazione:</w:t>
-      </w:r>
-      <w:r>
-        <w:rPr>
-          <w:rFonts w:ascii="Times New Roman" w:hAnsi="Times New Roman" w:cs="Times New Roman"/>
+      <w:proofErr w:type="spellStart"/>
+      <w:r>
+        <w:rPr>
+          <w:rFonts w:ascii="Times New Roman" w:hAnsi="Times New Roman" w:cs="Times New Roman"/>
+          <w:b/>
+          <w:bCs/>
+        </w:rPr>
+        <w:t>Resampling</w:t>
+      </w:r>
+      <w:proofErr w:type="spellEnd"/>
+      <w:r>
+        <w:rPr>
+          <w:rFonts w:ascii="Times New Roman" w:hAnsi="Times New Roman" w:cs="Times New Roman"/>
+          <w:b/>
+          <w:bCs/>
         </w:rPr>
         <w:t xml:space="preserve"> </w:t>
       </w:r>
-      <w:r>
-        <w:rPr>
-          <w:rFonts w:ascii="Times New Roman" w:hAnsi="Times New Roman" w:cs="Times New Roman"/>
+      <w:proofErr w:type="spellStart"/>
+      <w:r>
+        <w:rPr>
+          <w:rFonts w:ascii="Times New Roman" w:hAnsi="Times New Roman" w:cs="Times New Roman"/>
+          <w:b/>
+          <w:bCs/>
         </w:rPr>
         <w:t>p</w:t>
       </w:r>
       <w:r>
         <w:rPr>
           <w:rFonts w:ascii="Times New Roman" w:hAnsi="Times New Roman" w:cs="Times New Roman"/>
-        </w:rPr>
-        <w:t xml:space="preserve">oiché un utente può comparire più volte nei metadati se ha cambiato contratto, </w:t>
-      </w:r>
-      <w:r>
-        <w:rPr>
-          <w:rFonts w:ascii="Times New Roman" w:hAnsi="Times New Roman" w:cs="Times New Roman"/>
-        </w:rPr>
-        <w:t xml:space="preserve">ho </w:t>
-      </w:r>
-      <w:r>
-        <w:rPr>
-          <w:rFonts w:ascii="Times New Roman" w:hAnsi="Times New Roman" w:cs="Times New Roman"/>
-        </w:rPr>
-        <w:t>effettu</w:t>
-      </w:r>
-      <w:r>
-        <w:rPr>
-          <w:rFonts w:ascii="Times New Roman" w:hAnsi="Times New Roman" w:cs="Times New Roman"/>
-        </w:rPr>
-        <w:t>ato</w:t>
-      </w:r>
-      <w:r>
-        <w:rPr>
-          <w:rFonts w:ascii="Times New Roman" w:hAnsi="Times New Roman" w:cs="Times New Roman"/>
-        </w:rPr>
-        <w:t xml:space="preserve"> una </w:t>
+          <w:b/>
+          <w:bCs/>
+        </w:rPr>
+        <w:t>reparation</w:t>
+      </w:r>
+      <w:proofErr w:type="spellEnd"/>
+      <w:r>
+        <w:rPr>
+          <w:rFonts w:ascii="Times New Roman" w:hAnsi="Times New Roman" w:cs="Times New Roman"/>
+        </w:rPr>
+        <w:t xml:space="preserve">: </w:t>
+      </w:r>
+      <w:r>
+        <w:rPr>
+          <w:rFonts w:ascii="Times New Roman" w:hAnsi="Times New Roman" w:cs="Times New Roman"/>
+        </w:rPr>
+        <w:t>è</w:t>
+      </w:r>
+      <w:r>
+        <w:rPr>
+          <w:rFonts w:ascii="Times New Roman" w:hAnsi="Times New Roman" w:cs="Times New Roman"/>
+        </w:rPr>
+        <w:t xml:space="preserve"> stata generata una colonna </w:t>
       </w:r>
       <w:proofErr w:type="spellStart"/>
       <w:r>
         <w:rPr>
           <w:rFonts w:ascii="Courier New" w:hAnsi="Courier New" w:cs="Courier New"/>
         </w:rPr>
-        <w:t>dropDuplicates</w:t>
+        <w:t>join_hour</w:t>
       </w:r>
       <w:proofErr w:type="spellEnd"/>
       <w:r>
         <w:rPr>
           <w:rFonts w:ascii="Times New Roman" w:hAnsi="Times New Roman" w:cs="Times New Roman"/>
         </w:rPr>
-        <w:t xml:space="preserve"> basata sull'ID utente.</w:t>
+        <w:t xml:space="preserve"> tramite la funzione </w:t>
+      </w:r>
+      <w:proofErr w:type="spellStart"/>
+      <w:r>
+        <w:rPr>
+          <w:rFonts w:ascii="Courier New" w:hAnsi="Courier New" w:cs="Courier New"/>
+        </w:rPr>
+        <w:t>date_trunc</w:t>
+      </w:r>
+      <w:proofErr w:type="spellEnd"/>
+      <w:r>
+        <w:rPr>
+          <w:rFonts w:ascii="Times New Roman" w:hAnsi="Times New Roman" w:cs="Times New Roman"/>
+        </w:rPr>
+        <w:t>, fondamentale per allineare i consumi semi-orari</w:t>
+      </w:r>
+      <w:r>
+        <w:rPr>
+          <w:rFonts w:ascii="Times New Roman" w:hAnsi="Times New Roman" w:cs="Times New Roman"/>
+        </w:rPr>
+        <w:t xml:space="preserve"> (30 minuti)</w:t>
+      </w:r>
+      <w:r>
+        <w:rPr>
+          <w:rFonts w:ascii="Times New Roman" w:hAnsi="Times New Roman" w:cs="Times New Roman"/>
+        </w:rPr>
+        <w:t xml:space="preserve"> con i dati meteo orari.</w:t>
+      </w:r>
+    </w:p>
+    <w:p>
+      <w:pPr>
+        <w:spacing w:after="0" w:line="360" w:lineRule="auto"/>
+        <w:jc w:val="both"/>
+        <w:rPr>
+          <w:rFonts w:ascii="Times New Roman" w:hAnsi="Times New Roman" w:cs="Times New Roman"/>
+        </w:rPr>
+      </w:pPr>
+    </w:p>
+    <w:p>
+      <w:pPr>
+        <w:spacing w:after="0" w:line="360" w:lineRule="auto"/>
+        <w:jc w:val="both"/>
+        <w:rPr>
+          <w:rFonts w:ascii="Times New Roman" w:hAnsi="Times New Roman" w:cs="Times New Roman"/>
+        </w:rPr>
+      </w:pPr>
+      <w:r>
+        <w:rPr>
+          <w:rFonts w:ascii="Times New Roman" w:hAnsi="Times New Roman" w:cs="Times New Roman"/>
+          <w:b/>
+          <w:bCs/>
+        </w:rPr>
+        <w:t>B. Dataset Metadati Acorn</w:t>
       </w:r>
     </w:p>
     <w:p>
       <w:pPr>
         <w:numPr>
           <w:ilvl w:val="0"/>
-          <w:numId w:val="23"/>
+          <w:numId w:val="34"/>
         </w:numPr>
         <w:tabs>
           <w:tab w:val="clear" w:pos="720"/>
@@ -5010,148 +5239,76 @@
           <w:b/>
           <w:bCs/>
         </w:rPr>
-        <w:t xml:space="preserve">Mapping </w:t>
-      </w:r>
-      <w:r>
-        <w:rPr>
-          <w:rFonts w:ascii="Times New Roman" w:hAnsi="Times New Roman" w:cs="Times New Roman"/>
-          <w:b/>
-          <w:bCs/>
-        </w:rPr>
-        <w:t>c</w:t>
-      </w:r>
-      <w:r>
-        <w:rPr>
-          <w:rFonts w:ascii="Times New Roman" w:hAnsi="Times New Roman" w:cs="Times New Roman"/>
-          <w:b/>
-          <w:bCs/>
-        </w:rPr>
-        <w:t>ategoriale:</w:t>
-      </w:r>
-      <w:r>
-        <w:rPr>
-          <w:rFonts w:ascii="Times New Roman" w:hAnsi="Times New Roman" w:cs="Times New Roman"/>
-        </w:rPr>
-        <w:t xml:space="preserve"> </w:t>
-      </w:r>
-      <w:r>
-        <w:rPr>
-          <w:rFonts w:ascii="Times New Roman" w:hAnsi="Times New Roman" w:cs="Times New Roman"/>
-        </w:rPr>
-        <w:t>p</w:t>
-      </w:r>
-      <w:r>
-        <w:rPr>
-          <w:rFonts w:ascii="Times New Roman" w:hAnsi="Times New Roman" w:cs="Times New Roman"/>
-        </w:rPr>
-        <w:t>er ottimizzare le performance, i gruppi Acorn (es. "</w:t>
+        <w:t xml:space="preserve">Integrità </w:t>
+      </w:r>
+      <w:r>
+        <w:rPr>
+          <w:rFonts w:ascii="Times New Roman" w:hAnsi="Times New Roman" w:cs="Times New Roman"/>
+          <w:b/>
+          <w:bCs/>
+        </w:rPr>
+        <w:t>r</w:t>
+      </w:r>
+      <w:r>
+        <w:rPr>
+          <w:rFonts w:ascii="Times New Roman" w:hAnsi="Times New Roman" w:cs="Times New Roman"/>
+          <w:b/>
+          <w:bCs/>
+        </w:rPr>
+        <w:t>eferenziale</w:t>
+      </w:r>
+      <w:r>
+        <w:rPr>
+          <w:rFonts w:ascii="Times New Roman" w:hAnsi="Times New Roman" w:cs="Times New Roman"/>
+        </w:rPr>
+        <w:t xml:space="preserve">: </w:t>
+      </w:r>
+      <w:r>
+        <w:rPr>
+          <w:rFonts w:ascii="Times New Roman" w:hAnsi="Times New Roman" w:cs="Times New Roman"/>
+        </w:rPr>
+        <w:t>è</w:t>
+      </w:r>
+      <w:r>
+        <w:rPr>
+          <w:rFonts w:ascii="Times New Roman" w:hAnsi="Times New Roman" w:cs="Times New Roman"/>
+        </w:rPr>
+        <w:t xml:space="preserve"> stata applicata una </w:t>
       </w:r>
       <w:proofErr w:type="spellStart"/>
       <w:r>
         <w:rPr>
-          <w:rFonts w:ascii="Times New Roman" w:hAnsi="Times New Roman" w:cs="Times New Roman"/>
-        </w:rPr>
-        <w:t>Affluent</w:t>
+          <w:rFonts w:ascii="Courier New" w:hAnsi="Courier New" w:cs="Courier New"/>
+        </w:rPr>
+        <w:t>dropDuplicates</w:t>
       </w:r>
       <w:proofErr w:type="spellEnd"/>
       <w:r>
         <w:rPr>
           <w:rFonts w:ascii="Times New Roman" w:hAnsi="Times New Roman" w:cs="Times New Roman"/>
         </w:rPr>
-        <w:t>", "</w:t>
-      </w:r>
-      <w:proofErr w:type="spellStart"/>
-      <w:r>
-        <w:rPr>
-          <w:rFonts w:ascii="Times New Roman" w:hAnsi="Times New Roman" w:cs="Times New Roman"/>
-        </w:rPr>
-        <w:t>Adversity</w:t>
-      </w:r>
-      <w:proofErr w:type="spellEnd"/>
-      <w:r>
-        <w:rPr>
-          <w:rFonts w:ascii="Times New Roman" w:hAnsi="Times New Roman" w:cs="Times New Roman"/>
-        </w:rPr>
-        <w:t xml:space="preserve">") vengono preparati per </w:t>
+        <w:t xml:space="preserve"> preventiva sull'ID utente come misura di sicurezza per garantire un rapporto 1:1 durante </w:t>
       </w:r>
       <w:proofErr w:type="gramStart"/>
       <w:r>
         <w:rPr>
           <w:rFonts w:ascii="Times New Roman" w:hAnsi="Times New Roman" w:cs="Times New Roman"/>
         </w:rPr>
-        <w:t>un join</w:t>
+        <w:t>il join</w:t>
       </w:r>
       <w:proofErr w:type="gramEnd"/>
       <w:r>
         <w:rPr>
           <w:rFonts w:ascii="Times New Roman" w:hAnsi="Times New Roman" w:cs="Times New Roman"/>
         </w:rPr>
-        <w:t xml:space="preserve"> di tipo </w:t>
-      </w:r>
-      <w:r>
-        <w:rPr>
-          <w:rFonts w:ascii="Times New Roman" w:hAnsi="Times New Roman" w:cs="Times New Roman"/>
-          <w:i/>
-          <w:iCs/>
-        </w:rPr>
-        <w:t>Broadcast</w:t>
-      </w:r>
-      <w:r>
-        <w:rPr>
-          <w:rFonts w:ascii="Times New Roman" w:hAnsi="Times New Roman" w:cs="Times New Roman"/>
-        </w:rPr>
-        <w:t>. Essendo un dataset piccolo rispetto ai consumi, Spark lo invierà in ogni nodo del cluster, evitando costosi spostamenti di dati in rete (Shuffle).</w:t>
-      </w:r>
-    </w:p>
-    <w:p>
-      <w:pPr>
-        <w:spacing w:after="0" w:line="360" w:lineRule="auto"/>
-        <w:jc w:val="both"/>
-        <w:rPr>
-          <w:rFonts w:ascii="Times New Roman" w:hAnsi="Times New Roman" w:cs="Times New Roman"/>
-        </w:rPr>
-      </w:pPr>
-    </w:p>
-    <w:p>
-      <w:pPr>
-        <w:spacing w:after="0" w:line="360" w:lineRule="auto"/>
-        <w:jc w:val="both"/>
-        <w:rPr>
-          <w:rFonts w:ascii="Times New Roman" w:hAnsi="Times New Roman" w:cs="Times New Roman"/>
-        </w:rPr>
-      </w:pPr>
-      <w:r>
-        <w:rPr>
-          <w:rFonts w:ascii="Times New Roman" w:hAnsi="Times New Roman" w:cs="Times New Roman"/>
-          <w:b/>
-          <w:bCs/>
-        </w:rPr>
-        <w:t xml:space="preserve">C. Dataset </w:t>
-      </w:r>
-      <w:proofErr w:type="spellStart"/>
-      <w:r>
-        <w:rPr>
-          <w:rFonts w:ascii="Times New Roman" w:hAnsi="Times New Roman" w:cs="Times New Roman"/>
-          <w:b/>
-          <w:bCs/>
-        </w:rPr>
-        <w:t>Weather</w:t>
-      </w:r>
-      <w:proofErr w:type="spellEnd"/>
-      <w:r>
-        <w:rPr>
-          <w:rFonts w:ascii="Times New Roman" w:hAnsi="Times New Roman" w:cs="Times New Roman"/>
-          <w:b/>
-          <w:bCs/>
-        </w:rPr>
-        <w:t xml:space="preserve"> (Dati Contestuali):</w:t>
+        <w:t>.</w:t>
       </w:r>
     </w:p>
     <w:p>
       <w:pPr>
         <w:numPr>
           <w:ilvl w:val="0"/>
-          <w:numId w:val="24"/>
+          <w:numId w:val="34"/>
         </w:numPr>
         <w:tabs>
           <w:tab w:val="clear" w:pos="720"/>
@@ -5163,97 +5320,61 @@
           <w:rFonts w:ascii="Times New Roman" w:hAnsi="Times New Roman" w:cs="Times New Roman"/>
         </w:rPr>
       </w:pPr>
-      <w:proofErr w:type="spellStart"/>
-      <w:r>
-        <w:rPr>
-          <w:rFonts w:ascii="Times New Roman" w:hAnsi="Times New Roman" w:cs="Times New Roman"/>
-          <w:b/>
-          <w:bCs/>
-        </w:rPr>
-        <w:t>Resampling</w:t>
-      </w:r>
-      <w:proofErr w:type="spellEnd"/>
-      <w:r>
-        <w:rPr>
-          <w:rFonts w:ascii="Times New Roman" w:hAnsi="Times New Roman" w:cs="Times New Roman"/>
-          <w:b/>
-          <w:bCs/>
-        </w:rPr>
-        <w:t xml:space="preserve"> </w:t>
-      </w:r>
-      <w:r>
-        <w:rPr>
-          <w:rFonts w:ascii="Times New Roman" w:hAnsi="Times New Roman" w:cs="Times New Roman"/>
-          <w:b/>
-          <w:bCs/>
-        </w:rPr>
-        <w:t>t</w:t>
-      </w:r>
-      <w:r>
-        <w:rPr>
-          <w:rFonts w:ascii="Times New Roman" w:hAnsi="Times New Roman" w:cs="Times New Roman"/>
-          <w:b/>
-          <w:bCs/>
-        </w:rPr>
-        <w:t>emporale:</w:t>
-      </w:r>
-      <w:r>
-        <w:rPr>
-          <w:rFonts w:ascii="Times New Roman" w:hAnsi="Times New Roman" w:cs="Times New Roman"/>
-        </w:rPr>
-        <w:t xml:space="preserve"> </w:t>
-      </w:r>
-      <w:r>
-        <w:rPr>
-          <w:rFonts w:ascii="Times New Roman" w:hAnsi="Times New Roman" w:cs="Times New Roman"/>
-        </w:rPr>
-        <w:t>i</w:t>
-      </w:r>
-      <w:r>
-        <w:rPr>
-          <w:rFonts w:ascii="Times New Roman" w:hAnsi="Times New Roman" w:cs="Times New Roman"/>
-        </w:rPr>
-        <w:t xml:space="preserve">l dataset meteo è orario, mentre i consumi sono semi-orari (ogni 30 minuti). Durante il </w:t>
-      </w:r>
-      <w:proofErr w:type="spellStart"/>
-      <w:r>
-        <w:rPr>
-          <w:rFonts w:ascii="Times New Roman" w:hAnsi="Times New Roman" w:cs="Times New Roman"/>
-        </w:rPr>
-        <w:t>preprocessing</w:t>
-      </w:r>
-      <w:proofErr w:type="spellEnd"/>
-      <w:r>
-        <w:rPr>
-          <w:rFonts w:ascii="Times New Roman" w:hAnsi="Times New Roman" w:cs="Times New Roman"/>
-        </w:rPr>
-        <w:t xml:space="preserve">, </w:t>
-      </w:r>
-      <w:r>
-        <w:rPr>
-          <w:rFonts w:ascii="Times New Roman" w:hAnsi="Times New Roman" w:cs="Times New Roman"/>
-        </w:rPr>
-        <w:t>ho</w:t>
-      </w:r>
-      <w:r>
-        <w:rPr>
-          <w:rFonts w:ascii="Times New Roman" w:hAnsi="Times New Roman" w:cs="Times New Roman"/>
-        </w:rPr>
-        <w:t xml:space="preserve"> preparato la logica di join per "</w:t>
-      </w:r>
-      <w:proofErr w:type="spellStart"/>
-      <w:r>
-        <w:rPr>
-          <w:rFonts w:ascii="Times New Roman" w:hAnsi="Times New Roman" w:cs="Times New Roman"/>
-        </w:rPr>
-        <w:t>propogare</w:t>
-      </w:r>
-      <w:proofErr w:type="spellEnd"/>
-      <w:r>
-        <w:rPr>
-          <w:rFonts w:ascii="Times New Roman" w:hAnsi="Times New Roman" w:cs="Times New Roman"/>
-        </w:rPr>
-        <w:t>" la temperatura di un'ora su entrambe le letture di consumo corrispondenti a quell'arco temporale.</w:t>
+      <w:r>
+        <w:rPr>
+          <w:rFonts w:ascii="Times New Roman" w:hAnsi="Times New Roman" w:cs="Times New Roman"/>
+          <w:b/>
+          <w:bCs/>
+        </w:rPr>
+        <w:t xml:space="preserve">Filtraggio </w:t>
+      </w:r>
+      <w:r>
+        <w:rPr>
+          <w:rFonts w:ascii="Times New Roman" w:hAnsi="Times New Roman" w:cs="Times New Roman"/>
+          <w:b/>
+          <w:bCs/>
+        </w:rPr>
+        <w:t>c</w:t>
+      </w:r>
+      <w:r>
+        <w:rPr>
+          <w:rFonts w:ascii="Times New Roman" w:hAnsi="Times New Roman" w:cs="Times New Roman"/>
+          <w:b/>
+          <w:bCs/>
+        </w:rPr>
+        <w:t>ategoriale</w:t>
+      </w:r>
+      <w:r>
+        <w:rPr>
+          <w:rFonts w:ascii="Times New Roman" w:hAnsi="Times New Roman" w:cs="Times New Roman"/>
+        </w:rPr>
+        <w:t xml:space="preserve">: </w:t>
+      </w:r>
+      <w:r>
+        <w:rPr>
+          <w:rFonts w:ascii="Times New Roman" w:hAnsi="Times New Roman" w:cs="Times New Roman"/>
+        </w:rPr>
+        <w:t>s</w:t>
+      </w:r>
+      <w:r>
+        <w:rPr>
+          <w:rFonts w:ascii="Times New Roman" w:hAnsi="Times New Roman" w:cs="Times New Roman"/>
+        </w:rPr>
+        <w:t xml:space="preserve">ono state rimosse le categorie non informative (ACORN-U, ACORN-) per mantenere la purezza statistica dei gruppi </w:t>
+      </w:r>
+      <w:proofErr w:type="gramStart"/>
+      <w:r>
+        <w:rPr>
+          <w:rFonts w:ascii="Times New Roman" w:hAnsi="Times New Roman" w:cs="Times New Roman"/>
+        </w:rPr>
+        <w:t>socio-economici</w:t>
+      </w:r>
+      <w:proofErr w:type="gramEnd"/>
+      <w:r>
+        <w:rPr>
+          <w:rFonts w:ascii="Times New Roman" w:hAnsi="Times New Roman" w:cs="Times New Roman"/>
+        </w:rPr>
+        <w:t>.</w:t>
       </w:r>
     </w:p>
     <w:p>
@@ -5262,31 +5383,41 @@
         <w:jc w:val="both"/>
         <w:rPr>
           <w:rFonts w:ascii="Times New Roman" w:hAnsi="Times New Roman" w:cs="Times New Roman"/>
-          <w:b/>
-          <w:bCs/>
-        </w:rPr>
-      </w:pPr>
-    </w:p>
-    <w:p>
-      <w:pPr>
-        <w:spacing w:after="0" w:line="360" w:lineRule="auto"/>
-        <w:jc w:val="both"/>
-        <w:rPr>
-          <w:rFonts w:ascii="Times New Roman" w:hAnsi="Times New Roman" w:cs="Times New Roman"/>
-        </w:rPr>
-      </w:pPr>
-      <w:r>
-        <w:rPr>
-          <w:rFonts w:ascii="Times New Roman" w:hAnsi="Times New Roman" w:cs="Times New Roman"/>
-        </w:rPr>
-        <w:t>Per non saturare la memoria in questa fase:</w:t>
+        </w:rPr>
+      </w:pPr>
+      <w:r>
+        <w:rPr>
+          <w:rFonts w:ascii="Times New Roman" w:hAnsi="Times New Roman" w:cs="Times New Roman"/>
+          <w:b/>
+          <w:bCs/>
+        </w:rPr>
+        <w:lastRenderedPageBreak/>
+        <w:t xml:space="preserve">C. Dataset </w:t>
+      </w:r>
+      <w:proofErr w:type="spellStart"/>
+      <w:r>
+        <w:rPr>
+          <w:rFonts w:ascii="Times New Roman" w:hAnsi="Times New Roman" w:cs="Times New Roman"/>
+          <w:b/>
+          <w:bCs/>
+        </w:rPr>
+        <w:t>Weather</w:t>
+      </w:r>
+      <w:proofErr w:type="spellEnd"/>
+      <w:r>
+        <w:rPr>
+          <w:rFonts w:ascii="Times New Roman" w:hAnsi="Times New Roman" w:cs="Times New Roman"/>
+          <w:b/>
+          <w:bCs/>
+        </w:rPr>
+        <w:t xml:space="preserve"> (Dati Contestuali)</w:t>
       </w:r>
     </w:p>
     <w:p>
       <w:pPr>
         <w:numPr>
           <w:ilvl w:val="0"/>
-          <w:numId w:val="25"/>
+          <w:numId w:val="35"/>
         </w:numPr>
         <w:tabs>
           <w:tab w:val="clear" w:pos="720"/>
@@ -5304,46 +5435,104 @@
           <w:b/>
           <w:bCs/>
         </w:rPr>
-        <w:t>Uso di Parquet/Delta:</w:t>
-      </w:r>
-      <w:r>
-        <w:rPr>
-          <w:rFonts w:ascii="Times New Roman" w:hAnsi="Times New Roman" w:cs="Times New Roman"/>
-        </w:rPr>
-        <w:t xml:space="preserve"> </w:t>
-      </w:r>
-      <w:r>
-        <w:rPr>
-          <w:rFonts w:ascii="Times New Roman" w:hAnsi="Times New Roman" w:cs="Times New Roman"/>
-        </w:rPr>
-        <w:t>i</w:t>
-      </w:r>
-      <w:r>
-        <w:rPr>
-          <w:rFonts w:ascii="Times New Roman" w:hAnsi="Times New Roman" w:cs="Times New Roman"/>
-        </w:rPr>
-        <w:t xml:space="preserve">n fase di test, i dati puliti non vengono salvati in CSV (lento e pesante), ma convertiti nel formato </w:t>
-      </w:r>
-      <w:r>
-        <w:rPr>
-          <w:rFonts w:ascii="Times New Roman" w:hAnsi="Times New Roman" w:cs="Times New Roman"/>
-          <w:b/>
-          <w:bCs/>
-        </w:rPr>
-        <w:t>Parquet</w:t>
-      </w:r>
-      <w:r>
-        <w:rPr>
-          <w:rFonts w:ascii="Times New Roman" w:hAnsi="Times New Roman" w:cs="Times New Roman"/>
-        </w:rPr>
-        <w:t>. Questo formato "colonnare" permette a Spark di leggere solo le parti del file necessarie, riducendo l'I/O del disco fino all'80%.</w:t>
+        <w:t xml:space="preserve">Feature </w:t>
+      </w:r>
+      <w:proofErr w:type="spellStart"/>
+      <w:r>
+        <w:rPr>
+          <w:rFonts w:ascii="Times New Roman" w:hAnsi="Times New Roman" w:cs="Times New Roman"/>
+          <w:b/>
+          <w:bCs/>
+        </w:rPr>
+        <w:t>s</w:t>
+      </w:r>
+      <w:r>
+        <w:rPr>
+          <w:rFonts w:ascii="Times New Roman" w:hAnsi="Times New Roman" w:cs="Times New Roman"/>
+          <w:b/>
+          <w:bCs/>
+        </w:rPr>
+        <w:t>election</w:t>
+      </w:r>
+      <w:proofErr w:type="spellEnd"/>
+      <w:r>
+        <w:rPr>
+          <w:rFonts w:ascii="Times New Roman" w:hAnsi="Times New Roman" w:cs="Times New Roman"/>
+        </w:rPr>
+        <w:t xml:space="preserve">: </w:t>
+      </w:r>
+      <w:r>
+        <w:rPr>
+          <w:rFonts w:ascii="Times New Roman" w:hAnsi="Times New Roman" w:cs="Times New Roman"/>
+        </w:rPr>
+        <w:t>s</w:t>
+      </w:r>
+      <w:r>
+        <w:rPr>
+          <w:rFonts w:ascii="Times New Roman" w:hAnsi="Times New Roman" w:cs="Times New Roman"/>
+        </w:rPr>
+        <w:t xml:space="preserve">ono state selezionate solo le variabili con impatto provato sul consumo energetico: </w:t>
+      </w:r>
+      <w:r>
+        <w:rPr>
+          <w:rFonts w:ascii="Courier New" w:hAnsi="Courier New" w:cs="Courier New"/>
+        </w:rPr>
+        <w:t>temperature</w:t>
+      </w:r>
+      <w:r>
+        <w:rPr>
+          <w:rFonts w:ascii="Times New Roman" w:hAnsi="Times New Roman" w:cs="Times New Roman"/>
+        </w:rPr>
+        <w:t xml:space="preserve">, </w:t>
+      </w:r>
+      <w:proofErr w:type="spellStart"/>
+      <w:r>
+        <w:rPr>
+          <w:rFonts w:ascii="Courier New" w:hAnsi="Courier New" w:cs="Courier New"/>
+        </w:rPr>
+        <w:t>apparentTemperature</w:t>
+      </w:r>
+      <w:proofErr w:type="spellEnd"/>
+      <w:r>
+        <w:rPr>
+          <w:rFonts w:ascii="Times New Roman" w:hAnsi="Times New Roman" w:cs="Times New Roman"/>
+        </w:rPr>
+        <w:t xml:space="preserve"> (percepita), </w:t>
+      </w:r>
+      <w:proofErr w:type="spellStart"/>
+      <w:r>
+        <w:rPr>
+          <w:rFonts w:ascii="Courier New" w:hAnsi="Courier New" w:cs="Courier New"/>
+        </w:rPr>
+        <w:t>humidity</w:t>
+      </w:r>
+      <w:proofErr w:type="spellEnd"/>
+      <w:r>
+        <w:rPr>
+          <w:rFonts w:ascii="Times New Roman" w:hAnsi="Times New Roman" w:cs="Times New Roman"/>
+        </w:rPr>
+        <w:t xml:space="preserve"> e </w:t>
+      </w:r>
+      <w:proofErr w:type="spellStart"/>
+      <w:r>
+        <w:rPr>
+          <w:rFonts w:ascii="Courier New" w:hAnsi="Courier New" w:cs="Courier New"/>
+        </w:rPr>
+        <w:t>precipType</w:t>
+      </w:r>
+      <w:proofErr w:type="spellEnd"/>
+      <w:r>
+        <w:rPr>
+          <w:rFonts w:ascii="Times New Roman" w:hAnsi="Times New Roman" w:cs="Times New Roman"/>
+        </w:rPr>
+        <w:t>.</w:t>
       </w:r>
     </w:p>
     <w:p>
       <w:pPr>
         <w:numPr>
           <w:ilvl w:val="0"/>
-          <w:numId w:val="25"/>
+          <w:numId w:val="35"/>
         </w:numPr>
         <w:tabs>
           <w:tab w:val="clear" w:pos="720"/>
@@ -5355,41 +5544,331 @@
           <w:rFonts w:ascii="Times New Roman" w:hAnsi="Times New Roman" w:cs="Times New Roman"/>
         </w:rPr>
       </w:pPr>
+      <w:r>
+        <w:rPr>
+          <w:rFonts w:ascii="Times New Roman" w:hAnsi="Times New Roman" w:cs="Times New Roman"/>
+          <w:b/>
+          <w:bCs/>
+        </w:rPr>
+        <w:t xml:space="preserve">Allineamento </w:t>
+      </w:r>
+      <w:r>
+        <w:rPr>
+          <w:rFonts w:ascii="Times New Roman" w:hAnsi="Times New Roman" w:cs="Times New Roman"/>
+          <w:b/>
+          <w:bCs/>
+        </w:rPr>
+        <w:t>t</w:t>
+      </w:r>
+      <w:r>
+        <w:rPr>
+          <w:rFonts w:ascii="Times New Roman" w:hAnsi="Times New Roman" w:cs="Times New Roman"/>
+          <w:b/>
+          <w:bCs/>
+        </w:rPr>
+        <w:t>emporale</w:t>
+      </w:r>
+      <w:r>
+        <w:rPr>
+          <w:rFonts w:ascii="Times New Roman" w:hAnsi="Times New Roman" w:cs="Times New Roman"/>
+        </w:rPr>
+        <w:t xml:space="preserve">: </w:t>
+      </w:r>
+      <w:r>
+        <w:rPr>
+          <w:rFonts w:ascii="Times New Roman" w:hAnsi="Times New Roman" w:cs="Times New Roman"/>
+        </w:rPr>
+        <w:t>t</w:t>
+      </w:r>
+      <w:r>
+        <w:rPr>
+          <w:rFonts w:ascii="Times New Roman" w:hAnsi="Times New Roman" w:cs="Times New Roman"/>
+        </w:rPr>
+        <w:t xml:space="preserve">ramite un </w:t>
+      </w:r>
+      <w:r>
+        <w:rPr>
+          <w:rFonts w:ascii="Times New Roman" w:hAnsi="Times New Roman" w:cs="Times New Roman"/>
+          <w:i/>
+          <w:iCs/>
+        </w:rPr>
+        <w:t>Left Join</w:t>
+      </w:r>
+      <w:r>
+        <w:rPr>
+          <w:rFonts w:ascii="Times New Roman" w:hAnsi="Times New Roman" w:cs="Times New Roman"/>
+        </w:rPr>
+        <w:t xml:space="preserve"> sulla colonna troncata all'ora, ogni lettura di consumo è stata arricchita con le condizioni climatiche del momento, garantendo la persistenza del dato di consumo anche in caso di mancanze temporanee nel set meteorologico.</w:t>
+      </w:r>
+    </w:p>
+    <w:p>
+      <w:pPr>
+        <w:spacing w:after="0" w:line="360" w:lineRule="auto"/>
+        <w:jc w:val="both"/>
+        <w:rPr>
+          <w:rFonts w:ascii="Times New Roman" w:hAnsi="Times New Roman" w:cs="Times New Roman"/>
+        </w:rPr>
+      </w:pPr>
+    </w:p>
+    <w:p>
+      <w:pPr>
+        <w:spacing w:after="0" w:line="360" w:lineRule="auto"/>
+        <w:jc w:val="both"/>
+        <w:rPr>
+          <w:rFonts w:ascii="Times New Roman" w:hAnsi="Times New Roman" w:cs="Times New Roman"/>
+          <w:b/>
+          <w:bCs/>
+        </w:rPr>
+      </w:pPr>
+      <w:r>
+        <w:rPr>
+          <w:rFonts w:ascii="Times New Roman" w:hAnsi="Times New Roman" w:cs="Times New Roman"/>
+          <w:b/>
+          <w:bCs/>
+        </w:rPr>
+        <w:t>Persistenza nel Silver Layer (Delta Lake)</w:t>
+      </w:r>
+    </w:p>
+    <w:p>
+      <w:pPr>
+        <w:spacing w:after="0" w:line="360" w:lineRule="auto"/>
+        <w:jc w:val="both"/>
+        <w:rPr>
+          <w:rFonts w:ascii="Times New Roman" w:hAnsi="Times New Roman" w:cs="Times New Roman"/>
+        </w:rPr>
+      </w:pPr>
+      <w:r>
+        <w:rPr>
+          <w:rFonts w:ascii="Times New Roman" w:hAnsi="Times New Roman" w:cs="Times New Roman"/>
+        </w:rPr>
+        <w:t xml:space="preserve">Il risultato finale è stato </w:t>
+      </w:r>
+      <w:r>
+        <w:rPr>
+          <w:rFonts w:ascii="Times New Roman" w:hAnsi="Times New Roman" w:cs="Times New Roman"/>
+        </w:rPr>
+        <w:t>salvato</w:t>
+      </w:r>
+      <w:r>
+        <w:rPr>
+          <w:rFonts w:ascii="Times New Roman" w:hAnsi="Times New Roman" w:cs="Times New Roman"/>
+        </w:rPr>
+        <w:t xml:space="preserve"> in formato </w:t>
+      </w:r>
+      <w:r>
+        <w:rPr>
+          <w:rFonts w:ascii="Times New Roman" w:hAnsi="Times New Roman" w:cs="Times New Roman"/>
+          <w:b/>
+          <w:bCs/>
+        </w:rPr>
+        <w:t>Delta Lake</w:t>
+      </w:r>
+      <w:r>
+        <w:rPr>
+          <w:rFonts w:ascii="Times New Roman" w:hAnsi="Times New Roman" w:cs="Times New Roman"/>
+        </w:rPr>
+        <w:t xml:space="preserve">. A differenza del semplice Parquet, questa scelta ha richiesto una configurazione specifica della </w:t>
+      </w:r>
       <w:proofErr w:type="spellStart"/>
       <w:r>
         <w:rPr>
           <w:rFonts w:ascii="Times New Roman" w:hAnsi="Times New Roman" w:cs="Times New Roman"/>
-          <w:b/>
-          <w:bCs/>
-        </w:rPr>
-        <w:t>Lazy</w:t>
+        </w:rPr>
+        <w:t>SparkSession</w:t>
       </w:r>
       <w:proofErr w:type="spellEnd"/>
       <w:r>
         <w:rPr>
           <w:rFonts w:ascii="Times New Roman" w:hAnsi="Times New Roman" w:cs="Times New Roman"/>
-          <w:b/>
-          <w:bCs/>
-        </w:rPr>
-        <w:t xml:space="preserve"> Evaluation:</w:t>
-      </w:r>
-      <w:r>
-        <w:rPr>
-          <w:rFonts w:ascii="Times New Roman" w:hAnsi="Times New Roman" w:cs="Times New Roman"/>
-        </w:rPr>
-        <w:t xml:space="preserve"> </w:t>
-      </w:r>
-      <w:r>
-        <w:rPr>
-          <w:rFonts w:ascii="Times New Roman" w:hAnsi="Times New Roman" w:cs="Times New Roman"/>
-        </w:rPr>
-        <w:t>t</w:t>
-      </w:r>
-      <w:r>
-        <w:rPr>
-          <w:rFonts w:ascii="Times New Roman" w:hAnsi="Times New Roman" w:cs="Times New Roman"/>
-        </w:rPr>
-        <w:t>utte le trasformazioni descritte sopra non vengono eseguite finché non viene richiesta un'azione (come il salvataggio o l'invio a Kafka). Questo permette a Spark di creare un piano d'esecuzione ottimizzato che accorpa più filtri in un unico passaggio.</w:t>
+        </w:rPr>
+        <w:t xml:space="preserve"> (tramite </w:t>
+      </w:r>
+      <w:proofErr w:type="spellStart"/>
+      <w:r>
+        <w:rPr>
+          <w:rFonts w:ascii="Times New Roman" w:hAnsi="Times New Roman" w:cs="Times New Roman"/>
+        </w:rPr>
+        <w:t>DeltaSparkSessionExtension</w:t>
+      </w:r>
+      <w:proofErr w:type="spellEnd"/>
+      <w:r>
+        <w:rPr>
+          <w:rFonts w:ascii="Times New Roman" w:hAnsi="Times New Roman" w:cs="Times New Roman"/>
+        </w:rPr>
+        <w:t xml:space="preserve"> e </w:t>
+      </w:r>
+      <w:proofErr w:type="spellStart"/>
+      <w:r>
+        <w:rPr>
+          <w:rFonts w:ascii="Times New Roman" w:hAnsi="Times New Roman" w:cs="Times New Roman"/>
+        </w:rPr>
+        <w:t>DeltaCatalog</w:t>
+      </w:r>
+      <w:proofErr w:type="spellEnd"/>
+      <w:r>
+        <w:rPr>
+          <w:rFonts w:ascii="Times New Roman" w:hAnsi="Times New Roman" w:cs="Times New Roman"/>
+        </w:rPr>
+        <w:t>) per abilitare le seguenti funzionalità:</w:t>
+      </w:r>
+    </w:p>
+    <w:p>
+      <w:pPr>
+        <w:numPr>
+          <w:ilvl w:val="0"/>
+          <w:numId w:val="36"/>
+        </w:numPr>
+        <w:tabs>
+          <w:tab w:val="clear" w:pos="720"/>
+        </w:tabs>
+        <w:spacing w:after="0" w:line="360" w:lineRule="auto"/>
+        <w:ind w:left="284" w:hanging="284"/>
+        <w:jc w:val="both"/>
+        <w:rPr>
+          <w:rFonts w:ascii="Times New Roman" w:hAnsi="Times New Roman" w:cs="Times New Roman"/>
+        </w:rPr>
+      </w:pPr>
+      <w:r>
+        <w:rPr>
+          <w:rFonts w:ascii="Times New Roman" w:hAnsi="Times New Roman" w:cs="Times New Roman"/>
+          <w:b/>
+          <w:bCs/>
+        </w:rPr>
+        <w:t>Garanzie ACID</w:t>
+      </w:r>
+      <w:r>
+        <w:rPr>
+          <w:rFonts w:ascii="Times New Roman" w:hAnsi="Times New Roman" w:cs="Times New Roman"/>
+        </w:rPr>
+        <w:t xml:space="preserve">: </w:t>
+      </w:r>
+      <w:r>
+        <w:rPr>
+          <w:rFonts w:ascii="Times New Roman" w:hAnsi="Times New Roman" w:cs="Times New Roman"/>
+        </w:rPr>
+        <w:t>p</w:t>
+      </w:r>
+      <w:r>
+        <w:rPr>
+          <w:rFonts w:ascii="Times New Roman" w:hAnsi="Times New Roman" w:cs="Times New Roman"/>
+        </w:rPr>
+        <w:t>rotezione contro scritture parziali o corruzioni in caso di crash durante l'elaborazione dei 167 milioni di righe.</w:t>
+      </w:r>
+    </w:p>
+    <w:p>
+      <w:pPr>
+        <w:numPr>
+          <w:ilvl w:val="0"/>
+          <w:numId w:val="36"/>
+        </w:numPr>
+        <w:tabs>
+          <w:tab w:val="clear" w:pos="720"/>
+        </w:tabs>
+        <w:spacing w:after="0" w:line="360" w:lineRule="auto"/>
+        <w:ind w:left="284" w:hanging="284"/>
+        <w:jc w:val="both"/>
+        <w:rPr>
+          <w:rFonts w:ascii="Times New Roman" w:hAnsi="Times New Roman" w:cs="Times New Roman"/>
+        </w:rPr>
+      </w:pPr>
+      <w:r>
+        <w:rPr>
+          <w:rFonts w:ascii="Times New Roman" w:hAnsi="Times New Roman" w:cs="Times New Roman"/>
+          <w:b/>
+          <w:bCs/>
+        </w:rPr>
+        <w:t xml:space="preserve">Schema </w:t>
+      </w:r>
+      <w:r>
+        <w:rPr>
+          <w:rFonts w:ascii="Times New Roman" w:hAnsi="Times New Roman" w:cs="Times New Roman"/>
+          <w:b/>
+          <w:bCs/>
+        </w:rPr>
+        <w:t>e</w:t>
+      </w:r>
+      <w:r>
+        <w:rPr>
+          <w:rFonts w:ascii="Times New Roman" w:hAnsi="Times New Roman" w:cs="Times New Roman"/>
+          <w:b/>
+          <w:bCs/>
+        </w:rPr>
+        <w:t>nforcement</w:t>
+      </w:r>
+      <w:r>
+        <w:rPr>
+          <w:rFonts w:ascii="Times New Roman" w:hAnsi="Times New Roman" w:cs="Times New Roman"/>
+        </w:rPr>
+        <w:t xml:space="preserve">: </w:t>
+      </w:r>
+      <w:r>
+        <w:rPr>
+          <w:rFonts w:ascii="Times New Roman" w:hAnsi="Times New Roman" w:cs="Times New Roman"/>
+        </w:rPr>
+        <w:t>g</w:t>
+      </w:r>
+      <w:r>
+        <w:rPr>
+          <w:rFonts w:ascii="Times New Roman" w:hAnsi="Times New Roman" w:cs="Times New Roman"/>
+        </w:rPr>
+        <w:t>aranzia che ogni scrittura futura rispetti rigorosamente i tipi di dato definiti.</w:t>
+      </w:r>
+    </w:p>
+    <w:p>
+      <w:pPr>
+        <w:numPr>
+          <w:ilvl w:val="0"/>
+          <w:numId w:val="36"/>
+        </w:numPr>
+        <w:tabs>
+          <w:tab w:val="clear" w:pos="720"/>
+        </w:tabs>
+        <w:spacing w:after="0" w:line="360" w:lineRule="auto"/>
+        <w:ind w:left="284" w:hanging="284"/>
+        <w:jc w:val="both"/>
+        <w:rPr>
+          <w:rFonts w:ascii="Times New Roman" w:hAnsi="Times New Roman" w:cs="Times New Roman"/>
+        </w:rPr>
+      </w:pPr>
+      <w:r>
+        <w:rPr>
+          <w:rFonts w:ascii="Times New Roman" w:hAnsi="Times New Roman" w:cs="Times New Roman"/>
+          <w:b/>
+          <w:bCs/>
+        </w:rPr>
+        <w:t>Ottimizzazione I/O</w:t>
+      </w:r>
+      <w:r>
+        <w:rPr>
+          <w:rFonts w:ascii="Times New Roman" w:hAnsi="Times New Roman" w:cs="Times New Roman"/>
+        </w:rPr>
+        <w:t xml:space="preserve">: </w:t>
+      </w:r>
+      <w:r>
+        <w:rPr>
+          <w:rFonts w:ascii="Times New Roman" w:hAnsi="Times New Roman" w:cs="Times New Roman"/>
+        </w:rPr>
+        <w:t>i</w:t>
+      </w:r>
+      <w:r>
+        <w:rPr>
+          <w:rFonts w:ascii="Times New Roman" w:hAnsi="Times New Roman" w:cs="Times New Roman"/>
+        </w:rPr>
+        <w:t xml:space="preserve">l formato colonnare riduce l'occupazione su disco fino all'80% rispetto ai CSV originali, velocizzando drasticamente le analisi nel successivo </w:t>
+      </w:r>
+      <w:r>
+        <w:rPr>
+          <w:rFonts w:ascii="Times New Roman" w:hAnsi="Times New Roman" w:cs="Times New Roman"/>
+          <w:i/>
+          <w:iCs/>
+        </w:rPr>
+        <w:t>Gold Layer</w:t>
+      </w:r>
+      <w:r>
+        <w:rPr>
+          <w:rFonts w:ascii="Times New Roman" w:hAnsi="Times New Roman" w:cs="Times New Roman"/>
+        </w:rPr>
+        <w:t>.</w:t>
       </w:r>
     </w:p>
     <w:p>
@@ -5403,80 +5882,9 @@
     </w:p>
     <w:p>
       <w:pPr>
-        <w:spacing w:line="360" w:lineRule="auto"/>
-        <w:jc w:val="both"/>
-        <w:rPr>
-          <w:rFonts w:ascii="Times New Roman" w:hAnsi="Times New Roman" w:cs="Times New Roman"/>
-          <w:b/>
-          <w:bCs/>
-        </w:rPr>
-      </w:pPr>
-      <w:r>
-        <w:rPr>
-          <w:rFonts w:ascii="Times New Roman" w:hAnsi="Times New Roman" w:cs="Times New Roman"/>
-          <w:b/>
-          <w:bCs/>
-        </w:rPr>
-        <w:t>3.5 Lo Schema Finale (</w:t>
-      </w:r>
-      <w:proofErr w:type="spellStart"/>
-      <w:r>
-        <w:rPr>
-          <w:rFonts w:ascii="Times New Roman" w:hAnsi="Times New Roman" w:cs="Times New Roman"/>
-          <w:b/>
-          <w:bCs/>
-        </w:rPr>
-        <w:t>Bronze</w:t>
-      </w:r>
-      <w:proofErr w:type="spellEnd"/>
-      <w:r>
-        <w:rPr>
-          <w:rFonts w:ascii="Times New Roman" w:hAnsi="Times New Roman" w:cs="Times New Roman"/>
-          <w:b/>
-          <w:bCs/>
-        </w:rPr>
-        <w:t xml:space="preserve"> Layer)</w:t>
-      </w:r>
-    </w:p>
-    <w:p>
-      <w:pPr>
-        <w:spacing w:line="360" w:lineRule="auto"/>
-        <w:jc w:val="both"/>
-        <w:rPr>
-          <w:rFonts w:ascii="Times New Roman" w:hAnsi="Times New Roman" w:cs="Times New Roman"/>
-        </w:rPr>
-      </w:pPr>
-      <w:r>
-        <w:rPr>
-          <w:rFonts w:ascii="Times New Roman" w:hAnsi="Times New Roman" w:cs="Times New Roman"/>
-        </w:rPr>
-        <w:t>Prima di passare al processing, abbiamo definito uno schema rigoroso (Case Classes in Scala) che funge da contratto per l'intera pipeline. Questo garantisce che ogni messaggio JSON letto da Kafka sia validato istantaneamente, scartando i dati malformati prima ancora che arrivino al motore di calcolo.</w:t>
-      </w:r>
-    </w:p>
-    <w:p>
-      <w:pPr>
-        <w:spacing w:line="360" w:lineRule="auto"/>
-        <w:jc w:val="both"/>
-        <w:rPr>
-          <w:rFonts w:ascii="Times New Roman" w:hAnsi="Times New Roman" w:cs="Times New Roman"/>
-        </w:rPr>
-      </w:pPr>
-    </w:p>
-    <w:p>
-      <w:pPr>
-        <w:spacing w:line="360" w:lineRule="auto"/>
-        <w:jc w:val="both"/>
-        <w:rPr>
-          <w:rFonts w:ascii="Times New Roman" w:hAnsi="Times New Roman" w:cs="Times New Roman"/>
-        </w:rPr>
-      </w:pPr>
-    </w:p>
-    <w:p>
-      <w:pPr>
         <w:pStyle w:val="Titolo1"/>
       </w:pPr>
       <w:r>
-        <w:lastRenderedPageBreak/>
         <w:t xml:space="preserve">4. Ingestione dei Dati (Data </w:t>
       </w:r>
       <w:proofErr w:type="spellStart"/>
@@ -5747,6 +6155,7 @@
           <w:b/>
           <w:bCs/>
         </w:rPr>
+        <w:lastRenderedPageBreak/>
         <w:t>Windowing</w:t>
       </w:r>
       <w:proofErr w:type="spellEnd"/>
@@ -6114,7 +6523,6 @@
         <w:pStyle w:val="Titolo1"/>
       </w:pPr>
       <w:r>
-        <w:lastRenderedPageBreak/>
         <w:t>8. Risultati e Conclusioni</w:t>
       </w:r>
     </w:p>
@@ -6556,6 +6964,304 @@
     </w:lvl>
   </w:abstractNum>
   <w:abstractNum w:abstractNumId="2" w15:restartNumberingAfterBreak="0">
+    <w:nsid w:val="06F21F5E"/>
+    <w:multiLevelType w:val="multilevel"/>
+    <w:tmpl w:val="2A161830"/>
+    <w:lvl w:ilvl="0">
+      <w:start w:val="1"/>
+      <w:numFmt w:val="bullet"/>
+      <w:lvlText w:val=""/>
+      <w:lvlJc w:val="left"/>
+      <w:pPr>
+        <w:tabs>
+          <w:tab w:val="num" w:pos="720"/>
+        </w:tabs>
+        <w:ind w:left="720" w:hanging="360"/>
+      </w:pPr>
+      <w:rPr>
+        <w:rFonts w:ascii="Symbol" w:hAnsi="Symbol" w:hint="default"/>
+        <w:sz w:val="20"/>
+      </w:rPr>
+    </w:lvl>
+    <w:lvl w:ilvl="1" w:tentative="1">
+      <w:start w:val="1"/>
+      <w:numFmt w:val="bullet"/>
+      <w:lvlText w:val="o"/>
+      <w:lvlJc w:val="left"/>
+      <w:pPr>
+        <w:tabs>
+          <w:tab w:val="num" w:pos="1440"/>
+        </w:tabs>
+        <w:ind w:left="1440" w:hanging="360"/>
+      </w:pPr>
+      <w:rPr>
+        <w:rFonts w:ascii="Courier New" w:hAnsi="Courier New" w:hint="default"/>
+        <w:sz w:val="20"/>
+      </w:rPr>
+    </w:lvl>
+    <w:lvl w:ilvl="2" w:tentative="1">
+      <w:start w:val="1"/>
+      <w:numFmt w:val="bullet"/>
+      <w:lvlText w:val=""/>
+      <w:lvlJc w:val="left"/>
+      <w:pPr>
+        <w:tabs>
+          <w:tab w:val="num" w:pos="2160"/>
+        </w:tabs>
+        <w:ind w:left="2160" w:hanging="360"/>
+      </w:pPr>
+      <w:rPr>
+        <w:rFonts w:ascii="Wingdings" w:hAnsi="Wingdings" w:hint="default"/>
+        <w:sz w:val="20"/>
+      </w:rPr>
+    </w:lvl>
+    <w:lvl w:ilvl="3" w:tentative="1">
+      <w:start w:val="1"/>
+      <w:numFmt w:val="bullet"/>
+      <w:lvlText w:val=""/>
+      <w:lvlJc w:val="left"/>
+      <w:pPr>
+        <w:tabs>
+          <w:tab w:val="num" w:pos="2880"/>
+        </w:tabs>
+        <w:ind w:left="2880" w:hanging="360"/>
+      </w:pPr>
+      <w:rPr>
+        <w:rFonts w:ascii="Wingdings" w:hAnsi="Wingdings" w:hint="default"/>
+        <w:sz w:val="20"/>
+      </w:rPr>
+    </w:lvl>
+    <w:lvl w:ilvl="4" w:tentative="1">
+      <w:start w:val="1"/>
+      <w:numFmt w:val="bullet"/>
+      <w:lvlText w:val=""/>
+      <w:lvlJc w:val="left"/>
+      <w:pPr>
+        <w:tabs>
+          <w:tab w:val="num" w:pos="3600"/>
+        </w:tabs>
+        <w:ind w:left="3600" w:hanging="360"/>
+      </w:pPr>
+      <w:rPr>
+        <w:rFonts w:ascii="Wingdings" w:hAnsi="Wingdings" w:hint="default"/>
+        <w:sz w:val="20"/>
+      </w:rPr>
+    </w:lvl>
+    <w:lvl w:ilvl="5" w:tentative="1">
+      <w:start w:val="1"/>
+      <w:numFmt w:val="bullet"/>
+      <w:lvlText w:val=""/>
+      <w:lvlJc w:val="left"/>
+      <w:pPr>
+        <w:tabs>
+          <w:tab w:val="num" w:pos="4320"/>
+        </w:tabs>
+        <w:ind w:left="4320" w:hanging="360"/>
+      </w:pPr>
+      <w:rPr>
+        <w:rFonts w:ascii="Wingdings" w:hAnsi="Wingdings" w:hint="default"/>
+        <w:sz w:val="20"/>
+      </w:rPr>
+    </w:lvl>
+    <w:lvl w:ilvl="6" w:tentative="1">
+      <w:start w:val="1"/>
+      <w:numFmt w:val="bullet"/>
+      <w:lvlText w:val=""/>
+      <w:lvlJc w:val="left"/>
+      <w:pPr>
+        <w:tabs>
+          <w:tab w:val="num" w:pos="5040"/>
+        </w:tabs>
+        <w:ind w:left="5040" w:hanging="360"/>
+      </w:pPr>
+      <w:rPr>
+        <w:rFonts w:ascii="Wingdings" w:hAnsi="Wingdings" w:hint="default"/>
+        <w:sz w:val="20"/>
+      </w:rPr>
+    </w:lvl>
+    <w:lvl w:ilvl="7" w:tentative="1">
+      <w:start w:val="1"/>
+      <w:numFmt w:val="bullet"/>
+      <w:lvlText w:val=""/>
+      <w:lvlJc w:val="left"/>
+      <w:pPr>
+        <w:tabs>
+          <w:tab w:val="num" w:pos="5760"/>
+        </w:tabs>
+        <w:ind w:left="5760" w:hanging="360"/>
+      </w:pPr>
+      <w:rPr>
+        <w:rFonts w:ascii="Wingdings" w:hAnsi="Wingdings" w:hint="default"/>
+        <w:sz w:val="20"/>
+      </w:rPr>
+    </w:lvl>
+    <w:lvl w:ilvl="8" w:tentative="1">
+      <w:start w:val="1"/>
+      <w:numFmt w:val="bullet"/>
+      <w:lvlText w:val=""/>
+      <w:lvlJc w:val="left"/>
+      <w:pPr>
+        <w:tabs>
+          <w:tab w:val="num" w:pos="6480"/>
+        </w:tabs>
+        <w:ind w:left="6480" w:hanging="360"/>
+      </w:pPr>
+      <w:rPr>
+        <w:rFonts w:ascii="Wingdings" w:hAnsi="Wingdings" w:hint="default"/>
+        <w:sz w:val="20"/>
+      </w:rPr>
+    </w:lvl>
+  </w:abstractNum>
+  <w:abstractNum w:abstractNumId="3" w15:restartNumberingAfterBreak="0">
+    <w:nsid w:val="092B578F"/>
+    <w:multiLevelType w:val="multilevel"/>
+    <w:tmpl w:val="952C5C8C"/>
+    <w:lvl w:ilvl="0">
+      <w:start w:val="1"/>
+      <w:numFmt w:val="bullet"/>
+      <w:lvlText w:val=""/>
+      <w:lvlJc w:val="left"/>
+      <w:pPr>
+        <w:tabs>
+          <w:tab w:val="num" w:pos="720"/>
+        </w:tabs>
+        <w:ind w:left="720" w:hanging="360"/>
+      </w:pPr>
+      <w:rPr>
+        <w:rFonts w:ascii="Symbol" w:hAnsi="Symbol" w:hint="default"/>
+        <w:sz w:val="20"/>
+      </w:rPr>
+    </w:lvl>
+    <w:lvl w:ilvl="1" w:tentative="1">
+      <w:start w:val="1"/>
+      <w:numFmt w:val="bullet"/>
+      <w:lvlText w:val="o"/>
+      <w:lvlJc w:val="left"/>
+      <w:pPr>
+        <w:tabs>
+          <w:tab w:val="num" w:pos="1440"/>
+        </w:tabs>
+        <w:ind w:left="1440" w:hanging="360"/>
+      </w:pPr>
+      <w:rPr>
+        <w:rFonts w:ascii="Courier New" w:hAnsi="Courier New" w:hint="default"/>
+        <w:sz w:val="20"/>
+      </w:rPr>
+    </w:lvl>
+    <w:lvl w:ilvl="2" w:tentative="1">
+      <w:start w:val="1"/>
+      <w:numFmt w:val="bullet"/>
+      <w:lvlText w:val=""/>
+      <w:lvlJc w:val="left"/>
+      <w:pPr>
+        <w:tabs>
+          <w:tab w:val="num" w:pos="2160"/>
+        </w:tabs>
+        <w:ind w:left="2160" w:hanging="360"/>
+      </w:pPr>
+      <w:rPr>
+        <w:rFonts w:ascii="Wingdings" w:hAnsi="Wingdings" w:hint="default"/>
+        <w:sz w:val="20"/>
+      </w:rPr>
+    </w:lvl>
+    <w:lvl w:ilvl="3" w:tentative="1">
+      <w:start w:val="1"/>
+      <w:numFmt w:val="bullet"/>
+      <w:lvlText w:val=""/>
+      <w:lvlJc w:val="left"/>
+      <w:pPr>
+        <w:tabs>
+          <w:tab w:val="num" w:pos="2880"/>
+        </w:tabs>
+        <w:ind w:left="2880" w:hanging="360"/>
+      </w:pPr>
+      <w:rPr>
+        <w:rFonts w:ascii="Wingdings" w:hAnsi="Wingdings" w:hint="default"/>
+        <w:sz w:val="20"/>
+      </w:rPr>
+    </w:lvl>
+    <w:lvl w:ilvl="4" w:tentative="1">
+      <w:start w:val="1"/>
+      <w:numFmt w:val="bullet"/>
+      <w:lvlText w:val=""/>
+      <w:lvlJc w:val="left"/>
+      <w:pPr>
+        <w:tabs>
+          <w:tab w:val="num" w:pos="3600"/>
+        </w:tabs>
+        <w:ind w:left="3600" w:hanging="360"/>
+      </w:pPr>
+      <w:rPr>
+        <w:rFonts w:ascii="Wingdings" w:hAnsi="Wingdings" w:hint="default"/>
+        <w:sz w:val="20"/>
+      </w:rPr>
+    </w:lvl>
+    <w:lvl w:ilvl="5" w:tentative="1">
+      <w:start w:val="1"/>
+      <w:numFmt w:val="bullet"/>
+      <w:lvlText w:val=""/>
+      <w:lvlJc w:val="left"/>
+      <w:pPr>
+        <w:tabs>
+          <w:tab w:val="num" w:pos="4320"/>
+        </w:tabs>
+        <w:ind w:left="4320" w:hanging="360"/>
+      </w:pPr>
+      <w:rPr>
+        <w:rFonts w:ascii="Wingdings" w:hAnsi="Wingdings" w:hint="default"/>
+        <w:sz w:val="20"/>
+      </w:rPr>
+    </w:lvl>
+    <w:lvl w:ilvl="6" w:tentative="1">
+      <w:start w:val="1"/>
+      <w:numFmt w:val="bullet"/>
+      <w:lvlText w:val=""/>
+      <w:lvlJc w:val="left"/>
+      <w:pPr>
+        <w:tabs>
+          <w:tab w:val="num" w:pos="5040"/>
+        </w:tabs>
+        <w:ind w:left="5040" w:hanging="360"/>
+      </w:pPr>
+      <w:rPr>
+        <w:rFonts w:ascii="Wingdings" w:hAnsi="Wingdings" w:hint="default"/>
+        <w:sz w:val="20"/>
+      </w:rPr>
+    </w:lvl>
+    <w:lvl w:ilvl="7" w:tentative="1">
+      <w:start w:val="1"/>
+      <w:numFmt w:val="bullet"/>
+      <w:lvlText w:val=""/>
+      <w:lvlJc w:val="left"/>
+      <w:pPr>
+        <w:tabs>
+          <w:tab w:val="num" w:pos="5760"/>
+        </w:tabs>
+        <w:ind w:left="5760" w:hanging="360"/>
+      </w:pPr>
+      <w:rPr>
+        <w:rFonts w:ascii="Wingdings" w:hAnsi="Wingdings" w:hint="default"/>
+        <w:sz w:val="20"/>
+      </w:rPr>
+    </w:lvl>
+    <w:lvl w:ilvl="8" w:tentative="1">
+      <w:start w:val="1"/>
+      <w:numFmt w:val="bullet"/>
+      <w:lvlText w:val=""/>
+      <w:lvlJc w:val="left"/>
+      <w:pPr>
+        <w:tabs>
+          <w:tab w:val="num" w:pos="6480"/>
+        </w:tabs>
+        <w:ind w:left="6480" w:hanging="360"/>
+      </w:pPr>
+      <w:rPr>
+        <w:rFonts w:ascii="Wingdings" w:hAnsi="Wingdings" w:hint="default"/>
+        <w:sz w:val="20"/>
+      </w:rPr>
+    </w:lvl>
+  </w:abstractNum>
+  <w:abstractNum w:abstractNumId="4" w15:restartNumberingAfterBreak="0">
     <w:nsid w:val="0DBE6CFA"/>
     <w:multiLevelType w:val="multilevel"/>
     <w:tmpl w:val="1FAA1E50"/>
@@ -6704,7 +7410,7 @@
       </w:rPr>
     </w:lvl>
   </w:abstractNum>
-  <w:abstractNum w:abstractNumId="3" w15:restartNumberingAfterBreak="0">
+  <w:abstractNum w:abstractNumId="5" w15:restartNumberingAfterBreak="0">
     <w:nsid w:val="169046AE"/>
     <w:multiLevelType w:val="multilevel"/>
     <w:tmpl w:val="AA30803E"/>
@@ -6853,7 +7559,7 @@
       </w:rPr>
     </w:lvl>
   </w:abstractNum>
-  <w:abstractNum w:abstractNumId="4" w15:restartNumberingAfterBreak="0">
+  <w:abstractNum w:abstractNumId="6" w15:restartNumberingAfterBreak="0">
     <w:nsid w:val="16E1754D"/>
     <w:multiLevelType w:val="multilevel"/>
     <w:tmpl w:val="C532B90C"/>
@@ -6966,7 +7672,120 @@
       </w:pPr>
     </w:lvl>
   </w:abstractNum>
-  <w:abstractNum w:abstractNumId="5" w15:restartNumberingAfterBreak="0">
+  <w:abstractNum w:abstractNumId="7" w15:restartNumberingAfterBreak="0">
+    <w:nsid w:val="1E975044"/>
+    <w:multiLevelType w:val="multilevel"/>
+    <w:tmpl w:val="11705A00"/>
+    <w:lvl w:ilvl="0">
+      <w:start w:val="1"/>
+      <w:numFmt w:val="decimal"/>
+      <w:lvlText w:val="%1."/>
+      <w:lvlJc w:val="left"/>
+      <w:pPr>
+        <w:tabs>
+          <w:tab w:val="num" w:pos="720"/>
+        </w:tabs>
+        <w:ind w:left="720" w:hanging="360"/>
+      </w:pPr>
+    </w:lvl>
+    <w:lvl w:ilvl="1" w:tentative="1">
+      <w:start w:val="1"/>
+      <w:numFmt w:val="decimal"/>
+      <w:lvlText w:val="%2."/>
+      <w:lvlJc w:val="left"/>
+      <w:pPr>
+        <w:tabs>
+          <w:tab w:val="num" w:pos="1440"/>
+        </w:tabs>
+        <w:ind w:left="1440" w:hanging="360"/>
+      </w:pPr>
+    </w:lvl>
+    <w:lvl w:ilvl="2" w:tentative="1">
+      <w:start w:val="1"/>
+      <w:numFmt w:val="decimal"/>
+      <w:lvlText w:val="%3."/>
+      <w:lvlJc w:val="left"/>
+      <w:pPr>
+        <w:tabs>
+          <w:tab w:val="num" w:pos="2160"/>
+        </w:tabs>
+        <w:ind w:left="2160" w:hanging="360"/>
+      </w:pPr>
+    </w:lvl>
+    <w:lvl w:ilvl="3" w:tentative="1">
+      <w:start w:val="1"/>
+      <w:numFmt w:val="decimal"/>
+      <w:lvlText w:val="%4."/>
+      <w:lvlJc w:val="left"/>
+      <w:pPr>
+        <w:tabs>
+          <w:tab w:val="num" w:pos="2880"/>
+        </w:tabs>
+        <w:ind w:left="2880" w:hanging="360"/>
+      </w:pPr>
+    </w:lvl>
+    <w:lvl w:ilvl="4" w:tentative="1">
+      <w:start w:val="1"/>
+      <w:numFmt w:val="decimal"/>
+      <w:lvlText w:val="%5."/>
+      <w:lvlJc w:val="left"/>
+      <w:pPr>
+        <w:tabs>
+          <w:tab w:val="num" w:pos="3600"/>
+        </w:tabs>
+        <w:ind w:left="3600" w:hanging="360"/>
+      </w:pPr>
+    </w:lvl>
+    <w:lvl w:ilvl="5" w:tentative="1">
+      <w:start w:val="1"/>
+      <w:numFmt w:val="decimal"/>
+      <w:lvlText w:val="%6."/>
+      <w:lvlJc w:val="left"/>
+      <w:pPr>
+        <w:tabs>
+          <w:tab w:val="num" w:pos="4320"/>
+        </w:tabs>
+        <w:ind w:left="4320" w:hanging="360"/>
+      </w:pPr>
+    </w:lvl>
+    <w:lvl w:ilvl="6" w:tentative="1">
+      <w:start w:val="1"/>
+      <w:numFmt w:val="decimal"/>
+      <w:lvlText w:val="%7."/>
+      <w:lvlJc w:val="left"/>
+      <w:pPr>
+        <w:tabs>
+          <w:tab w:val="num" w:pos="5040"/>
+        </w:tabs>
+        <w:ind w:left="5040" w:hanging="360"/>
+      </w:pPr>
+    </w:lvl>
+    <w:lvl w:ilvl="7" w:tentative="1">
+      <w:start w:val="1"/>
+      <w:numFmt w:val="decimal"/>
+      <w:lvlText w:val="%8."/>
+      <w:lvlJc w:val="left"/>
+      <w:pPr>
+        <w:tabs>
+          <w:tab w:val="num" w:pos="5760"/>
+        </w:tabs>
+        <w:ind w:left="5760" w:hanging="360"/>
+      </w:pPr>
+    </w:lvl>
+    <w:lvl w:ilvl="8" w:tentative="1">
+      <w:start w:val="1"/>
+      <w:numFmt w:val="decimal"/>
+      <w:lvlText w:val="%9."/>
+      <w:lvlJc w:val="left"/>
+      <w:pPr>
+        <w:tabs>
+          <w:tab w:val="num" w:pos="6480"/>
+        </w:tabs>
+        <w:ind w:left="6480" w:hanging="360"/>
+      </w:pPr>
+    </w:lvl>
+  </w:abstractNum>
+  <w:abstractNum w:abstractNumId="8" w15:restartNumberingAfterBreak="0">
     <w:nsid w:val="2609586F"/>
     <w:multiLevelType w:val="multilevel"/>
     <w:tmpl w:val="D548A2FC"/>
@@ -7079,7 +7898,7 @@
       </w:pPr>
     </w:lvl>
   </w:abstractNum>
-  <w:abstractNum w:abstractNumId="6" w15:restartNumberingAfterBreak="0">
+  <w:abstractNum w:abstractNumId="9" w15:restartNumberingAfterBreak="0">
     <w:nsid w:val="28266C06"/>
     <w:multiLevelType w:val="multilevel"/>
     <w:tmpl w:val="0024DC92"/>
@@ -7228,7 +8047,7 @@
       </w:rPr>
     </w:lvl>
   </w:abstractNum>
-  <w:abstractNum w:abstractNumId="7" w15:restartNumberingAfterBreak="0">
+  <w:abstractNum w:abstractNumId="10" w15:restartNumberingAfterBreak="0">
     <w:nsid w:val="337B3063"/>
     <w:multiLevelType w:val="multilevel"/>
     <w:tmpl w:val="F20C4AD4"/>
@@ -7341,7 +8160,418 @@
       </w:pPr>
     </w:lvl>
   </w:abstractNum>
-  <w:abstractNum w:abstractNumId="8" w15:restartNumberingAfterBreak="0">
+  <w:abstractNum w:abstractNumId="11" w15:restartNumberingAfterBreak="0">
+    <w:nsid w:val="35891324"/>
+    <w:multiLevelType w:val="multilevel"/>
+    <w:tmpl w:val="F9B40878"/>
+    <w:lvl w:ilvl="0">
+      <w:start w:val="1"/>
+      <w:numFmt w:val="bullet"/>
+      <w:lvlText w:val=""/>
+      <w:lvlJc w:val="left"/>
+      <w:pPr>
+        <w:tabs>
+          <w:tab w:val="num" w:pos="720"/>
+        </w:tabs>
+        <w:ind w:left="720" w:hanging="360"/>
+      </w:pPr>
+      <w:rPr>
+        <w:rFonts w:ascii="Symbol" w:hAnsi="Symbol" w:hint="default"/>
+        <w:sz w:val="20"/>
+      </w:rPr>
+    </w:lvl>
+    <w:lvl w:ilvl="1" w:tentative="1">
+      <w:start w:val="1"/>
+      <w:numFmt w:val="bullet"/>
+      <w:lvlText w:val="o"/>
+      <w:lvlJc w:val="left"/>
+      <w:pPr>
+        <w:tabs>
+          <w:tab w:val="num" w:pos="1440"/>
+        </w:tabs>
+        <w:ind w:left="1440" w:hanging="360"/>
+      </w:pPr>
+      <w:rPr>
+        <w:rFonts w:ascii="Courier New" w:hAnsi="Courier New" w:hint="default"/>
+        <w:sz w:val="20"/>
+      </w:rPr>
+    </w:lvl>
+    <w:lvl w:ilvl="2" w:tentative="1">
+      <w:start w:val="1"/>
+      <w:numFmt w:val="bullet"/>
+      <w:lvlText w:val=""/>
+      <w:lvlJc w:val="left"/>
+      <w:pPr>
+        <w:tabs>
+          <w:tab w:val="num" w:pos="2160"/>
+        </w:tabs>
+        <w:ind w:left="2160" w:hanging="360"/>
+      </w:pPr>
+      <w:rPr>
+        <w:rFonts w:ascii="Wingdings" w:hAnsi="Wingdings" w:hint="default"/>
+        <w:sz w:val="20"/>
+      </w:rPr>
+    </w:lvl>
+    <w:lvl w:ilvl="3" w:tentative="1">
+      <w:start w:val="1"/>
+      <w:numFmt w:val="bullet"/>
+      <w:lvlText w:val=""/>
+      <w:lvlJc w:val="left"/>
+      <w:pPr>
+        <w:tabs>
+          <w:tab w:val="num" w:pos="2880"/>
+        </w:tabs>
+        <w:ind w:left="2880" w:hanging="360"/>
+      </w:pPr>
+      <w:rPr>
+        <w:rFonts w:ascii="Wingdings" w:hAnsi="Wingdings" w:hint="default"/>
+        <w:sz w:val="20"/>
+      </w:rPr>
+    </w:lvl>
+    <w:lvl w:ilvl="4" w:tentative="1">
+      <w:start w:val="1"/>
+      <w:numFmt w:val="bullet"/>
+      <w:lvlText w:val=""/>
+      <w:lvlJc w:val="left"/>
+      <w:pPr>
+        <w:tabs>
+          <w:tab w:val="num" w:pos="3600"/>
+        </w:tabs>
+        <w:ind w:left="3600" w:hanging="360"/>
+      </w:pPr>
+      <w:rPr>
+        <w:rFonts w:ascii="Wingdings" w:hAnsi="Wingdings" w:hint="default"/>
+        <w:sz w:val="20"/>
+      </w:rPr>
+    </w:lvl>
+    <w:lvl w:ilvl="5" w:tentative="1">
+      <w:start w:val="1"/>
+      <w:numFmt w:val="bullet"/>
+      <w:lvlText w:val=""/>
+      <w:lvlJc w:val="left"/>
+      <w:pPr>
+        <w:tabs>
+          <w:tab w:val="num" w:pos="4320"/>
+        </w:tabs>
+        <w:ind w:left="4320" w:hanging="360"/>
+      </w:pPr>
+      <w:rPr>
+        <w:rFonts w:ascii="Wingdings" w:hAnsi="Wingdings" w:hint="default"/>
+        <w:sz w:val="20"/>
+      </w:rPr>
+    </w:lvl>
+    <w:lvl w:ilvl="6" w:tentative="1">
+      <w:start w:val="1"/>
+      <w:numFmt w:val="bullet"/>
+      <w:lvlText w:val=""/>
+      <w:lvlJc w:val="left"/>
+      <w:pPr>
+        <w:tabs>
+          <w:tab w:val="num" w:pos="5040"/>
+        </w:tabs>
+        <w:ind w:left="5040" w:hanging="360"/>
+      </w:pPr>
+      <w:rPr>
+        <w:rFonts w:ascii="Wingdings" w:hAnsi="Wingdings" w:hint="default"/>
+        <w:sz w:val="20"/>
+      </w:rPr>
+    </w:lvl>
+    <w:lvl w:ilvl="7" w:tentative="1">
+      <w:start w:val="1"/>
+      <w:numFmt w:val="bullet"/>
+      <w:lvlText w:val=""/>
+      <w:lvlJc w:val="left"/>
+      <w:pPr>
+        <w:tabs>
+          <w:tab w:val="num" w:pos="5760"/>
+        </w:tabs>
+        <w:ind w:left="5760" w:hanging="360"/>
+      </w:pPr>
+      <w:rPr>
+        <w:rFonts w:ascii="Wingdings" w:hAnsi="Wingdings" w:hint="default"/>
+        <w:sz w:val="20"/>
+      </w:rPr>
+    </w:lvl>
+    <w:lvl w:ilvl="8" w:tentative="1">
+      <w:start w:val="1"/>
+      <w:numFmt w:val="bullet"/>
+      <w:lvlText w:val=""/>
+      <w:lvlJc w:val="left"/>
+      <w:pPr>
+        <w:tabs>
+          <w:tab w:val="num" w:pos="6480"/>
+        </w:tabs>
+        <w:ind w:left="6480" w:hanging="360"/>
+      </w:pPr>
+      <w:rPr>
+        <w:rFonts w:ascii="Wingdings" w:hAnsi="Wingdings" w:hint="default"/>
+        <w:sz w:val="20"/>
+      </w:rPr>
+    </w:lvl>
+  </w:abstractNum>
+  <w:abstractNum w:abstractNumId="12" w15:restartNumberingAfterBreak="0">
+    <w:nsid w:val="37156409"/>
+    <w:multiLevelType w:val="multilevel"/>
+    <w:tmpl w:val="E90E536A"/>
+    <w:lvl w:ilvl="0">
+      <w:start w:val="1"/>
+      <w:numFmt w:val="bullet"/>
+      <w:lvlText w:val=""/>
+      <w:lvlJc w:val="left"/>
+      <w:pPr>
+        <w:tabs>
+          <w:tab w:val="num" w:pos="720"/>
+        </w:tabs>
+        <w:ind w:left="720" w:hanging="360"/>
+      </w:pPr>
+      <w:rPr>
+        <w:rFonts w:ascii="Symbol" w:hAnsi="Symbol" w:hint="default"/>
+        <w:sz w:val="20"/>
+      </w:rPr>
+    </w:lvl>
+    <w:lvl w:ilvl="1" w:tentative="1">
+      <w:start w:val="1"/>
+      <w:numFmt w:val="bullet"/>
+      <w:lvlText w:val="o"/>
+      <w:lvlJc w:val="left"/>
+      <w:pPr>
+        <w:tabs>
+          <w:tab w:val="num" w:pos="1440"/>
+        </w:tabs>
+        <w:ind w:left="1440" w:hanging="360"/>
+      </w:pPr>
+      <w:rPr>
+        <w:rFonts w:ascii="Courier New" w:hAnsi="Courier New" w:hint="default"/>
+        <w:sz w:val="20"/>
+      </w:rPr>
+    </w:lvl>
+    <w:lvl w:ilvl="2" w:tentative="1">
+      <w:start w:val="1"/>
+      <w:numFmt w:val="bullet"/>
+      <w:lvlText w:val=""/>
+      <w:lvlJc w:val="left"/>
+      <w:pPr>
+        <w:tabs>
+          <w:tab w:val="num" w:pos="2160"/>
+        </w:tabs>
+        <w:ind w:left="2160" w:hanging="360"/>
+      </w:pPr>
+      <w:rPr>
+        <w:rFonts w:ascii="Wingdings" w:hAnsi="Wingdings" w:hint="default"/>
+        <w:sz w:val="20"/>
+      </w:rPr>
+    </w:lvl>
+    <w:lvl w:ilvl="3" w:tentative="1">
+      <w:start w:val="1"/>
+      <w:numFmt w:val="bullet"/>
+      <w:lvlText w:val=""/>
+      <w:lvlJc w:val="left"/>
+      <w:pPr>
+        <w:tabs>
+          <w:tab w:val="num" w:pos="2880"/>
+        </w:tabs>
+        <w:ind w:left="2880" w:hanging="360"/>
+      </w:pPr>
+      <w:rPr>
+        <w:rFonts w:ascii="Wingdings" w:hAnsi="Wingdings" w:hint="default"/>
+        <w:sz w:val="20"/>
+      </w:rPr>
+    </w:lvl>
+    <w:lvl w:ilvl="4" w:tentative="1">
+      <w:start w:val="1"/>
+      <w:numFmt w:val="bullet"/>
+      <w:lvlText w:val=""/>
+      <w:lvlJc w:val="left"/>
+      <w:pPr>
+        <w:tabs>
+          <w:tab w:val="num" w:pos="3600"/>
+        </w:tabs>
+        <w:ind w:left="3600" w:hanging="360"/>
+      </w:pPr>
+      <w:rPr>
+        <w:rFonts w:ascii="Wingdings" w:hAnsi="Wingdings" w:hint="default"/>
+        <w:sz w:val="20"/>
+      </w:rPr>
+    </w:lvl>
+    <w:lvl w:ilvl="5" w:tentative="1">
+      <w:start w:val="1"/>
+      <w:numFmt w:val="bullet"/>
+      <w:lvlText w:val=""/>
+      <w:lvlJc w:val="left"/>
+      <w:pPr>
+        <w:tabs>
+          <w:tab w:val="num" w:pos="4320"/>
+        </w:tabs>
+        <w:ind w:left="4320" w:hanging="360"/>
+      </w:pPr>
+      <w:rPr>
+        <w:rFonts w:ascii="Wingdings" w:hAnsi="Wingdings" w:hint="default"/>
+        <w:sz w:val="20"/>
+      </w:rPr>
+    </w:lvl>
+    <w:lvl w:ilvl="6" w:tentative="1">
+      <w:start w:val="1"/>
+      <w:numFmt w:val="bullet"/>
+      <w:lvlText w:val=""/>
+      <w:lvlJc w:val="left"/>
+      <w:pPr>
+        <w:tabs>
+          <w:tab w:val="num" w:pos="5040"/>
+        </w:tabs>
+        <w:ind w:left="5040" w:hanging="360"/>
+      </w:pPr>
+      <w:rPr>
+        <w:rFonts w:ascii="Wingdings" w:hAnsi="Wingdings" w:hint="default"/>
+        <w:sz w:val="20"/>
+      </w:rPr>
+    </w:lvl>
+    <w:lvl w:ilvl="7" w:tentative="1">
+      <w:start w:val="1"/>
+      <w:numFmt w:val="bullet"/>
+      <w:lvlText w:val=""/>
+      <w:lvlJc w:val="left"/>
+      <w:pPr>
+        <w:tabs>
+          <w:tab w:val="num" w:pos="5760"/>
+        </w:tabs>
+        <w:ind w:left="5760" w:hanging="360"/>
+      </w:pPr>
+      <w:rPr>
+        <w:rFonts w:ascii="Wingdings" w:hAnsi="Wingdings" w:hint="default"/>
+        <w:sz w:val="20"/>
+      </w:rPr>
+    </w:lvl>
+    <w:lvl w:ilvl="8" w:tentative="1">
+      <w:start w:val="1"/>
+      <w:numFmt w:val="bullet"/>
+      <w:lvlText w:val=""/>
+      <w:lvlJc w:val="left"/>
+      <w:pPr>
+        <w:tabs>
+          <w:tab w:val="num" w:pos="6480"/>
+        </w:tabs>
+        <w:ind w:left="6480" w:hanging="360"/>
+      </w:pPr>
+      <w:rPr>
+        <w:rFonts w:ascii="Wingdings" w:hAnsi="Wingdings" w:hint="default"/>
+        <w:sz w:val="20"/>
+      </w:rPr>
+    </w:lvl>
+  </w:abstractNum>
+  <w:abstractNum w:abstractNumId="13" w15:restartNumberingAfterBreak="0">
+    <w:nsid w:val="38BC53C0"/>
+    <w:multiLevelType w:val="multilevel"/>
+    <w:tmpl w:val="594666C4"/>
+    <w:lvl w:ilvl="0">
+      <w:start w:val="1"/>
+      <w:numFmt w:val="decimal"/>
+      <w:lvlText w:val="%1."/>
+      <w:lvlJc w:val="left"/>
+      <w:pPr>
+        <w:tabs>
+          <w:tab w:val="num" w:pos="720"/>
+        </w:tabs>
+        <w:ind w:left="720" w:hanging="360"/>
+      </w:pPr>
+    </w:lvl>
+    <w:lvl w:ilvl="1" w:tentative="1">
+      <w:start w:val="1"/>
+      <w:numFmt w:val="decimal"/>
+      <w:lvlText w:val="%2."/>
+      <w:lvlJc w:val="left"/>
+      <w:pPr>
+        <w:tabs>
+          <w:tab w:val="num" w:pos="1440"/>
+        </w:tabs>
+        <w:ind w:left="1440" w:hanging="360"/>
+      </w:pPr>
+    </w:lvl>
+    <w:lvl w:ilvl="2" w:tentative="1">
+      <w:start w:val="1"/>
+      <w:numFmt w:val="decimal"/>
+      <w:lvlText w:val="%3."/>
+      <w:lvlJc w:val="left"/>
+      <w:pPr>
+        <w:tabs>
+          <w:tab w:val="num" w:pos="2160"/>
+        </w:tabs>
+        <w:ind w:left="2160" w:hanging="360"/>
+      </w:pPr>
+    </w:lvl>
+    <w:lvl w:ilvl="3" w:tentative="1">
+      <w:start w:val="1"/>
+      <w:numFmt w:val="decimal"/>
+      <w:lvlText w:val="%4."/>
+      <w:lvlJc w:val="left"/>
+      <w:pPr>
+        <w:tabs>
+          <w:tab w:val="num" w:pos="2880"/>
+        </w:tabs>
+        <w:ind w:left="2880" w:hanging="360"/>
+      </w:pPr>
+    </w:lvl>
+    <w:lvl w:ilvl="4" w:tentative="1">
+      <w:start w:val="1"/>
+      <w:numFmt w:val="decimal"/>
+      <w:lvlText w:val="%5."/>
+      <w:lvlJc w:val="left"/>
+      <w:pPr>
+        <w:tabs>
+          <w:tab w:val="num" w:pos="3600"/>
+        </w:tabs>
+        <w:ind w:left="3600" w:hanging="360"/>
+      </w:pPr>
+    </w:lvl>
+    <w:lvl w:ilvl="5" w:tentative="1">
+      <w:start w:val="1"/>
+      <w:numFmt w:val="decimal"/>
+      <w:lvlText w:val="%6."/>
+      <w:lvlJc w:val="left"/>
+      <w:pPr>
+        <w:tabs>
+          <w:tab w:val="num" w:pos="4320"/>
+        </w:tabs>
+        <w:ind w:left="4320" w:hanging="360"/>
+      </w:pPr>
+    </w:lvl>
+    <w:lvl w:ilvl="6" w:tentative="1">
+      <w:start w:val="1"/>
+      <w:numFmt w:val="decimal"/>
+      <w:lvlText w:val="%7."/>
+      <w:lvlJc w:val="left"/>
+      <w:pPr>
+        <w:tabs>
+          <w:tab w:val="num" w:pos="5040"/>
+        </w:tabs>
+        <w:ind w:left="5040" w:hanging="360"/>
+      </w:pPr>
+    </w:lvl>
+    <w:lvl w:ilvl="7" w:tentative="1">
+      <w:start w:val="1"/>
+      <w:numFmt w:val="decimal"/>
+      <w:lvlText w:val="%8."/>
+      <w:lvlJc w:val="left"/>
+      <w:pPr>
+        <w:tabs>
+          <w:tab w:val="num" w:pos="5760"/>
+        </w:tabs>
+        <w:ind w:left="5760" w:hanging="360"/>
+      </w:pPr>
+    </w:lvl>
+    <w:lvl w:ilvl="8" w:tentative="1">
+      <w:start w:val="1"/>
+      <w:numFmt w:val="decimal"/>
+      <w:lvlText w:val="%9."/>
+      <w:lvlJc w:val="left"/>
+      <w:pPr>
+        <w:tabs>
+          <w:tab w:val="num" w:pos="6480"/>
+        </w:tabs>
+        <w:ind w:left="6480" w:hanging="360"/>
+      </w:pPr>
+    </w:lvl>
+  </w:abstractNum>
+  <w:abstractNum w:abstractNumId="14" w15:restartNumberingAfterBreak="0">
     <w:nsid w:val="3E8C4E9E"/>
     <w:multiLevelType w:val="multilevel"/>
     <w:tmpl w:val="6DE8CC28"/>
@@ -7490,7 +8720,7 @@
       </w:rPr>
     </w:lvl>
   </w:abstractNum>
-  <w:abstractNum w:abstractNumId="9" w15:restartNumberingAfterBreak="0">
+  <w:abstractNum w:abstractNumId="15" w15:restartNumberingAfterBreak="0">
     <w:nsid w:val="41F64F2F"/>
     <w:multiLevelType w:val="multilevel"/>
     <w:tmpl w:val="E320C506"/>
@@ -7639,7 +8869,7 @@
       </w:rPr>
     </w:lvl>
   </w:abstractNum>
-  <w:abstractNum w:abstractNumId="10" w15:restartNumberingAfterBreak="0">
+  <w:abstractNum w:abstractNumId="16" w15:restartNumberingAfterBreak="0">
     <w:nsid w:val="43A31521"/>
     <w:multiLevelType w:val="multilevel"/>
     <w:tmpl w:val="A636EDDA"/>
@@ -7788,7 +9018,7 @@
       </w:rPr>
     </w:lvl>
   </w:abstractNum>
-  <w:abstractNum w:abstractNumId="11" w15:restartNumberingAfterBreak="0">
+  <w:abstractNum w:abstractNumId="17" w15:restartNumberingAfterBreak="0">
     <w:nsid w:val="46D76447"/>
     <w:multiLevelType w:val="multilevel"/>
     <w:tmpl w:val="625CCF26"/>
@@ -7937,7 +9167,7 @@
       </w:rPr>
     </w:lvl>
   </w:abstractNum>
-  <w:abstractNum w:abstractNumId="12" w15:restartNumberingAfterBreak="0">
+  <w:abstractNum w:abstractNumId="18" w15:restartNumberingAfterBreak="0">
     <w:nsid w:val="525E286E"/>
     <w:multiLevelType w:val="multilevel"/>
     <w:tmpl w:val="917266B6"/>
@@ -8086,7 +9316,7 @@
       </w:rPr>
     </w:lvl>
   </w:abstractNum>
-  <w:abstractNum w:abstractNumId="13" w15:restartNumberingAfterBreak="0">
+  <w:abstractNum w:abstractNumId="19" w15:restartNumberingAfterBreak="0">
     <w:nsid w:val="5371535D"/>
     <w:multiLevelType w:val="multilevel"/>
     <w:tmpl w:val="A9D25CA4"/>
@@ -8199,7 +9429,7 @@
       </w:pPr>
     </w:lvl>
   </w:abstractNum>
-  <w:abstractNum w:abstractNumId="14" w15:restartNumberingAfterBreak="0">
+  <w:abstractNum w:abstractNumId="20" w15:restartNumberingAfterBreak="0">
     <w:nsid w:val="55B97331"/>
     <w:multiLevelType w:val="multilevel"/>
     <w:tmpl w:val="FE301E10"/>
@@ -8348,7 +9578,7 @@
       </w:rPr>
     </w:lvl>
   </w:abstractNum>
-  <w:abstractNum w:abstractNumId="15" w15:restartNumberingAfterBreak="0">
+  <w:abstractNum w:abstractNumId="21" w15:restartNumberingAfterBreak="0">
     <w:nsid w:val="583A6599"/>
     <w:multiLevelType w:val="multilevel"/>
     <w:tmpl w:val="D9B22D0A"/>
@@ -8461,7 +9691,7 @@
       </w:pPr>
     </w:lvl>
   </w:abstractNum>
-  <w:abstractNum w:abstractNumId="16" w15:restartNumberingAfterBreak="0">
+  <w:abstractNum w:abstractNumId="22" w15:restartNumberingAfterBreak="0">
     <w:nsid w:val="58A31F64"/>
     <w:multiLevelType w:val="multilevel"/>
     <w:tmpl w:val="E376B886"/>
@@ -8610,7 +9840,7 @@
       </w:rPr>
     </w:lvl>
   </w:abstractNum>
-  <w:abstractNum w:abstractNumId="17" w15:restartNumberingAfterBreak="0">
+  <w:abstractNum w:abstractNumId="23" w15:restartNumberingAfterBreak="0">
     <w:nsid w:val="5B8F3493"/>
     <w:multiLevelType w:val="multilevel"/>
     <w:tmpl w:val="661A68E2"/>
@@ -8759,7 +9989,156 @@
       </w:rPr>
     </w:lvl>
   </w:abstractNum>
-  <w:abstractNum w:abstractNumId="18" w15:restartNumberingAfterBreak="0">
+  <w:abstractNum w:abstractNumId="24" w15:restartNumberingAfterBreak="0">
+    <w:nsid w:val="5C1B3B2E"/>
+    <w:multiLevelType w:val="multilevel"/>
+    <w:tmpl w:val="18D4C0EE"/>
+    <w:lvl w:ilvl="0">
+      <w:start w:val="1"/>
+      <w:numFmt w:val="bullet"/>
+      <w:lvlText w:val=""/>
+      <w:lvlJc w:val="left"/>
+      <w:pPr>
+        <w:tabs>
+          <w:tab w:val="num" w:pos="720"/>
+        </w:tabs>
+        <w:ind w:left="720" w:hanging="360"/>
+      </w:pPr>
+      <w:rPr>
+        <w:rFonts w:ascii="Symbol" w:hAnsi="Symbol" w:hint="default"/>
+        <w:sz w:val="20"/>
+      </w:rPr>
+    </w:lvl>
+    <w:lvl w:ilvl="1" w:tentative="1">
+      <w:start w:val="1"/>
+      <w:numFmt w:val="bullet"/>
+      <w:lvlText w:val="o"/>
+      <w:lvlJc w:val="left"/>
+      <w:pPr>
+        <w:tabs>
+          <w:tab w:val="num" w:pos="1440"/>
+        </w:tabs>
+        <w:ind w:left="1440" w:hanging="360"/>
+      </w:pPr>
+      <w:rPr>
+        <w:rFonts w:ascii="Courier New" w:hAnsi="Courier New" w:hint="default"/>
+        <w:sz w:val="20"/>
+      </w:rPr>
+    </w:lvl>
+    <w:lvl w:ilvl="2" w:tentative="1">
+      <w:start w:val="1"/>
+      <w:numFmt w:val="bullet"/>
+      <w:lvlText w:val=""/>
+      <w:lvlJc w:val="left"/>
+      <w:pPr>
+        <w:tabs>
+          <w:tab w:val="num" w:pos="2160"/>
+        </w:tabs>
+        <w:ind w:left="2160" w:hanging="360"/>
+      </w:pPr>
+      <w:rPr>
+        <w:rFonts w:ascii="Wingdings" w:hAnsi="Wingdings" w:hint="default"/>
+        <w:sz w:val="20"/>
+      </w:rPr>
+    </w:lvl>
+    <w:lvl w:ilvl="3" w:tentative="1">
+      <w:start w:val="1"/>
+      <w:numFmt w:val="bullet"/>
+      <w:lvlText w:val=""/>
+      <w:lvlJc w:val="left"/>
+      <w:pPr>
+        <w:tabs>
+          <w:tab w:val="num" w:pos="2880"/>
+        </w:tabs>
+        <w:ind w:left="2880" w:hanging="360"/>
+      </w:pPr>
+      <w:rPr>
+        <w:rFonts w:ascii="Wingdings" w:hAnsi="Wingdings" w:hint="default"/>
+        <w:sz w:val="20"/>
+      </w:rPr>
+    </w:lvl>
+    <w:lvl w:ilvl="4" w:tentative="1">
+      <w:start w:val="1"/>
+      <w:numFmt w:val="bullet"/>
+      <w:lvlText w:val=""/>
+      <w:lvlJc w:val="left"/>
+      <w:pPr>
+        <w:tabs>
+          <w:tab w:val="num" w:pos="3600"/>
+        </w:tabs>
+        <w:ind w:left="3600" w:hanging="360"/>
+      </w:pPr>
+      <w:rPr>
+        <w:rFonts w:ascii="Wingdings" w:hAnsi="Wingdings" w:hint="default"/>
+        <w:sz w:val="20"/>
+      </w:rPr>
+    </w:lvl>
+    <w:lvl w:ilvl="5" w:tentative="1">
+      <w:start w:val="1"/>
+      <w:numFmt w:val="bullet"/>
+      <w:lvlText w:val=""/>
+      <w:lvlJc w:val="left"/>
+      <w:pPr>
+        <w:tabs>
+          <w:tab w:val="num" w:pos="4320"/>
+        </w:tabs>
+        <w:ind w:left="4320" w:hanging="360"/>
+      </w:pPr>
+      <w:rPr>
+        <w:rFonts w:ascii="Wingdings" w:hAnsi="Wingdings" w:hint="default"/>
+        <w:sz w:val="20"/>
+      </w:rPr>
+    </w:lvl>
+    <w:lvl w:ilvl="6" w:tentative="1">
+      <w:start w:val="1"/>
+      <w:numFmt w:val="bullet"/>
+      <w:lvlText w:val=""/>
+      <w:lvlJc w:val="left"/>
+      <w:pPr>
+        <w:tabs>
+          <w:tab w:val="num" w:pos="5040"/>
+        </w:tabs>
+        <w:ind w:left="5040" w:hanging="360"/>
+      </w:pPr>
+      <w:rPr>
+        <w:rFonts w:ascii="Wingdings" w:hAnsi="Wingdings" w:hint="default"/>
+        <w:sz w:val="20"/>
+      </w:rPr>
+    </w:lvl>
+    <w:lvl w:ilvl="7" w:tentative="1">
+      <w:start w:val="1"/>
+      <w:numFmt w:val="bullet"/>
+      <w:lvlText w:val=""/>
+      <w:lvlJc w:val="left"/>
+      <w:pPr>
+        <w:tabs>
+          <w:tab w:val="num" w:pos="5760"/>
+        </w:tabs>
+        <w:ind w:left="5760" w:hanging="360"/>
+      </w:pPr>
+      <w:rPr>
+        <w:rFonts w:ascii="Wingdings" w:hAnsi="Wingdings" w:hint="default"/>
+        <w:sz w:val="20"/>
+      </w:rPr>
+    </w:lvl>
+    <w:lvl w:ilvl="8" w:tentative="1">
+      <w:start w:val="1"/>
+      <w:numFmt w:val="bullet"/>
+      <w:lvlText w:val=""/>
+      <w:lvlJc w:val="left"/>
+      <w:pPr>
+        <w:tabs>
+          <w:tab w:val="num" w:pos="6480"/>
+        </w:tabs>
+        <w:ind w:left="6480" w:hanging="360"/>
+      </w:pPr>
+      <w:rPr>
+        <w:rFonts w:ascii="Wingdings" w:hAnsi="Wingdings" w:hint="default"/>
+        <w:sz w:val="20"/>
+      </w:rPr>
+    </w:lvl>
+  </w:abstractNum>
+  <w:abstractNum w:abstractNumId="25" w15:restartNumberingAfterBreak="0">
     <w:nsid w:val="5E5A632C"/>
     <w:multiLevelType w:val="multilevel"/>
     <w:tmpl w:val="C9B0DAC6"/>
@@ -8908,7 +10287,7 @@
       </w:rPr>
     </w:lvl>
   </w:abstractNum>
-  <w:abstractNum w:abstractNumId="19" w15:restartNumberingAfterBreak="0">
+  <w:abstractNum w:abstractNumId="26" w15:restartNumberingAfterBreak="0">
     <w:nsid w:val="63917845"/>
     <w:multiLevelType w:val="multilevel"/>
     <w:tmpl w:val="85DA6CC4"/>
@@ -9057,7 +10436,7 @@
       </w:rPr>
     </w:lvl>
   </w:abstractNum>
-  <w:abstractNum w:abstractNumId="20" w15:restartNumberingAfterBreak="0">
+  <w:abstractNum w:abstractNumId="27" w15:restartNumberingAfterBreak="0">
     <w:nsid w:val="63AE5996"/>
     <w:multiLevelType w:val="multilevel"/>
     <w:tmpl w:val="40DA5966"/>
@@ -9206,7 +10585,7 @@
       </w:rPr>
     </w:lvl>
   </w:abstractNum>
-  <w:abstractNum w:abstractNumId="21" w15:restartNumberingAfterBreak="0">
+  <w:abstractNum w:abstractNumId="28" w15:restartNumberingAfterBreak="0">
     <w:nsid w:val="66341A8F"/>
     <w:multiLevelType w:val="multilevel"/>
     <w:tmpl w:val="135067EE"/>
@@ -9355,7 +10734,7 @@
       </w:rPr>
     </w:lvl>
   </w:abstractNum>
-  <w:abstractNum w:abstractNumId="22" w15:restartNumberingAfterBreak="0">
+  <w:abstractNum w:abstractNumId="29" w15:restartNumberingAfterBreak="0">
     <w:nsid w:val="6737663A"/>
     <w:multiLevelType w:val="multilevel"/>
     <w:tmpl w:val="3CF02D0E"/>
@@ -9504,7 +10883,7 @@
       </w:rPr>
     </w:lvl>
   </w:abstractNum>
-  <w:abstractNum w:abstractNumId="23" w15:restartNumberingAfterBreak="0">
+  <w:abstractNum w:abstractNumId="30" w15:restartNumberingAfterBreak="0">
     <w:nsid w:val="69E009C9"/>
     <w:multiLevelType w:val="multilevel"/>
     <w:tmpl w:val="3B3CF598"/>
@@ -9653,7 +11032,305 @@
       </w:rPr>
     </w:lvl>
   </w:abstractNum>
-  <w:abstractNum w:abstractNumId="24" w15:restartNumberingAfterBreak="0">
+  <w:abstractNum w:abstractNumId="31" w15:restartNumberingAfterBreak="0">
+    <w:nsid w:val="6E143386"/>
+    <w:multiLevelType w:val="multilevel"/>
+    <w:tmpl w:val="AD005EBA"/>
+    <w:lvl w:ilvl="0">
+      <w:start w:val="1"/>
+      <w:numFmt w:val="bullet"/>
+      <w:lvlText w:val=""/>
+      <w:lvlJc w:val="left"/>
+      <w:pPr>
+        <w:tabs>
+          <w:tab w:val="num" w:pos="720"/>
+        </w:tabs>
+        <w:ind w:left="720" w:hanging="360"/>
+      </w:pPr>
+      <w:rPr>
+        <w:rFonts w:ascii="Symbol" w:hAnsi="Symbol" w:hint="default"/>
+        <w:sz w:val="20"/>
+      </w:rPr>
+    </w:lvl>
+    <w:lvl w:ilvl="1" w:tentative="1">
+      <w:start w:val="1"/>
+      <w:numFmt w:val="bullet"/>
+      <w:lvlText w:val="o"/>
+      <w:lvlJc w:val="left"/>
+      <w:pPr>
+        <w:tabs>
+          <w:tab w:val="num" w:pos="1440"/>
+        </w:tabs>
+        <w:ind w:left="1440" w:hanging="360"/>
+      </w:pPr>
+      <w:rPr>
+        <w:rFonts w:ascii="Courier New" w:hAnsi="Courier New" w:hint="default"/>
+        <w:sz w:val="20"/>
+      </w:rPr>
+    </w:lvl>
+    <w:lvl w:ilvl="2" w:tentative="1">
+      <w:start w:val="1"/>
+      <w:numFmt w:val="bullet"/>
+      <w:lvlText w:val=""/>
+      <w:lvlJc w:val="left"/>
+      <w:pPr>
+        <w:tabs>
+          <w:tab w:val="num" w:pos="2160"/>
+        </w:tabs>
+        <w:ind w:left="2160" w:hanging="360"/>
+      </w:pPr>
+      <w:rPr>
+        <w:rFonts w:ascii="Wingdings" w:hAnsi="Wingdings" w:hint="default"/>
+        <w:sz w:val="20"/>
+      </w:rPr>
+    </w:lvl>
+    <w:lvl w:ilvl="3" w:tentative="1">
+      <w:start w:val="1"/>
+      <w:numFmt w:val="bullet"/>
+      <w:lvlText w:val=""/>
+      <w:lvlJc w:val="left"/>
+      <w:pPr>
+        <w:tabs>
+          <w:tab w:val="num" w:pos="2880"/>
+        </w:tabs>
+        <w:ind w:left="2880" w:hanging="360"/>
+      </w:pPr>
+      <w:rPr>
+        <w:rFonts w:ascii="Wingdings" w:hAnsi="Wingdings" w:hint="default"/>
+        <w:sz w:val="20"/>
+      </w:rPr>
+    </w:lvl>
+    <w:lvl w:ilvl="4" w:tentative="1">
+      <w:start w:val="1"/>
+      <w:numFmt w:val="bullet"/>
+      <w:lvlText w:val=""/>
+      <w:lvlJc w:val="left"/>
+      <w:pPr>
+        <w:tabs>
+          <w:tab w:val="num" w:pos="3600"/>
+        </w:tabs>
+        <w:ind w:left="3600" w:hanging="360"/>
+      </w:pPr>
+      <w:rPr>
+        <w:rFonts w:ascii="Wingdings" w:hAnsi="Wingdings" w:hint="default"/>
+        <w:sz w:val="20"/>
+      </w:rPr>
+    </w:lvl>
+    <w:lvl w:ilvl="5" w:tentative="1">
+      <w:start w:val="1"/>
+      <w:numFmt w:val="bullet"/>
+      <w:lvlText w:val=""/>
+      <w:lvlJc w:val="left"/>
+      <w:pPr>
+        <w:tabs>
+          <w:tab w:val="num" w:pos="4320"/>
+        </w:tabs>
+        <w:ind w:left="4320" w:hanging="360"/>
+      </w:pPr>
+      <w:rPr>
+        <w:rFonts w:ascii="Wingdings" w:hAnsi="Wingdings" w:hint="default"/>
+        <w:sz w:val="20"/>
+      </w:rPr>
+    </w:lvl>
+    <w:lvl w:ilvl="6" w:tentative="1">
+      <w:start w:val="1"/>
+      <w:numFmt w:val="bullet"/>
+      <w:lvlText w:val=""/>
+      <w:lvlJc w:val="left"/>
+      <w:pPr>
+        <w:tabs>
+          <w:tab w:val="num" w:pos="5040"/>
+        </w:tabs>
+        <w:ind w:left="5040" w:hanging="360"/>
+      </w:pPr>
+      <w:rPr>
+        <w:rFonts w:ascii="Wingdings" w:hAnsi="Wingdings" w:hint="default"/>
+        <w:sz w:val="20"/>
+      </w:rPr>
+    </w:lvl>
+    <w:lvl w:ilvl="7" w:tentative="1">
+      <w:start w:val="1"/>
+      <w:numFmt w:val="bullet"/>
+      <w:lvlText w:val=""/>
+      <w:lvlJc w:val="left"/>
+      <w:pPr>
+        <w:tabs>
+          <w:tab w:val="num" w:pos="5760"/>
+        </w:tabs>
+        <w:ind w:left="5760" w:hanging="360"/>
+      </w:pPr>
+      <w:rPr>
+        <w:rFonts w:ascii="Wingdings" w:hAnsi="Wingdings" w:hint="default"/>
+        <w:sz w:val="20"/>
+      </w:rPr>
+    </w:lvl>
+    <w:lvl w:ilvl="8" w:tentative="1">
+      <w:start w:val="1"/>
+      <w:numFmt w:val="bullet"/>
+      <w:lvlText w:val=""/>
+      <w:lvlJc w:val="left"/>
+      <w:pPr>
+        <w:tabs>
+          <w:tab w:val="num" w:pos="6480"/>
+        </w:tabs>
+        <w:ind w:left="6480" w:hanging="360"/>
+      </w:pPr>
+      <w:rPr>
+        <w:rFonts w:ascii="Wingdings" w:hAnsi="Wingdings" w:hint="default"/>
+        <w:sz w:val="20"/>
+      </w:rPr>
+    </w:lvl>
+  </w:abstractNum>
+  <w:abstractNum w:abstractNumId="32" w15:restartNumberingAfterBreak="0">
+    <w:nsid w:val="70246F1E"/>
+    <w:multiLevelType w:val="multilevel"/>
+    <w:tmpl w:val="1F56660E"/>
+    <w:lvl w:ilvl="0">
+      <w:start w:val="1"/>
+      <w:numFmt w:val="bullet"/>
+      <w:lvlText w:val=""/>
+      <w:lvlJc w:val="left"/>
+      <w:pPr>
+        <w:tabs>
+          <w:tab w:val="num" w:pos="720"/>
+        </w:tabs>
+        <w:ind w:left="720" w:hanging="360"/>
+      </w:pPr>
+      <w:rPr>
+        <w:rFonts w:ascii="Symbol" w:hAnsi="Symbol" w:hint="default"/>
+        <w:sz w:val="20"/>
+      </w:rPr>
+    </w:lvl>
+    <w:lvl w:ilvl="1" w:tentative="1">
+      <w:start w:val="1"/>
+      <w:numFmt w:val="bullet"/>
+      <w:lvlText w:val="o"/>
+      <w:lvlJc w:val="left"/>
+      <w:pPr>
+        <w:tabs>
+          <w:tab w:val="num" w:pos="1440"/>
+        </w:tabs>
+        <w:ind w:left="1440" w:hanging="360"/>
+      </w:pPr>
+      <w:rPr>
+        <w:rFonts w:ascii="Courier New" w:hAnsi="Courier New" w:hint="default"/>
+        <w:sz w:val="20"/>
+      </w:rPr>
+    </w:lvl>
+    <w:lvl w:ilvl="2" w:tentative="1">
+      <w:start w:val="1"/>
+      <w:numFmt w:val="bullet"/>
+      <w:lvlText w:val=""/>
+      <w:lvlJc w:val="left"/>
+      <w:pPr>
+        <w:tabs>
+          <w:tab w:val="num" w:pos="2160"/>
+        </w:tabs>
+        <w:ind w:left="2160" w:hanging="360"/>
+      </w:pPr>
+      <w:rPr>
+        <w:rFonts w:ascii="Wingdings" w:hAnsi="Wingdings" w:hint="default"/>
+        <w:sz w:val="20"/>
+      </w:rPr>
+    </w:lvl>
+    <w:lvl w:ilvl="3" w:tentative="1">
+      <w:start w:val="1"/>
+      <w:numFmt w:val="bullet"/>
+      <w:lvlText w:val=""/>
+      <w:lvlJc w:val="left"/>
+      <w:pPr>
+        <w:tabs>
+          <w:tab w:val="num" w:pos="2880"/>
+        </w:tabs>
+        <w:ind w:left="2880" w:hanging="360"/>
+      </w:pPr>
+      <w:rPr>
+        <w:rFonts w:ascii="Wingdings" w:hAnsi="Wingdings" w:hint="default"/>
+        <w:sz w:val="20"/>
+      </w:rPr>
+    </w:lvl>
+    <w:lvl w:ilvl="4" w:tentative="1">
+      <w:start w:val="1"/>
+      <w:numFmt w:val="bullet"/>
+      <w:lvlText w:val=""/>
+      <w:lvlJc w:val="left"/>
+      <w:pPr>
+        <w:tabs>
+          <w:tab w:val="num" w:pos="3600"/>
+        </w:tabs>
+        <w:ind w:left="3600" w:hanging="360"/>
+      </w:pPr>
+      <w:rPr>
+        <w:rFonts w:ascii="Wingdings" w:hAnsi="Wingdings" w:hint="default"/>
+        <w:sz w:val="20"/>
+      </w:rPr>
+    </w:lvl>
+    <w:lvl w:ilvl="5" w:tentative="1">
+      <w:start w:val="1"/>
+      <w:numFmt w:val="bullet"/>
+      <w:lvlText w:val=""/>
+      <w:lvlJc w:val="left"/>
+      <w:pPr>
+        <w:tabs>
+          <w:tab w:val="num" w:pos="4320"/>
+        </w:tabs>
+        <w:ind w:left="4320" w:hanging="360"/>
+      </w:pPr>
+      <w:rPr>
+        <w:rFonts w:ascii="Wingdings" w:hAnsi="Wingdings" w:hint="default"/>
+        <w:sz w:val="20"/>
+      </w:rPr>
+    </w:lvl>
+    <w:lvl w:ilvl="6" w:tentative="1">
+      <w:start w:val="1"/>
+      <w:numFmt w:val="bullet"/>
+      <w:lvlText w:val=""/>
+      <w:lvlJc w:val="left"/>
+      <w:pPr>
+        <w:tabs>
+          <w:tab w:val="num" w:pos="5040"/>
+        </w:tabs>
+        <w:ind w:left="5040" w:hanging="360"/>
+      </w:pPr>
+      <w:rPr>
+        <w:rFonts w:ascii="Wingdings" w:hAnsi="Wingdings" w:hint="default"/>
+        <w:sz w:val="20"/>
+      </w:rPr>
+    </w:lvl>
+    <w:lvl w:ilvl="7" w:tentative="1">
+      <w:start w:val="1"/>
+      <w:numFmt w:val="bullet"/>
+      <w:lvlText w:val=""/>
+      <w:lvlJc w:val="left"/>
+      <w:pPr>
+        <w:tabs>
+          <w:tab w:val="num" w:pos="5760"/>
+        </w:tabs>
+        <w:ind w:left="5760" w:hanging="360"/>
+      </w:pPr>
+      <w:rPr>
+        <w:rFonts w:ascii="Wingdings" w:hAnsi="Wingdings" w:hint="default"/>
+        <w:sz w:val="20"/>
+      </w:rPr>
+    </w:lvl>
+    <w:lvl w:ilvl="8" w:tentative="1">
+      <w:start w:val="1"/>
+      <w:numFmt w:val="bullet"/>
+      <w:lvlText w:val=""/>
+      <w:lvlJc w:val="left"/>
+      <w:pPr>
+        <w:tabs>
+          <w:tab w:val="num" w:pos="6480"/>
+        </w:tabs>
+        <w:ind w:left="6480" w:hanging="360"/>
+      </w:pPr>
+      <w:rPr>
+        <w:rFonts w:ascii="Wingdings" w:hAnsi="Wingdings" w:hint="default"/>
+        <w:sz w:val="20"/>
+      </w:rPr>
+    </w:lvl>
+  </w:abstractNum>
+  <w:abstractNum w:abstractNumId="33" w15:restartNumberingAfterBreak="0">
     <w:nsid w:val="786A4D3B"/>
     <w:multiLevelType w:val="multilevel"/>
     <w:tmpl w:val="1C9E256C"/>
@@ -9802,7 +11479,7 @@
       </w:rPr>
     </w:lvl>
   </w:abstractNum>
-  <w:abstractNum w:abstractNumId="25" w15:restartNumberingAfterBreak="0">
+  <w:abstractNum w:abstractNumId="34" w15:restartNumberingAfterBreak="0">
     <w:nsid w:val="787043DD"/>
     <w:multiLevelType w:val="multilevel"/>
     <w:tmpl w:val="8B328E80"/>
@@ -9951,83 +11628,262 @@
       </w:rPr>
     </w:lvl>
   </w:abstractNum>
+  <w:abstractNum w:abstractNumId="35" w15:restartNumberingAfterBreak="0">
+    <w:nsid w:val="7C011659"/>
+    <w:multiLevelType w:val="multilevel"/>
+    <w:tmpl w:val="10AC0A78"/>
+    <w:lvl w:ilvl="0">
+      <w:start w:val="1"/>
+      <w:numFmt w:val="bullet"/>
+      <w:lvlText w:val=""/>
+      <w:lvlJc w:val="left"/>
+      <w:pPr>
+        <w:tabs>
+          <w:tab w:val="num" w:pos="720"/>
+        </w:tabs>
+        <w:ind w:left="720" w:hanging="360"/>
+      </w:pPr>
+      <w:rPr>
+        <w:rFonts w:ascii="Symbol" w:hAnsi="Symbol" w:hint="default"/>
+        <w:sz w:val="20"/>
+      </w:rPr>
+    </w:lvl>
+    <w:lvl w:ilvl="1" w:tentative="1">
+      <w:start w:val="1"/>
+      <w:numFmt w:val="bullet"/>
+      <w:lvlText w:val="o"/>
+      <w:lvlJc w:val="left"/>
+      <w:pPr>
+        <w:tabs>
+          <w:tab w:val="num" w:pos="1440"/>
+        </w:tabs>
+        <w:ind w:left="1440" w:hanging="360"/>
+      </w:pPr>
+      <w:rPr>
+        <w:rFonts w:ascii="Courier New" w:hAnsi="Courier New" w:hint="default"/>
+        <w:sz w:val="20"/>
+      </w:rPr>
+    </w:lvl>
+    <w:lvl w:ilvl="2" w:tentative="1">
+      <w:start w:val="1"/>
+      <w:numFmt w:val="bullet"/>
+      <w:lvlText w:val=""/>
+      <w:lvlJc w:val="left"/>
+      <w:pPr>
+        <w:tabs>
+          <w:tab w:val="num" w:pos="2160"/>
+        </w:tabs>
+        <w:ind w:left="2160" w:hanging="360"/>
+      </w:pPr>
+      <w:rPr>
+        <w:rFonts w:ascii="Wingdings" w:hAnsi="Wingdings" w:hint="default"/>
+        <w:sz w:val="20"/>
+      </w:rPr>
+    </w:lvl>
+    <w:lvl w:ilvl="3" w:tentative="1">
+      <w:start w:val="1"/>
+      <w:numFmt w:val="bullet"/>
+      <w:lvlText w:val=""/>
+      <w:lvlJc w:val="left"/>
+      <w:pPr>
+        <w:tabs>
+          <w:tab w:val="num" w:pos="2880"/>
+        </w:tabs>
+        <w:ind w:left="2880" w:hanging="360"/>
+      </w:pPr>
+      <w:rPr>
+        <w:rFonts w:ascii="Wingdings" w:hAnsi="Wingdings" w:hint="default"/>
+        <w:sz w:val="20"/>
+      </w:rPr>
+    </w:lvl>
+    <w:lvl w:ilvl="4" w:tentative="1">
+      <w:start w:val="1"/>
+      <w:numFmt w:val="bullet"/>
+      <w:lvlText w:val=""/>
+      <w:lvlJc w:val="left"/>
+      <w:pPr>
+        <w:tabs>
+          <w:tab w:val="num" w:pos="3600"/>
+        </w:tabs>
+        <w:ind w:left="3600" w:hanging="360"/>
+      </w:pPr>
+      <w:rPr>
+        <w:rFonts w:ascii="Wingdings" w:hAnsi="Wingdings" w:hint="default"/>
+        <w:sz w:val="20"/>
+      </w:rPr>
+    </w:lvl>
+    <w:lvl w:ilvl="5" w:tentative="1">
+      <w:start w:val="1"/>
+      <w:numFmt w:val="bullet"/>
+      <w:lvlText w:val=""/>
+      <w:lvlJc w:val="left"/>
+      <w:pPr>
+        <w:tabs>
+          <w:tab w:val="num" w:pos="4320"/>
+        </w:tabs>
+        <w:ind w:left="4320" w:hanging="360"/>
+      </w:pPr>
+      <w:rPr>
+        <w:rFonts w:ascii="Wingdings" w:hAnsi="Wingdings" w:hint="default"/>
+        <w:sz w:val="20"/>
+      </w:rPr>
+    </w:lvl>
+    <w:lvl w:ilvl="6" w:tentative="1">
+      <w:start w:val="1"/>
+      <w:numFmt w:val="bullet"/>
+      <w:lvlText w:val=""/>
+      <w:lvlJc w:val="left"/>
+      <w:pPr>
+        <w:tabs>
+          <w:tab w:val="num" w:pos="5040"/>
+        </w:tabs>
+        <w:ind w:left="5040" w:hanging="360"/>
+      </w:pPr>
+      <w:rPr>
+        <w:rFonts w:ascii="Wingdings" w:hAnsi="Wingdings" w:hint="default"/>
+        <w:sz w:val="20"/>
+      </w:rPr>
+    </w:lvl>
+    <w:lvl w:ilvl="7" w:tentative="1">
+      <w:start w:val="1"/>
+      <w:numFmt w:val="bullet"/>
+      <w:lvlText w:val=""/>
+      <w:lvlJc w:val="left"/>
+      <w:pPr>
+        <w:tabs>
+          <w:tab w:val="num" w:pos="5760"/>
+        </w:tabs>
+        <w:ind w:left="5760" w:hanging="360"/>
+      </w:pPr>
+      <w:rPr>
+        <w:rFonts w:ascii="Wingdings" w:hAnsi="Wingdings" w:hint="default"/>
+        <w:sz w:val="20"/>
+      </w:rPr>
+    </w:lvl>
+    <w:lvl w:ilvl="8" w:tentative="1">
+      <w:start w:val="1"/>
+      <w:numFmt w:val="bullet"/>
+      <w:lvlText w:val=""/>
+      <w:lvlJc w:val="left"/>
+      <w:pPr>
+        <w:tabs>
+          <w:tab w:val="num" w:pos="6480"/>
+        </w:tabs>
+        <w:ind w:left="6480" w:hanging="360"/>
+      </w:pPr>
+      <w:rPr>
+        <w:rFonts w:ascii="Wingdings" w:hAnsi="Wingdings" w:hint="default"/>
+        <w:sz w:val="20"/>
+      </w:rPr>
+    </w:lvl>
+  </w:abstractNum>
   <w:num w:numId="1" w16cid:durableId="955064590">
-    <w:abstractNumId w:val="16"/>
+    <w:abstractNumId w:val="22"/>
   </w:num>
   <w:num w:numId="2" w16cid:durableId="856381992">
-    <w:abstractNumId w:val="18"/>
+    <w:abstractNumId w:val="25"/>
   </w:num>
   <w:num w:numId="3" w16cid:durableId="510919362">
-    <w:abstractNumId w:val="25"/>
+    <w:abstractNumId w:val="34"/>
   </w:num>
   <w:num w:numId="4" w16cid:durableId="1724405010">
     <w:abstractNumId w:val="0"/>
   </w:num>
   <w:num w:numId="5" w16cid:durableId="1629623069">
-    <w:abstractNumId w:val="14"/>
+    <w:abstractNumId w:val="20"/>
   </w:num>
   <w:num w:numId="6" w16cid:durableId="372192214">
-    <w:abstractNumId w:val="24"/>
+    <w:abstractNumId w:val="33"/>
   </w:num>
   <w:num w:numId="7" w16cid:durableId="25327836">
-    <w:abstractNumId w:val="19"/>
+    <w:abstractNumId w:val="26"/>
   </w:num>
   <w:num w:numId="8" w16cid:durableId="176893813">
-    <w:abstractNumId w:val="20"/>
+    <w:abstractNumId w:val="27"/>
   </w:num>
   <w:num w:numId="9" w16cid:durableId="1011765007">
-    <w:abstractNumId w:val="23"/>
+    <w:abstractNumId w:val="30"/>
   </w:num>
   <w:num w:numId="10" w16cid:durableId="1195389871">
     <w:abstractNumId w:val="1"/>
   </w:num>
   <w:num w:numId="11" w16cid:durableId="21175925">
+    <w:abstractNumId w:val="23"/>
+  </w:num>
+  <w:num w:numId="12" w16cid:durableId="244921388">
+    <w:abstractNumId w:val="10"/>
+  </w:num>
+  <w:num w:numId="13" w16cid:durableId="1749184363">
+    <w:abstractNumId w:val="14"/>
+  </w:num>
+  <w:num w:numId="14" w16cid:durableId="649359082">
+    <w:abstractNumId w:val="8"/>
+  </w:num>
+  <w:num w:numId="15" w16cid:durableId="74983087">
+    <w:abstractNumId w:val="15"/>
+  </w:num>
+  <w:num w:numId="16" w16cid:durableId="1079594202">
     <w:abstractNumId w:val="17"/>
   </w:num>
-  <w:num w:numId="12" w16cid:durableId="244921388">
+  <w:num w:numId="17" w16cid:durableId="680013669">
+    <w:abstractNumId w:val="4"/>
+  </w:num>
+  <w:num w:numId="18" w16cid:durableId="1151286382">
+    <w:abstractNumId w:val="28"/>
+  </w:num>
+  <w:num w:numId="19" w16cid:durableId="1188518645">
+    <w:abstractNumId w:val="6"/>
+  </w:num>
+  <w:num w:numId="20" w16cid:durableId="596645482">
+    <w:abstractNumId w:val="9"/>
+  </w:num>
+  <w:num w:numId="21" w16cid:durableId="1095788525">
+    <w:abstractNumId w:val="19"/>
+  </w:num>
+  <w:num w:numId="22" w16cid:durableId="1107695619">
+    <w:abstractNumId w:val="16"/>
+  </w:num>
+  <w:num w:numId="23" w16cid:durableId="1533301829">
+    <w:abstractNumId w:val="18"/>
+  </w:num>
+  <w:num w:numId="24" w16cid:durableId="669063692">
+    <w:abstractNumId w:val="5"/>
+  </w:num>
+  <w:num w:numId="25" w16cid:durableId="1947106744">
+    <w:abstractNumId w:val="29"/>
+  </w:num>
+  <w:num w:numId="26" w16cid:durableId="815488017">
+    <w:abstractNumId w:val="21"/>
+  </w:num>
+  <w:num w:numId="27" w16cid:durableId="1680155581">
+    <w:abstractNumId w:val="13"/>
+  </w:num>
+  <w:num w:numId="28" w16cid:durableId="780993803">
+    <w:abstractNumId w:val="2"/>
+  </w:num>
+  <w:num w:numId="29" w16cid:durableId="604120900">
+    <w:abstractNumId w:val="11"/>
+  </w:num>
+  <w:num w:numId="30" w16cid:durableId="1650476261">
+    <w:abstractNumId w:val="3"/>
+  </w:num>
+  <w:num w:numId="31" w16cid:durableId="779253416">
+    <w:abstractNumId w:val="12"/>
+  </w:num>
+  <w:num w:numId="32" w16cid:durableId="373043512">
     <w:abstractNumId w:val="7"/>
   </w:num>
-  <w:num w:numId="13" w16cid:durableId="1749184363">
-    <w:abstractNumId w:val="8"/>
+  <w:num w:numId="33" w16cid:durableId="1816139125">
+    <w:abstractNumId w:val="35"/>
   </w:num>
-  <w:num w:numId="14" w16cid:durableId="649359082">
-    <w:abstractNumId w:val="5"/>
+  <w:num w:numId="34" w16cid:durableId="2004314918">
+    <w:abstractNumId w:val="24"/>
   </w:num>
-  <w:num w:numId="15" w16cid:durableId="74983087">
-    <w:abstractNumId w:val="9"/>
+  <w:num w:numId="35" w16cid:durableId="1424108609">
+    <w:abstractNumId w:val="32"/>
   </w:num>
-  <w:num w:numId="16" w16cid:durableId="1079594202">
-    <w:abstractNumId w:val="11"/>
-  </w:num>
-  <w:num w:numId="17" w16cid:durableId="680013669">
-    <w:abstractNumId w:val="2"/>
-  </w:num>
-  <w:num w:numId="18" w16cid:durableId="1151286382">
-    <w:abstractNumId w:val="21"/>
-  </w:num>
-  <w:num w:numId="19" w16cid:durableId="1188518645">
-    <w:abstractNumId w:val="4"/>
-  </w:num>
-  <w:num w:numId="20" w16cid:durableId="596645482">
-    <w:abstractNumId w:val="6"/>
-  </w:num>
-  <w:num w:numId="21" w16cid:durableId="1095788525">
-    <w:abstractNumId w:val="13"/>
-  </w:num>
-  <w:num w:numId="22" w16cid:durableId="1107695619">
-    <w:abstractNumId w:val="10"/>
-  </w:num>
-  <w:num w:numId="23" w16cid:durableId="1533301829">
-    <w:abstractNumId w:val="12"/>
-  </w:num>
-  <w:num w:numId="24" w16cid:durableId="669063692">
-    <w:abstractNumId w:val="3"/>
-  </w:num>
-  <w:num w:numId="25" w16cid:durableId="1947106744">
-    <w:abstractNumId w:val="22"/>
-  </w:num>
-  <w:num w:numId="26" w16cid:durableId="815488017">
-    <w:abstractNumId w:val="15"/>
+  <w:num w:numId="36" w16cid:durableId="1177380654">
+    <w:abstractNumId w:val="31"/>
   </w:num>
 </w:numbering>
 </file>

</xml_diff>

<commit_message>
Modifiche finali al progetto.
</commit_message>
<xml_diff>
--- a/Documentazione.docx
+++ b/Documentazione.docx
@@ -417,22 +417,2652 @@
     <w:p>
       <w:pPr>
         <w:pStyle w:val="Titolo1"/>
-      </w:pPr>
+        <w:spacing w:before="0" w:after="0"/>
+      </w:pPr>
+      <w:r>
+        <w:lastRenderedPageBreak/>
+        <w:t>INDICE</w:t>
+      </w:r>
+    </w:p>
+    <w:p>
+      <w:pPr>
+        <w:pStyle w:val="Sommario1"/>
+        <w:tabs>
+          <w:tab w:val="right" w:leader="dot" w:pos="9628"/>
+        </w:tabs>
+        <w:rPr>
+          <w:noProof/>
+        </w:rPr>
+      </w:pPr>
+      <w:r>
+        <w:fldChar w:fldCharType="begin"/>
+      </w:r>
+      <w:r>
+        <w:instrText xml:space="preserve"> TOC \o "1-3" \h \z \u </w:instrText>
+      </w:r>
+      <w:r>
+        <w:fldChar w:fldCharType="separate"/>
+      </w:r>
+      <w:hyperlink w:anchor="_Toc224033443" w:history="1">
+        <w:r>
+          <w:rPr>
+            <w:rStyle w:val="Collegamentoipertestuale"/>
+            <w:noProof/>
+          </w:rPr>
+          <w:t>1. Introduzione e Obiettivi</w:t>
+        </w:r>
+        <w:r>
+          <w:rPr>
+            <w:noProof/>
+            <w:webHidden/>
+          </w:rPr>
+          <w:tab/>
+        </w:r>
+        <w:r>
+          <w:rPr>
+            <w:noProof/>
+            <w:webHidden/>
+          </w:rPr>
+          <w:fldChar w:fldCharType="begin"/>
+        </w:r>
+        <w:r>
+          <w:rPr>
+            <w:noProof/>
+            <w:webHidden/>
+          </w:rPr>
+          <w:instrText xml:space="preserve"> PAGEREF _Toc224033443 \h </w:instrText>
+        </w:r>
+        <w:r>
+          <w:rPr>
+            <w:noProof/>
+            <w:webHidden/>
+          </w:rPr>
+        </w:r>
+        <w:r>
+          <w:rPr>
+            <w:noProof/>
+            <w:webHidden/>
+          </w:rPr>
+          <w:fldChar w:fldCharType="separate"/>
+        </w:r>
+        <w:r>
+          <w:rPr>
+            <w:noProof/>
+            <w:webHidden/>
+          </w:rPr>
+          <w:t>3</w:t>
+        </w:r>
+        <w:r>
+          <w:rPr>
+            <w:noProof/>
+            <w:webHidden/>
+          </w:rPr>
+          <w:fldChar w:fldCharType="end"/>
+        </w:r>
+      </w:hyperlink>
+    </w:p>
+    <w:p>
+      <w:pPr>
+        <w:pStyle w:val="Sommario2"/>
+        <w:tabs>
+          <w:tab w:val="right" w:leader="dot" w:pos="9628"/>
+        </w:tabs>
+        <w:rPr>
+          <w:noProof/>
+        </w:rPr>
+      </w:pPr>
+      <w:hyperlink w:anchor="_Toc224033444" w:history="1">
+        <w:r>
+          <w:rPr>
+            <w:rStyle w:val="Collegamentoipertestuale"/>
+            <w:noProof/>
+          </w:rPr>
+          <w:t>1.1 Contesto</w:t>
+        </w:r>
+        <w:r>
+          <w:rPr>
+            <w:noProof/>
+            <w:webHidden/>
+          </w:rPr>
+          <w:tab/>
+        </w:r>
+        <w:r>
+          <w:rPr>
+            <w:noProof/>
+            <w:webHidden/>
+          </w:rPr>
+          <w:fldChar w:fldCharType="begin"/>
+        </w:r>
+        <w:r>
+          <w:rPr>
+            <w:noProof/>
+            <w:webHidden/>
+          </w:rPr>
+          <w:instrText xml:space="preserve"> PAGEREF _Toc224033444 \h </w:instrText>
+        </w:r>
+        <w:r>
+          <w:rPr>
+            <w:noProof/>
+            <w:webHidden/>
+          </w:rPr>
+        </w:r>
+        <w:r>
+          <w:rPr>
+            <w:noProof/>
+            <w:webHidden/>
+          </w:rPr>
+          <w:fldChar w:fldCharType="separate"/>
+        </w:r>
+        <w:r>
+          <w:rPr>
+            <w:noProof/>
+            <w:webHidden/>
+          </w:rPr>
+          <w:t>3</w:t>
+        </w:r>
+        <w:r>
+          <w:rPr>
+            <w:noProof/>
+            <w:webHidden/>
+          </w:rPr>
+          <w:fldChar w:fldCharType="end"/>
+        </w:r>
+      </w:hyperlink>
+    </w:p>
+    <w:p>
+      <w:pPr>
+        <w:pStyle w:val="Sommario2"/>
+        <w:tabs>
+          <w:tab w:val="right" w:leader="dot" w:pos="9628"/>
+        </w:tabs>
+        <w:rPr>
+          <w:noProof/>
+        </w:rPr>
+      </w:pPr>
+      <w:hyperlink w:anchor="_Toc224033445" w:history="1">
+        <w:r>
+          <w:rPr>
+            <w:rStyle w:val="Collegamentoipertestuale"/>
+            <w:noProof/>
+          </w:rPr>
+          <w:t>1.2 Il Problema</w:t>
+        </w:r>
+        <w:r>
+          <w:rPr>
+            <w:noProof/>
+            <w:webHidden/>
+          </w:rPr>
+          <w:tab/>
+        </w:r>
+        <w:r>
+          <w:rPr>
+            <w:noProof/>
+            <w:webHidden/>
+          </w:rPr>
+          <w:fldChar w:fldCharType="begin"/>
+        </w:r>
+        <w:r>
+          <w:rPr>
+            <w:noProof/>
+            <w:webHidden/>
+          </w:rPr>
+          <w:instrText xml:space="preserve"> PAGEREF _Toc224033445 \h </w:instrText>
+        </w:r>
+        <w:r>
+          <w:rPr>
+            <w:noProof/>
+            <w:webHidden/>
+          </w:rPr>
+        </w:r>
+        <w:r>
+          <w:rPr>
+            <w:noProof/>
+            <w:webHidden/>
+          </w:rPr>
+          <w:fldChar w:fldCharType="separate"/>
+        </w:r>
+        <w:r>
+          <w:rPr>
+            <w:noProof/>
+            <w:webHidden/>
+          </w:rPr>
+          <w:t>3</w:t>
+        </w:r>
+        <w:r>
+          <w:rPr>
+            <w:noProof/>
+            <w:webHidden/>
+          </w:rPr>
+          <w:fldChar w:fldCharType="end"/>
+        </w:r>
+      </w:hyperlink>
+    </w:p>
+    <w:p>
+      <w:pPr>
+        <w:pStyle w:val="Sommario2"/>
+        <w:tabs>
+          <w:tab w:val="right" w:leader="dot" w:pos="9628"/>
+        </w:tabs>
+        <w:rPr>
+          <w:noProof/>
+        </w:rPr>
+      </w:pPr>
+      <w:hyperlink w:anchor="_Toc224033446" w:history="1">
+        <w:r>
+          <w:rPr>
+            <w:rStyle w:val="Collegamentoipertestuale"/>
+            <w:noProof/>
+          </w:rPr>
+          <w:t>1.3 Obiettivo del progetto</w:t>
+        </w:r>
+        <w:r>
+          <w:rPr>
+            <w:noProof/>
+            <w:webHidden/>
+          </w:rPr>
+          <w:tab/>
+        </w:r>
+        <w:r>
+          <w:rPr>
+            <w:noProof/>
+            <w:webHidden/>
+          </w:rPr>
+          <w:fldChar w:fldCharType="begin"/>
+        </w:r>
+        <w:r>
+          <w:rPr>
+            <w:noProof/>
+            <w:webHidden/>
+          </w:rPr>
+          <w:instrText xml:space="preserve"> PAGEREF _Toc224033446 \h </w:instrText>
+        </w:r>
+        <w:r>
+          <w:rPr>
+            <w:noProof/>
+            <w:webHidden/>
+          </w:rPr>
+        </w:r>
+        <w:r>
+          <w:rPr>
+            <w:noProof/>
+            <w:webHidden/>
+          </w:rPr>
+          <w:fldChar w:fldCharType="separate"/>
+        </w:r>
+        <w:r>
+          <w:rPr>
+            <w:noProof/>
+            <w:webHidden/>
+          </w:rPr>
+          <w:t>3</w:t>
+        </w:r>
+        <w:r>
+          <w:rPr>
+            <w:noProof/>
+            <w:webHidden/>
+          </w:rPr>
+          <w:fldChar w:fldCharType="end"/>
+        </w:r>
+      </w:hyperlink>
+    </w:p>
+    <w:p>
+      <w:pPr>
+        <w:pStyle w:val="Sommario1"/>
+        <w:tabs>
+          <w:tab w:val="right" w:leader="dot" w:pos="9628"/>
+        </w:tabs>
+        <w:rPr>
+          <w:noProof/>
+        </w:rPr>
+      </w:pPr>
+      <w:hyperlink w:anchor="_Toc224033447" w:history="1">
+        <w:r>
+          <w:rPr>
+            <w:rStyle w:val="Collegamentoipertestuale"/>
+            <w:noProof/>
+          </w:rPr>
+          <w:t>2. Architettura del sistema</w:t>
+        </w:r>
+        <w:r>
+          <w:rPr>
+            <w:noProof/>
+            <w:webHidden/>
+          </w:rPr>
+          <w:tab/>
+        </w:r>
+        <w:r>
+          <w:rPr>
+            <w:noProof/>
+            <w:webHidden/>
+          </w:rPr>
+          <w:fldChar w:fldCharType="begin"/>
+        </w:r>
+        <w:r>
+          <w:rPr>
+            <w:noProof/>
+            <w:webHidden/>
+          </w:rPr>
+          <w:instrText xml:space="preserve"> PAGEREF _Toc224033447 \h </w:instrText>
+        </w:r>
+        <w:r>
+          <w:rPr>
+            <w:noProof/>
+            <w:webHidden/>
+          </w:rPr>
+        </w:r>
+        <w:r>
+          <w:rPr>
+            <w:noProof/>
+            <w:webHidden/>
+          </w:rPr>
+          <w:fldChar w:fldCharType="separate"/>
+        </w:r>
+        <w:r>
+          <w:rPr>
+            <w:noProof/>
+            <w:webHidden/>
+          </w:rPr>
+          <w:t>4</w:t>
+        </w:r>
+        <w:r>
+          <w:rPr>
+            <w:noProof/>
+            <w:webHidden/>
+          </w:rPr>
+          <w:fldChar w:fldCharType="end"/>
+        </w:r>
+      </w:hyperlink>
+    </w:p>
+    <w:p>
+      <w:pPr>
+        <w:pStyle w:val="Sommario2"/>
+        <w:tabs>
+          <w:tab w:val="right" w:leader="dot" w:pos="9628"/>
+        </w:tabs>
+        <w:rPr>
+          <w:noProof/>
+        </w:rPr>
+      </w:pPr>
+      <w:hyperlink w:anchor="_Toc224033448" w:history="1">
+        <w:r>
+          <w:rPr>
+            <w:rStyle w:val="Collegamentoipertestuale"/>
+            <w:noProof/>
+          </w:rPr>
+          <w:t>2.1 Architettura</w:t>
+        </w:r>
+        <w:r>
+          <w:rPr>
+            <w:noProof/>
+            <w:webHidden/>
+          </w:rPr>
+          <w:tab/>
+        </w:r>
+        <w:r>
+          <w:rPr>
+            <w:noProof/>
+            <w:webHidden/>
+          </w:rPr>
+          <w:fldChar w:fldCharType="begin"/>
+        </w:r>
+        <w:r>
+          <w:rPr>
+            <w:noProof/>
+            <w:webHidden/>
+          </w:rPr>
+          <w:instrText xml:space="preserve"> PAGEREF _Toc224033448 \h </w:instrText>
+        </w:r>
+        <w:r>
+          <w:rPr>
+            <w:noProof/>
+            <w:webHidden/>
+          </w:rPr>
+        </w:r>
+        <w:r>
+          <w:rPr>
+            <w:noProof/>
+            <w:webHidden/>
+          </w:rPr>
+          <w:fldChar w:fldCharType="separate"/>
+        </w:r>
+        <w:r>
+          <w:rPr>
+            <w:noProof/>
+            <w:webHidden/>
+          </w:rPr>
+          <w:t>5</w:t>
+        </w:r>
+        <w:r>
+          <w:rPr>
+            <w:noProof/>
+            <w:webHidden/>
+          </w:rPr>
+          <w:fldChar w:fldCharType="end"/>
+        </w:r>
+      </w:hyperlink>
+    </w:p>
+    <w:p>
+      <w:pPr>
+        <w:pStyle w:val="Sommario3"/>
+        <w:tabs>
+          <w:tab w:val="right" w:leader="dot" w:pos="9628"/>
+        </w:tabs>
+        <w:rPr>
+          <w:noProof/>
+        </w:rPr>
+      </w:pPr>
+      <w:hyperlink w:anchor="_Toc224033449" w:history="1">
+        <w:r>
+          <w:rPr>
+            <w:rStyle w:val="Collegamentoipertestuale"/>
+            <w:noProof/>
+          </w:rPr>
+          <w:t>2.1.1 Il Layer di Ingestione: Apache Kafka</w:t>
+        </w:r>
+        <w:r>
+          <w:rPr>
+            <w:noProof/>
+            <w:webHidden/>
+          </w:rPr>
+          <w:tab/>
+        </w:r>
+        <w:r>
+          <w:rPr>
+            <w:noProof/>
+            <w:webHidden/>
+          </w:rPr>
+          <w:fldChar w:fldCharType="begin"/>
+        </w:r>
+        <w:r>
+          <w:rPr>
+            <w:noProof/>
+            <w:webHidden/>
+          </w:rPr>
+          <w:instrText xml:space="preserve"> PAGEREF _Toc224033449 \h </w:instrText>
+        </w:r>
+        <w:r>
+          <w:rPr>
+            <w:noProof/>
+            <w:webHidden/>
+          </w:rPr>
+        </w:r>
+        <w:r>
+          <w:rPr>
+            <w:noProof/>
+            <w:webHidden/>
+          </w:rPr>
+          <w:fldChar w:fldCharType="separate"/>
+        </w:r>
+        <w:r>
+          <w:rPr>
+            <w:noProof/>
+            <w:webHidden/>
+          </w:rPr>
+          <w:t>5</w:t>
+        </w:r>
+        <w:r>
+          <w:rPr>
+            <w:noProof/>
+            <w:webHidden/>
+          </w:rPr>
+          <w:fldChar w:fldCharType="end"/>
+        </w:r>
+      </w:hyperlink>
+    </w:p>
+    <w:p>
+      <w:pPr>
+        <w:pStyle w:val="Sommario3"/>
+        <w:tabs>
+          <w:tab w:val="right" w:leader="dot" w:pos="9628"/>
+        </w:tabs>
+        <w:rPr>
+          <w:noProof/>
+        </w:rPr>
+      </w:pPr>
+      <w:hyperlink w:anchor="_Toc224033450" w:history="1">
+        <w:r>
+          <w:rPr>
+            <w:rStyle w:val="Collegamentoipertestuale"/>
+            <w:noProof/>
+          </w:rPr>
+          <w:t>2.1.2 Il Motore di Calcolo: Spark Structured Streaming &amp; Scala</w:t>
+        </w:r>
+        <w:r>
+          <w:rPr>
+            <w:noProof/>
+            <w:webHidden/>
+          </w:rPr>
+          <w:tab/>
+        </w:r>
+        <w:r>
+          <w:rPr>
+            <w:noProof/>
+            <w:webHidden/>
+          </w:rPr>
+          <w:fldChar w:fldCharType="begin"/>
+        </w:r>
+        <w:r>
+          <w:rPr>
+            <w:noProof/>
+            <w:webHidden/>
+          </w:rPr>
+          <w:instrText xml:space="preserve"> PAGEREF _Toc224033450 \h </w:instrText>
+        </w:r>
+        <w:r>
+          <w:rPr>
+            <w:noProof/>
+            <w:webHidden/>
+          </w:rPr>
+        </w:r>
+        <w:r>
+          <w:rPr>
+            <w:noProof/>
+            <w:webHidden/>
+          </w:rPr>
+          <w:fldChar w:fldCharType="separate"/>
+        </w:r>
+        <w:r>
+          <w:rPr>
+            <w:noProof/>
+            <w:webHidden/>
+          </w:rPr>
+          <w:t>6</w:t>
+        </w:r>
+        <w:r>
+          <w:rPr>
+            <w:noProof/>
+            <w:webHidden/>
+          </w:rPr>
+          <w:fldChar w:fldCharType="end"/>
+        </w:r>
+      </w:hyperlink>
+    </w:p>
+    <w:p>
+      <w:pPr>
+        <w:pStyle w:val="Sommario3"/>
+        <w:tabs>
+          <w:tab w:val="right" w:leader="dot" w:pos="9628"/>
+        </w:tabs>
+        <w:rPr>
+          <w:noProof/>
+        </w:rPr>
+      </w:pPr>
+      <w:hyperlink w:anchor="_Toc224033451" w:history="1">
+        <w:r>
+          <w:rPr>
+            <w:rStyle w:val="Collegamentoipertestuale"/>
+            <w:noProof/>
+          </w:rPr>
+          <w:t>2.1.3 Il Layer di Persistenza: Medallion Architecture su Delta Lake</w:t>
+        </w:r>
+        <w:r>
+          <w:rPr>
+            <w:noProof/>
+            <w:webHidden/>
+          </w:rPr>
+          <w:tab/>
+        </w:r>
+        <w:r>
+          <w:rPr>
+            <w:noProof/>
+            <w:webHidden/>
+          </w:rPr>
+          <w:fldChar w:fldCharType="begin"/>
+        </w:r>
+        <w:r>
+          <w:rPr>
+            <w:noProof/>
+            <w:webHidden/>
+          </w:rPr>
+          <w:instrText xml:space="preserve"> PAGEREF _Toc224033451 \h </w:instrText>
+        </w:r>
+        <w:r>
+          <w:rPr>
+            <w:noProof/>
+            <w:webHidden/>
+          </w:rPr>
+        </w:r>
+        <w:r>
+          <w:rPr>
+            <w:noProof/>
+            <w:webHidden/>
+          </w:rPr>
+          <w:fldChar w:fldCharType="separate"/>
+        </w:r>
+        <w:r>
+          <w:rPr>
+            <w:noProof/>
+            <w:webHidden/>
+          </w:rPr>
+          <w:t>6</w:t>
+        </w:r>
+        <w:r>
+          <w:rPr>
+            <w:noProof/>
+            <w:webHidden/>
+          </w:rPr>
+          <w:fldChar w:fldCharType="end"/>
+        </w:r>
+      </w:hyperlink>
+    </w:p>
+    <w:p>
+      <w:pPr>
+        <w:pStyle w:val="Sommario3"/>
+        <w:tabs>
+          <w:tab w:val="right" w:leader="dot" w:pos="9628"/>
+        </w:tabs>
+        <w:rPr>
+          <w:noProof/>
+        </w:rPr>
+      </w:pPr>
+      <w:hyperlink w:anchor="_Toc224033452" w:history="1">
+        <w:r>
+          <w:rPr>
+            <w:rStyle w:val="Collegamentoipertestuale"/>
+            <w:noProof/>
+          </w:rPr>
+          <w:t>2.1.4 RealTimeAlertManager</w:t>
+        </w:r>
+        <w:r>
+          <w:rPr>
+            <w:noProof/>
+            <w:webHidden/>
+          </w:rPr>
+          <w:tab/>
+        </w:r>
+        <w:r>
+          <w:rPr>
+            <w:noProof/>
+            <w:webHidden/>
+          </w:rPr>
+          <w:fldChar w:fldCharType="begin"/>
+        </w:r>
+        <w:r>
+          <w:rPr>
+            <w:noProof/>
+            <w:webHidden/>
+          </w:rPr>
+          <w:instrText xml:space="preserve"> PAGEREF _Toc224033452 \h </w:instrText>
+        </w:r>
+        <w:r>
+          <w:rPr>
+            <w:noProof/>
+            <w:webHidden/>
+          </w:rPr>
+        </w:r>
+        <w:r>
+          <w:rPr>
+            <w:noProof/>
+            <w:webHidden/>
+          </w:rPr>
+          <w:fldChar w:fldCharType="separate"/>
+        </w:r>
+        <w:r>
+          <w:rPr>
+            <w:noProof/>
+            <w:webHidden/>
+          </w:rPr>
+          <w:t>7</w:t>
+        </w:r>
+        <w:r>
+          <w:rPr>
+            <w:noProof/>
+            <w:webHidden/>
+          </w:rPr>
+          <w:fldChar w:fldCharType="end"/>
+        </w:r>
+      </w:hyperlink>
+    </w:p>
+    <w:p>
+      <w:pPr>
+        <w:pStyle w:val="Sommario3"/>
+        <w:tabs>
+          <w:tab w:val="right" w:leader="dot" w:pos="9628"/>
+        </w:tabs>
+        <w:rPr>
+          <w:noProof/>
+        </w:rPr>
+      </w:pPr>
+      <w:hyperlink w:anchor="_Toc224033453" w:history="1">
+        <w:r>
+          <w:rPr>
+            <w:rStyle w:val="Collegamentoipertestuale"/>
+            <w:noProof/>
+          </w:rPr>
+          <w:t>2.1.5 BusinessInsightsEngine</w:t>
+        </w:r>
+        <w:r>
+          <w:rPr>
+            <w:noProof/>
+            <w:webHidden/>
+          </w:rPr>
+          <w:tab/>
+        </w:r>
+        <w:r>
+          <w:rPr>
+            <w:noProof/>
+            <w:webHidden/>
+          </w:rPr>
+          <w:fldChar w:fldCharType="begin"/>
+        </w:r>
+        <w:r>
+          <w:rPr>
+            <w:noProof/>
+            <w:webHidden/>
+          </w:rPr>
+          <w:instrText xml:space="preserve"> PAGEREF _Toc224033453 \h </w:instrText>
+        </w:r>
+        <w:r>
+          <w:rPr>
+            <w:noProof/>
+            <w:webHidden/>
+          </w:rPr>
+        </w:r>
+        <w:r>
+          <w:rPr>
+            <w:noProof/>
+            <w:webHidden/>
+          </w:rPr>
+          <w:fldChar w:fldCharType="separate"/>
+        </w:r>
+        <w:r>
+          <w:rPr>
+            <w:noProof/>
+            <w:webHidden/>
+          </w:rPr>
+          <w:t>7</w:t>
+        </w:r>
+        <w:r>
+          <w:rPr>
+            <w:noProof/>
+            <w:webHidden/>
+          </w:rPr>
+          <w:fldChar w:fldCharType="end"/>
+        </w:r>
+      </w:hyperlink>
+    </w:p>
+    <w:p>
+      <w:pPr>
+        <w:pStyle w:val="Sommario3"/>
+        <w:tabs>
+          <w:tab w:val="right" w:leader="dot" w:pos="9628"/>
+        </w:tabs>
+        <w:rPr>
+          <w:noProof/>
+        </w:rPr>
+      </w:pPr>
+      <w:hyperlink w:anchor="_Toc224033454" w:history="1">
+        <w:r>
+          <w:rPr>
+            <w:rStyle w:val="Collegamentoipertestuale"/>
+            <w:noProof/>
+          </w:rPr>
+          <w:t>2.1.6 Optimizer</w:t>
+        </w:r>
+        <w:r>
+          <w:rPr>
+            <w:noProof/>
+            <w:webHidden/>
+          </w:rPr>
+          <w:tab/>
+        </w:r>
+        <w:r>
+          <w:rPr>
+            <w:noProof/>
+            <w:webHidden/>
+          </w:rPr>
+          <w:fldChar w:fldCharType="begin"/>
+        </w:r>
+        <w:r>
+          <w:rPr>
+            <w:noProof/>
+            <w:webHidden/>
+          </w:rPr>
+          <w:instrText xml:space="preserve"> PAGEREF _Toc224033454 \h </w:instrText>
+        </w:r>
+        <w:r>
+          <w:rPr>
+            <w:noProof/>
+            <w:webHidden/>
+          </w:rPr>
+        </w:r>
+        <w:r>
+          <w:rPr>
+            <w:noProof/>
+            <w:webHidden/>
+          </w:rPr>
+          <w:fldChar w:fldCharType="separate"/>
+        </w:r>
+        <w:r>
+          <w:rPr>
+            <w:noProof/>
+            <w:webHidden/>
+          </w:rPr>
+          <w:t>7</w:t>
+        </w:r>
+        <w:r>
+          <w:rPr>
+            <w:noProof/>
+            <w:webHidden/>
+          </w:rPr>
+          <w:fldChar w:fldCharType="end"/>
+        </w:r>
+      </w:hyperlink>
+    </w:p>
+    <w:p>
+      <w:pPr>
+        <w:pStyle w:val="Sommario1"/>
+        <w:tabs>
+          <w:tab w:val="right" w:leader="dot" w:pos="9628"/>
+        </w:tabs>
+        <w:rPr>
+          <w:noProof/>
+        </w:rPr>
+      </w:pPr>
+      <w:hyperlink w:anchor="_Toc224033455" w:history="1">
+        <w:r>
+          <w:rPr>
+            <w:rStyle w:val="Collegamentoipertestuale"/>
+            <w:noProof/>
+          </w:rPr>
+          <w:t>3. Analisi dei Dataset</w:t>
+        </w:r>
+        <w:r>
+          <w:rPr>
+            <w:noProof/>
+            <w:webHidden/>
+          </w:rPr>
+          <w:tab/>
+        </w:r>
+        <w:r>
+          <w:rPr>
+            <w:noProof/>
+            <w:webHidden/>
+          </w:rPr>
+          <w:fldChar w:fldCharType="begin"/>
+        </w:r>
+        <w:r>
+          <w:rPr>
+            <w:noProof/>
+            <w:webHidden/>
+          </w:rPr>
+          <w:instrText xml:space="preserve"> PAGEREF _Toc224033455 \h </w:instrText>
+        </w:r>
+        <w:r>
+          <w:rPr>
+            <w:noProof/>
+            <w:webHidden/>
+          </w:rPr>
+        </w:r>
+        <w:r>
+          <w:rPr>
+            <w:noProof/>
+            <w:webHidden/>
+          </w:rPr>
+          <w:fldChar w:fldCharType="separate"/>
+        </w:r>
+        <w:r>
+          <w:rPr>
+            <w:noProof/>
+            <w:webHidden/>
+          </w:rPr>
+          <w:t>7</w:t>
+        </w:r>
+        <w:r>
+          <w:rPr>
+            <w:noProof/>
+            <w:webHidden/>
+          </w:rPr>
+          <w:fldChar w:fldCharType="end"/>
+        </w:r>
+      </w:hyperlink>
+    </w:p>
+    <w:p>
+      <w:pPr>
+        <w:pStyle w:val="Sommario2"/>
+        <w:tabs>
+          <w:tab w:val="right" w:leader="dot" w:pos="9628"/>
+        </w:tabs>
+        <w:rPr>
+          <w:noProof/>
+        </w:rPr>
+      </w:pPr>
+      <w:hyperlink w:anchor="_Toc224033456" w:history="1">
+        <w:r>
+          <w:rPr>
+            <w:rStyle w:val="Collegamentoipertestuale"/>
+            <w:noProof/>
+          </w:rPr>
+          <w:t>3.1 La sorgente: LCL SmartMeter Dataset</w:t>
+        </w:r>
+        <w:r>
+          <w:rPr>
+            <w:noProof/>
+            <w:webHidden/>
+          </w:rPr>
+          <w:tab/>
+        </w:r>
+        <w:r>
+          <w:rPr>
+            <w:noProof/>
+            <w:webHidden/>
+          </w:rPr>
+          <w:fldChar w:fldCharType="begin"/>
+        </w:r>
+        <w:r>
+          <w:rPr>
+            <w:noProof/>
+            <w:webHidden/>
+          </w:rPr>
+          <w:instrText xml:space="preserve"> PAGEREF _Toc224033456 \h </w:instrText>
+        </w:r>
+        <w:r>
+          <w:rPr>
+            <w:noProof/>
+            <w:webHidden/>
+          </w:rPr>
+        </w:r>
+        <w:r>
+          <w:rPr>
+            <w:noProof/>
+            <w:webHidden/>
+          </w:rPr>
+          <w:fldChar w:fldCharType="separate"/>
+        </w:r>
+        <w:r>
+          <w:rPr>
+            <w:noProof/>
+            <w:webHidden/>
+          </w:rPr>
+          <w:t>7</w:t>
+        </w:r>
+        <w:r>
+          <w:rPr>
+            <w:noProof/>
+            <w:webHidden/>
+          </w:rPr>
+          <w:fldChar w:fldCharType="end"/>
+        </w:r>
+      </w:hyperlink>
+    </w:p>
+    <w:p>
+      <w:pPr>
+        <w:pStyle w:val="Sommario2"/>
+        <w:tabs>
+          <w:tab w:val="right" w:leader="dot" w:pos="9628"/>
+        </w:tabs>
+        <w:rPr>
+          <w:noProof/>
+        </w:rPr>
+      </w:pPr>
+      <w:hyperlink w:anchor="_Toc224033457" w:history="1">
+        <w:r>
+          <w:rPr>
+            <w:rStyle w:val="Collegamentoipertestuale"/>
+            <w:noProof/>
+          </w:rPr>
+          <w:t>3.2 L'Arricchimento: gruppi Acorn</w:t>
+        </w:r>
+        <w:r>
+          <w:rPr>
+            <w:noProof/>
+            <w:webHidden/>
+          </w:rPr>
+          <w:tab/>
+        </w:r>
+        <w:r>
+          <w:rPr>
+            <w:noProof/>
+            <w:webHidden/>
+          </w:rPr>
+          <w:fldChar w:fldCharType="begin"/>
+        </w:r>
+        <w:r>
+          <w:rPr>
+            <w:noProof/>
+            <w:webHidden/>
+          </w:rPr>
+          <w:instrText xml:space="preserve"> PAGEREF _Toc224033457 \h </w:instrText>
+        </w:r>
+        <w:r>
+          <w:rPr>
+            <w:noProof/>
+            <w:webHidden/>
+          </w:rPr>
+        </w:r>
+        <w:r>
+          <w:rPr>
+            <w:noProof/>
+            <w:webHidden/>
+          </w:rPr>
+          <w:fldChar w:fldCharType="separate"/>
+        </w:r>
+        <w:r>
+          <w:rPr>
+            <w:noProof/>
+            <w:webHidden/>
+          </w:rPr>
+          <w:t>8</w:t>
+        </w:r>
+        <w:r>
+          <w:rPr>
+            <w:noProof/>
+            <w:webHidden/>
+          </w:rPr>
+          <w:fldChar w:fldCharType="end"/>
+        </w:r>
+      </w:hyperlink>
+    </w:p>
+    <w:p>
+      <w:pPr>
+        <w:pStyle w:val="Sommario2"/>
+        <w:tabs>
+          <w:tab w:val="right" w:leader="dot" w:pos="9628"/>
+        </w:tabs>
+        <w:rPr>
+          <w:noProof/>
+        </w:rPr>
+      </w:pPr>
+      <w:hyperlink w:anchor="_Toc224033458" w:history="1">
+        <w:r>
+          <w:rPr>
+            <w:rStyle w:val="Collegamentoipertestuale"/>
+            <w:noProof/>
+          </w:rPr>
+          <w:t>3.3 Il contesto ambientale: Weather Data</w:t>
+        </w:r>
+        <w:r>
+          <w:rPr>
+            <w:noProof/>
+            <w:webHidden/>
+          </w:rPr>
+          <w:tab/>
+        </w:r>
+        <w:r>
+          <w:rPr>
+            <w:noProof/>
+            <w:webHidden/>
+          </w:rPr>
+          <w:fldChar w:fldCharType="begin"/>
+        </w:r>
+        <w:r>
+          <w:rPr>
+            <w:noProof/>
+            <w:webHidden/>
+          </w:rPr>
+          <w:instrText xml:space="preserve"> PAGEREF _Toc224033458 \h </w:instrText>
+        </w:r>
+        <w:r>
+          <w:rPr>
+            <w:noProof/>
+            <w:webHidden/>
+          </w:rPr>
+        </w:r>
+        <w:r>
+          <w:rPr>
+            <w:noProof/>
+            <w:webHidden/>
+          </w:rPr>
+          <w:fldChar w:fldCharType="separate"/>
+        </w:r>
+        <w:r>
+          <w:rPr>
+            <w:noProof/>
+            <w:webHidden/>
+          </w:rPr>
+          <w:t>8</w:t>
+        </w:r>
+        <w:r>
+          <w:rPr>
+            <w:noProof/>
+            <w:webHidden/>
+          </w:rPr>
+          <w:fldChar w:fldCharType="end"/>
+        </w:r>
+      </w:hyperlink>
+    </w:p>
+    <w:p>
+      <w:pPr>
+        <w:pStyle w:val="Sommario2"/>
+        <w:tabs>
+          <w:tab w:val="right" w:leader="dot" w:pos="9628"/>
+        </w:tabs>
+        <w:rPr>
+          <w:noProof/>
+        </w:rPr>
+      </w:pPr>
+      <w:hyperlink w:anchor="_Toc224033459" w:history="1">
+        <w:r>
+          <w:rPr>
+            <w:rStyle w:val="Collegamentoipertestuale"/>
+            <w:noProof/>
+          </w:rPr>
+          <w:t>3.4 Analisi Esplorativa dei Dati (EDA)</w:t>
+        </w:r>
+        <w:r>
+          <w:rPr>
+            <w:noProof/>
+            <w:webHidden/>
+          </w:rPr>
+          <w:tab/>
+        </w:r>
+        <w:r>
+          <w:rPr>
+            <w:noProof/>
+            <w:webHidden/>
+          </w:rPr>
+          <w:fldChar w:fldCharType="begin"/>
+        </w:r>
+        <w:r>
+          <w:rPr>
+            <w:noProof/>
+            <w:webHidden/>
+          </w:rPr>
+          <w:instrText xml:space="preserve"> PAGEREF _Toc224033459 \h </w:instrText>
+        </w:r>
+        <w:r>
+          <w:rPr>
+            <w:noProof/>
+            <w:webHidden/>
+          </w:rPr>
+        </w:r>
+        <w:r>
+          <w:rPr>
+            <w:noProof/>
+            <w:webHidden/>
+          </w:rPr>
+          <w:fldChar w:fldCharType="separate"/>
+        </w:r>
+        <w:r>
+          <w:rPr>
+            <w:noProof/>
+            <w:webHidden/>
+          </w:rPr>
+          <w:t>8</w:t>
+        </w:r>
+        <w:r>
+          <w:rPr>
+            <w:noProof/>
+            <w:webHidden/>
+          </w:rPr>
+          <w:fldChar w:fldCharType="end"/>
+        </w:r>
+      </w:hyperlink>
+    </w:p>
+    <w:p>
+      <w:pPr>
+        <w:pStyle w:val="Sommario1"/>
+        <w:tabs>
+          <w:tab w:val="right" w:leader="dot" w:pos="9628"/>
+        </w:tabs>
+        <w:rPr>
+          <w:noProof/>
+        </w:rPr>
+      </w:pPr>
+      <w:hyperlink w:anchor="_Toc224033460" w:history="1">
+        <w:r>
+          <w:rPr>
+            <w:rStyle w:val="Collegamentoipertestuale"/>
+            <w:noProof/>
+          </w:rPr>
+          <w:t>4. Ingestione dei Dati (Data Ingestion Layer)</w:t>
+        </w:r>
+        <w:r>
+          <w:rPr>
+            <w:noProof/>
+            <w:webHidden/>
+          </w:rPr>
+          <w:tab/>
+        </w:r>
+        <w:r>
+          <w:rPr>
+            <w:noProof/>
+            <w:webHidden/>
+          </w:rPr>
+          <w:fldChar w:fldCharType="begin"/>
+        </w:r>
+        <w:r>
+          <w:rPr>
+            <w:noProof/>
+            <w:webHidden/>
+          </w:rPr>
+          <w:instrText xml:space="preserve"> PAGEREF _Toc224033460 \h </w:instrText>
+        </w:r>
+        <w:r>
+          <w:rPr>
+            <w:noProof/>
+            <w:webHidden/>
+          </w:rPr>
+        </w:r>
+        <w:r>
+          <w:rPr>
+            <w:noProof/>
+            <w:webHidden/>
+          </w:rPr>
+          <w:fldChar w:fldCharType="separate"/>
+        </w:r>
+        <w:r>
+          <w:rPr>
+            <w:noProof/>
+            <w:webHidden/>
+          </w:rPr>
+          <w:t>10</w:t>
+        </w:r>
+        <w:r>
+          <w:rPr>
+            <w:noProof/>
+            <w:webHidden/>
+          </w:rPr>
+          <w:fldChar w:fldCharType="end"/>
+        </w:r>
+      </w:hyperlink>
+    </w:p>
+    <w:p>
+      <w:pPr>
+        <w:pStyle w:val="Sommario2"/>
+        <w:tabs>
+          <w:tab w:val="right" w:leader="dot" w:pos="9628"/>
+        </w:tabs>
+        <w:rPr>
+          <w:noProof/>
+        </w:rPr>
+      </w:pPr>
+      <w:hyperlink w:anchor="_Toc224033461" w:history="1">
+        <w:r>
+          <w:rPr>
+            <w:rStyle w:val="Collegamentoipertestuale"/>
+            <w:noProof/>
+          </w:rPr>
+          <w:t>4.1 Architettura basata su Apache Kafka</w:t>
+        </w:r>
+        <w:r>
+          <w:rPr>
+            <w:noProof/>
+            <w:webHidden/>
+          </w:rPr>
+          <w:tab/>
+        </w:r>
+        <w:r>
+          <w:rPr>
+            <w:noProof/>
+            <w:webHidden/>
+          </w:rPr>
+          <w:fldChar w:fldCharType="begin"/>
+        </w:r>
+        <w:r>
+          <w:rPr>
+            <w:noProof/>
+            <w:webHidden/>
+          </w:rPr>
+          <w:instrText xml:space="preserve"> PAGEREF _Toc224033461 \h </w:instrText>
+        </w:r>
+        <w:r>
+          <w:rPr>
+            <w:noProof/>
+            <w:webHidden/>
+          </w:rPr>
+        </w:r>
+        <w:r>
+          <w:rPr>
+            <w:noProof/>
+            <w:webHidden/>
+          </w:rPr>
+          <w:fldChar w:fldCharType="separate"/>
+        </w:r>
+        <w:r>
+          <w:rPr>
+            <w:noProof/>
+            <w:webHidden/>
+          </w:rPr>
+          <w:t>10</w:t>
+        </w:r>
+        <w:r>
+          <w:rPr>
+            <w:noProof/>
+            <w:webHidden/>
+          </w:rPr>
+          <w:fldChar w:fldCharType="end"/>
+        </w:r>
+      </w:hyperlink>
+    </w:p>
+    <w:p>
+      <w:pPr>
+        <w:pStyle w:val="Sommario2"/>
+        <w:tabs>
+          <w:tab w:val="right" w:leader="dot" w:pos="9628"/>
+        </w:tabs>
+        <w:rPr>
+          <w:noProof/>
+        </w:rPr>
+      </w:pPr>
+      <w:hyperlink w:anchor="_Toc224033462" w:history="1">
+        <w:r>
+          <w:rPr>
+            <w:rStyle w:val="Collegamentoipertestuale"/>
+            <w:noProof/>
+          </w:rPr>
+          <w:t>4.2 Strategia di Ingestione: Historical Data Replay</w:t>
+        </w:r>
+        <w:r>
+          <w:rPr>
+            <w:noProof/>
+            <w:webHidden/>
+          </w:rPr>
+          <w:tab/>
+        </w:r>
+        <w:r>
+          <w:rPr>
+            <w:noProof/>
+            <w:webHidden/>
+          </w:rPr>
+          <w:fldChar w:fldCharType="begin"/>
+        </w:r>
+        <w:r>
+          <w:rPr>
+            <w:noProof/>
+            <w:webHidden/>
+          </w:rPr>
+          <w:instrText xml:space="preserve"> PAGEREF _Toc224033462 \h </w:instrText>
+        </w:r>
+        <w:r>
+          <w:rPr>
+            <w:noProof/>
+            <w:webHidden/>
+          </w:rPr>
+        </w:r>
+        <w:r>
+          <w:rPr>
+            <w:noProof/>
+            <w:webHidden/>
+          </w:rPr>
+          <w:fldChar w:fldCharType="separate"/>
+        </w:r>
+        <w:r>
+          <w:rPr>
+            <w:noProof/>
+            <w:webHidden/>
+          </w:rPr>
+          <w:t>11</w:t>
+        </w:r>
+        <w:r>
+          <w:rPr>
+            <w:noProof/>
+            <w:webHidden/>
+          </w:rPr>
+          <w:fldChar w:fldCharType="end"/>
+        </w:r>
+      </w:hyperlink>
+    </w:p>
+    <w:p>
+      <w:pPr>
+        <w:pStyle w:val="Sommario2"/>
+        <w:tabs>
+          <w:tab w:val="right" w:leader="dot" w:pos="9628"/>
+        </w:tabs>
+        <w:rPr>
+          <w:noProof/>
+        </w:rPr>
+      </w:pPr>
+      <w:hyperlink w:anchor="_Toc224033463" w:history="1">
+        <w:r>
+          <w:rPr>
+            <w:rStyle w:val="Collegamentoipertestuale"/>
+            <w:noProof/>
+          </w:rPr>
+          <w:t>4.3 Definizione del flusso</w:t>
+        </w:r>
+        <w:r>
+          <w:rPr>
+            <w:noProof/>
+            <w:webHidden/>
+          </w:rPr>
+          <w:tab/>
+        </w:r>
+        <w:r>
+          <w:rPr>
+            <w:noProof/>
+            <w:webHidden/>
+          </w:rPr>
+          <w:fldChar w:fldCharType="begin"/>
+        </w:r>
+        <w:r>
+          <w:rPr>
+            <w:noProof/>
+            <w:webHidden/>
+          </w:rPr>
+          <w:instrText xml:space="preserve"> PAGEREF _Toc224033463 \h </w:instrText>
+        </w:r>
+        <w:r>
+          <w:rPr>
+            <w:noProof/>
+            <w:webHidden/>
+          </w:rPr>
+        </w:r>
+        <w:r>
+          <w:rPr>
+            <w:noProof/>
+            <w:webHidden/>
+          </w:rPr>
+          <w:fldChar w:fldCharType="separate"/>
+        </w:r>
+        <w:r>
+          <w:rPr>
+            <w:noProof/>
+            <w:webHidden/>
+          </w:rPr>
+          <w:t>11</w:t>
+        </w:r>
+        <w:r>
+          <w:rPr>
+            <w:noProof/>
+            <w:webHidden/>
+          </w:rPr>
+          <w:fldChar w:fldCharType="end"/>
+        </w:r>
+      </w:hyperlink>
+    </w:p>
+    <w:p>
+      <w:pPr>
+        <w:pStyle w:val="Sommario1"/>
+        <w:tabs>
+          <w:tab w:val="right" w:leader="dot" w:pos="9628"/>
+        </w:tabs>
+        <w:rPr>
+          <w:noProof/>
+        </w:rPr>
+      </w:pPr>
+      <w:hyperlink w:anchor="_Toc224033464" w:history="1">
+        <w:r>
+          <w:rPr>
+            <w:rStyle w:val="Collegamentoipertestuale"/>
+            <w:noProof/>
+          </w:rPr>
+          <w:t>5. Elaborazione in Streaming (Processing Layer)</w:t>
+        </w:r>
+        <w:r>
+          <w:rPr>
+            <w:noProof/>
+            <w:webHidden/>
+          </w:rPr>
+          <w:tab/>
+        </w:r>
+        <w:r>
+          <w:rPr>
+            <w:noProof/>
+            <w:webHidden/>
+          </w:rPr>
+          <w:fldChar w:fldCharType="begin"/>
+        </w:r>
+        <w:r>
+          <w:rPr>
+            <w:noProof/>
+            <w:webHidden/>
+          </w:rPr>
+          <w:instrText xml:space="preserve"> PAGEREF _Toc224033464 \h </w:instrText>
+        </w:r>
+        <w:r>
+          <w:rPr>
+            <w:noProof/>
+            <w:webHidden/>
+          </w:rPr>
+        </w:r>
+        <w:r>
+          <w:rPr>
+            <w:noProof/>
+            <w:webHidden/>
+          </w:rPr>
+          <w:fldChar w:fldCharType="separate"/>
+        </w:r>
+        <w:r>
+          <w:rPr>
+            <w:noProof/>
+            <w:webHidden/>
+          </w:rPr>
+          <w:t>12</w:t>
+        </w:r>
+        <w:r>
+          <w:rPr>
+            <w:noProof/>
+            <w:webHidden/>
+          </w:rPr>
+          <w:fldChar w:fldCharType="end"/>
+        </w:r>
+      </w:hyperlink>
+    </w:p>
+    <w:p>
+      <w:pPr>
+        <w:pStyle w:val="Sommario2"/>
+        <w:tabs>
+          <w:tab w:val="right" w:leader="dot" w:pos="9628"/>
+        </w:tabs>
+        <w:rPr>
+          <w:noProof/>
+        </w:rPr>
+      </w:pPr>
+      <w:hyperlink w:anchor="_Toc224033465" w:history="1">
+        <w:r>
+          <w:rPr>
+            <w:rStyle w:val="Collegamentoipertestuale"/>
+            <w:noProof/>
+          </w:rPr>
+          <w:t>5.1 Architettura della Pipeline: dal Bronze al Gold Layer</w:t>
+        </w:r>
+        <w:r>
+          <w:rPr>
+            <w:noProof/>
+            <w:webHidden/>
+          </w:rPr>
+          <w:tab/>
+        </w:r>
+        <w:r>
+          <w:rPr>
+            <w:noProof/>
+            <w:webHidden/>
+          </w:rPr>
+          <w:fldChar w:fldCharType="begin"/>
+        </w:r>
+        <w:r>
+          <w:rPr>
+            <w:noProof/>
+            <w:webHidden/>
+          </w:rPr>
+          <w:instrText xml:space="preserve"> PAGEREF _Toc224033465 \h </w:instrText>
+        </w:r>
+        <w:r>
+          <w:rPr>
+            <w:noProof/>
+            <w:webHidden/>
+          </w:rPr>
+        </w:r>
+        <w:r>
+          <w:rPr>
+            <w:noProof/>
+            <w:webHidden/>
+          </w:rPr>
+          <w:fldChar w:fldCharType="separate"/>
+        </w:r>
+        <w:r>
+          <w:rPr>
+            <w:noProof/>
+            <w:webHidden/>
+          </w:rPr>
+          <w:t>12</w:t>
+        </w:r>
+        <w:r>
+          <w:rPr>
+            <w:noProof/>
+            <w:webHidden/>
+          </w:rPr>
+          <w:fldChar w:fldCharType="end"/>
+        </w:r>
+      </w:hyperlink>
+    </w:p>
+    <w:p>
+      <w:pPr>
+        <w:pStyle w:val="Sommario2"/>
+        <w:tabs>
+          <w:tab w:val="right" w:leader="dot" w:pos="9628"/>
+        </w:tabs>
+        <w:rPr>
+          <w:noProof/>
+        </w:rPr>
+      </w:pPr>
+      <w:hyperlink w:anchor="_Toc224033466" w:history="1">
+        <w:r>
+          <w:rPr>
+            <w:rStyle w:val="Collegamentoipertestuale"/>
+            <w:noProof/>
+          </w:rPr>
+          <w:t>5.2 Pre-processing dei dati (Silver Layer)</w:t>
+        </w:r>
+        <w:r>
+          <w:rPr>
+            <w:noProof/>
+            <w:webHidden/>
+          </w:rPr>
+          <w:tab/>
+        </w:r>
+        <w:r>
+          <w:rPr>
+            <w:noProof/>
+            <w:webHidden/>
+          </w:rPr>
+          <w:fldChar w:fldCharType="begin"/>
+        </w:r>
+        <w:r>
+          <w:rPr>
+            <w:noProof/>
+            <w:webHidden/>
+          </w:rPr>
+          <w:instrText xml:space="preserve"> PAGEREF _Toc224033466 \h </w:instrText>
+        </w:r>
+        <w:r>
+          <w:rPr>
+            <w:noProof/>
+            <w:webHidden/>
+          </w:rPr>
+        </w:r>
+        <w:r>
+          <w:rPr>
+            <w:noProof/>
+            <w:webHidden/>
+          </w:rPr>
+          <w:fldChar w:fldCharType="separate"/>
+        </w:r>
+        <w:r>
+          <w:rPr>
+            <w:noProof/>
+            <w:webHidden/>
+          </w:rPr>
+          <w:t>12</w:t>
+        </w:r>
+        <w:r>
+          <w:rPr>
+            <w:noProof/>
+            <w:webHidden/>
+          </w:rPr>
+          <w:fldChar w:fldCharType="end"/>
+        </w:r>
+      </w:hyperlink>
+    </w:p>
+    <w:p>
+      <w:pPr>
+        <w:pStyle w:val="Sommario2"/>
+        <w:tabs>
+          <w:tab w:val="right" w:leader="dot" w:pos="9628"/>
+        </w:tabs>
+        <w:rPr>
+          <w:noProof/>
+        </w:rPr>
+      </w:pPr>
+      <w:hyperlink w:anchor="_Toc224033467" w:history="1">
+        <w:r>
+          <w:rPr>
+            <w:rStyle w:val="Collegamentoipertestuale"/>
+            <w:noProof/>
+          </w:rPr>
+          <w:t>5.3 Streaming Enrichment tramite Broadcast Join</w:t>
+        </w:r>
+        <w:r>
+          <w:rPr>
+            <w:noProof/>
+            <w:webHidden/>
+          </w:rPr>
+          <w:tab/>
+        </w:r>
+        <w:r>
+          <w:rPr>
+            <w:noProof/>
+            <w:webHidden/>
+          </w:rPr>
+          <w:fldChar w:fldCharType="begin"/>
+        </w:r>
+        <w:r>
+          <w:rPr>
+            <w:noProof/>
+            <w:webHidden/>
+          </w:rPr>
+          <w:instrText xml:space="preserve"> PAGEREF _Toc224033467 \h </w:instrText>
+        </w:r>
+        <w:r>
+          <w:rPr>
+            <w:noProof/>
+            <w:webHidden/>
+          </w:rPr>
+        </w:r>
+        <w:r>
+          <w:rPr>
+            <w:noProof/>
+            <w:webHidden/>
+          </w:rPr>
+          <w:fldChar w:fldCharType="separate"/>
+        </w:r>
+        <w:r>
+          <w:rPr>
+            <w:noProof/>
+            <w:webHidden/>
+          </w:rPr>
+          <w:t>14</w:t>
+        </w:r>
+        <w:r>
+          <w:rPr>
+            <w:noProof/>
+            <w:webHidden/>
+          </w:rPr>
+          <w:fldChar w:fldCharType="end"/>
+        </w:r>
+      </w:hyperlink>
+    </w:p>
+    <w:p>
+      <w:pPr>
+        <w:pStyle w:val="Sommario2"/>
+        <w:tabs>
+          <w:tab w:val="right" w:leader="dot" w:pos="9628"/>
+        </w:tabs>
+        <w:rPr>
+          <w:noProof/>
+        </w:rPr>
+      </w:pPr>
+      <w:hyperlink w:anchor="_Toc224033468" w:history="1">
+        <w:r>
+          <w:rPr>
+            <w:rStyle w:val="Collegamentoipertestuale"/>
+            <w:noProof/>
+          </w:rPr>
+          <w:t>5.4 Analisi Temporale: Watermarking e Windowing (Gold Layer)</w:t>
+        </w:r>
+        <w:r>
+          <w:rPr>
+            <w:noProof/>
+            <w:webHidden/>
+          </w:rPr>
+          <w:tab/>
+        </w:r>
+        <w:r>
+          <w:rPr>
+            <w:noProof/>
+            <w:webHidden/>
+          </w:rPr>
+          <w:fldChar w:fldCharType="begin"/>
+        </w:r>
+        <w:r>
+          <w:rPr>
+            <w:noProof/>
+            <w:webHidden/>
+          </w:rPr>
+          <w:instrText xml:space="preserve"> PAGEREF _Toc224033468 \h </w:instrText>
+        </w:r>
+        <w:r>
+          <w:rPr>
+            <w:noProof/>
+            <w:webHidden/>
+          </w:rPr>
+        </w:r>
+        <w:r>
+          <w:rPr>
+            <w:noProof/>
+            <w:webHidden/>
+          </w:rPr>
+          <w:fldChar w:fldCharType="separate"/>
+        </w:r>
+        <w:r>
+          <w:rPr>
+            <w:noProof/>
+            <w:webHidden/>
+          </w:rPr>
+          <w:t>15</w:t>
+        </w:r>
+        <w:r>
+          <w:rPr>
+            <w:noProof/>
+            <w:webHidden/>
+          </w:rPr>
+          <w:fldChar w:fldCharType="end"/>
+        </w:r>
+      </w:hyperlink>
+    </w:p>
+    <w:p>
+      <w:pPr>
+        <w:pStyle w:val="Sommario2"/>
+        <w:tabs>
+          <w:tab w:val="right" w:leader="dot" w:pos="9628"/>
+        </w:tabs>
+        <w:rPr>
+          <w:noProof/>
+        </w:rPr>
+      </w:pPr>
+      <w:hyperlink w:anchor="_Toc224033469" w:history="1">
+        <w:r>
+          <w:rPr>
+            <w:rStyle w:val="Collegamentoipertestuale"/>
+            <w:noProof/>
+          </w:rPr>
+          <w:t>5.5 Multi-target storage e Fault Tolerance</w:t>
+        </w:r>
+        <w:r>
+          <w:rPr>
+            <w:noProof/>
+            <w:webHidden/>
+          </w:rPr>
+          <w:tab/>
+        </w:r>
+        <w:r>
+          <w:rPr>
+            <w:noProof/>
+            <w:webHidden/>
+          </w:rPr>
+          <w:fldChar w:fldCharType="begin"/>
+        </w:r>
+        <w:r>
+          <w:rPr>
+            <w:noProof/>
+            <w:webHidden/>
+          </w:rPr>
+          <w:instrText xml:space="preserve"> PAGEREF _Toc224033469 \h </w:instrText>
+        </w:r>
+        <w:r>
+          <w:rPr>
+            <w:noProof/>
+            <w:webHidden/>
+          </w:rPr>
+        </w:r>
+        <w:r>
+          <w:rPr>
+            <w:noProof/>
+            <w:webHidden/>
+          </w:rPr>
+          <w:fldChar w:fldCharType="separate"/>
+        </w:r>
+        <w:r>
+          <w:rPr>
+            <w:noProof/>
+            <w:webHidden/>
+          </w:rPr>
+          <w:t>15</w:t>
+        </w:r>
+        <w:r>
+          <w:rPr>
+            <w:noProof/>
+            <w:webHidden/>
+          </w:rPr>
+          <w:fldChar w:fldCharType="end"/>
+        </w:r>
+      </w:hyperlink>
+    </w:p>
+    <w:p>
+      <w:pPr>
+        <w:pStyle w:val="Sommario1"/>
+        <w:tabs>
+          <w:tab w:val="right" w:leader="dot" w:pos="9628"/>
+        </w:tabs>
+        <w:rPr>
+          <w:noProof/>
+        </w:rPr>
+      </w:pPr>
+      <w:hyperlink w:anchor="_Toc224033470" w:history="1">
+        <w:r>
+          <w:rPr>
+            <w:rStyle w:val="Collegamentoipertestuale"/>
+            <w:noProof/>
+          </w:rPr>
+          <w:t>6. Intelligence &amp; Stateful Analysis</w:t>
+        </w:r>
+        <w:r>
+          <w:rPr>
+            <w:noProof/>
+            <w:webHidden/>
+          </w:rPr>
+          <w:tab/>
+        </w:r>
+        <w:r>
+          <w:rPr>
+            <w:noProof/>
+            <w:webHidden/>
+          </w:rPr>
+          <w:fldChar w:fldCharType="begin"/>
+        </w:r>
+        <w:r>
+          <w:rPr>
+            <w:noProof/>
+            <w:webHidden/>
+          </w:rPr>
+          <w:instrText xml:space="preserve"> PAGEREF _Toc224033470 \h </w:instrText>
+        </w:r>
+        <w:r>
+          <w:rPr>
+            <w:noProof/>
+            <w:webHidden/>
+          </w:rPr>
+        </w:r>
+        <w:r>
+          <w:rPr>
+            <w:noProof/>
+            <w:webHidden/>
+          </w:rPr>
+          <w:fldChar w:fldCharType="separate"/>
+        </w:r>
+        <w:r>
+          <w:rPr>
+            <w:noProof/>
+            <w:webHidden/>
+          </w:rPr>
+          <w:t>16</w:t>
+        </w:r>
+        <w:r>
+          <w:rPr>
+            <w:noProof/>
+            <w:webHidden/>
+          </w:rPr>
+          <w:fldChar w:fldCharType="end"/>
+        </w:r>
+      </w:hyperlink>
+    </w:p>
+    <w:p>
+      <w:pPr>
+        <w:pStyle w:val="Sommario2"/>
+        <w:tabs>
+          <w:tab w:val="right" w:leader="dot" w:pos="9628"/>
+        </w:tabs>
+        <w:rPr>
+          <w:noProof/>
+        </w:rPr>
+      </w:pPr>
+      <w:hyperlink w:anchor="_Toc224033471" w:history="1">
+        <w:r>
+          <w:rPr>
+            <w:rStyle w:val="Collegamentoipertestuale"/>
+            <w:noProof/>
+          </w:rPr>
+          <w:t>6.1 Implementazione dello Stateful Streaming</w:t>
+        </w:r>
+        <w:r>
+          <w:rPr>
+            <w:noProof/>
+            <w:webHidden/>
+          </w:rPr>
+          <w:tab/>
+        </w:r>
+        <w:r>
+          <w:rPr>
+            <w:noProof/>
+            <w:webHidden/>
+          </w:rPr>
+          <w:fldChar w:fldCharType="begin"/>
+        </w:r>
+        <w:r>
+          <w:rPr>
+            <w:noProof/>
+            <w:webHidden/>
+          </w:rPr>
+          <w:instrText xml:space="preserve"> PAGEREF _Toc224033471 \h </w:instrText>
+        </w:r>
+        <w:r>
+          <w:rPr>
+            <w:noProof/>
+            <w:webHidden/>
+          </w:rPr>
+        </w:r>
+        <w:r>
+          <w:rPr>
+            <w:noProof/>
+            <w:webHidden/>
+          </w:rPr>
+          <w:fldChar w:fldCharType="separate"/>
+        </w:r>
+        <w:r>
+          <w:rPr>
+            <w:noProof/>
+            <w:webHidden/>
+          </w:rPr>
+          <w:t>16</w:t>
+        </w:r>
+        <w:r>
+          <w:rPr>
+            <w:noProof/>
+            <w:webHidden/>
+          </w:rPr>
+          <w:fldChar w:fldCharType="end"/>
+        </w:r>
+      </w:hyperlink>
+    </w:p>
+    <w:p>
+      <w:pPr>
+        <w:pStyle w:val="Sommario2"/>
+        <w:tabs>
+          <w:tab w:val="right" w:leader="dot" w:pos="9628"/>
+        </w:tabs>
+        <w:rPr>
+          <w:noProof/>
+        </w:rPr>
+      </w:pPr>
+      <w:hyperlink w:anchor="_Toc224033472" w:history="1">
+        <w:r>
+          <w:rPr>
+            <w:rStyle w:val="Collegamentoipertestuale"/>
+            <w:noProof/>
+          </w:rPr>
+          <w:t>6.2 Calcolo Statistico Incrementale: Algoritmo di Welford</w:t>
+        </w:r>
+        <w:r>
+          <w:rPr>
+            <w:noProof/>
+            <w:webHidden/>
+          </w:rPr>
+          <w:tab/>
+        </w:r>
+        <w:r>
+          <w:rPr>
+            <w:noProof/>
+            <w:webHidden/>
+          </w:rPr>
+          <w:fldChar w:fldCharType="begin"/>
+        </w:r>
+        <w:r>
+          <w:rPr>
+            <w:noProof/>
+            <w:webHidden/>
+          </w:rPr>
+          <w:instrText xml:space="preserve"> PAGEREF _Toc224033472 \h </w:instrText>
+        </w:r>
+        <w:r>
+          <w:rPr>
+            <w:noProof/>
+            <w:webHidden/>
+          </w:rPr>
+        </w:r>
+        <w:r>
+          <w:rPr>
+            <w:noProof/>
+            <w:webHidden/>
+          </w:rPr>
+          <w:fldChar w:fldCharType="separate"/>
+        </w:r>
+        <w:r>
+          <w:rPr>
+            <w:noProof/>
+            <w:webHidden/>
+          </w:rPr>
+          <w:t>16</w:t>
+        </w:r>
+        <w:r>
+          <w:rPr>
+            <w:noProof/>
+            <w:webHidden/>
+          </w:rPr>
+          <w:fldChar w:fldCharType="end"/>
+        </w:r>
+      </w:hyperlink>
+    </w:p>
+    <w:p>
+      <w:pPr>
+        <w:pStyle w:val="Sommario2"/>
+        <w:tabs>
+          <w:tab w:val="right" w:leader="dot" w:pos="9628"/>
+        </w:tabs>
+        <w:rPr>
+          <w:noProof/>
+        </w:rPr>
+      </w:pPr>
+      <w:hyperlink w:anchor="_Toc224033473" w:history="1">
+        <w:r>
+          <w:rPr>
+            <w:rStyle w:val="Collegamentoipertestuale"/>
+            <w:noProof/>
+          </w:rPr>
+          <w:t>6.3 Motore di Rilevamento delle Anomalie (Context-Aware)</w:t>
+        </w:r>
+        <w:r>
+          <w:rPr>
+            <w:noProof/>
+            <w:webHidden/>
+          </w:rPr>
+          <w:tab/>
+        </w:r>
+        <w:r>
+          <w:rPr>
+            <w:noProof/>
+            <w:webHidden/>
+          </w:rPr>
+          <w:fldChar w:fldCharType="begin"/>
+        </w:r>
+        <w:r>
+          <w:rPr>
+            <w:noProof/>
+            <w:webHidden/>
+          </w:rPr>
+          <w:instrText xml:space="preserve"> PAGEREF _Toc224033473 \h </w:instrText>
+        </w:r>
+        <w:r>
+          <w:rPr>
+            <w:noProof/>
+            <w:webHidden/>
+          </w:rPr>
+        </w:r>
+        <w:r>
+          <w:rPr>
+            <w:noProof/>
+            <w:webHidden/>
+          </w:rPr>
+          <w:fldChar w:fldCharType="separate"/>
+        </w:r>
+        <w:r>
+          <w:rPr>
+            <w:noProof/>
+            <w:webHidden/>
+          </w:rPr>
+          <w:t>18</w:t>
+        </w:r>
+        <w:r>
+          <w:rPr>
+            <w:noProof/>
+            <w:webHidden/>
+          </w:rPr>
+          <w:fldChar w:fldCharType="end"/>
+        </w:r>
+      </w:hyperlink>
+    </w:p>
+    <w:p>
+      <w:pPr>
+        <w:pStyle w:val="Sommario2"/>
+        <w:tabs>
+          <w:tab w:val="right" w:leader="dot" w:pos="9628"/>
+        </w:tabs>
+        <w:rPr>
+          <w:noProof/>
+        </w:rPr>
+      </w:pPr>
+      <w:hyperlink w:anchor="_Toc224033474" w:history="1">
+        <w:r>
+          <w:rPr>
+            <w:rStyle w:val="Collegamentoipertestuale"/>
+            <w:noProof/>
+          </w:rPr>
+          <w:t>6.4 Gestione del ciclo di vita e Fault Tolerance</w:t>
+        </w:r>
+        <w:r>
+          <w:rPr>
+            <w:noProof/>
+            <w:webHidden/>
+          </w:rPr>
+          <w:tab/>
+        </w:r>
+        <w:r>
+          <w:rPr>
+            <w:noProof/>
+            <w:webHidden/>
+          </w:rPr>
+          <w:fldChar w:fldCharType="begin"/>
+        </w:r>
+        <w:r>
+          <w:rPr>
+            <w:noProof/>
+            <w:webHidden/>
+          </w:rPr>
+          <w:instrText xml:space="preserve"> PAGEREF _Toc224033474 \h </w:instrText>
+        </w:r>
+        <w:r>
+          <w:rPr>
+            <w:noProof/>
+            <w:webHidden/>
+          </w:rPr>
+        </w:r>
+        <w:r>
+          <w:rPr>
+            <w:noProof/>
+            <w:webHidden/>
+          </w:rPr>
+          <w:fldChar w:fldCharType="separate"/>
+        </w:r>
+        <w:r>
+          <w:rPr>
+            <w:noProof/>
+            <w:webHidden/>
+          </w:rPr>
+          <w:t>19</w:t>
+        </w:r>
+        <w:r>
+          <w:rPr>
+            <w:noProof/>
+            <w:webHidden/>
+          </w:rPr>
+          <w:fldChar w:fldCharType="end"/>
+        </w:r>
+      </w:hyperlink>
+    </w:p>
+    <w:p>
+      <w:pPr>
+        <w:pStyle w:val="Sommario2"/>
+        <w:tabs>
+          <w:tab w:val="right" w:leader="dot" w:pos="9628"/>
+        </w:tabs>
+        <w:rPr>
+          <w:noProof/>
+        </w:rPr>
+      </w:pPr>
+      <w:hyperlink w:anchor="_Toc224033475" w:history="1">
+        <w:r>
+          <w:rPr>
+            <w:rStyle w:val="Collegamentoipertestuale"/>
+            <w:noProof/>
+          </w:rPr>
+          <w:t>6.5 Validazione e Testing</w:t>
+        </w:r>
+        <w:r>
+          <w:rPr>
+            <w:noProof/>
+            <w:webHidden/>
+          </w:rPr>
+          <w:tab/>
+        </w:r>
+        <w:r>
+          <w:rPr>
+            <w:noProof/>
+            <w:webHidden/>
+          </w:rPr>
+          <w:fldChar w:fldCharType="begin"/>
+        </w:r>
+        <w:r>
+          <w:rPr>
+            <w:noProof/>
+            <w:webHidden/>
+          </w:rPr>
+          <w:instrText xml:space="preserve"> PAGEREF _Toc224033475 \h </w:instrText>
+        </w:r>
+        <w:r>
+          <w:rPr>
+            <w:noProof/>
+            <w:webHidden/>
+          </w:rPr>
+        </w:r>
+        <w:r>
+          <w:rPr>
+            <w:noProof/>
+            <w:webHidden/>
+          </w:rPr>
+          <w:fldChar w:fldCharType="separate"/>
+        </w:r>
+        <w:r>
+          <w:rPr>
+            <w:noProof/>
+            <w:webHidden/>
+          </w:rPr>
+          <w:t>19</w:t>
+        </w:r>
+        <w:r>
+          <w:rPr>
+            <w:noProof/>
+            <w:webHidden/>
+          </w:rPr>
+          <w:fldChar w:fldCharType="end"/>
+        </w:r>
+      </w:hyperlink>
+    </w:p>
+    <w:p>
+      <w:pPr>
+        <w:pStyle w:val="Sommario1"/>
+        <w:tabs>
+          <w:tab w:val="right" w:leader="dot" w:pos="9628"/>
+        </w:tabs>
+        <w:rPr>
+          <w:noProof/>
+        </w:rPr>
+      </w:pPr>
+      <w:hyperlink w:anchor="_Toc224033476" w:history="1">
+        <w:r>
+          <w:rPr>
+            <w:rStyle w:val="Collegamentoipertestuale"/>
+            <w:noProof/>
+          </w:rPr>
+          <w:t>7. Monitoring Real-time, Business Intelligence e Maintenance</w:t>
+        </w:r>
+        <w:r>
+          <w:rPr>
+            <w:noProof/>
+            <w:webHidden/>
+          </w:rPr>
+          <w:tab/>
+        </w:r>
+        <w:r>
+          <w:rPr>
+            <w:noProof/>
+            <w:webHidden/>
+          </w:rPr>
+          <w:fldChar w:fldCharType="begin"/>
+        </w:r>
+        <w:r>
+          <w:rPr>
+            <w:noProof/>
+            <w:webHidden/>
+          </w:rPr>
+          <w:instrText xml:space="preserve"> PAGEREF _Toc224033476 \h </w:instrText>
+        </w:r>
+        <w:r>
+          <w:rPr>
+            <w:noProof/>
+            <w:webHidden/>
+          </w:rPr>
+        </w:r>
+        <w:r>
+          <w:rPr>
+            <w:noProof/>
+            <w:webHidden/>
+          </w:rPr>
+          <w:fldChar w:fldCharType="separate"/>
+        </w:r>
+        <w:r>
+          <w:rPr>
+            <w:noProof/>
+            <w:webHidden/>
+          </w:rPr>
+          <w:t>20</w:t>
+        </w:r>
+        <w:r>
+          <w:rPr>
+            <w:noProof/>
+            <w:webHidden/>
+          </w:rPr>
+          <w:fldChar w:fldCharType="end"/>
+        </w:r>
+      </w:hyperlink>
+    </w:p>
+    <w:p>
+      <w:pPr>
+        <w:pStyle w:val="Sommario2"/>
+        <w:tabs>
+          <w:tab w:val="right" w:leader="dot" w:pos="9628"/>
+        </w:tabs>
+        <w:rPr>
+          <w:noProof/>
+        </w:rPr>
+      </w:pPr>
+      <w:hyperlink w:anchor="_Toc224033477" w:history="1">
+        <w:r>
+          <w:rPr>
+            <w:rStyle w:val="Collegamentoipertestuale"/>
+            <w:noProof/>
+          </w:rPr>
+          <w:t>7.1 Gestione reattiva degli Alert</w:t>
+        </w:r>
+        <w:r>
+          <w:rPr>
+            <w:noProof/>
+            <w:webHidden/>
+          </w:rPr>
+          <w:tab/>
+        </w:r>
+        <w:r>
+          <w:rPr>
+            <w:noProof/>
+            <w:webHidden/>
+          </w:rPr>
+          <w:fldChar w:fldCharType="begin"/>
+        </w:r>
+        <w:r>
+          <w:rPr>
+            <w:noProof/>
+            <w:webHidden/>
+          </w:rPr>
+          <w:instrText xml:space="preserve"> PAGEREF _Toc224033477 \h </w:instrText>
+        </w:r>
+        <w:r>
+          <w:rPr>
+            <w:noProof/>
+            <w:webHidden/>
+          </w:rPr>
+        </w:r>
+        <w:r>
+          <w:rPr>
+            <w:noProof/>
+            <w:webHidden/>
+          </w:rPr>
+          <w:fldChar w:fldCharType="separate"/>
+        </w:r>
+        <w:r>
+          <w:rPr>
+            <w:noProof/>
+            <w:webHidden/>
+          </w:rPr>
+          <w:t>20</w:t>
+        </w:r>
+        <w:r>
+          <w:rPr>
+            <w:noProof/>
+            <w:webHidden/>
+          </w:rPr>
+          <w:fldChar w:fldCharType="end"/>
+        </w:r>
+      </w:hyperlink>
+    </w:p>
+    <w:p>
+      <w:pPr>
+        <w:pStyle w:val="Sommario2"/>
+        <w:tabs>
+          <w:tab w:val="right" w:leader="dot" w:pos="9628"/>
+        </w:tabs>
+        <w:rPr>
+          <w:noProof/>
+        </w:rPr>
+      </w:pPr>
+      <w:hyperlink w:anchor="_Toc224033478" w:history="1">
+        <w:r>
+          <w:rPr>
+            <w:rStyle w:val="Collegamentoipertestuale"/>
+            <w:noProof/>
+          </w:rPr>
+          <w:t>7.2 Business Insights Engine</w:t>
+        </w:r>
+        <w:r>
+          <w:rPr>
+            <w:noProof/>
+            <w:webHidden/>
+          </w:rPr>
+          <w:tab/>
+        </w:r>
+        <w:r>
+          <w:rPr>
+            <w:noProof/>
+            <w:webHidden/>
+          </w:rPr>
+          <w:fldChar w:fldCharType="begin"/>
+        </w:r>
+        <w:r>
+          <w:rPr>
+            <w:noProof/>
+            <w:webHidden/>
+          </w:rPr>
+          <w:instrText xml:space="preserve"> PAGEREF _Toc224033478 \h </w:instrText>
+        </w:r>
+        <w:r>
+          <w:rPr>
+            <w:noProof/>
+            <w:webHidden/>
+          </w:rPr>
+        </w:r>
+        <w:r>
+          <w:rPr>
+            <w:noProof/>
+            <w:webHidden/>
+          </w:rPr>
+          <w:fldChar w:fldCharType="separate"/>
+        </w:r>
+        <w:r>
+          <w:rPr>
+            <w:noProof/>
+            <w:webHidden/>
+          </w:rPr>
+          <w:t>21</w:t>
+        </w:r>
+        <w:r>
+          <w:rPr>
+            <w:noProof/>
+            <w:webHidden/>
+          </w:rPr>
+          <w:fldChar w:fldCharType="end"/>
+        </w:r>
+      </w:hyperlink>
+    </w:p>
+    <w:p>
+      <w:pPr>
+        <w:pStyle w:val="Sommario2"/>
+        <w:tabs>
+          <w:tab w:val="right" w:leader="dot" w:pos="9628"/>
+        </w:tabs>
+        <w:rPr>
+          <w:noProof/>
+        </w:rPr>
+      </w:pPr>
+      <w:hyperlink w:anchor="_Toc224033479" w:history="1">
+        <w:r>
+          <w:rPr>
+            <w:rStyle w:val="Collegamentoipertestuale"/>
+            <w:noProof/>
+          </w:rPr>
+          <w:t>7.3 Ottimizzazione e Manutenzione del Data Lake</w:t>
+        </w:r>
+        <w:r>
+          <w:rPr>
+            <w:noProof/>
+            <w:webHidden/>
+          </w:rPr>
+          <w:tab/>
+        </w:r>
+        <w:r>
+          <w:rPr>
+            <w:noProof/>
+            <w:webHidden/>
+          </w:rPr>
+          <w:fldChar w:fldCharType="begin"/>
+        </w:r>
+        <w:r>
+          <w:rPr>
+            <w:noProof/>
+            <w:webHidden/>
+          </w:rPr>
+          <w:instrText xml:space="preserve"> PAGEREF _Toc224033479 \h </w:instrText>
+        </w:r>
+        <w:r>
+          <w:rPr>
+            <w:noProof/>
+            <w:webHidden/>
+          </w:rPr>
+        </w:r>
+        <w:r>
+          <w:rPr>
+            <w:noProof/>
+            <w:webHidden/>
+          </w:rPr>
+          <w:fldChar w:fldCharType="separate"/>
+        </w:r>
+        <w:r>
+          <w:rPr>
+            <w:noProof/>
+            <w:webHidden/>
+          </w:rPr>
+          <w:t>22</w:t>
+        </w:r>
+        <w:r>
+          <w:rPr>
+            <w:noProof/>
+            <w:webHidden/>
+          </w:rPr>
+          <w:fldChar w:fldCharType="end"/>
+        </w:r>
+      </w:hyperlink>
+    </w:p>
+    <w:p>
+      <w:pPr>
+        <w:pStyle w:val="Sommario1"/>
+        <w:tabs>
+          <w:tab w:val="right" w:leader="dot" w:pos="9628"/>
+        </w:tabs>
+        <w:rPr>
+          <w:noProof/>
+        </w:rPr>
+      </w:pPr>
+      <w:hyperlink w:anchor="_Toc224033480" w:history="1">
+        <w:r>
+          <w:rPr>
+            <w:rStyle w:val="Collegamentoipertestuale"/>
+            <w:noProof/>
+          </w:rPr>
+          <w:t>8. Risultati e Conclusioni</w:t>
+        </w:r>
+        <w:r>
+          <w:rPr>
+            <w:noProof/>
+            <w:webHidden/>
+          </w:rPr>
+          <w:tab/>
+        </w:r>
+        <w:r>
+          <w:rPr>
+            <w:noProof/>
+            <w:webHidden/>
+          </w:rPr>
+          <w:fldChar w:fldCharType="begin"/>
+        </w:r>
+        <w:r>
+          <w:rPr>
+            <w:noProof/>
+            <w:webHidden/>
+          </w:rPr>
+          <w:instrText xml:space="preserve"> PAGEREF _Toc224033480 \h </w:instrText>
+        </w:r>
+        <w:r>
+          <w:rPr>
+            <w:noProof/>
+            <w:webHidden/>
+          </w:rPr>
+        </w:r>
+        <w:r>
+          <w:rPr>
+            <w:noProof/>
+            <w:webHidden/>
+          </w:rPr>
+          <w:fldChar w:fldCharType="separate"/>
+        </w:r>
+        <w:r>
+          <w:rPr>
+            <w:noProof/>
+            <w:webHidden/>
+          </w:rPr>
+          <w:t>22</w:t>
+        </w:r>
+        <w:r>
+          <w:rPr>
+            <w:noProof/>
+            <w:webHidden/>
+          </w:rPr>
+          <w:fldChar w:fldCharType="end"/>
+        </w:r>
+      </w:hyperlink>
+    </w:p>
+    <w:p>
+      <w:r>
+        <w:fldChar w:fldCharType="end"/>
+      </w:r>
+    </w:p>
+    <w:p/>
+    <w:p/>
+    <w:p/>
+    <w:p/>
+    <w:p/>
+    <w:p/>
+    <w:p/>
+    <w:p/>
+    <w:p/>
+    <w:p/>
+    <w:p/>
+    <w:p/>
+    <w:p/>
+    <w:p/>
+    <w:p/>
+    <w:p/>
+    <w:p/>
+    <w:p/>
+    <w:p>
+      <w:pPr>
+        <w:pStyle w:val="Titolo1"/>
+      </w:pPr>
+      <w:bookmarkStart w:id="0" w:name="_Toc224033443"/>
       <w:r>
         <w:lastRenderedPageBreak/>
         <w:t>1. Introduzione e Obiettivi</w:t>
       </w:r>
+      <w:bookmarkEnd w:id="0"/>
     </w:p>
     <w:p>
       <w:pPr>
         <w:pStyle w:val="Titolo2"/>
       </w:pPr>
+      <w:bookmarkStart w:id="1" w:name="_Toc224033444"/>
       <w:r>
         <w:t xml:space="preserve">1.1 </w:t>
       </w:r>
       <w:r>
         <w:t>Contesto</w:t>
       </w:r>
+      <w:bookmarkEnd w:id="1"/>
     </w:p>
     <w:p>
       <w:pPr>
@@ -688,12 +3318,14 @@
       <w:pPr>
         <w:pStyle w:val="Titolo2"/>
       </w:pPr>
+      <w:bookmarkStart w:id="2" w:name="_Toc224033445"/>
       <w:r>
         <w:t xml:space="preserve">1.2 </w:t>
       </w:r>
       <w:r>
         <w:t>Il Problema</w:t>
       </w:r>
+      <w:bookmarkEnd w:id="2"/>
     </w:p>
     <w:p>
       <w:pPr>
@@ -821,6 +3453,7 @@
       <w:pPr>
         <w:pStyle w:val="Titolo2"/>
       </w:pPr>
+      <w:bookmarkStart w:id="3" w:name="_Toc224033446"/>
       <w:r>
         <w:t xml:space="preserve">1.3 </w:t>
       </w:r>
@@ -833,6 +3466,7 @@
       <w:r>
         <w:t>rogetto</w:t>
       </w:r>
+      <w:bookmarkEnd w:id="3"/>
     </w:p>
     <w:p>
       <w:pPr>
@@ -1337,6 +3971,7 @@
       <w:pPr>
         <w:pStyle w:val="Titolo1"/>
       </w:pPr>
+      <w:bookmarkStart w:id="4" w:name="_Toc224033447"/>
       <w:r>
         <w:lastRenderedPageBreak/>
         <w:t xml:space="preserve">2. Architettura del </w:t>
@@ -1347,6 +3982,7 @@
       <w:r>
         <w:t>istema</w:t>
       </w:r>
+      <w:bookmarkEnd w:id="4"/>
     </w:p>
     <w:p>
       <w:pPr>
@@ -2134,13 +4770,12 @@
           <w:rFonts w:asciiTheme="minorHAnsi" w:hAnsiTheme="minorHAnsi"/>
         </w:rPr>
       </w:pPr>
+      <w:bookmarkStart w:id="5" w:name="_Toc224033448"/>
       <w:r>
         <w:lastRenderedPageBreak/>
-        <w:t xml:space="preserve">2.1 </w:t>
-      </w:r>
-      <w:r>
-        <w:t>Architettura</w:t>
-      </w:r>
+        <w:t>2.1 Architettura</w:t>
+      </w:r>
+      <w:bookmarkEnd w:id="5"/>
     </w:p>
     <w:p>
       <w:pPr>
@@ -2217,6 +4852,7 @@
       <w:pPr>
         <w:pStyle w:val="Titolo3"/>
       </w:pPr>
+      <w:bookmarkStart w:id="6" w:name="_Toc224033449"/>
       <w:r>
         <w:t>2.</w:t>
       </w:r>
@@ -2229,6 +4865,7 @@
       <w:r>
         <w:t xml:space="preserve"> Il Layer di Ingestione: Apache Kafka</w:t>
       </w:r>
+      <w:bookmarkEnd w:id="6"/>
     </w:p>
     <w:p>
       <w:pPr>
@@ -2340,16 +4977,8 @@
         <w:rPr>
           <w:rFonts w:ascii="Times New Roman" w:hAnsi="Times New Roman" w:cs="Times New Roman"/>
         </w:rPr>
-        <w:t xml:space="preserve"> i dati in sicurezza finché il sistema non è pronto a </w:t>
-      </w:r>
-      <w:proofErr w:type="spellStart"/>
-      <w:r>
-        <w:rPr>
-          <w:rFonts w:ascii="Times New Roman" w:hAnsi="Times New Roman" w:cs="Times New Roman"/>
-        </w:rPr>
-        <w:t>processarli.</w:t>
-      </w:r>
-      <w:proofErr w:type="spellEnd"/>
+        <w:t xml:space="preserve"> i dati in sicurezza finché il sistema non è pronto a processarli.</w:t>
+      </w:r>
     </w:p>
     <w:p>
       <w:pPr>
@@ -2384,6 +5013,7 @@
       <w:pPr>
         <w:pStyle w:val="Titolo3"/>
       </w:pPr>
+      <w:bookmarkStart w:id="7" w:name="_Toc224033450"/>
       <w:r>
         <w:t>2.</w:t>
       </w:r>
@@ -2404,6 +5034,7 @@
       <w:r>
         <w:t xml:space="preserve"> Streaming &amp; Scala</w:t>
       </w:r>
+      <w:bookmarkEnd w:id="7"/>
     </w:p>
     <w:p>
       <w:pPr>
@@ -2973,6 +5604,7 @@
       <w:pPr>
         <w:pStyle w:val="Titolo3"/>
       </w:pPr>
+      <w:bookmarkStart w:id="8" w:name="_Toc224033451"/>
       <w:r>
         <w:t>2.</w:t>
       </w:r>
@@ -2993,6 +5625,7 @@
       <w:r>
         <w:t xml:space="preserve"> Architecture su Delta Lake</w:t>
       </w:r>
+      <w:bookmarkEnd w:id="8"/>
     </w:p>
     <w:p>
       <w:pPr>
@@ -3331,6 +5964,7 @@
       <w:pPr>
         <w:pStyle w:val="Titolo3"/>
       </w:pPr>
+      <w:bookmarkStart w:id="9" w:name="_Toc224033452"/>
       <w:r>
         <w:t xml:space="preserve">2.1.4 </w:t>
       </w:r>
@@ -3338,6 +5972,7 @@
       <w:r>
         <w:t>RealTimeAlertManager</w:t>
       </w:r>
+      <w:bookmarkEnd w:id="9"/>
       <w:proofErr w:type="spellEnd"/>
     </w:p>
     <w:p>
@@ -3417,6 +6052,7 @@
       <w:pPr>
         <w:pStyle w:val="Titolo3"/>
       </w:pPr>
+      <w:bookmarkStart w:id="10" w:name="_Toc224033453"/>
       <w:r>
         <w:lastRenderedPageBreak/>
         <w:t xml:space="preserve">2.1.5 </w:t>
@@ -3425,6 +6061,7 @@
       <w:r>
         <w:t>BusinessInsightsEngine</w:t>
       </w:r>
+      <w:bookmarkEnd w:id="10"/>
       <w:proofErr w:type="spellEnd"/>
     </w:p>
     <w:p>
@@ -3494,6 +6131,7 @@
       <w:pPr>
         <w:pStyle w:val="Titolo3"/>
       </w:pPr>
+      <w:bookmarkStart w:id="11" w:name="_Toc224033454"/>
       <w:r>
         <w:t xml:space="preserve">2.1.6 </w:t>
       </w:r>
@@ -3501,6 +6139,7 @@
       <w:r>
         <w:t>Optimizer</w:t>
       </w:r>
+      <w:bookmarkEnd w:id="11"/>
       <w:proofErr w:type="spellEnd"/>
     </w:p>
     <w:p>
@@ -3552,14 +6191,17 @@
       <w:pPr>
         <w:pStyle w:val="Titolo1"/>
       </w:pPr>
+      <w:bookmarkStart w:id="12" w:name="_Toc224033455"/>
       <w:r>
         <w:t>3. Analisi dei Dataset</w:t>
       </w:r>
+      <w:bookmarkEnd w:id="12"/>
     </w:p>
     <w:p>
       <w:pPr>
         <w:pStyle w:val="Titolo2"/>
       </w:pPr>
+      <w:bookmarkStart w:id="13" w:name="_Toc224033456"/>
       <w:r>
         <w:t xml:space="preserve">3.1 La </w:t>
       </w:r>
@@ -3577,6 +6219,7 @@
       <w:r>
         <w:t xml:space="preserve"> Dataset</w:t>
       </w:r>
+      <w:bookmarkEnd w:id="13"/>
     </w:p>
     <w:p>
       <w:pPr>
@@ -4029,6 +6672,7 @@
       <w:pPr>
         <w:pStyle w:val="Titolo2"/>
       </w:pPr>
+      <w:bookmarkStart w:id="14" w:name="_Toc224033457"/>
       <w:r>
         <w:t xml:space="preserve">3.2 L'Arricchimento: </w:t>
       </w:r>
@@ -4038,6 +6682,7 @@
       <w:r>
         <w:t>ruppi Acorn</w:t>
       </w:r>
+      <w:bookmarkEnd w:id="14"/>
     </w:p>
     <w:p>
       <w:pPr>
@@ -4384,6 +7029,7 @@
       <w:pPr>
         <w:pStyle w:val="Titolo2"/>
       </w:pPr>
+      <w:bookmarkStart w:id="15" w:name="_Toc224033458"/>
       <w:r>
         <w:t xml:space="preserve">3.3 Il </w:t>
       </w:r>
@@ -4407,6 +7053,7 @@
       <w:r>
         <w:t xml:space="preserve"> Data</w:t>
       </w:r>
+      <w:bookmarkEnd w:id="15"/>
     </w:p>
     <w:p>
       <w:pPr>
@@ -4523,9 +7170,11 @@
       <w:pPr>
         <w:pStyle w:val="Titolo2"/>
       </w:pPr>
+      <w:bookmarkStart w:id="16" w:name="_Toc224033459"/>
       <w:r>
         <w:t>3.4 Analisi Esplorativa dei Dati (EDA)</w:t>
       </w:r>
+      <w:bookmarkEnd w:id="16"/>
     </w:p>
     <w:p>
       <w:pPr>
@@ -6618,6 +9267,7 @@
         <w:pStyle w:val="Titolo1"/>
         <w:spacing w:after="0"/>
       </w:pPr>
+      <w:bookmarkStart w:id="17" w:name="_Toc224033460"/>
       <w:r>
         <w:lastRenderedPageBreak/>
         <w:t xml:space="preserve">4. Ingestione dei Dati (Data </w:t>
@@ -6630,6 +9280,7 @@
       <w:r>
         <w:t xml:space="preserve"> Layer)</w:t>
       </w:r>
+      <w:bookmarkEnd w:id="17"/>
     </w:p>
     <w:p>
       <w:pPr>
@@ -6750,9 +9401,11 @@
         <w:pStyle w:val="Titolo2"/>
         <w:spacing w:before="0"/>
       </w:pPr>
+      <w:bookmarkStart w:id="18" w:name="_Toc224033461"/>
       <w:r>
         <w:t>4.1 Architettura basata su Apache Kafka</w:t>
       </w:r>
+      <w:bookmarkEnd w:id="18"/>
     </w:p>
     <w:p>
       <w:pPr>
@@ -6816,7 +9469,7 @@
         <w:rPr>
           <w:rFonts w:ascii="Times New Roman" w:hAnsi="Times New Roman" w:cs="Times New Roman"/>
         </w:rPr>
-        <w:t>. Kafka agisce come il "sistema nervoso" dell'architettura, svolgendo il ruolo di buffer transazionale tra la sorgente dei dati e il motore di calcolo.</w:t>
+        <w:t>. Kafka agisce come il "sistema nervoso" dell'architettura, svolgendo il ruolo di buffer tansazionale tra la sorgente dei dati e il motore di calcolo.</w:t>
       </w:r>
     </w:p>
     <w:p>
@@ -7187,6 +9840,7 @@
       <w:pPr>
         <w:pStyle w:val="Titolo2"/>
       </w:pPr>
+      <w:bookmarkStart w:id="19" w:name="_Toc224033462"/>
       <w:r>
         <w:t xml:space="preserve">4.2 Strategia di Ingestione: </w:t>
       </w:r>
@@ -7198,6 +9852,7 @@
       <w:r>
         <w:t xml:space="preserve"> Data Replay</w:t>
       </w:r>
+      <w:bookmarkEnd w:id="19"/>
     </w:p>
     <w:p>
       <w:pPr>
@@ -7580,6 +10235,7 @@
       <w:pPr>
         <w:pStyle w:val="Titolo2"/>
       </w:pPr>
+      <w:bookmarkStart w:id="20" w:name="_Toc224033463"/>
       <w:r>
         <w:t xml:space="preserve">4.3 Definizione del </w:t>
       </w:r>
@@ -7589,6 +10245,7 @@
       <w:r>
         <w:t>lusso</w:t>
       </w:r>
+      <w:bookmarkEnd w:id="20"/>
     </w:p>
     <w:p>
       <w:pPr>
@@ -8072,6 +10729,7 @@
         <w:pStyle w:val="Titolo1"/>
         <w:spacing w:after="0"/>
       </w:pPr>
+      <w:bookmarkStart w:id="21" w:name="_Toc224033464"/>
       <w:r>
         <w:lastRenderedPageBreak/>
         <w:t>5. Elaborazione in Streaming</w:t>
@@ -8079,6 +10737,7 @@
       <w:r>
         <w:t xml:space="preserve"> (Processing Layer)</w:t>
       </w:r>
+      <w:bookmarkEnd w:id="21"/>
     </w:p>
     <w:p>
       <w:pPr>
@@ -8166,6 +10825,7 @@
       <w:pPr>
         <w:pStyle w:val="Titolo2"/>
       </w:pPr>
+      <w:bookmarkStart w:id="22" w:name="_Toc224033465"/>
       <w:r>
         <w:t xml:space="preserve">5.1 Architettura della Pipeline: dal </w:t>
       </w:r>
@@ -8177,6 +10837,7 @@
       <w:r>
         <w:t xml:space="preserve"> al Gold Layer</w:t>
       </w:r>
+      <w:bookmarkEnd w:id="22"/>
     </w:p>
     <w:p>
       <w:pPr>
@@ -8478,6 +11139,7 @@
       <w:pPr>
         <w:pStyle w:val="Titolo2"/>
       </w:pPr>
+      <w:bookmarkStart w:id="23" w:name="_Toc224033466"/>
       <w:r>
         <w:t xml:space="preserve">5.2 </w:t>
       </w:r>
@@ -8498,6 +11160,7 @@
       <w:r>
         <w:t xml:space="preserve"> (Silver Layer)</w:t>
       </w:r>
+      <w:bookmarkEnd w:id="23"/>
     </w:p>
     <w:p>
       <w:pPr>
@@ -11260,6 +13923,7 @@
       <w:pPr>
         <w:pStyle w:val="Titolo2"/>
       </w:pPr>
+      <w:bookmarkStart w:id="24" w:name="_Toc224033467"/>
       <w:r>
         <w:lastRenderedPageBreak/>
         <w:t xml:space="preserve">5.3 Streaming </w:t>
@@ -11272,6 +13936,7 @@
       <w:r>
         <w:t xml:space="preserve"> tramite Broadcast Join</w:t>
       </w:r>
+      <w:bookmarkEnd w:id="24"/>
     </w:p>
     <w:p>
       <w:pPr>
@@ -13088,6 +15753,7 @@
       <w:pPr>
         <w:pStyle w:val="Titolo2"/>
       </w:pPr>
+      <w:bookmarkStart w:id="25" w:name="_Toc224033468"/>
       <w:r>
         <w:t xml:space="preserve">5.4 Analisi Temporale: </w:t>
       </w:r>
@@ -13107,6 +15773,7 @@
       <w:r>
         <w:t xml:space="preserve"> (Gold Layer)</w:t>
       </w:r>
+      <w:bookmarkEnd w:id="25"/>
     </w:p>
     <w:p>
       <w:pPr>
@@ -13325,6 +15992,7 @@
       <w:pPr>
         <w:pStyle w:val="Titolo2"/>
       </w:pPr>
+      <w:bookmarkStart w:id="26" w:name="_Toc224033469"/>
       <w:r>
         <w:t>5.</w:t>
       </w:r>
@@ -13344,6 +16012,7 @@
       <w:r>
         <w:t>Tolerance</w:t>
       </w:r>
+      <w:bookmarkEnd w:id="26"/>
       <w:proofErr w:type="spellEnd"/>
     </w:p>
     <w:p>
@@ -13814,6 +16483,7 @@
         <w:pStyle w:val="Titolo1"/>
         <w:spacing w:after="0"/>
       </w:pPr>
+      <w:bookmarkStart w:id="27" w:name="_Toc224033470"/>
       <w:r>
         <w:lastRenderedPageBreak/>
         <w:t xml:space="preserve">6. Intelligence &amp; </w:t>
@@ -13826,6 +16496,7 @@
       <w:r>
         <w:t xml:space="preserve"> Analysis</w:t>
       </w:r>
+      <w:bookmarkEnd w:id="27"/>
     </w:p>
     <w:p>
       <w:pPr>
@@ -13871,6 +16542,7 @@
       <w:pPr>
         <w:pStyle w:val="Titolo2"/>
       </w:pPr>
+      <w:bookmarkStart w:id="28" w:name="_Toc224033471"/>
       <w:r>
         <w:t xml:space="preserve">6.1 Implementazione dello </w:t>
       </w:r>
@@ -13882,6 +16554,7 @@
       <w:r>
         <w:t xml:space="preserve"> Streaming</w:t>
       </w:r>
+      <w:bookmarkEnd w:id="28"/>
     </w:p>
     <w:p>
       <w:pPr>
@@ -14248,6 +16921,7 @@
       <w:pPr>
         <w:pStyle w:val="Titolo2"/>
       </w:pPr>
+      <w:bookmarkStart w:id="29" w:name="_Toc224033472"/>
       <w:r>
         <w:t xml:space="preserve">6.2 Calcolo Statistico Incrementale: Algoritmo di </w:t>
       </w:r>
@@ -14255,6 +16929,7 @@
       <w:r>
         <w:t>Welford</w:t>
       </w:r>
+      <w:bookmarkEnd w:id="29"/>
       <w:proofErr w:type="spellEnd"/>
     </w:p>
     <w:p>
@@ -14867,16 +17542,7 @@
           <w:rPr>
             <w:rFonts w:ascii="Cambria Math" w:eastAsiaTheme="minorEastAsia" w:hAnsi="Cambria Math" w:cs="Times New Roman"/>
           </w:rPr>
-          <m:t>Δ</m:t>
-        </m:r>
-        <m:r>
-          <m:rPr>
-            <m:sty m:val="p"/>
-          </m:rPr>
-          <w:rPr>
-            <w:rFonts w:ascii="Cambria Math" w:eastAsiaTheme="minorEastAsia" w:hAnsi="Cambria Math" w:cs="Times New Roman"/>
-          </w:rPr>
-          <m:t>=x-</m:t>
+          <m:t>Δ=x-</m:t>
         </m:r>
         <m:sSub>
           <m:sSubPr>
@@ -15205,16 +17871,7 @@
           <w:rPr>
             <w:rFonts w:ascii="Cambria Math" w:eastAsiaTheme="minorEastAsia" w:hAnsi="Cambria Math" w:cs="Times New Roman"/>
           </w:rPr>
-          <m:t>+</m:t>
-        </m:r>
-        <m:r>
-          <m:rPr>
-            <m:sty m:val="p"/>
-          </m:rPr>
-          <w:rPr>
-            <w:rFonts w:ascii="Cambria Math" w:eastAsiaTheme="minorEastAsia" w:hAnsi="Cambria Math" w:cs="Times New Roman"/>
-          </w:rPr>
-          <m:t>Δ×</m:t>
+          <m:t>+Δ×</m:t>
         </m:r>
         <m:d>
           <m:dPr>
@@ -16147,16 +18804,7 @@
             <w:rPr>
               <w:rFonts w:ascii="Cambria Math" w:hAnsi="Cambria Math" w:cs="Times New Roman"/>
             </w:rPr>
-            <m:t>σ</m:t>
-          </m:r>
-          <m:r>
-            <m:rPr>
-              <m:sty m:val="p"/>
-            </m:rPr>
-            <w:rPr>
-              <w:rFonts w:ascii="Cambria Math" w:hAnsi="Cambria Math" w:cs="Times New Roman"/>
-            </w:rPr>
-            <m:t>=</m:t>
+            <m:t>σ=</m:t>
           </m:r>
           <m:rad>
             <m:radPr>
@@ -16271,6 +18919,7 @@
       <w:pPr>
         <w:pStyle w:val="Titolo2"/>
       </w:pPr>
+      <w:bookmarkStart w:id="30" w:name="_Toc224033473"/>
       <w:r>
         <w:t>6.3 Motore di Rilevamento delle Anomalie (</w:t>
       </w:r>
@@ -16282,6 +18931,7 @@
       <w:r>
         <w:t>)</w:t>
       </w:r>
+      <w:bookmarkEnd w:id="30"/>
     </w:p>
     <w:p>
       <w:pPr>
@@ -16443,16 +19093,7 @@
                     <w:rPr>
                       <w:rFonts w:ascii="Cambria Math" w:hAnsi="Cambria Math" w:cs="Times New Roman"/>
                     </w:rPr>
-                    <m:t>x-</m:t>
-                  </m:r>
-                  <m:r>
-                    <m:rPr>
-                      <m:sty m:val="p"/>
-                    </m:rPr>
-                    <w:rPr>
-                      <w:rFonts w:ascii="Cambria Math" w:hAnsi="Cambria Math" w:cs="Times New Roman"/>
-                    </w:rPr>
-                    <m:t>μ</m:t>
+                    <m:t>x-μ</m:t>
                   </m:r>
                 </m:e>
               </m:d>
@@ -16465,16 +19106,7 @@
                 <w:rPr>
                   <w:rFonts w:ascii="Cambria Math" w:hAnsi="Cambria Math" w:cs="Times New Roman"/>
                 </w:rPr>
-                <m:t>σ</m:t>
-              </m:r>
-              <m:r>
-                <m:rPr>
-                  <m:sty m:val="p"/>
-                </m:rPr>
-                <w:rPr>
-                  <w:rFonts w:ascii="Cambria Math" w:hAnsi="Cambria Math" w:cs="Times New Roman"/>
-                </w:rPr>
-                <m:t>+0.1</m:t>
+                <m:t>σ+0.1</m:t>
               </m:r>
             </m:den>
           </m:f>
@@ -17056,6 +19688,7 @@
       <w:pPr>
         <w:pStyle w:val="Titolo2"/>
       </w:pPr>
+      <w:bookmarkStart w:id="31" w:name="_Toc224033474"/>
       <w:r>
         <w:t xml:space="preserve">6.4 Gestione del </w:t>
       </w:r>
@@ -17075,6 +19708,7 @@
       <w:r>
         <w:t>Tolerance</w:t>
       </w:r>
+      <w:bookmarkEnd w:id="31"/>
       <w:proofErr w:type="spellEnd"/>
     </w:p>
     <w:p>
@@ -17493,6 +20127,7 @@
       <w:pPr>
         <w:pStyle w:val="Titolo2"/>
       </w:pPr>
+      <w:bookmarkStart w:id="32" w:name="_Toc224033475"/>
       <w:r>
         <w:t>6.</w:t>
       </w:r>
@@ -17502,6 +20137,7 @@
       <w:r>
         <w:t xml:space="preserve"> Validazione e Testing</w:t>
       </w:r>
+      <w:bookmarkEnd w:id="32"/>
     </w:p>
     <w:p>
       <w:pPr>
@@ -17999,6 +20635,7 @@
       <w:pPr>
         <w:pStyle w:val="Titolo1"/>
       </w:pPr>
+      <w:bookmarkStart w:id="33" w:name="_Toc224033476"/>
       <w:r>
         <w:t>7</w:t>
       </w:r>
@@ -18006,10 +20643,7 @@
         <w:t>.</w:t>
       </w:r>
       <w:r>
-        <w:t xml:space="preserve"> </w:t>
-      </w:r>
-      <w:r>
-        <w:t>Monitoring Real-time</w:t>
+        <w:t xml:space="preserve"> Monitoring Real-time</w:t>
       </w:r>
       <w:r>
         <w:t xml:space="preserve">, Business Intelligence e </w:t>
@@ -18021,12 +20655,14 @@
       <w:r>
         <w:t>intenance</w:t>
       </w:r>
+      <w:bookmarkEnd w:id="33"/>
       <w:proofErr w:type="spellEnd"/>
     </w:p>
     <w:p>
       <w:pPr>
         <w:pStyle w:val="Titolo2"/>
       </w:pPr>
+      <w:bookmarkStart w:id="34" w:name="_Toc224033477"/>
       <w:r>
         <w:t xml:space="preserve">7.1 Gestione </w:t>
       </w:r>
@@ -18036,6 +20672,7 @@
       <w:r>
         <w:t>eattiva degli Alert</w:t>
       </w:r>
+      <w:bookmarkEnd w:id="34"/>
     </w:p>
     <w:p>
       <w:pPr>
@@ -18579,10 +21216,12 @@
       <w:pPr>
         <w:pStyle w:val="Titolo2"/>
       </w:pPr>
+      <w:bookmarkStart w:id="35" w:name="_Toc224033478"/>
       <w:r>
         <w:lastRenderedPageBreak/>
         <w:t>7.2 Business Insights Engine</w:t>
       </w:r>
+      <w:bookmarkEnd w:id="35"/>
     </w:p>
     <w:p>
       <w:pPr>
@@ -19327,16 +21966,7 @@
           <w:rPr>
             <w:rFonts w:ascii="Cambria Math" w:hAnsi="Cambria Math" w:cs="Times New Roman"/>
           </w:rPr>
-          <m:t xml:space="preserve">CoV = </m:t>
-        </m:r>
-        <m:r>
-          <m:rPr>
-            <m:sty m:val="p"/>
-          </m:rPr>
-          <w:rPr>
-            <w:rFonts w:ascii="Cambria Math" w:hAnsi="Cambria Math" w:cs="Times New Roman"/>
-          </w:rPr>
-          <m:t>σ</m:t>
+          <m:t>CoV = σ</m:t>
         </m:r>
         <m:r>
           <m:rPr>
@@ -19355,16 +21985,7 @@
           <w:rPr>
             <w:rFonts w:ascii="Cambria Math" w:hAnsi="Cambria Math" w:cs="Times New Roman"/>
           </w:rPr>
-          <m:t xml:space="preserve"> </m:t>
-        </m:r>
-        <m:r>
-          <m:rPr>
-            <m:sty m:val="p"/>
-          </m:rPr>
-          <w:rPr>
-            <w:rFonts w:ascii="Cambria Math" w:hAnsi="Cambria Math" w:cs="Times New Roman"/>
-          </w:rPr>
-          <m:t>μ</m:t>
+          <m:t xml:space="preserve"> μ</m:t>
         </m:r>
       </m:oMath>
       <w:r>
@@ -19608,7 +22229,6 @@
               </m:func>
             </m:num>
             <m:den>
-              <w:proofErr w:type="spellStart"/>
               <m:r>
                 <m:rPr>
                   <m:nor/>
@@ -19618,7 +22238,6 @@
                 </w:rPr>
                 <m:t>avg</m:t>
               </m:r>
-              <w:proofErr w:type="spellEnd"/>
               <m:d>
                 <m:dPr>
                   <m:ctrlPr>
@@ -19926,10 +22545,12 @@
       <w:pPr>
         <w:pStyle w:val="Titolo2"/>
       </w:pPr>
+      <w:bookmarkStart w:id="36" w:name="_Toc224033479"/>
       <w:r>
         <w:lastRenderedPageBreak/>
         <w:t>7.3 Ottimizzazione e Manutenzione del Data Lake</w:t>
       </w:r>
+      <w:bookmarkEnd w:id="36"/>
     </w:p>
     <w:p>
       <w:pPr>
@@ -20258,9 +22879,11 @@
         <w:pStyle w:val="Titolo1"/>
         <w:spacing w:after="0"/>
       </w:pPr>
+      <w:bookmarkStart w:id="37" w:name="_Toc224033480"/>
       <w:r>
         <w:t>8. Risultati e Conclusioni</w:t>
       </w:r>
+      <w:bookmarkEnd w:id="37"/>
     </w:p>
     <w:p>
       <w:pPr>
@@ -33870,6 +36493,7 @@
   <w:style w:type="character" w:default="1" w:styleId="Carpredefinitoparagrafo">
     <w:name w:val="Default Paragraph Font"/>
     <w:uiPriority w:val="1"/>
+    <w:semiHidden/>
     <w:unhideWhenUsed/>
   </w:style>
   <w:style w:type="table" w:default="1" w:styleId="Tabellanormale">
@@ -34320,6 +36944,44 @@
       </w:tcPr>
     </w:tblStylePr>
   </w:style>
+  <w:style w:type="paragraph" w:styleId="Sommario1">
+    <w:name w:val="toc 1"/>
+    <w:basedOn w:val="Normale"/>
+    <w:next w:val="Normale"/>
+    <w:autoRedefine/>
+    <w:uiPriority w:val="39"/>
+    <w:unhideWhenUsed/>
+    <w:rsid w:val="008F7210"/>
+    <w:pPr>
+      <w:spacing w:after="100"/>
+    </w:pPr>
+  </w:style>
+  <w:style w:type="paragraph" w:styleId="Sommario2">
+    <w:name w:val="toc 2"/>
+    <w:basedOn w:val="Normale"/>
+    <w:next w:val="Normale"/>
+    <w:autoRedefine/>
+    <w:uiPriority w:val="39"/>
+    <w:unhideWhenUsed/>
+    <w:rsid w:val="008F7210"/>
+    <w:pPr>
+      <w:spacing w:after="100"/>
+      <w:ind w:left="240"/>
+    </w:pPr>
+  </w:style>
+  <w:style w:type="paragraph" w:styleId="Sommario3">
+    <w:name w:val="toc 3"/>
+    <w:basedOn w:val="Normale"/>
+    <w:next w:val="Normale"/>
+    <w:autoRedefine/>
+    <w:uiPriority w:val="39"/>
+    <w:unhideWhenUsed/>
+    <w:rsid w:val="008F7210"/>
+    <w:pPr>
+      <w:spacing w:after="100"/>
+      <w:ind w:left="480"/>
+    </w:pPr>
+  </w:style>
 </w:styles>
 </file>
 

</xml_diff>